<commit_message>
Added Important Algorithms and Imprtant Problems
</commit_message>
<xml_diff>
--- a/Driving Lessons Manager.docx
+++ b/Driving Lessons Manager.docx
@@ -4955,25 +4955,53 @@
           <w:sz w:val="24"/>
           <w:rtl/>
         </w:rPr>
-        <w:t xml:space="preserve">קרה והייתי צריך לבטל, לדחות או להקדים את השיעור וזה כבר סיפור בפני עצמו, בשל העובדה שצריך היה להזיז תלמידים אחרים, בתקווה שהם יכולים כמובן, דבר שלקח זמן והיה מייאש. מוטיבציה נוספת לפרויקט היא שהרעיון הכללי </w:t>
-      </w:r>
-      <w:proofErr w:type="spellStart"/>
+        <w:t>קרה והייתי צריך לבטל, לדחות או להקדים את השיעור וזה כבר סיפור בפני עצמו, בשל העובדה שצריך היה להזיז תלמידים אחרים, בתקווה שהם יכולים כמובן, דבר שלקח זמן והיה מייאש. מוטיבציה נוספת לפרויקט היא שהרעיון הכללי לאיך שהאפליקציה תיראה ותעבוד כבר היה בראש שלי מתחילת העבודה על הפרויקט, דבר שהקל על מהלך העבודה לעומת מקרה אחר בו הייתי עובד על הפרויקט ללא רעיון כללי בראש</w:t>
+      </w:r>
       <w:r>
         <w:rPr>
           <w:rFonts w:ascii="David" w:hAnsi="David" w:hint="cs"/>
           <w:sz w:val="24"/>
           <w:rtl/>
         </w:rPr>
-        <w:t>לאיך</w:t>
-      </w:r>
-      <w:proofErr w:type="spellEnd"/>
+        <w:t>, דבר אשר היה קשה יותר ופחות בר ביצוע.</w:t>
+      </w:r>
+    </w:p>
+    <w:p>
+      <w:pPr>
+        <w:spacing w:line="360" w:lineRule="auto"/>
+        <w:jc w:val="left"/>
+        <w:rPr>
+          <w:rFonts w:ascii="David" w:hAnsi="David"/>
+          <w:sz w:val="24"/>
+          <w:rtl/>
+        </w:rPr>
+      </w:pPr>
+    </w:p>
+    <w:p>
+      <w:pPr>
+        <w:spacing w:line="360" w:lineRule="auto"/>
+        <w:jc w:val="left"/>
+        <w:rPr>
+          <w:rFonts w:ascii="David" w:hAnsi="David"/>
+          <w:sz w:val="24"/>
+          <w:rtl/>
+        </w:rPr>
+      </w:pPr>
       <w:r>
         <w:rPr>
           <w:rFonts w:ascii="David" w:hAnsi="David" w:hint="cs"/>
           <w:sz w:val="24"/>
           <w:rtl/>
         </w:rPr>
-        <w:t xml:space="preserve"> שהאפליקציה תיראה ותעבוד כבר היה בראש שלי מתחילת העבודה על הפרויקט, דבר שהקל על מהלך העבודה לעומת מקרה אחר בו הייתי עובד על הפרויקט ללא רעיון כללי בראש</w:t>
+        <w:t>המצב הקיים בשוק, כפי שתיארתי קודם לכן, הוא אפליקציות אשר מאפשרות לתלמיד לערוך רשימה של שיעורי נהיגה ופרטים נוספים אודות השיעורים, אך אין כל מידע על המורים ותקשורת ביניה</w:t>
+      </w:r>
+      <w:r>
+        <w:rPr>
+          <w:rFonts w:ascii="David" w:hAnsi="David" w:hint="eastAsia"/>
+          <w:sz w:val="24"/>
+          <w:rtl/>
+        </w:rPr>
+        <w:t>ם</w:t>
       </w:r>
       <w:r>
         <w:rPr>
@@ -4981,7 +5009,31 @@
           <w:sz w:val="24"/>
           <w:rtl/>
         </w:rPr>
-        <w:t>, דבר אשר היה קשה יותר ופחות בר ביצוע.</w:t>
+        <w:t xml:space="preserve">. באפליקציה הזאת, ישנו החידוש הזה לעומת האפליקציות הקיימות כיום </w:t>
+      </w:r>
+      <w:r>
+        <w:rPr>
+          <w:rFonts w:ascii="David" w:hAnsi="David"/>
+          <w:sz w:val="24"/>
+          <w:rtl/>
+        </w:rPr>
+        <w:t>–</w:t>
+      </w:r>
+      <w:r>
+        <w:rPr>
+          <w:rFonts w:ascii="David" w:hAnsi="David" w:hint="cs"/>
+          <w:sz w:val="24"/>
+          <w:rtl/>
+        </w:rPr>
+        <w:t xml:space="preserve"> תקשורת עם המורים. לכל תלמיד יש מורה אותו הוא יכול לבחור ולכל מורה ישנה רשימת תלמידים. בנוסף, כאשר תלמיד מוסיף שיעור, הוא לא רק מוסיף אלא גם קובע את השיעור אצל המורה</w:t>
+      </w:r>
+      <w:r>
+        <w:rPr>
+          <w:rFonts w:ascii="David" w:hAnsi="David" w:hint="cs"/>
+          <w:sz w:val="24"/>
+          <w:rtl/>
+        </w:rPr>
+        <w:t xml:space="preserve"> (במידת האשפר) ובכך חוסכת כאב ראש רב כמו שתיארתי קודם לכן.</w:t>
       </w:r>
     </w:p>
     <w:p>
@@ -5002,7 +5054,6 @@
         <w:rPr>
           <w:rFonts w:ascii="David" w:hAnsi="David"/>
           <w:sz w:val="24"/>
-          <w:rtl/>
         </w:rPr>
       </w:pPr>
       <w:r>
@@ -5011,15 +5062,7 @@
           <w:sz w:val="24"/>
           <w:rtl/>
         </w:rPr>
-        <w:t>המצב הקיים בשוק, כפי שתיארתי קודם לכן, הוא אפליקציות אשר מאפשרות לתלמיד לערוך רשימה של שיעורי נהיגה ופרטים נוספים אודות השיעורים, אך אין כל מידע על המורים ותקשורת ביניה</w:t>
-      </w:r>
-      <w:r>
-        <w:rPr>
-          <w:rFonts w:ascii="David" w:hAnsi="David" w:hint="eastAsia"/>
-          <w:sz w:val="24"/>
-          <w:rtl/>
-        </w:rPr>
-        <w:t>ם</w:t>
+        <w:t xml:space="preserve">לכן, הפתרון אשר הפרויקט בא לתת הינו דרך מאוד קלה לסדר את שיעורי הנהיגה, פרטים עליהם, </w:t>
       </w:r>
       <w:r>
         <w:rPr>
@@ -5027,12 +5070,629 @@
           <w:sz w:val="24"/>
           <w:rtl/>
         </w:rPr>
-        <w:t xml:space="preserve">. באפליקציה הזאת, ישנו החידוש הזה לעומת האפליקציות הקיימות כיום </w:t>
-      </w:r>
-      <w:r>
+        <w:t xml:space="preserve">וקביעת שיעורי הנהיגה תוך כדי תקשורת תמידית עם המורה ויומן השיעורים שלו. עם זאת, </w:t>
+      </w:r>
+      <w:r>
+        <w:rPr>
+          <w:rFonts w:ascii="David" w:hAnsi="David" w:hint="cs"/>
+          <w:sz w:val="24"/>
+          <w:rtl/>
+        </w:rPr>
+        <w:t>ישנם פתרונות אחרים לבעיה, כגון אפליקציה למורה בלבד, שם הוא יכול לקבוע שיעורים ואז האפליקציה יכולה לשלוח הודעה לתלמיד לגבי פרטים והתראה לפני השיעור. הסיבה שלא בחרתי בפתרון זה הוא שהיכולות שלו הן מוגבלות לעומת האפליקציה הנוכחית אשר יותר כללית ובעלת אפשרויות נרחבות יותר.</w:t>
+      </w:r>
+    </w:p>
+    <w:p>
+      <w:pPr>
+        <w:spacing w:line="276" w:lineRule="auto"/>
+        <w:jc w:val="left"/>
         <w:rPr>
           <w:rFonts w:ascii="David" w:hAnsi="David"/>
           <w:sz w:val="24"/>
+        </w:rPr>
+      </w:pPr>
+    </w:p>
+    <w:p>
+      <w:pPr>
+        <w:pStyle w:val="1"/>
+        <w:spacing w:line="276" w:lineRule="auto"/>
+        <w:rPr>
+          <w:rtl/>
+        </w:rPr>
+      </w:pPr>
+      <w:bookmarkStart w:id="2" w:name="_Toc29994015"/>
+      <w:bookmarkStart w:id="3" w:name="_Toc39329407"/>
+      <w:r>
+        <w:rPr>
+          <w:rFonts w:hint="cs"/>
+          <w:rtl/>
+        </w:rPr>
+        <w:lastRenderedPageBreak/>
+        <w:t xml:space="preserve">מדריך </w:t>
+      </w:r>
+      <w:r>
+        <w:rPr>
+          <w:rFonts w:hint="cs"/>
+          <w:rtl/>
+        </w:rPr>
+        <w:t>ל</w:t>
+      </w:r>
+      <w:r>
+        <w:rPr>
+          <w:rFonts w:hint="cs"/>
+          <w:rtl/>
+        </w:rPr>
+        <w:t>מתכנת</w:t>
+      </w:r>
+      <w:bookmarkEnd w:id="2"/>
+      <w:bookmarkEnd w:id="3"/>
+    </w:p>
+    <w:p>
+      <w:pPr>
+        <w:pStyle w:val="2"/>
+        <w:spacing w:line="276" w:lineRule="auto"/>
+      </w:pPr>
+      <w:bookmarkStart w:id="4" w:name="_Toc29994016"/>
+      <w:bookmarkStart w:id="5" w:name="_Toc39329408"/>
+      <w:r>
+        <w:rPr>
+          <w:rFonts w:hint="cs"/>
+          <w:rtl/>
+        </w:rPr>
+        <w:t>אלגוריתמים</w:t>
+      </w:r>
+      <w:r>
+        <w:rPr>
+          <w:rFonts w:hint="cs"/>
+          <w:rtl/>
+        </w:rPr>
+        <w:t xml:space="preserve"> מרכזיים</w:t>
+      </w:r>
+      <w:bookmarkEnd w:id="4"/>
+      <w:bookmarkEnd w:id="5"/>
+    </w:p>
+    <w:p>
+      <w:pPr>
+        <w:rPr>
+          <w:b/>
+          <w:bCs/>
+          <w:u w:val="single"/>
+          <w:rtl/>
+        </w:rPr>
+      </w:pPr>
+      <w:r>
+        <w:rPr>
+          <w:rFonts w:hint="cs"/>
+          <w:b/>
+          <w:bCs/>
+          <w:u w:val="single"/>
+          <w:rtl/>
+        </w:rPr>
+        <w:t>הוספת שיעור חדש</w:t>
+      </w:r>
+    </w:p>
+    <w:p>
+      <w:pPr>
+        <w:rPr>
+          <w:rtl/>
+        </w:rPr>
+      </w:pPr>
+      <w:r>
+        <w:rPr>
+          <w:rFonts w:hint="cs"/>
+          <w:rtl/>
+        </w:rPr>
+        <w:t>כל שיעור הוא אובייקט המכיל את מספר תעודת הזהות של תלמיד, סוג שיעור, עלות, תאריך ואם שולם או לא שולם על ידי התלמיד.</w:t>
+      </w:r>
+      <w:r>
+        <w:rPr>
+          <w:rFonts w:hint="cs"/>
+          <w:rtl/>
+        </w:rPr>
+        <w:t xml:space="preserve"> אם אני רוצה להוסיף אובייקט שיעור </w:t>
+      </w:r>
+      <w:r>
+        <w:rPr>
+          <w:rFonts w:hint="cs"/>
+          <w:rtl/>
+        </w:rPr>
+        <w:t>ל</w:t>
+      </w:r>
+      <w:r>
+        <w:t xml:space="preserve"> Data Base</w:t>
+      </w:r>
+      <w:r>
+        <w:rPr>
+          <w:rFonts w:hint="cs"/>
+          <w:rtl/>
+        </w:rPr>
+        <w:t xml:space="preserve">, עלי לקרוא לפונקציה </w:t>
+      </w:r>
+      <w:r>
+        <w:t>SelectAll</w:t>
+      </w:r>
+      <w:r>
+        <w:rPr>
+          <w:rFonts w:hint="cs"/>
+          <w:rtl/>
+        </w:rPr>
+        <w:t xml:space="preserve"> של </w:t>
+      </w:r>
+      <w:r>
+        <w:t>Lessons</w:t>
+      </w:r>
+      <w:r>
+        <w:rPr>
+          <w:rFonts w:hint="cs"/>
+          <w:rtl/>
+        </w:rPr>
+        <w:t xml:space="preserve"> על מנת שאוכל לקבל את רשימת השיעורים הקיימים במידה ויש ולאחר מכן להוסיף את השיעור לרשימת  השיעורים על ידי קריאה לפעולה </w:t>
+      </w:r>
+      <w:r>
+        <w:t>Insert</w:t>
+      </w:r>
+      <w:r>
+        <w:rPr>
+          <w:rFonts w:hint="cs"/>
+          <w:rtl/>
+        </w:rPr>
+        <w:t xml:space="preserve"> של ה </w:t>
+      </w:r>
+      <w:r>
+        <w:t>Data Base</w:t>
+      </w:r>
+      <w:r>
+        <w:rPr>
+          <w:rFonts w:hint="cs"/>
+          <w:rtl/>
+        </w:rPr>
+        <w:t>.</w:t>
+      </w:r>
+    </w:p>
+    <w:p>
+      <w:pPr>
+        <w:rPr>
+          <w:rtl/>
+        </w:rPr>
+      </w:pPr>
+    </w:p>
+    <w:p>
+      <w:pPr>
+        <w:rPr>
+          <w:rtl/>
+        </w:rPr>
+      </w:pPr>
+      <w:r>
+        <w:rPr>
+          <w:rFonts w:hint="cs"/>
+          <w:b/>
+          <w:bCs/>
+          <w:u w:val="single"/>
+          <w:rtl/>
+        </w:rPr>
+        <w:t xml:space="preserve">הוספת </w:t>
+      </w:r>
+      <w:r>
+        <w:rPr>
+          <w:rFonts w:hint="cs"/>
+          <w:b/>
+          <w:bCs/>
+          <w:u w:val="single"/>
+          <w:rtl/>
+        </w:rPr>
+        <w:t>מורה</w:t>
+      </w:r>
+      <w:r>
+        <w:rPr>
+          <w:rFonts w:hint="cs"/>
+          <w:b/>
+          <w:bCs/>
+          <w:u w:val="single"/>
+          <w:rtl/>
+        </w:rPr>
+        <w:t xml:space="preserve"> חדש</w:t>
+      </w:r>
+    </w:p>
+    <w:p>
+      <w:pPr>
+        <w:rPr>
+          <w:rtl/>
+        </w:rPr>
+      </w:pPr>
+      <w:r>
+        <w:rPr>
+          <w:rFonts w:hint="cs"/>
+          <w:rtl/>
+        </w:rPr>
+        <w:t xml:space="preserve">יש אפשרות להוסיף </w:t>
+      </w:r>
+      <w:r>
+        <w:rPr>
+          <w:rFonts w:hint="cs"/>
+          <w:rtl/>
+        </w:rPr>
+        <w:t>מורה</w:t>
+      </w:r>
+      <w:r>
+        <w:rPr>
+          <w:rFonts w:hint="cs"/>
+          <w:rtl/>
+        </w:rPr>
+        <w:t xml:space="preserve"> חדש</w:t>
+      </w:r>
+      <w:r>
+        <w:rPr>
+          <w:rFonts w:hint="cs"/>
+          <w:rtl/>
+        </w:rPr>
+        <w:t>. על מנת לעשות זאת, על המשתמש קוד</w:t>
+      </w:r>
+      <w:r>
+        <w:rPr>
+          <w:rFonts w:hint="cs"/>
+          <w:rtl/>
+        </w:rPr>
+        <w:t>ם כל להירשם בטופס הרישום, שם יצטרך למלא שם, מספר טלפון, מייל ושעות עבודה</w:t>
+      </w:r>
+      <w:r>
+        <w:rPr>
+          <w:rFonts w:hint="cs"/>
+          <w:rtl/>
+        </w:rPr>
+        <w:t xml:space="preserve">. לאחר מכן התהליך הוא דומה להוספת שיעור: קריאה לרשימת מורים הקיימת אם ישנה, והוספת המורה החדש לרשימה ב </w:t>
+      </w:r>
+      <w:r>
+        <w:t>Data Base</w:t>
+      </w:r>
+      <w:r>
+        <w:rPr>
+          <w:rFonts w:hint="cs"/>
+          <w:rtl/>
+        </w:rPr>
+        <w:t>.</w:t>
+      </w:r>
+    </w:p>
+    <w:p>
+      <w:pPr>
+        <w:rPr>
+          <w:rtl/>
+        </w:rPr>
+      </w:pPr>
+    </w:p>
+    <w:p>
+      <w:pPr>
+        <w:rPr>
+          <w:b/>
+          <w:bCs/>
+          <w:u w:val="single"/>
+          <w:rtl/>
+        </w:rPr>
+      </w:pPr>
+      <w:r>
+        <w:rPr>
+          <w:rFonts w:hint="cs"/>
+          <w:b/>
+          <w:bCs/>
+          <w:u w:val="single"/>
+          <w:rtl/>
+        </w:rPr>
+        <w:t>הוספת תלמיד חדש</w:t>
+      </w:r>
+    </w:p>
+    <w:p>
+      <w:pPr>
+        <w:rPr>
+          <w:rtl/>
+        </w:rPr>
+      </w:pPr>
+      <w:r>
+        <w:rPr>
+          <w:rFonts w:hint="cs"/>
+          <w:rtl/>
+        </w:rPr>
+        <w:t>הוספת תמיד חדש הינה דומה מאוד להוספת מורה חדש ואף כמעט זהה, וזאת משום שתלמיד יורש ממורה (יש לו את כל המאפיינים שלו) ובנוסף לכך יש לו תעודת זהות, קישור למורה ורשימת עשייה (מה שעשה עד כה מבחינת ההליכים לקבלת רישיון נהיגה).</w:t>
+      </w:r>
+      <w:r>
+        <w:rPr>
+          <w:rFonts w:ascii="David" w:hAnsi="David" w:hint="cs"/>
+          <w:rtl/>
+        </w:rPr>
+        <w:t xml:space="preserve"> </w:t>
+      </w:r>
+      <w:r>
+        <w:rPr>
+          <w:rFonts w:hint="cs"/>
+          <w:rtl/>
+        </w:rPr>
+        <w:t xml:space="preserve">התלמיד נרשם תחילה בטופס הרשמה ולאחר מכן נוסף לרשימת התלמידים ב </w:t>
+      </w:r>
+      <w:r>
+        <w:rPr>
+          <w:rFonts w:hint="cs"/>
+        </w:rPr>
+        <w:t>D</w:t>
+      </w:r>
+      <w:r>
+        <w:t>ata Base</w:t>
+      </w:r>
+      <w:r>
+        <w:rPr>
+          <w:rFonts w:hint="cs"/>
+          <w:rtl/>
+        </w:rPr>
+        <w:t>.</w:t>
+      </w:r>
+    </w:p>
+    <w:p>
+      <w:pPr>
+        <w:rPr>
+          <w:rtl/>
+        </w:rPr>
+      </w:pPr>
+    </w:p>
+    <w:p>
+      <w:pPr>
+        <w:rPr>
+          <w:b/>
+          <w:bCs/>
+          <w:u w:val="single"/>
+          <w:rtl/>
+        </w:rPr>
+      </w:pPr>
+      <w:r>
+        <w:rPr>
+          <w:rFonts w:hint="cs"/>
+          <w:b/>
+          <w:bCs/>
+          <w:u w:val="single"/>
+          <w:rtl/>
+        </w:rPr>
+        <w:t>הוספת יומן חדש</w:t>
+      </w:r>
+    </w:p>
+    <w:p>
+      <w:pPr>
+        <w:rPr>
+          <w:rtl/>
+        </w:rPr>
+      </w:pPr>
+      <w:r>
+        <w:rPr>
+          <w:rFonts w:hint="cs"/>
+          <w:rtl/>
+        </w:rPr>
+        <w:t xml:space="preserve">לכל מורה יש יומן שיעורים אשר יש בו את כל השעורים של תלמידיו. דבר זה משמש לסינון השיעורים החדשים על פי שעות העבודה של המורה ועל פי </w:t>
+      </w:r>
+      <w:r>
+        <w:rPr>
+          <w:rFonts w:hint="cs"/>
+          <w:rtl/>
+        </w:rPr>
+        <w:t>שיעורים קיימים אחרים</w:t>
+      </w:r>
+      <w:r>
+        <w:rPr>
+          <w:rFonts w:hint="cs"/>
+          <w:rtl/>
+        </w:rPr>
+        <w:t>. למשתמש אין גישה למחלקה זו, אך באמצעותה המערכת מסננת את השיעורים למורה ומסדרת אותם לכדי יומן שיעורים.</w:t>
+      </w:r>
+    </w:p>
+    <w:p>
+      <w:pPr>
+        <w:rPr>
+          <w:rtl/>
+        </w:rPr>
+      </w:pPr>
+    </w:p>
+    <w:p>
+      <w:pPr>
+        <w:rPr>
+          <w:rtl/>
+        </w:rPr>
+      </w:pPr>
+      <w:r>
+        <w:rPr>
+          <w:rFonts w:hint="cs"/>
+          <w:b/>
+          <w:bCs/>
+          <w:u w:val="single"/>
+          <w:rtl/>
+        </w:rPr>
+        <w:t>בחירת מורה</w:t>
+      </w:r>
+    </w:p>
+    <w:p>
+      <w:pPr>
+        <w:jc w:val="left"/>
+        <w:rPr>
+          <w:rFonts w:ascii="David" w:hAnsi="David"/>
+          <w:rtl/>
+        </w:rPr>
+      </w:pPr>
+      <w:r>
+        <w:rPr>
+          <w:rFonts w:ascii="David" w:hAnsi="David"/>
+          <w:rtl/>
+        </w:rPr>
+        <w:t xml:space="preserve">כאשר תלמיד נרשם, עליו לבחור מורה מבין רשימת המורים הקיימים במערכת. שלב זה הכרחי משום שבחירת המורה על ידי התלמיד עוזרת לסידור השיעורים ביומן, ולפונקציות אחרות כמו נתוני שיעורי התלמיד (למשל כמה כסף שילם) לעבוד. כאשר התלמיד בוחר מורה, ה </w:t>
+      </w:r>
+      <w:r>
+        <w:rPr>
+          <w:rFonts w:ascii="David" w:hAnsi="David"/>
+        </w:rPr>
+        <w:t>Id</w:t>
+      </w:r>
+      <w:r>
+        <w:rPr>
+          <w:rFonts w:ascii="David" w:hAnsi="David"/>
+          <w:rtl/>
+        </w:rPr>
+        <w:t xml:space="preserve"> של המורה נקשר ל </w:t>
+      </w:r>
+      <w:r>
+        <w:rPr>
+          <w:rFonts w:ascii="David" w:hAnsi="David"/>
+        </w:rPr>
+        <w:t>Id</w:t>
+      </w:r>
+      <w:r>
+        <w:rPr>
+          <w:rFonts w:ascii="David" w:hAnsi="David"/>
+          <w:rtl/>
+        </w:rPr>
+        <w:t xml:space="preserve"> אצל התלמיד ובעזרת  פונקציה ב </w:t>
+      </w:r>
+      <w:r>
+        <w:rPr>
+          <w:rFonts w:ascii="David" w:hAnsi="David"/>
+        </w:rPr>
+        <w:t>Data Base</w:t>
+      </w:r>
+      <w:r>
+        <w:rPr>
+          <w:rFonts w:ascii="David" w:hAnsi="David"/>
+          <w:rtl/>
+        </w:rPr>
+        <w:t xml:space="preserve"> אשר מחזירה מורה על פי </w:t>
+      </w:r>
+      <w:r>
+        <w:rPr>
+          <w:rFonts w:ascii="David" w:hAnsi="David"/>
+        </w:rPr>
+        <w:t>Id</w:t>
+      </w:r>
+      <w:r>
+        <w:rPr>
+          <w:rFonts w:ascii="David" w:hAnsi="David"/>
+          <w:rtl/>
+        </w:rPr>
+        <w:t xml:space="preserve"> אותו היא מקבלת, </w:t>
+      </w:r>
+      <w:r>
+        <w:rPr>
+          <w:rFonts w:ascii="David" w:hAnsi="David"/>
+          <w:rtl/>
+        </w:rPr>
+        <w:t>ישנו קישור והפונקציות עובדות.</w:t>
+      </w:r>
+    </w:p>
+    <w:p>
+      <w:pPr>
+        <w:jc w:val="left"/>
+        <w:rPr>
+          <w:rFonts w:ascii="David" w:hAnsi="David"/>
+          <w:rtl/>
+        </w:rPr>
+      </w:pPr>
+    </w:p>
+    <w:p>
+      <w:pPr>
+        <w:jc w:val="left"/>
+        <w:rPr>
+          <w:rFonts w:ascii="David" w:hAnsi="David"/>
+          <w:rtl/>
+        </w:rPr>
+      </w:pPr>
+      <w:r>
+        <w:rPr>
+          <w:rFonts w:ascii="David" w:hAnsi="David" w:hint="cs"/>
+          <w:b/>
+          <w:bCs/>
+          <w:u w:val="single"/>
+          <w:rtl/>
+        </w:rPr>
+        <w:t>רשימת השיעורים</w:t>
+      </w:r>
+    </w:p>
+    <w:p>
+      <w:pPr>
+        <w:jc w:val="left"/>
+        <w:rPr>
+          <w:rFonts w:ascii="David" w:hAnsi="David"/>
+        </w:rPr>
+      </w:pPr>
+      <w:r>
+        <w:rPr>
+          <w:rFonts w:ascii="David" w:hAnsi="David" w:hint="cs"/>
+          <w:rtl/>
+        </w:rPr>
+        <w:t xml:space="preserve">לכל תלמיד ישנה רשימה של שיעורים אותם הוסיף וקישר ליומן אצל המורה אותו בחר. במסך מיוחד להצגת הרשימה, פועלת פעולה אשר מביאה את כל השיעורים אשר שייכים לאותו תלמיד (פעולה שעובדת עם ה </w:t>
+      </w:r>
+      <w:r>
+        <w:rPr>
+          <w:rFonts w:ascii="David" w:hAnsi="David"/>
+        </w:rPr>
+        <w:t>Data Base</w:t>
+      </w:r>
+      <w:r>
+        <w:rPr>
+          <w:rFonts w:ascii="David" w:hAnsi="David" w:hint="cs"/>
+          <w:rtl/>
+        </w:rPr>
+        <w:t>)</w:t>
+      </w:r>
+    </w:p>
+    <w:p>
+      <w:pPr>
+        <w:jc w:val="left"/>
+        <w:rPr>
+          <w:rFonts w:ascii="David" w:hAnsi="David"/>
+        </w:rPr>
+      </w:pPr>
+    </w:p>
+    <w:p>
+      <w:pPr>
+        <w:jc w:val="left"/>
+        <w:rPr>
+          <w:rFonts w:ascii="David" w:hAnsi="David"/>
+          <w:b/>
+          <w:bCs/>
+          <w:u w:val="single"/>
+          <w:rtl/>
+        </w:rPr>
+      </w:pPr>
+      <w:r>
+        <w:rPr>
+          <w:rFonts w:ascii="David" w:hAnsi="David" w:hint="cs"/>
+          <w:b/>
+          <w:bCs/>
+          <w:u w:val="single"/>
+          <w:rtl/>
+        </w:rPr>
+        <w:t>סריאליזציה</w:t>
+      </w:r>
+    </w:p>
+    <w:p>
+      <w:pPr>
+        <w:jc w:val="left"/>
+        <w:rPr>
+          <w:rFonts w:ascii="David" w:hAnsi="David"/>
+          <w:rtl/>
+        </w:rPr>
+      </w:pPr>
+      <w:r>
+        <w:rPr>
+          <w:rFonts w:ascii="David" w:hAnsi="David" w:hint="cs"/>
+          <w:rtl/>
+        </w:rPr>
+        <w:t xml:space="preserve">כל אובייקט שאני רוצה להעביר אותו בין </w:t>
+      </w:r>
+      <w:r>
+        <w:rPr>
+          <w:rFonts w:ascii="David" w:hAnsi="David"/>
+        </w:rPr>
+        <w:t>Activities</w:t>
+      </w:r>
+      <w:r>
+        <w:rPr>
+          <w:rFonts w:ascii="David" w:hAnsi="David" w:hint="cs"/>
+          <w:rtl/>
+        </w:rPr>
+        <w:t xml:space="preserve"> שונים, צריך לעבור תהליך סריאליזציה אשר הופך אותו לרשימה של מספרים אשר המערכת יכולה להעביר. לאח מכן, הוא עובר את התהליך ההפוך </w:t>
+      </w:r>
+      <w:r>
+        <w:rPr>
+          <w:rFonts w:ascii="David" w:hAnsi="David"/>
           <w:rtl/>
         </w:rPr>
         <w:t>–</w:t>
@@ -5040,276 +5700,375 @@
       <w:r>
         <w:rPr>
           <w:rFonts w:ascii="David" w:hAnsi="David" w:hint="cs"/>
-          <w:sz w:val="24"/>
-          <w:rtl/>
-        </w:rPr>
-        <w:t xml:space="preserve"> תקשורת עם המורים. לכל תלמיד יש מורה אותו הוא יכול לבחור ולכל מורה ישנה רשימת תלמידים. בנוסף, כאשר תלמיד מוסיף שיעור, הוא לא רק מוסיף אלא גם קובע את השיעור אצל המורה</w:t>
-      </w:r>
-      <w:r>
-        <w:rPr>
-          <w:rFonts w:ascii="David" w:hAnsi="David" w:hint="cs"/>
-          <w:sz w:val="24"/>
-          <w:rtl/>
-        </w:rPr>
-        <w:t xml:space="preserve"> (במידת האשפר) ובכך חוסכת כאב ראש רב כמו שתיארתי קודם לכן.</w:t>
-      </w:r>
+          <w:rtl/>
+        </w:rPr>
+        <w:t xml:space="preserve"> דה-סריאליזציה, על מנת להחזיר אותו לאובייקט המקורי עם כל הנתונים שלו.</w:t>
+      </w:r>
+    </w:p>
+    <w:p>
+      <w:pPr>
+        <w:bidi w:val="0"/>
+        <w:spacing w:line="240" w:lineRule="auto"/>
+        <w:jc w:val="left"/>
+        <w:rPr>
+          <w:rFonts w:ascii="David" w:hAnsi="David"/>
+          <w:rtl/>
+        </w:rPr>
+      </w:pPr>
+      <w:r>
+        <w:rPr>
+          <w:rFonts w:ascii="David" w:hAnsi="David"/>
+          <w:rtl/>
+        </w:rPr>
+        <w:br w:type="page"/>
+      </w:r>
+    </w:p>
+    <w:p>
+      <w:pPr>
+        <w:pStyle w:val="2"/>
+        <w:spacing w:line="276" w:lineRule="auto"/>
+        <w:rPr>
+          <w:rtl/>
+        </w:rPr>
+      </w:pPr>
+      <w:bookmarkStart w:id="6" w:name="_Toc29994017"/>
+      <w:bookmarkStart w:id="7" w:name="_Toc39329409"/>
+      <w:r>
+        <w:rPr>
+          <w:rFonts w:hint="cs"/>
+          <w:rtl/>
+        </w:rPr>
+        <w:lastRenderedPageBreak/>
+        <w:t>אתגרים מרכזיים</w:t>
+      </w:r>
+      <w:bookmarkEnd w:id="6"/>
+      <w:bookmarkEnd w:id="7"/>
+    </w:p>
+    <w:p>
+      <w:pPr>
+        <w:spacing w:line="276" w:lineRule="auto"/>
+        <w:rPr>
+          <w:color w:val="0000FF"/>
+          <w:rtl/>
+        </w:rPr>
+      </w:pPr>
     </w:p>
     <w:p>
       <w:pPr>
         <w:spacing w:line="360" w:lineRule="auto"/>
         <w:jc w:val="left"/>
         <w:rPr>
-          <w:rFonts w:ascii="David" w:hAnsi="David"/>
-          <w:sz w:val="24"/>
-          <w:rtl/>
-        </w:rPr>
-      </w:pPr>
+          <w:rtl/>
+        </w:rPr>
+      </w:pPr>
+      <w:r>
+        <w:rPr>
+          <w:rFonts w:hint="cs"/>
+          <w:b/>
+          <w:bCs/>
+          <w:u w:val="single"/>
+          <w:rtl/>
+        </w:rPr>
+        <w:t>שיוך מורה לתלמיד</w:t>
+      </w:r>
     </w:p>
     <w:p>
       <w:pPr>
         <w:spacing w:line="360" w:lineRule="auto"/>
         <w:jc w:val="left"/>
         <w:rPr>
-          <w:rFonts w:ascii="David" w:hAnsi="David"/>
-          <w:sz w:val="24"/>
-        </w:rPr>
-      </w:pPr>
-      <w:r>
-        <w:rPr>
-          <w:rFonts w:ascii="David" w:hAnsi="David" w:hint="cs"/>
-          <w:sz w:val="24"/>
-          <w:rtl/>
-        </w:rPr>
-        <w:t xml:space="preserve">לכן, הפתרון אשר הפרויקט בא לתת הינו דרך מאוד קלה לסדר את שיעורי הנהיגה, פרטים עליהם, </w:t>
-      </w:r>
-      <w:r>
-        <w:rPr>
-          <w:rFonts w:ascii="David" w:hAnsi="David" w:hint="cs"/>
-          <w:sz w:val="24"/>
-          <w:rtl/>
-        </w:rPr>
-        <w:t xml:space="preserve">וקביעת שיעורי הנהיגה תוך כדי תקשורת תמידית עם המורה ויומן השיעורים שלו. עם זאת, </w:t>
-      </w:r>
-      <w:r>
-        <w:rPr>
-          <w:rFonts w:ascii="David" w:hAnsi="David" w:hint="cs"/>
-          <w:sz w:val="24"/>
-          <w:rtl/>
-        </w:rPr>
-        <w:t>ישנם פתרונות אחרים לבעיה, כגון אפליקציה למורה בלבד, שם הוא יכול לקבוע שיעורים ואז האפליקציה יכולה לשלוח הודעה לתלמיד לגבי פרטים והתראה לפני השיעור. הסיבה שלא בחרתי בפתרון זה הוא שהיכולות שלו הן מוגבלות לעומת האפליקציה הנוכחית אשר יותר כללית ובעלת אפשרויות נרחבות יותר.</w:t>
-      </w:r>
-    </w:p>
-    <w:p>
-      <w:pPr>
-        <w:spacing w:line="276" w:lineRule="auto"/>
+          <w:rtl/>
+        </w:rPr>
+      </w:pPr>
+      <w:r>
+        <w:rPr>
+          <w:rFonts w:hint="cs"/>
+          <w:rtl/>
+        </w:rPr>
+        <w:t xml:space="preserve">בהתחלה היה לי קושי בשיוך מורה לתלמיד. הסיבה לכך היא שניסיתי לתת לתלמיד מאפיין של מורה ואז פשוט להשים את המורה המבוקש אצל התלמיד. נשמע פשוט, נכון? אז זהו, שלא כל כך. העניין הוא ששל תלמיד, על פי מחלקת תלמיד, יורש ממורה. לכן, עצם העובדה שניסיתי לתת מאפיין לתלמיד של מורה אשר יורש ממורה, סיבך את המצב. הפתרון לכך הוא במקום לתת מאפיין מטיפוס מורה, נתתי מאפיין מטיפוס </w:t>
+      </w:r>
+      <w:r>
+        <w:t>int</w:t>
+      </w:r>
+      <w:r>
+        <w:rPr>
+          <w:rFonts w:hint="cs"/>
+          <w:rtl/>
+        </w:rPr>
+        <w:t xml:space="preserve"> אשר מכיל את ה </w:t>
+      </w:r>
+      <w:r>
+        <w:t>Id</w:t>
+      </w:r>
+      <w:r>
+        <w:rPr>
+          <w:rFonts w:hint="cs"/>
+          <w:rtl/>
+        </w:rPr>
+        <w:t xml:space="preserve"> של המורה, אשר ניתן לקבל רק על ידי המרה של ה </w:t>
+      </w:r>
+      <w:r>
+        <w:t>Id</w:t>
+      </w:r>
+      <w:r>
+        <w:rPr>
+          <w:rFonts w:hint="cs"/>
+          <w:rtl/>
+        </w:rPr>
+        <w:t xml:space="preserve"> של המורה </w:t>
+      </w:r>
+      <w:r>
+        <w:rPr>
+          <w:rFonts w:hint="cs"/>
+          <w:rtl/>
+        </w:rPr>
+        <w:t xml:space="preserve">וקישור שלו לרשימת המורים עצמה, והשמה של זה ל </w:t>
+      </w:r>
+      <w:r>
+        <w:t>Id</w:t>
+      </w:r>
+      <w:r>
+        <w:rPr>
+          <w:rFonts w:hint="cs"/>
+          <w:rtl/>
+        </w:rPr>
+        <w:t xml:space="preserve"> אשר נמצא אצל התלמיד.</w:t>
+      </w:r>
+    </w:p>
+    <w:p>
+      <w:pPr>
+        <w:spacing w:line="360" w:lineRule="auto"/>
         <w:jc w:val="left"/>
         <w:rPr>
-          <w:rFonts w:ascii="David" w:hAnsi="David"/>
-          <w:sz w:val="24"/>
-        </w:rPr>
-      </w:pPr>
-    </w:p>
-    <w:p>
-      <w:pPr>
-        <w:pStyle w:val="1"/>
-        <w:spacing w:line="276" w:lineRule="auto"/>
-        <w:rPr>
-          <w:rtl/>
-        </w:rPr>
-      </w:pPr>
-      <w:bookmarkStart w:id="2" w:name="_Toc29994015"/>
-      <w:bookmarkStart w:id="3" w:name="_Toc39329407"/>
-      <w:r>
-        <w:rPr>
-          <w:rFonts w:hint="cs"/>
-          <w:rtl/>
-        </w:rPr>
-        <w:lastRenderedPageBreak/>
-        <w:t xml:space="preserve">מדריך </w:t>
-      </w:r>
-      <w:r>
-        <w:rPr>
-          <w:rFonts w:hint="cs"/>
-          <w:rtl/>
-        </w:rPr>
-        <w:t>ל</w:t>
-      </w:r>
-      <w:r>
-        <w:rPr>
-          <w:rFonts w:hint="cs"/>
-          <w:rtl/>
-        </w:rPr>
-        <w:t>מתכנת</w:t>
-      </w:r>
-      <w:bookmarkEnd w:id="2"/>
-      <w:bookmarkEnd w:id="3"/>
-    </w:p>
-    <w:p>
-      <w:pPr>
-        <w:pStyle w:val="2"/>
-        <w:spacing w:line="276" w:lineRule="auto"/>
-        <w:rPr>
-          <w:rtl/>
-        </w:rPr>
-      </w:pPr>
-      <w:bookmarkStart w:id="4" w:name="_Toc29994016"/>
-      <w:bookmarkStart w:id="5" w:name="_Toc39329408"/>
-      <w:r>
-        <w:rPr>
-          <w:rFonts w:hint="cs"/>
-          <w:rtl/>
-        </w:rPr>
-        <w:t>אלגוריתמים</w:t>
-      </w:r>
-      <w:r>
-        <w:rPr>
-          <w:rFonts w:hint="cs"/>
-          <w:rtl/>
-        </w:rPr>
-        <w:t xml:space="preserve"> מרכזיים</w:t>
-      </w:r>
-      <w:bookmarkEnd w:id="4"/>
-      <w:bookmarkEnd w:id="5"/>
-    </w:p>
-    <w:p>
-      <w:pPr>
-        <w:spacing w:line="276" w:lineRule="auto"/>
-        <w:rPr>
-          <w:color w:val="0000FF"/>
-          <w:rtl/>
-        </w:rPr>
-      </w:pPr>
-      <w:r>
-        <w:rPr>
-          <w:rFonts w:hint="cs"/>
-          <w:color w:val="0000FF"/>
-          <w:rtl/>
-        </w:rPr>
-        <w:t xml:space="preserve"> </w:t>
-      </w:r>
-      <w:r>
-        <w:rPr>
-          <w:rFonts w:hint="cs"/>
-          <w:color w:val="0000FF"/>
-          <w:rtl/>
-        </w:rPr>
-        <w:t xml:space="preserve">אם יש כאלה </w:t>
-      </w:r>
-      <w:r>
-        <w:rPr>
-          <w:color w:val="0000FF"/>
-          <w:rtl/>
-        </w:rPr>
-        <w:t>–</w:t>
-      </w:r>
-      <w:r>
-        <w:rPr>
-          <w:rFonts w:hint="cs"/>
-          <w:color w:val="0000FF"/>
-          <w:rtl/>
-        </w:rPr>
-        <w:t xml:space="preserve"> אם אין אז אפשר למחוק את הסעיף הזה</w:t>
-      </w:r>
-    </w:p>
-    <w:p>
-      <w:pPr>
-        <w:pStyle w:val="2"/>
-        <w:spacing w:line="276" w:lineRule="auto"/>
-        <w:rPr>
-          <w:rtl/>
-        </w:rPr>
-      </w:pPr>
-      <w:bookmarkStart w:id="6" w:name="_Toc29994017"/>
-      <w:bookmarkStart w:id="7" w:name="_Toc39329409"/>
-      <w:r>
-        <w:rPr>
-          <w:rFonts w:hint="cs"/>
-          <w:rtl/>
-        </w:rPr>
-        <w:t>אתגרים מרכזיים</w:t>
-      </w:r>
-      <w:bookmarkEnd w:id="6"/>
-      <w:bookmarkEnd w:id="7"/>
-    </w:p>
-    <w:p>
-      <w:pPr>
-        <w:spacing w:line="276" w:lineRule="auto"/>
-        <w:rPr>
-          <w:color w:val="0000FF"/>
-          <w:rtl/>
-        </w:rPr>
-      </w:pPr>
-      <w:r>
-        <w:rPr>
-          <w:rFonts w:hint="cs"/>
-          <w:color w:val="0000FF"/>
-          <w:rtl/>
-        </w:rPr>
-        <w:t xml:space="preserve"> </w:t>
-      </w:r>
-      <w:r>
-        <w:rPr>
-          <w:rFonts w:hint="cs"/>
-          <w:color w:val="0000FF"/>
-          <w:rtl/>
-        </w:rPr>
-        <w:t xml:space="preserve">פרטו פה את האתגרים המרכזיים איתם התמודדתם בזמן פיתוח הפרויקט (ברמת פירוט של 1-3 משפטים לכל אתגר). </w:t>
-      </w:r>
-      <w:r>
-        <w:rPr>
-          <w:rFonts w:hint="cs"/>
+          <w:rtl/>
+        </w:rPr>
+      </w:pPr>
+    </w:p>
+    <w:p>
+      <w:pPr>
+        <w:spacing w:line="360" w:lineRule="auto"/>
+        <w:jc w:val="left"/>
+        <w:rPr>
           <w:b/>
           <w:bCs/>
-          <w:color w:val="0000FF"/>
-          <w:rtl/>
-        </w:rPr>
-        <w:t xml:space="preserve">קחו בחשבון </w:t>
-      </w:r>
-      <w:r>
-        <w:rPr>
+          <w:u w:val="single"/>
+          <w:rtl/>
+        </w:rPr>
+      </w:pPr>
+      <w:r>
+        <w:rPr>
+          <w:rFonts w:hint="cs"/>
           <w:b/>
           <w:bCs/>
-          <w:color w:val="0000FF"/>
-          <w:rtl/>
-        </w:rPr>
-        <w:t>–</w:t>
-      </w:r>
-      <w:r>
-        <w:rPr>
-          <w:rFonts w:hint="cs"/>
+          <w:u w:val="single"/>
+          <w:rtl/>
+        </w:rPr>
+        <w:t xml:space="preserve">בחירה ספציפית ב </w:t>
+      </w:r>
+      <w:r>
+        <w:rPr>
           <w:b/>
           <w:bCs/>
-          <w:color w:val="0000FF"/>
-          <w:rtl/>
-        </w:rPr>
-        <w:t xml:space="preserve"> זו ההזדמנות שלכם להסביר לבוחן למה הפרויקט הוא יותר מורכב ממה שהוא נראה ממבט ראשון.</w:t>
-      </w:r>
-      <w:r>
-        <w:rPr>
-          <w:rFonts w:hint="cs"/>
+          <w:u w:val="single"/>
+        </w:rPr>
+        <w:t>Data Base</w:t>
+      </w:r>
+    </w:p>
+    <w:p>
+      <w:pPr>
+        <w:spacing w:line="360" w:lineRule="auto"/>
+        <w:jc w:val="left"/>
+      </w:pPr>
+      <w:r>
+        <w:rPr>
+          <w:rFonts w:hint="cs"/>
+          <w:rtl/>
+        </w:rPr>
+        <w:t>בכל מחלקות הרבים (</w:t>
+      </w:r>
+      <w:r>
+        <w:t>Teachers, Students, Diaries…</w:t>
+      </w:r>
+      <w:r>
+        <w:rPr>
+          <w:rFonts w:hint="cs"/>
+          <w:rtl/>
+        </w:rPr>
+        <w:t>) ישנן קריאות לרשימה כולה, אך בחלק מן המקרים ישנן גם קריאות לחלקים מסוננים של הרשימות. למשל, קריאה להבאת רק את השיעורים המשויכים לתלמיד מסוים מבין כל השיעורים, על מנת להציגם ברשימת השיעורים של התלמיד</w:t>
+      </w:r>
+      <w:r>
+        <w:rPr>
+          <w:rFonts w:hint="cs"/>
+          <w:rtl/>
+        </w:rPr>
+        <w:t xml:space="preserve">. על מנת לעשות כן, יש להשתמש </w:t>
+      </w:r>
+      <w:r>
+        <w:rPr>
+          <w:rFonts w:hint="cs"/>
+          <w:rtl/>
+        </w:rPr>
+        <w:t xml:space="preserve">במשפט </w:t>
+      </w:r>
+      <w:r>
+        <w:t>sql</w:t>
+      </w:r>
+      <w:r>
+        <w:rPr>
+          <w:rFonts w:hint="cs"/>
+          <w:rtl/>
+        </w:rPr>
+        <w:t xml:space="preserve"> השייכת ל </w:t>
+      </w:r>
+      <w:r>
+        <w:t>Data Base</w:t>
+      </w:r>
+      <w:r>
+        <w:rPr>
+          <w:rFonts w:hint="cs"/>
+          <w:rtl/>
+        </w:rPr>
+        <w:t xml:space="preserve"> בשם </w:t>
+      </w:r>
+      <w:r>
+        <w:t>SQLite</w:t>
+      </w:r>
+      <w:r>
+        <w:rPr>
+          <w:rFonts w:hint="cs"/>
+          <w:rtl/>
+        </w:rPr>
+        <w:t>. משפט שכזה הוא קשה לכתיב, במיוחד גם כשלא מבינים ויודעים לעומק את כל הדרכים המדויקות שלימו שבו, וזאת משום שאם ישנה טעות אז קשה מאוד לעלות עליה, שכן הודעת השגיאה אינה מראה באופן מדויק היכן הבעיה וכיד לפתור אותה, אם בכלל.</w:t>
+      </w:r>
+    </w:p>
+    <w:p>
+      <w:pPr>
+        <w:spacing w:line="360" w:lineRule="auto"/>
+        <w:jc w:val="left"/>
+      </w:pPr>
+    </w:p>
+    <w:p>
+      <w:pPr>
+        <w:spacing w:line="360" w:lineRule="auto"/>
+        <w:jc w:val="left"/>
+        <w:rPr>
           <w:b/>
           <w:bCs/>
-          <w:color w:val="0000FF"/>
-          <w:rtl/>
-        </w:rPr>
-        <w:t xml:space="preserve"> </w:t>
-      </w:r>
-    </w:p>
-    <w:p>
-      <w:pPr>
-        <w:spacing w:line="276" w:lineRule="auto"/>
-        <w:rPr>
-          <w:color w:val="0000FF"/>
-          <w:rtl/>
-        </w:rPr>
-      </w:pPr>
-      <w:r>
-        <w:rPr>
-          <w:rFonts w:hint="cs"/>
-          <w:color w:val="0000FF"/>
-          <w:rtl/>
-        </w:rPr>
-        <w:t>לכל אתגר כזה ציינו גם באיזה מחלקה הוא מקבל מענה.</w:t>
+          <w:u w:val="single"/>
+          <w:rtl/>
+        </w:rPr>
+      </w:pPr>
+      <w:r>
+        <w:rPr>
+          <w:rFonts w:hint="cs"/>
+          <w:b/>
+          <w:bCs/>
+          <w:u w:val="single"/>
+          <w:rtl/>
+        </w:rPr>
+        <w:t xml:space="preserve">העברה של רשימת </w:t>
+      </w:r>
+      <w:r>
+        <w:rPr>
+          <w:b/>
+          <w:bCs/>
+          <w:u w:val="single"/>
+        </w:rPr>
+        <w:t>Check Box</w:t>
+      </w:r>
+      <w:r>
+        <w:rPr>
+          <w:rFonts w:hint="cs"/>
+          <w:b/>
+          <w:bCs/>
+          <w:u w:val="single"/>
+          <w:rtl/>
+        </w:rPr>
+        <w:t xml:space="preserve"> למסך אחר</w:t>
+      </w:r>
+    </w:p>
+    <w:p>
+      <w:pPr>
+        <w:spacing w:line="360" w:lineRule="auto"/>
+        <w:jc w:val="left"/>
+        <w:rPr>
+          <w:rFonts w:hint="cs"/>
+          <w:rtl/>
+        </w:rPr>
+      </w:pPr>
+      <w:r>
+        <w:rPr>
+          <w:rFonts w:hint="cs"/>
+          <w:rtl/>
+        </w:rPr>
+        <w:t xml:space="preserve">ישנו מסך אש במסך הזה שינה רשימה של אבני דרך חשובים בהם התלמיד צריך לעבור על מנת להשיג את רישיון הנהיגה הנחשק. רשימה זו היא מעין </w:t>
+      </w:r>
+      <w:r>
+        <w:t>To Do List</w:t>
+      </w:r>
+      <w:r>
+        <w:rPr>
+          <w:rFonts w:hint="cs"/>
+          <w:rtl/>
+        </w:rPr>
+        <w:t xml:space="preserve"> המאפשרת לתלמיד למחוק את מה שעשה כמעין דרך לציין ולסדר את מצבו בתהליך. </w:t>
+      </w:r>
+      <w:r>
+        <w:rPr>
+          <w:rFonts w:hint="cs"/>
+          <w:rtl/>
+        </w:rPr>
+        <w:t xml:space="preserve">הקושי פה היה להפוך את הכל לרשימה ולהעביר אותה כמו שהיא למסך אחר. לא משנה כמה ניסיתי, לא הצלחתי להעביר את הרשימה כמו שהיא. לכן, נאלצתי להמיר את הרשימה בעזרת לולאת </w:t>
+      </w:r>
+      <w:r>
+        <w:t>for</w:t>
+      </w:r>
+      <w:r>
+        <w:rPr>
+          <w:rFonts w:hint="cs"/>
+          <w:rtl/>
+        </w:rPr>
+        <w:t xml:space="preserve"> לרשימה מטיפוס </w:t>
+      </w:r>
+      <w:r>
+        <w:t>string</w:t>
+      </w:r>
+      <w:r>
+        <w:rPr>
+          <w:rFonts w:hint="cs"/>
+          <w:rtl/>
+        </w:rPr>
+        <w:t xml:space="preserve"> מטיפוס </w:t>
+      </w:r>
+      <w:r>
+        <w:t>bool</w:t>
+      </w:r>
+      <w:r>
+        <w:rPr>
+          <w:rFonts w:hint="cs"/>
+          <w:rtl/>
+        </w:rPr>
+        <w:t xml:space="preserve"> ולאחר מכן להמיר בחזרה לטיפוס </w:t>
+      </w:r>
+      <w:r>
+        <w:t>bool</w:t>
+      </w:r>
+      <w:r>
+        <w:rPr>
+          <w:rFonts w:hint="cs"/>
+          <w:rtl/>
+        </w:rPr>
+        <w:t xml:space="preserve"> מטיפוס </w:t>
+      </w:r>
+      <w:r>
+        <w:t>string</w:t>
+      </w:r>
+      <w:r>
+        <w:rPr>
+          <w:rFonts w:hint="cs"/>
+          <w:rtl/>
+        </w:rPr>
+        <w:t>. כמובן שנאלצתי לעשות את אותו הדבר גם כשנכנסים לרשימה במידה והתלמיד כבר ערך אותה בעבר.</w:t>
       </w:r>
     </w:p>
     <w:p>
@@ -5329,7 +6088,21 @@
           <w:rtl/>
         </w:rPr>
         <w:lastRenderedPageBreak/>
-        <w:t>תכן</w:t>
+        <w:t>ת</w:t>
+      </w:r>
+      <w:r>
+        <w:rPr>
+          <w:rFonts w:hint="cs"/>
+          <w:rtl/>
+        </w:rPr>
+        <w:t>ו</w:t>
+      </w:r>
+      <w:r>
+        <w:rPr>
+          <w:rFonts w:hint="cs"/>
+          <w:rtl/>
+        </w:rPr>
+        <w:t>כן</w:t>
       </w:r>
       <w:bookmarkEnd w:id="8"/>
       <w:bookmarkEnd w:id="9"/>
@@ -7964,16 +8737,8 @@
         <w:rPr>
           <w:color w:val="0000FF"/>
         </w:rPr>
-        <w:t>Alt-</w:t>
-      </w:r>
-      <w:proofErr w:type="spellStart"/>
-      <w:r>
-        <w:rPr>
-          <w:color w:val="0000FF"/>
-        </w:rPr>
-        <w:t>PrtScn</w:t>
-      </w:r>
-      <w:proofErr w:type="spellEnd"/>
+        <w:t>Alt-PrtScn</w:t>
+      </w:r>
       <w:r>
         <w:rPr>
           <w:rFonts w:hint="cs"/>
@@ -8319,25 +9084,7 @@
           <w:color w:val="0000FF"/>
           <w:rtl/>
         </w:rPr>
-        <w:t xml:space="preserve">מחלקות </w:t>
-      </w:r>
-      <w:proofErr w:type="spellStart"/>
-      <w:r>
-        <w:rPr>
-          <w:rFonts w:hint="cs"/>
-          <w:color w:val="0000FF"/>
-          <w:rtl/>
-        </w:rPr>
-        <w:t>מפרןיקט</w:t>
-      </w:r>
-      <w:proofErr w:type="spellEnd"/>
-      <w:r>
-        <w:rPr>
-          <w:rFonts w:hint="cs"/>
-          <w:color w:val="0000FF"/>
-          <w:rtl/>
-        </w:rPr>
-        <w:t xml:space="preserve"> </w:t>
+        <w:t xml:space="preserve">מחלקות מפרןיקט </w:t>
       </w:r>
       <w:r>
         <w:rPr>
@@ -8557,12 +9304,10 @@
         </w:rPr>
       </w:pPr>
       <w:bookmarkStart w:id="22" w:name="_Toc29994021"/>
-      <w:proofErr w:type="spellStart"/>
       <w:r>
         <w:t>MainMenuActivity</w:t>
       </w:r>
       <w:bookmarkEnd w:id="22"/>
-      <w:proofErr w:type="spellEnd"/>
     </w:p>
     <w:p>
       <w:pPr>
@@ -8590,12 +9335,10 @@
         </w:rPr>
       </w:pPr>
       <w:bookmarkStart w:id="23" w:name="_Toc29994022"/>
-      <w:proofErr w:type="spellStart"/>
       <w:r>
         <w:t>GameActivity</w:t>
       </w:r>
       <w:bookmarkEnd w:id="23"/>
-      <w:proofErr w:type="spellEnd"/>
     </w:p>
     <w:p>
       <w:pPr>
@@ -8708,12 +9451,10 @@
         </w:rPr>
       </w:pPr>
       <w:bookmarkStart w:id="26" w:name="_Toc29994024"/>
-      <w:proofErr w:type="spellStart"/>
       <w:r>
         <w:t>SoundService</w:t>
       </w:r>
       <w:bookmarkEnd w:id="26"/>
-      <w:proofErr w:type="spellEnd"/>
     </w:p>
     <w:p>
       <w:pPr>
@@ -8751,14 +9492,12 @@
         </w:rPr>
         <w:t xml:space="preserve"> מופעל ע"י </w:t>
       </w:r>
-      <w:proofErr w:type="spellStart"/>
       <w:r>
         <w:rPr>
           <w:color w:val="0000FF"/>
         </w:rPr>
         <w:t>onStart</w:t>
       </w:r>
-      <w:proofErr w:type="spellEnd"/>
       <w:r>
         <w:rPr>
           <w:rFonts w:hint="cs"/>
@@ -8767,14 +9506,12 @@
         </w:rPr>
         <w:t xml:space="preserve"> ב-</w:t>
       </w:r>
-      <w:proofErr w:type="spellStart"/>
       <w:r>
         <w:rPr>
           <w:color w:val="0000FF"/>
         </w:rPr>
         <w:t>GameActivity</w:t>
       </w:r>
-      <w:proofErr w:type="spellEnd"/>
       <w:r>
         <w:rPr>
           <w:rFonts w:hint="cs"/>
@@ -8790,12 +9527,10 @@
         <w:spacing w:line="276" w:lineRule="auto"/>
       </w:pPr>
       <w:bookmarkStart w:id="27" w:name="_Toc29994025"/>
-      <w:proofErr w:type="spellStart"/>
       <w:r>
         <w:t>VibratorService</w:t>
       </w:r>
       <w:bookmarkEnd w:id="27"/>
-      <w:proofErr w:type="spellEnd"/>
     </w:p>
     <w:p>
       <w:pPr>
@@ -8813,14 +9548,12 @@
         </w:rPr>
         <w:t>שירות של המערכת, המפעיל את הרטט במכשיר. נעשה בו שימוש ב-</w:t>
       </w:r>
-      <w:proofErr w:type="spellStart"/>
       <w:r>
         <w:rPr>
           <w:color w:val="0000FF"/>
         </w:rPr>
         <w:t>GameActivity</w:t>
       </w:r>
-      <w:proofErr w:type="spellEnd"/>
       <w:r>
         <w:rPr>
           <w:rFonts w:hint="cs"/>
@@ -8986,12 +9719,10 @@
         <w:spacing w:line="276" w:lineRule="auto"/>
       </w:pPr>
       <w:bookmarkStart w:id="30" w:name="_Toc29994027"/>
-      <w:proofErr w:type="spellStart"/>
       <w:r>
         <w:t>FinalAnimationThread</w:t>
       </w:r>
       <w:bookmarkEnd w:id="30"/>
-      <w:proofErr w:type="spellEnd"/>
     </w:p>
     <w:p>
       <w:pPr>
@@ -9009,14 +9740,12 @@
         </w:rPr>
         <w:t>מנהל את האנימציה במשחק. מופעל ע"י ה-</w:t>
       </w:r>
-      <w:proofErr w:type="spellStart"/>
       <w:r>
         <w:rPr>
           <w:color w:val="0000FF"/>
         </w:rPr>
         <w:t>GameActivity</w:t>
       </w:r>
-      <w:proofErr w:type="spellEnd"/>
       <w:r>
         <w:rPr>
           <w:rFonts w:hint="cs"/>
@@ -9029,16 +9758,8 @@
         <w:rPr>
           <w:color w:val="0000FF"/>
         </w:rPr>
-        <w:t xml:space="preserve"> </w:t>
-      </w:r>
-      <w:proofErr w:type="spellStart"/>
-      <w:r>
-        <w:rPr>
-          <w:color w:val="0000FF"/>
-        </w:rPr>
-        <w:t>GameActivity</w:t>
-      </w:r>
-      <w:proofErr w:type="spellEnd"/>
+        <w:t xml:space="preserve"> GameActivity</w:t>
+      </w:r>
       <w:r>
         <w:rPr>
           <w:rFonts w:hint="cs"/>
@@ -9061,14 +9782,12 @@
         </w:rPr>
         <w:t xml:space="preserve">  הממומש ע"י המחלקה </w:t>
       </w:r>
-      <w:proofErr w:type="spellStart"/>
       <w:r>
         <w:rPr>
           <w:color w:val="0000FF"/>
         </w:rPr>
         <w:t>AnimationHandler</w:t>
       </w:r>
-      <w:proofErr w:type="spellEnd"/>
       <w:r>
         <w:rPr>
           <w:rFonts w:hint="cs"/>
@@ -9378,61 +10097,7 @@
           <w:color w:val="0000FF"/>
           <w:rtl/>
         </w:rPr>
-        <w:t xml:space="preserve"> תוכנה </w:t>
-      </w:r>
-      <w:proofErr w:type="spellStart"/>
-      <w:r>
-        <w:rPr>
-          <w:rFonts w:hint="cs"/>
-          <w:color w:val="0000FF"/>
-          <w:rtl/>
-        </w:rPr>
-        <w:t>מסויימים</w:t>
-      </w:r>
-      <w:proofErr w:type="spellEnd"/>
-      <w:r>
-        <w:rPr>
-          <w:rFonts w:hint="cs"/>
-          <w:color w:val="0000FF"/>
-          <w:rtl/>
-        </w:rPr>
-        <w:t xml:space="preserve"> ולא באחרים </w:t>
-      </w:r>
-      <w:proofErr w:type="spellStart"/>
-      <w:r>
-        <w:rPr>
-          <w:rFonts w:hint="cs"/>
-          <w:color w:val="0000FF"/>
-          <w:rtl/>
-        </w:rPr>
-        <w:t>וכו</w:t>
-      </w:r>
-      <w:proofErr w:type="spellEnd"/>
-      <w:r>
-        <w:rPr>
-          <w:rFonts w:hint="cs"/>
-          <w:color w:val="0000FF"/>
-          <w:rtl/>
-        </w:rPr>
-        <w:t xml:space="preserve">', מדוע חילקתם למחלקות בצורה זו ולא אחרת </w:t>
-      </w:r>
-      <w:proofErr w:type="spellStart"/>
-      <w:r>
-        <w:rPr>
-          <w:rFonts w:hint="cs"/>
-          <w:color w:val="0000FF"/>
-          <w:rtl/>
-        </w:rPr>
-        <w:t>וכו</w:t>
-      </w:r>
-      <w:proofErr w:type="spellEnd"/>
-      <w:r>
-        <w:rPr>
-          <w:rFonts w:hint="cs"/>
-          <w:color w:val="0000FF"/>
-          <w:rtl/>
-        </w:rPr>
-        <w:t>'.</w:t>
+        <w:t xml:space="preserve"> תוכנה מסויימים ולא באחרים וכו', מדוע חילקתם למחלקות בצורה זו ולא אחרת וכו'.</w:t>
       </w:r>
     </w:p>
     <w:p>
@@ -9635,12 +10300,10 @@
         <w:spacing w:line="276" w:lineRule="auto"/>
       </w:pPr>
       <w:bookmarkStart w:id="41" w:name="_Toc29994037"/>
-      <w:proofErr w:type="spellStart"/>
       <w:r>
         <w:t>Drawables</w:t>
       </w:r>
       <w:bookmarkEnd w:id="41"/>
-      <w:proofErr w:type="spellEnd"/>
     </w:p>
     <w:p>
       <w:pPr>
@@ -9986,7 +10649,6 @@
           <w:szCs w:val="18"/>
         </w:rPr>
       </w:pPr>
-      <w:proofErr w:type="spellStart"/>
       <w:r>
         <w:rPr>
           <w:rFonts w:ascii="Segoe UI" w:hAnsi="Segoe UI" w:cs="Segoe UI"/>
@@ -9994,17 +10656,7 @@
           <w:sz w:val="18"/>
           <w:szCs w:val="18"/>
         </w:rPr>
-        <w:t>Settings.loadUserDetailsFromText</w:t>
-      </w:r>
-      <w:proofErr w:type="spellEnd"/>
-      <w:r>
-        <w:rPr>
-          <w:rFonts w:ascii="Segoe UI" w:hAnsi="Segoe UI" w:cs="Segoe UI"/>
-          <w:color w:val="0033CC"/>
-          <w:sz w:val="18"/>
-          <w:szCs w:val="18"/>
-        </w:rPr>
-        <w:t>()</w:t>
+        <w:t>Settings.loadUserDetailsFromText()</w:t>
       </w:r>
     </w:p>
     <w:p>
@@ -10023,7 +10675,6 @@
           <w:szCs w:val="18"/>
         </w:rPr>
       </w:pPr>
-      <w:proofErr w:type="spellStart"/>
       <w:r>
         <w:rPr>
           <w:rFonts w:ascii="Segoe UI" w:hAnsi="Segoe UI" w:cs="Segoe UI"/>
@@ -10033,7 +10684,6 @@
         </w:rPr>
         <w:t>Settings.saveUserDetailsToText</w:t>
       </w:r>
-      <w:proofErr w:type="spellEnd"/>
     </w:p>
     <w:p>
       <w:pPr>
@@ -10051,7 +10701,6 @@
           <w:szCs w:val="18"/>
         </w:rPr>
       </w:pPr>
-      <w:proofErr w:type="spellStart"/>
       <w:r>
         <w:rPr>
           <w:rFonts w:ascii="Segoe UI" w:hAnsi="Segoe UI" w:cs="Segoe UI"/>
@@ -10059,17 +10708,7 @@
           <w:sz w:val="18"/>
           <w:szCs w:val="18"/>
         </w:rPr>
-        <w:t>MainActivity.isNotificationVisible</w:t>
-      </w:r>
-      <w:proofErr w:type="spellEnd"/>
-      <w:r>
-        <w:rPr>
-          <w:rFonts w:ascii="Segoe UI" w:hAnsi="Segoe UI" w:cs="Segoe UI"/>
-          <w:color w:val="0033CC"/>
-          <w:sz w:val="18"/>
-          <w:szCs w:val="18"/>
-        </w:rPr>
-        <w:t>()</w:t>
+        <w:t>MainActivity.isNotificationVisible()</w:t>
       </w:r>
       <w:r>
         <w:rPr>
@@ -10097,7 +10736,6 @@
           <w:szCs w:val="18"/>
         </w:rPr>
       </w:pPr>
-      <w:proofErr w:type="spellStart"/>
       <w:r>
         <w:rPr>
           <w:rFonts w:ascii="Segoe UI" w:hAnsi="Segoe UI" w:cs="Segoe UI"/>
@@ -10105,17 +10743,7 @@
           <w:sz w:val="18"/>
           <w:szCs w:val="18"/>
         </w:rPr>
-        <w:t>Receiver.loadUserDetailsFromText</w:t>
-      </w:r>
-      <w:proofErr w:type="spellEnd"/>
-      <w:r>
-        <w:rPr>
-          <w:rFonts w:ascii="Segoe UI" w:hAnsi="Segoe UI" w:cs="Segoe UI"/>
-          <w:color w:val="0033CC"/>
-          <w:sz w:val="18"/>
-          <w:szCs w:val="18"/>
-        </w:rPr>
-        <w:t>()</w:t>
+        <w:t>Receiver.loadUserDetailsFromText()</w:t>
       </w:r>
       <w:r>
         <w:rPr>
@@ -10206,63 +10834,7 @@
           <w:sz w:val="19"/>
           <w:szCs w:val="19"/>
         </w:rPr>
-        <w:t xml:space="preserve">["Show notification" </w:t>
-      </w:r>
-      <w:proofErr w:type="spellStart"/>
-      <w:r>
-        <w:rPr>
-          <w:rFonts w:ascii="Segoe UI" w:hAnsi="Segoe UI" w:cs="Segoe UI"/>
-          <w:b/>
-          <w:bCs/>
-          <w:i/>
-          <w:iCs/>
-          <w:color w:val="0000FF"/>
-          <w:sz w:val="19"/>
-          <w:szCs w:val="19"/>
-        </w:rPr>
-        <w:t>CheckBox</w:t>
-      </w:r>
-      <w:proofErr w:type="spellEnd"/>
-      <w:r>
-        <w:rPr>
-          <w:rFonts w:ascii="Segoe UI" w:hAnsi="Segoe UI" w:cs="Segoe UI"/>
-          <w:b/>
-          <w:bCs/>
-          <w:i/>
-          <w:iCs/>
-          <w:color w:val="0000FF"/>
-          <w:sz w:val="19"/>
-          <w:szCs w:val="19"/>
-        </w:rPr>
-        <w:t xml:space="preserve"> state as string</w:t>
-      </w:r>
-      <w:proofErr w:type="gramStart"/>
-      <w:r>
-        <w:rPr>
-          <w:rFonts w:ascii="Segoe UI" w:hAnsi="Segoe UI" w:cs="Segoe UI"/>
-          <w:b/>
-          <w:bCs/>
-          <w:i/>
-          <w:iCs/>
-          <w:color w:val="0000FF"/>
-          <w:sz w:val="19"/>
-          <w:szCs w:val="19"/>
-        </w:rPr>
-        <w:t>] ;</w:t>
-      </w:r>
-      <w:proofErr w:type="gramEnd"/>
-      <w:r>
-        <w:rPr>
-          <w:rFonts w:ascii="Segoe UI" w:hAnsi="Segoe UI" w:cs="Segoe UI"/>
-          <w:b/>
-          <w:bCs/>
-          <w:i/>
-          <w:iCs/>
-          <w:color w:val="0000FF"/>
-          <w:sz w:val="19"/>
-          <w:szCs w:val="19"/>
-        </w:rPr>
-        <w:t xml:space="preserve"> [Email Address]; [Phone Number]; [User's Name]</w:t>
+        <w:t>["Show notification" CheckBox state as string] ; [Email Address]; [Phone Number]; [User's Name]</w:t>
       </w:r>
     </w:p>
     <w:p>
@@ -10308,19 +10880,11 @@
           <w:color w:val="0000FF"/>
         </w:rPr>
       </w:pPr>
-      <w:proofErr w:type="gramStart"/>
-      <w:r>
-        <w:rPr>
-          <w:color w:val="0000FF"/>
-        </w:rPr>
-        <w:t>false ;</w:t>
-      </w:r>
-      <w:proofErr w:type="gramEnd"/>
-      <w:r>
-        <w:rPr>
-          <w:color w:val="0000FF"/>
-        </w:rPr>
-        <w:t xml:space="preserve"> </w:t>
+      <w:r>
+        <w:rPr>
+          <w:color w:val="0000FF"/>
+        </w:rPr>
+        <w:t xml:space="preserve">false ; </w:t>
       </w:r>
       <w:hyperlink r:id="rId15" w:history="1">
         <w:r>
@@ -10345,19 +10909,11 @@
           <w:color w:val="0000FF"/>
         </w:rPr>
       </w:pPr>
-      <w:proofErr w:type="gramStart"/>
-      <w:r>
-        <w:rPr>
-          <w:color w:val="0000FF"/>
-        </w:rPr>
-        <w:t>true ;</w:t>
-      </w:r>
-      <w:proofErr w:type="gramEnd"/>
-      <w:r>
-        <w:rPr>
-          <w:color w:val="0000FF"/>
-        </w:rPr>
-        <w:t xml:space="preserve"> </w:t>
+      <w:r>
+        <w:rPr>
+          <w:color w:val="0000FF"/>
+        </w:rPr>
+        <w:t xml:space="preserve">true ; </w:t>
       </w:r>
       <w:hyperlink r:id="rId16" w:history="1">
         <w:r>
@@ -11053,7 +11609,6 @@
                 <w:sz w:val="24"/>
               </w:rPr>
             </w:pPr>
-            <w:proofErr w:type="spellStart"/>
             <w:r>
               <w:rPr>
                 <w:color w:val="0000FF"/>
@@ -11061,7 +11616,6 @@
               </w:rPr>
               <w:t>CityNo</w:t>
             </w:r>
-            <w:proofErr w:type="spellEnd"/>
           </w:p>
         </w:tc>
         <w:tc>
@@ -11185,7 +11739,6 @@
                 <w:sz w:val="24"/>
               </w:rPr>
             </w:pPr>
-            <w:proofErr w:type="spellStart"/>
             <w:r>
               <w:rPr>
                 <w:color w:val="0000FF"/>
@@ -11193,7 +11746,6 @@
               </w:rPr>
               <w:t>BirthDate</w:t>
             </w:r>
-            <w:proofErr w:type="spellEnd"/>
           </w:p>
         </w:tc>
         <w:tc>
@@ -11208,7 +11760,6 @@
                 <w:sz w:val="24"/>
               </w:rPr>
             </w:pPr>
-            <w:proofErr w:type="spellStart"/>
             <w:r>
               <w:rPr>
                 <w:color w:val="0000FF"/>
@@ -11216,7 +11767,6 @@
               </w:rPr>
               <w:t>DateTime</w:t>
             </w:r>
-            <w:proofErr w:type="spellEnd"/>
           </w:p>
         </w:tc>
         <w:tc>
@@ -11568,23 +12118,13 @@
         </w:rPr>
         <w:t xml:space="preserve">צורך היא עונה </w:t>
       </w:r>
-      <w:proofErr w:type="spellStart"/>
-      <w:r>
-        <w:rPr>
-          <w:rFonts w:hint="cs"/>
-          <w:color w:val="0000FF"/>
-          <w:rtl/>
-        </w:rPr>
-        <w:t>וכו</w:t>
-      </w:r>
-      <w:proofErr w:type="spellEnd"/>
-      <w:r>
-        <w:rPr>
-          <w:rFonts w:hint="cs"/>
-          <w:color w:val="0000FF"/>
-          <w:rtl/>
-        </w:rPr>
-        <w:t>'.</w:t>
+      <w:r>
+        <w:rPr>
+          <w:rFonts w:hint="cs"/>
+          <w:color w:val="0000FF"/>
+          <w:rtl/>
+        </w:rPr>
+        <w:t>וכו'.</w:t>
       </w:r>
     </w:p>
     <w:p>
@@ -11624,23 +12164,13 @@
         </w:rPr>
         <w:t xml:space="preserve">copy-paste </w:t>
       </w:r>
-      <w:proofErr w:type="spellStart"/>
-      <w:r>
-        <w:rPr>
-          <w:rFonts w:hint="cs"/>
-          <w:color w:val="0000FF"/>
-          <w:rtl/>
-        </w:rPr>
-        <w:t>מויקיפדיה</w:t>
-      </w:r>
-      <w:proofErr w:type="spellEnd"/>
-      <w:r>
-        <w:rPr>
-          <w:rFonts w:hint="cs"/>
-          <w:color w:val="0000FF"/>
-          <w:rtl/>
-        </w:rPr>
-        <w:t xml:space="preserve"> או מאתר כלשהו).</w:t>
+      <w:r>
+        <w:rPr>
+          <w:rFonts w:hint="cs"/>
+          <w:color w:val="0000FF"/>
+          <w:rtl/>
+        </w:rPr>
+        <w:t>מויקיפדיה או מאתר כלשהו).</w:t>
       </w:r>
     </w:p>
     <w:p>
@@ -11767,43 +12297,7 @@
           <w:color w:val="0000FF"/>
           <w:rtl/>
         </w:rPr>
-        <w:t>הצגה גרפית של לוח המשחק דו-</w:t>
-      </w:r>
-      <w:proofErr w:type="spellStart"/>
-      <w:r>
-        <w:rPr>
-          <w:rFonts w:hint="cs"/>
-          <w:color w:val="0000FF"/>
-          <w:rtl/>
-        </w:rPr>
-        <w:t>מימדית</w:t>
-      </w:r>
-      <w:proofErr w:type="spellEnd"/>
-      <w:r>
-        <w:rPr>
-          <w:rFonts w:hint="cs"/>
-          <w:color w:val="0000FF"/>
-          <w:rtl/>
-        </w:rPr>
-        <w:t xml:space="preserve"> ותלת-</w:t>
-      </w:r>
-      <w:proofErr w:type="spellStart"/>
-      <w:r>
-        <w:rPr>
-          <w:rFonts w:hint="cs"/>
-          <w:color w:val="0000FF"/>
-          <w:rtl/>
-        </w:rPr>
-        <w:t>מימדית</w:t>
-      </w:r>
-      <w:proofErr w:type="spellEnd"/>
-      <w:r>
-        <w:rPr>
-          <w:rFonts w:hint="cs"/>
-          <w:color w:val="0000FF"/>
-          <w:rtl/>
-        </w:rPr>
-        <w:t xml:space="preserve"> מנקודת המבט של השחקן.</w:t>
+        <w:t>הצגה גרפית של לוח המשחק דו-מימדית ותלת-מימדית מנקודת המבט של השחקן.</w:t>
       </w:r>
     </w:p>
     <w:p>
@@ -14700,29 +15194,7 @@
           <w:color w:val="0000FF"/>
           <w:rtl/>
         </w:rPr>
-        <w:t xml:space="preserve"> שנפתח </w:t>
-      </w:r>
-      <w:proofErr w:type="spellStart"/>
-      <w:r>
-        <w:rPr>
-          <w:rFonts w:hint="cs"/>
-          <w:b/>
-          <w:bCs/>
-          <w:color w:val="0000FF"/>
-          <w:rtl/>
-        </w:rPr>
-        <w:t>וכו</w:t>
-      </w:r>
-      <w:proofErr w:type="spellEnd"/>
-      <w:r>
-        <w:rPr>
-          <w:rFonts w:hint="cs"/>
-          <w:b/>
-          <w:bCs/>
-          <w:color w:val="0000FF"/>
-          <w:rtl/>
-        </w:rPr>
-        <w:t>'.</w:t>
+        <w:t xml:space="preserve"> שנפתח וכו'.</w:t>
       </w:r>
     </w:p>
     <w:p>
@@ -14748,25 +15220,7 @@
           <w:color w:val="0000FF"/>
           <w:rtl/>
         </w:rPr>
-        <w:t xml:space="preserve"> ניתן להניח כי הקורא הוא </w:t>
-      </w:r>
-      <w:proofErr w:type="spellStart"/>
-      <w:r>
-        <w:rPr>
-          <w:rFonts w:hint="cs"/>
-          <w:color w:val="0000FF"/>
-          <w:rtl/>
-        </w:rPr>
-        <w:t>אינטיליגנטי</w:t>
-      </w:r>
-      <w:proofErr w:type="spellEnd"/>
-      <w:r>
-        <w:rPr>
-          <w:rFonts w:hint="cs"/>
-          <w:color w:val="0000FF"/>
-          <w:rtl/>
-        </w:rPr>
-        <w:t xml:space="preserve"> מספיק כדי לדעת לקרוא את הכתוב על הכפתורים, לכן יש צורך להרחיב רק לגבי כפתורים/אופציות בתפריט אשר אינם מובנים מאליהם או שבקוד מאחור קורים דברים שאינם טריוויאליים (למשל </w:t>
+        <w:t xml:space="preserve"> ניתן להניח כי הקורא הוא אינטיליגנטי מספיק כדי לדעת לקרוא את הכתוב על הכפתורים, לכן יש צורך להרחיב רק לגבי כפתורים/אופציות בתפריט אשר אינם מובנים מאליהם או שבקוד מאחור קורים דברים שאינם טריוויאליים (למשל </w:t>
       </w:r>
       <w:r>
         <w:rPr>
@@ -14867,14 +15321,12 @@
         </w:rPr>
         <w:t xml:space="preserve"> ב-</w:t>
       </w:r>
-      <w:proofErr w:type="spellStart"/>
       <w:r>
         <w:rPr>
           <w:color w:val="0000FF"/>
         </w:rPr>
         <w:t>onPause</w:t>
       </w:r>
-      <w:proofErr w:type="spellEnd"/>
       <w:r>
         <w:rPr>
           <w:rFonts w:hint="cs"/>
@@ -14883,14 +15335,12 @@
         </w:rPr>
         <w:t xml:space="preserve"> שומרים לקובץ את מצב המערכת, ב-</w:t>
       </w:r>
-      <w:proofErr w:type="spellStart"/>
       <w:r>
         <w:rPr>
           <w:color w:val="0000FF"/>
         </w:rPr>
         <w:t>onResume</w:t>
       </w:r>
-      <w:proofErr w:type="spellEnd"/>
       <w:r>
         <w:rPr>
           <w:rFonts w:hint="cs"/>
@@ -15032,19 +15482,11 @@
         </w:rPr>
         <w:t>אם יש תפריטים גם על פקדים (</w:t>
       </w:r>
-      <w:proofErr w:type="spellStart"/>
       <w:r>
         <w:rPr>
           <w:color w:val="FF0000"/>
         </w:rPr>
-        <w:t>Conext</w:t>
-      </w:r>
-      <w:proofErr w:type="spellEnd"/>
-      <w:r>
-        <w:rPr>
-          <w:color w:val="FF0000"/>
-        </w:rPr>
-        <w:t xml:space="preserve"> menu</w:t>
+        <w:t>Conext menu</w:t>
       </w:r>
       <w:r>
         <w:rPr>
@@ -15236,14 +15678,12 @@
         </w:rPr>
         <w:t>העתיקו מה-</w:t>
       </w:r>
-      <w:proofErr w:type="spellStart"/>
       <w:r>
         <w:rPr>
           <w:color w:val="0000FF"/>
         </w:rPr>
         <w:t>AndroidManifest</w:t>
       </w:r>
-      <w:proofErr w:type="spellEnd"/>
       <w:r>
         <w:rPr>
           <w:rFonts w:hint="cs"/>
@@ -15278,22 +15718,12 @@
           <w:rtl/>
         </w:rPr>
       </w:pPr>
-      <w:proofErr w:type="spellStart"/>
-      <w:proofErr w:type="gramStart"/>
-      <w:r>
-        <w:rPr>
-          <w:color w:val="0000FF"/>
-        </w:rPr>
-        <w:t>android.permission</w:t>
-      </w:r>
-      <w:proofErr w:type="gramEnd"/>
-      <w:r>
-        <w:rPr>
-          <w:color w:val="0000FF"/>
-        </w:rPr>
-        <w:t>.VIBRATE</w:t>
-      </w:r>
-      <w:proofErr w:type="spellEnd"/>
+      <w:r>
+        <w:rPr>
+          <w:color w:val="0000FF"/>
+        </w:rPr>
+        <w:t>android.permission.VIBRATE</w:t>
+      </w:r>
       <w:r>
         <w:rPr>
           <w:rFonts w:hint="cs"/>
@@ -15404,25 +15834,7 @@
           <w:color w:val="0000FF"/>
           <w:rtl/>
         </w:rPr>
-        <w:t xml:space="preserve">, מערכת שאינה יכולה לרוץ על </w:t>
-      </w:r>
-      <w:proofErr w:type="spellStart"/>
-      <w:r>
-        <w:rPr>
-          <w:rFonts w:hint="cs"/>
-          <w:color w:val="0000FF"/>
-          <w:rtl/>
-        </w:rPr>
-        <w:t>אמולטור</w:t>
-      </w:r>
-      <w:proofErr w:type="spellEnd"/>
-      <w:r>
-        <w:rPr>
-          <w:rFonts w:hint="cs"/>
-          <w:color w:val="0000FF"/>
-          <w:rtl/>
-        </w:rPr>
-        <w:t xml:space="preserve"> אלא רק על מכשיר פיזי וכו').</w:t>
+        <w:t>, מערכת שאינה יכולה לרוץ על אמולטור אלא רק על מכשיר פיזי וכו').</w:t>
       </w:r>
     </w:p>
     <w:p>
@@ -15439,25 +15851,7 @@
           <w:color w:val="0000FF"/>
           <w:rtl/>
         </w:rPr>
-        <w:t xml:space="preserve">כמו כן יש לציין אם המערכת מצפה שיהיו קבצים </w:t>
-      </w:r>
-      <w:proofErr w:type="spellStart"/>
-      <w:r>
-        <w:rPr>
-          <w:rFonts w:hint="cs"/>
-          <w:color w:val="0000FF"/>
-          <w:rtl/>
-        </w:rPr>
-        <w:t>מסויימים</w:t>
-      </w:r>
-      <w:proofErr w:type="spellEnd"/>
-      <w:r>
-        <w:rPr>
-          <w:rFonts w:hint="cs"/>
-          <w:color w:val="0000FF"/>
-          <w:rtl/>
-        </w:rPr>
-        <w:t xml:space="preserve"> על המכשיר (תמונות,</w:t>
+        <w:t>כמו כן יש לציין אם המערכת מצפה שיהיו קבצים מסויימים על המכשיר (תמונות,</w:t>
       </w:r>
       <w:r>
         <w:rPr>
@@ -15471,25 +15865,7 @@
           <w:color w:val="0000FF"/>
           <w:rtl/>
         </w:rPr>
-        <w:t xml:space="preserve"> מוסיקה, וידאו) </w:t>
-      </w:r>
-      <w:proofErr w:type="spellStart"/>
-      <w:r>
-        <w:rPr>
-          <w:rFonts w:hint="cs"/>
-          <w:color w:val="0000FF"/>
-          <w:rtl/>
-        </w:rPr>
-        <w:t>וכו</w:t>
-      </w:r>
-      <w:proofErr w:type="spellEnd"/>
-      <w:r>
-        <w:rPr>
-          <w:rFonts w:hint="cs"/>
-          <w:color w:val="0000FF"/>
-          <w:rtl/>
-        </w:rPr>
-        <w:t>'. עקרונית עדיף לדאוג לספק 2-3 קבצי דוגמא בתוך ה-</w:t>
+        <w:t xml:space="preserve"> מוסיקה, וידאו) וכו'. עקרונית עדיף לדאוג לספק 2-3 קבצי דוגמא בתוך ה-</w:t>
       </w:r>
       <w:r>
         <w:rPr>
@@ -15515,21 +15891,12 @@
         </w:rPr>
       </w:pPr>
       <w:bookmarkStart w:id="70" w:name="_Toc29994013"/>
-      <w:proofErr w:type="spellStart"/>
-      <w:r>
-        <w:rPr>
-          <w:rFonts w:hint="cs"/>
-          <w:rtl/>
-        </w:rPr>
-        <w:t>גירסת</w:t>
-      </w:r>
-      <w:proofErr w:type="spellEnd"/>
-      <w:r>
-        <w:rPr>
-          <w:rFonts w:hint="cs"/>
-          <w:rtl/>
-        </w:rPr>
-        <w:t xml:space="preserve"> </w:t>
+      <w:r>
+        <w:rPr>
+          <w:rFonts w:hint="cs"/>
+          <w:rtl/>
+        </w:rPr>
+        <w:t xml:space="preserve">גירסת </w:t>
       </w:r>
       <w:r>
         <w:t>Android</w:t>
@@ -15557,25 +15924,7 @@
           <w:color w:val="0000FF"/>
           <w:rtl/>
         </w:rPr>
-        <w:t xml:space="preserve">מהי </w:t>
-      </w:r>
-      <w:proofErr w:type="spellStart"/>
-      <w:r>
-        <w:rPr>
-          <w:rFonts w:hint="cs"/>
-          <w:color w:val="0000FF"/>
-          <w:rtl/>
-        </w:rPr>
-        <w:t>גירסת</w:t>
-      </w:r>
-      <w:proofErr w:type="spellEnd"/>
-      <w:r>
-        <w:rPr>
-          <w:rFonts w:hint="cs"/>
-          <w:color w:val="0000FF"/>
-          <w:rtl/>
-        </w:rPr>
-        <w:t xml:space="preserve"> </w:t>
+        <w:t xml:space="preserve">מהי גירסת </w:t>
       </w:r>
       <w:r>
         <w:rPr>
@@ -15620,25 +15969,7 @@
           <w:color w:val="0000FF"/>
           <w:rtl/>
         </w:rPr>
-        <w:t xml:space="preserve"> </w:t>
-      </w:r>
-      <w:proofErr w:type="spellStart"/>
-      <w:r>
-        <w:rPr>
-          <w:rFonts w:hint="cs"/>
-          <w:color w:val="0000FF"/>
-          <w:rtl/>
-        </w:rPr>
-        <w:t>גירסת</w:t>
-      </w:r>
-      <w:proofErr w:type="spellEnd"/>
-      <w:r>
-        <w:rPr>
-          <w:rFonts w:hint="cs"/>
-          <w:color w:val="0000FF"/>
-          <w:rtl/>
-        </w:rPr>
-        <w:t xml:space="preserve"> </w:t>
+        <w:t xml:space="preserve"> גירסת </w:t>
       </w:r>
       <w:r>
         <w:rPr>
@@ -15687,25 +16018,7 @@
           <w:color w:val="0000FF"/>
           <w:rtl/>
         </w:rPr>
-        <w:t xml:space="preserve">ציינו על איזה מכשירים / </w:t>
-      </w:r>
-      <w:proofErr w:type="spellStart"/>
-      <w:r>
-        <w:rPr>
-          <w:rFonts w:hint="cs"/>
-          <w:color w:val="0000FF"/>
-          <w:rtl/>
-        </w:rPr>
-        <w:t>אמולטורים</w:t>
-      </w:r>
-      <w:proofErr w:type="spellEnd"/>
-      <w:r>
-        <w:rPr>
-          <w:rFonts w:hint="cs"/>
-          <w:color w:val="0000FF"/>
-          <w:rtl/>
-        </w:rPr>
-        <w:t xml:space="preserve"> נבדקה המערכת.</w:t>
+        <w:t>ציינו על איזה מכשירים / אמולטורים נבדקה המערכת.</w:t>
       </w:r>
     </w:p>
     <w:p>
@@ -15761,32 +16074,20 @@
           <w:rtl/>
         </w:rPr>
       </w:pPr>
-      <w:proofErr w:type="spellStart"/>
-      <w:r>
-        <w:rPr>
-          <w:rFonts w:hint="cs"/>
-          <w:color w:val="0000FF"/>
-          <w:rtl/>
-        </w:rPr>
-        <w:t>אמולטור</w:t>
-      </w:r>
-      <w:proofErr w:type="spellEnd"/>
-      <w:r>
-        <w:rPr>
-          <w:rFonts w:hint="cs"/>
-          <w:color w:val="0000FF"/>
-          <w:rtl/>
-        </w:rPr>
-        <w:t xml:space="preserve"> </w:t>
-      </w:r>
-      <w:proofErr w:type="spellStart"/>
+      <w:r>
+        <w:rPr>
+          <w:rFonts w:hint="cs"/>
+          <w:color w:val="0000FF"/>
+          <w:rtl/>
+        </w:rPr>
+        <w:t xml:space="preserve">אמולטור </w:t>
+      </w:r>
       <w:r>
         <w:rPr>
           <w:color w:val="0000FF"/>
         </w:rPr>
         <w:t>GennyMotion</w:t>
       </w:r>
-      <w:proofErr w:type="spellEnd"/>
       <w:r>
         <w:rPr>
           <w:rFonts w:hint="cs"/>
@@ -15821,25 +16122,7 @@
           <w:color w:val="0000FF"/>
           <w:rtl/>
         </w:rPr>
-        <w:t xml:space="preserve"> </w:t>
-      </w:r>
-      <w:proofErr w:type="spellStart"/>
-      <w:r>
-        <w:rPr>
-          <w:rFonts w:hint="cs"/>
-          <w:color w:val="0000FF"/>
-          <w:rtl/>
-        </w:rPr>
-        <w:t>גירסת</w:t>
-      </w:r>
-      <w:proofErr w:type="spellEnd"/>
-      <w:r>
-        <w:rPr>
-          <w:rFonts w:hint="cs"/>
-          <w:color w:val="0000FF"/>
-          <w:rtl/>
-        </w:rPr>
-        <w:t xml:space="preserve"> </w:t>
+        <w:t xml:space="preserve"> גירסת </w:t>
       </w:r>
       <w:r>
         <w:rPr>
@@ -16217,7 +16500,6 @@
         </w:rPr>
       </w:pPr>
       <w:bookmarkStart w:id="73" w:name="_Toc39329438"/>
-      <w:proofErr w:type="spellStart"/>
       <w:r>
         <w:rPr>
           <w:rFonts w:hint="cs"/>
@@ -16226,7 +16508,6 @@
         <w:t>ביבליוגראפיה</w:t>
       </w:r>
       <w:bookmarkEnd w:id="73"/>
-      <w:proofErr w:type="spellEnd"/>
     </w:p>
     <w:p>
       <w:pPr>
@@ -16426,25 +16707,7 @@
           <w:color w:val="0000FF"/>
           <w:rtl/>
         </w:rPr>
-        <w:t xml:space="preserve">כאן עליכם להעתיק את קוד </w:t>
-      </w:r>
-      <w:proofErr w:type="spellStart"/>
-      <w:r>
-        <w:rPr>
-          <w:rFonts w:hint="cs"/>
-          <w:color w:val="0000FF"/>
-          <w:rtl/>
-        </w:rPr>
-        <w:t>התכנית</w:t>
-      </w:r>
-      <w:proofErr w:type="spellEnd"/>
-      <w:r>
-        <w:rPr>
-          <w:rFonts w:hint="cs"/>
-          <w:color w:val="0000FF"/>
-          <w:rtl/>
-        </w:rPr>
-        <w:t>.</w:t>
+        <w:t>כאן עליכם להעתיק את קוד התכנית.</w:t>
       </w:r>
     </w:p>
     <w:p>
@@ -18838,6 +19101,7 @@
     <w:lsdException w:name="HTML Sample" w:semiHidden="1" w:unhideWhenUsed="1"/>
     <w:lsdException w:name="HTML Typewriter" w:semiHidden="1" w:unhideWhenUsed="1"/>
     <w:lsdException w:name="HTML Variable" w:semiHidden="1" w:unhideWhenUsed="1"/>
+    <w:lsdException w:name="Normal Table" w:semiHidden="1" w:unhideWhenUsed="1"/>
     <w:lsdException w:name="annotation subject" w:semiHidden="1" w:unhideWhenUsed="1"/>
     <w:lsdException w:name="No List" w:semiHidden="1" w:unhideWhenUsed="1"/>
     <w:lsdException w:name="Outline List 1" w:semiHidden="1" w:unhideWhenUsed="1"/>
@@ -18880,8 +19144,11 @@
     <w:lsdException w:name="Table Contemporary" w:semiHidden="1" w:unhideWhenUsed="1"/>
     <w:lsdException w:name="Table Elegant" w:semiHidden="1" w:unhideWhenUsed="1"/>
     <w:lsdException w:name="Table Professional" w:semiHidden="1" w:unhideWhenUsed="1"/>
+    <w:lsdException w:name="Table Subtle 1" w:semiHidden="1" w:unhideWhenUsed="1"/>
     <w:lsdException w:name="Table Subtle 2" w:semiHidden="1" w:unhideWhenUsed="1"/>
     <w:lsdException w:name="Table Web 1" w:semiHidden="1" w:unhideWhenUsed="1"/>
+    <w:lsdException w:name="Table Web 2" w:semiHidden="1" w:unhideWhenUsed="1"/>
+    <w:lsdException w:name="Table Web 3" w:semiHidden="1" w:unhideWhenUsed="1"/>
     <w:lsdException w:name="Balloon Text" w:semiHidden="1" w:unhideWhenUsed="1"/>
     <w:lsdException w:name="Table Theme" w:semiHidden="1" w:unhideWhenUsed="1"/>
     <w:lsdException w:name="Placeholder Text" w:semiHidden="1" w:uiPriority="99"/>
@@ -23874,7 +24141,7 @@
 </file>
 
 <file path=customXml/itemProps1.xml><?xml version="1.0" encoding="utf-8"?>
-<ds:datastoreItem xmlns:ds="http://schemas.openxmlformats.org/officeDocument/2006/customXml" ds:itemID="{FAB1F3F3-842E-4C72-8637-CE4E3AA11F15}">
+<ds:datastoreItem xmlns:ds="http://schemas.openxmlformats.org/officeDocument/2006/customXml" ds:itemID="{7272F692-3AF2-4AF8-BACF-1CA518EAD639}">
   <ds:schemaRefs>
     <ds:schemaRef ds:uri="http://schemas.openxmlformats.org/officeDocument/2006/bibliography"/>
   </ds:schemaRefs>

</xml_diff>

<commit_message>
Explained more about the Layouts and the Menus
</commit_message>
<xml_diff>
--- a/Driving Lessons Manager.docx
+++ b/Driving Lessons Manager.docx
@@ -6783,7 +6783,7 @@
           </mc:Choice>
           <mc:Fallback>
             <w:pict>
-              <v:rect w14:anchorId="53350FD1" id=" 59" o:spid="_x0000_s1026" style="position:absolute;margin-left:69.75pt;margin-top:13.95pt;width:311.5pt;height:458.25pt;z-index:251662848;visibility:visible;mso-wrap-style:square;mso-width-percent:0;mso-height-percent:0;mso-wrap-distance-left:9pt;mso-wrap-distance-top:0;mso-wrap-distance-right:9pt;mso-wrap-distance-bottom:0;mso-position-horizontal:absolute;mso-position-horizontal-relative:text;mso-position-vertical:absolute;mso-position-vertical-relative:text;mso-width-percent:0;mso-height-percent:0;mso-width-relative:page;mso-height-relative:page;v-text-anchor:top" o:gfxdata="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">
+              <v:rect w14:anchorId="21FE3985" id=" 59" o:spid="_x0000_s1026" style="position:absolute;margin-left:69.75pt;margin-top:13.95pt;width:311.5pt;height:458.25pt;z-index:251662848;visibility:visible;mso-wrap-style:square;mso-width-percent:0;mso-height-percent:0;mso-wrap-distance-left:9pt;mso-wrap-distance-top:0;mso-wrap-distance-right:9pt;mso-wrap-distance-bottom:0;mso-position-horizontal:absolute;mso-position-horizontal-relative:text;mso-position-vertical:absolute;mso-position-vertical-relative:text;mso-width-percent:0;mso-height-percent:0;mso-width-relative:page;mso-height-relative:page;v-text-anchor:top" o:gfxdata="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">
                 <v:path arrowok="t"/>
               </v:rect>
             </w:pict>
@@ -7057,7 +7057,7 @@
           </mc:Choice>
           <mc:Fallback>
             <w:pict>
-              <v:shapetype w14:anchorId="6DFDE36E" id="_x0000_t32" coordsize="21600,21600" o:spt="32" o:oned="t" path="m,l21600,21600e" filled="f">
+              <v:shapetype w14:anchorId="52E5E23B" id="_x0000_t32" coordsize="21600,21600" o:spt="32" o:oned="t" path="m,l21600,21600e" filled="f">
                 <v:path arrowok="t" fillok="f" o:connecttype="none"/>
                 <o:lock v:ext="edit" shapetype="t"/>
               </v:shapetype>
@@ -7138,7 +7138,7 @@
           </mc:Choice>
           <mc:Fallback>
             <w:pict>
-              <v:shape w14:anchorId="732DCEF7" id=" 94" o:spid="_x0000_s1026" type="#_x0000_t32" style="position:absolute;margin-left:33.75pt;margin-top:165.3pt;width:117pt;height:180.75pt;z-index:251684352;visibility:visible;mso-wrap-style:square;mso-width-percent:0;mso-height-percent:0;mso-wrap-distance-left:9pt;mso-wrap-distance-top:0;mso-wrap-distance-right:9pt;mso-wrap-distance-bottom:0;mso-position-horizontal:absolute;mso-position-horizontal-relative:text;mso-position-vertical:absolute;mso-position-vertical-relative:text;mso-width-percent:0;mso-height-percent:0;mso-width-relative:page;mso-height-relative:page" o:gfxdata="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" strokeweight="1.5pt">
+              <v:shape w14:anchorId="056167F9" id=" 94" o:spid="_x0000_s1026" type="#_x0000_t32" style="position:absolute;margin-left:33.75pt;margin-top:165.3pt;width:117pt;height:180.75pt;z-index:251684352;visibility:visible;mso-wrap-style:square;mso-width-percent:0;mso-height-percent:0;mso-wrap-distance-left:9pt;mso-wrap-distance-top:0;mso-wrap-distance-right:9pt;mso-wrap-distance-bottom:0;mso-position-horizontal:absolute;mso-position-horizontal-relative:text;mso-position-vertical:absolute;mso-position-vertical-relative:text;mso-width-percent:0;mso-height-percent:0;mso-width-relative:page;mso-height-relative:page" o:gfxdata="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" strokeweight="1.5pt">
                 <o:lock v:ext="edit" shapetype="f"/>
               </v:shape>
             </w:pict>
@@ -7717,7 +7717,7 @@
           </mc:Choice>
           <mc:Fallback>
             <w:pict>
-              <v:shape w14:anchorId="516E5B2D" id=" 97" o:spid="_x0000_s1026" type="#_x0000_t32" style="position:absolute;margin-left:318.75pt;margin-top:121.35pt;width:92.75pt;height:153pt;flip:y;z-index:251678208;visibility:visible;mso-wrap-style:square;mso-width-percent:0;mso-height-percent:0;mso-wrap-distance-left:9pt;mso-wrap-distance-top:0;mso-wrap-distance-right:9pt;mso-wrap-distance-bottom:0;mso-position-horizontal:absolute;mso-position-horizontal-relative:text;mso-position-vertical:absolute;mso-position-vertical-relative:text;mso-width-percent:0;mso-height-percent:0;mso-width-relative:page;mso-height-relative:page" o:gfxdata="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" strokeweight="1.5pt">
+              <v:shape w14:anchorId="4022031C" id=" 97" o:spid="_x0000_s1026" type="#_x0000_t32" style="position:absolute;margin-left:318.75pt;margin-top:121.35pt;width:92.75pt;height:153pt;flip:y;z-index:251678208;visibility:visible;mso-wrap-style:square;mso-width-percent:0;mso-height-percent:0;mso-wrap-distance-left:9pt;mso-wrap-distance-top:0;mso-wrap-distance-right:9pt;mso-wrap-distance-bottom:0;mso-position-horizontal:absolute;mso-position-horizontal-relative:text;mso-position-vertical:absolute;mso-position-vertical-relative:text;mso-width-percent:0;mso-height-percent:0;mso-width-relative:page;mso-height-relative:page" o:gfxdata="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" strokeweight="1.5pt">
                 <o:lock v:ext="edit" shapetype="f"/>
               </v:shape>
             </w:pict>
@@ -7794,7 +7794,7 @@
           </mc:Choice>
           <mc:Fallback>
             <w:pict>
-              <v:shape w14:anchorId="6B3227A7" id=" 93" o:spid="_x0000_s1026" type="#_x0000_t32" style="position:absolute;margin-left:21.75pt;margin-top:93.6pt;width:135.75pt;height:45pt;flip:y;z-index:251682304;visibility:visible;mso-wrap-style:square;mso-width-percent:0;mso-height-percent:0;mso-wrap-distance-left:9pt;mso-wrap-distance-top:0;mso-wrap-distance-right:9pt;mso-wrap-distance-bottom:0;mso-position-horizontal:absolute;mso-position-horizontal-relative:text;mso-position-vertical:absolute;mso-position-vertical-relative:text;mso-width-percent:0;mso-height-percent:0;mso-width-relative:page;mso-height-relative:page" o:gfxdata="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" strokeweight="1.5pt">
+              <v:shape w14:anchorId="57F398B9" id=" 93" o:spid="_x0000_s1026" type="#_x0000_t32" style="position:absolute;margin-left:21.75pt;margin-top:93.6pt;width:135.75pt;height:45pt;flip:y;z-index:251682304;visibility:visible;mso-wrap-style:square;mso-width-percent:0;mso-height-percent:0;mso-wrap-distance-left:9pt;mso-wrap-distance-top:0;mso-wrap-distance-right:9pt;mso-wrap-distance-bottom:0;mso-position-horizontal:absolute;mso-position-horizontal-relative:text;mso-position-vertical:absolute;mso-position-vertical-relative:text;mso-width-percent:0;mso-height-percent:0;mso-width-relative:page;mso-height-relative:page" o:gfxdata="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" strokeweight="1.5pt">
                 <o:lock v:ext="edit" shapetype="f"/>
               </v:shape>
             </w:pict>
@@ -7871,7 +7871,7 @@
           </mc:Choice>
           <mc:Fallback>
             <w:pict>
-              <v:shape w14:anchorId="16CB3568" id=" 93" o:spid="_x0000_s1026" type="#_x0000_t32" style="position:absolute;margin-left:26.25pt;margin-top:27.6pt;width:133.25pt;height:87.75pt;flip:y;z-index:251680256;visibility:visible;mso-wrap-style:square;mso-width-percent:0;mso-height-percent:0;mso-wrap-distance-left:9pt;mso-wrap-distance-top:0;mso-wrap-distance-right:9pt;mso-wrap-distance-bottom:0;mso-position-horizontal:absolute;mso-position-horizontal-relative:text;mso-position-vertical:absolute;mso-position-vertical-relative:text;mso-width-percent:0;mso-height-percent:0;mso-width-relative:page;mso-height-relative:page" o:gfxdata="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" strokeweight="1.5pt">
+              <v:shape w14:anchorId="255EBF28" id=" 93" o:spid="_x0000_s1026" type="#_x0000_t32" style="position:absolute;margin-left:26.25pt;margin-top:27.6pt;width:133.25pt;height:87.75pt;flip:y;z-index:251680256;visibility:visible;mso-wrap-style:square;mso-width-percent:0;mso-height-percent:0;mso-wrap-distance-left:9pt;mso-wrap-distance-top:0;mso-wrap-distance-right:9pt;mso-wrap-distance-bottom:0;mso-position-horizontal:absolute;mso-position-horizontal-relative:text;mso-position-vertical:absolute;mso-position-vertical-relative:text;mso-width-percent:0;mso-height-percent:0;mso-width-relative:page;mso-height-relative:page" o:gfxdata="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" strokeweight="1.5pt">
                 <o:lock v:ext="edit" shapetype="f"/>
               </v:shape>
             </w:pict>
@@ -8425,7 +8425,7 @@
           </mc:Choice>
           <mc:Fallback>
             <w:pict>
-              <v:shape w14:anchorId="6D1495F7" id=" 93" o:spid="_x0000_s1026" type="#_x0000_t32" style="position:absolute;margin-left:21pt;margin-top:146.95pt;width:139pt;height:6.5pt;z-index:251674112;visibility:visible;mso-wrap-style:square;mso-width-percent:0;mso-height-percent:0;mso-wrap-distance-left:9pt;mso-wrap-distance-top:0;mso-wrap-distance-right:9pt;mso-wrap-distance-bottom:0;mso-position-horizontal:absolute;mso-position-horizontal-relative:text;mso-position-vertical:absolute;mso-position-vertical-relative:text;mso-width-percent:0;mso-height-percent:0;mso-width-relative:page;mso-height-relative:page" o:gfxdata="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" strokeweight="1.5pt">
+              <v:shape w14:anchorId="0F0CC1B2" id=" 93" o:spid="_x0000_s1026" type="#_x0000_t32" style="position:absolute;margin-left:21pt;margin-top:146.95pt;width:139pt;height:6.5pt;z-index:251674112;visibility:visible;mso-wrap-style:square;mso-width-percent:0;mso-height-percent:0;mso-wrap-distance-left:9pt;mso-wrap-distance-top:0;mso-wrap-distance-right:9pt;mso-wrap-distance-bottom:0;mso-position-horizontal:absolute;mso-position-horizontal-relative:text;mso-position-vertical:absolute;mso-position-vertical-relative:text;mso-width-percent:0;mso-height-percent:0;mso-width-relative:page;mso-height-relative:page" o:gfxdata="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" strokeweight="1.5pt">
                 <o:lock v:ext="edit" shapetype="f"/>
               </v:shape>
             </w:pict>
@@ -8502,7 +8502,7 @@
           </mc:Choice>
           <mc:Fallback>
             <w:pict>
-              <v:shape w14:anchorId="028D9880" id=" 94" o:spid="_x0000_s1026" type="#_x0000_t32" style="position:absolute;margin-left:21.5pt;margin-top:155.6pt;width:150.2pt;height:52.5pt;z-index:251675136;visibility:visible;mso-wrap-style:square;mso-width-percent:0;mso-height-percent:0;mso-wrap-distance-left:9pt;mso-wrap-distance-top:0;mso-wrap-distance-right:9pt;mso-wrap-distance-bottom:0;mso-position-horizontal:absolute;mso-position-horizontal-relative:text;mso-position-vertical:absolute;mso-position-vertical-relative:text;mso-width-percent:0;mso-height-percent:0;mso-width-relative:page;mso-height-relative:page" o:gfxdata="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" strokeweight="1.5pt">
+              <v:shape w14:anchorId="7AD64666" id=" 94" o:spid="_x0000_s1026" type="#_x0000_t32" style="position:absolute;margin-left:21.5pt;margin-top:155.6pt;width:150.2pt;height:52.5pt;z-index:251675136;visibility:visible;mso-wrap-style:square;mso-width-percent:0;mso-height-percent:0;mso-wrap-distance-left:9pt;mso-wrap-distance-top:0;mso-wrap-distance-right:9pt;mso-wrap-distance-bottom:0;mso-position-horizontal:absolute;mso-position-horizontal-relative:text;mso-position-vertical:absolute;mso-position-vertical-relative:text;mso-width-percent:0;mso-height-percent:0;mso-width-relative:page;mso-height-relative:page" o:gfxdata="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" strokeweight="1.5pt">
                 <o:lock v:ext="edit" shapetype="f"/>
               </v:shape>
             </w:pict>
@@ -11502,7 +11502,6 @@
         <w:jc w:val="left"/>
         <w:rPr>
           <w:rFonts w:ascii="David" w:hAnsi="David"/>
-          <w:rtl/>
         </w:rPr>
       </w:pPr>
       <w:r>
@@ -11543,47 +11542,1560 @@
     </w:p>
     <w:p>
       <w:pPr>
+        <w:pStyle w:val="4"/>
         <w:spacing w:line="276" w:lineRule="auto"/>
         <w:rPr>
-          <w:rFonts w:ascii="David" w:hAnsi="David"/>
-          <w:i/>
-          <w:iCs/>
-          <w:color w:val="0000FF"/>
-          <w:rtl/>
-        </w:rPr>
-      </w:pPr>
-      <w:r>
-        <w:rPr>
-          <w:rFonts w:ascii="David" w:hAnsi="David"/>
-          <w:i/>
-          <w:iCs/>
-          <w:color w:val="0000FF"/>
-          <w:rtl/>
-        </w:rPr>
-        <w:t xml:space="preserve">יש לפרט את ה- </w:t>
-      </w:r>
-      <w:r>
-        <w:rPr>
-          <w:rFonts w:ascii="David" w:hAnsi="David"/>
-          <w:i/>
-          <w:iCs/>
-          <w:color w:val="0000FF"/>
-        </w:rPr>
-        <w:t>resources</w:t>
-      </w:r>
-      <w:r>
-        <w:rPr>
-          <w:rFonts w:ascii="David" w:hAnsi="David"/>
-          <w:i/>
-          <w:iCs/>
-          <w:color w:val="0000FF"/>
-          <w:rtl/>
-        </w:rPr>
-        <w:t xml:space="preserve"> השונים המשמשים לפרויקט, עם הסבר (ברמה של משפט) לגבי כל אחד מהם.</w:t>
-      </w:r>
+          <w:rFonts w:ascii="David" w:hAnsi="David" w:cs="David"/>
+          <w:rtl/>
+        </w:rPr>
+      </w:pPr>
+      <w:bookmarkStart w:id="33" w:name="_Toc29994035"/>
+      <w:r>
+        <w:rPr>
+          <w:rFonts w:ascii="David" w:hAnsi="David" w:cs="David"/>
+        </w:rPr>
+        <w:t>Layouts</w:t>
+      </w:r>
+      <w:bookmarkEnd w:id="33"/>
+    </w:p>
+    <w:tbl>
+      <w:tblPr>
+        <w:tblStyle w:val="a8"/>
+        <w:bidiVisual/>
+        <w:tblW w:w="0" w:type="auto"/>
+        <w:tblLook w:val="04A0" w:firstRow="1" w:lastRow="0" w:firstColumn="1" w:lastColumn="0" w:noHBand="0" w:noVBand="1"/>
+      </w:tblPr>
+      <w:tblGrid>
+        <w:gridCol w:w="3006"/>
+        <w:gridCol w:w="3006"/>
+        <w:gridCol w:w="3007"/>
+      </w:tblGrid>
+      <w:tr>
+        <w:tc>
+          <w:tcPr>
+            <w:tcW w:w="3006" w:type="dxa"/>
+          </w:tcPr>
+          <w:p>
+            <w:pPr>
+              <w:pStyle w:val="4"/>
+              <w:spacing w:line="276" w:lineRule="auto"/>
+              <w:jc w:val="center"/>
+              <w:outlineLvl w:val="3"/>
+              <w:rPr>
+                <w:rFonts w:ascii="David" w:hAnsi="David" w:cs="David"/>
+                <w:sz w:val="24"/>
+                <w:szCs w:val="24"/>
+              </w:rPr>
+            </w:pPr>
+            <w:bookmarkStart w:id="34" w:name="_Toc29994036"/>
+            <w:r>
+              <w:rPr>
+                <w:rFonts w:ascii="David" w:hAnsi="David" w:cs="David" w:hint="cs"/>
+                <w:sz w:val="24"/>
+                <w:szCs w:val="24"/>
+                <w:rtl/>
+              </w:rPr>
+              <w:t xml:space="preserve">שם ה </w:t>
+            </w:r>
+            <w:r>
+              <w:rPr>
+                <w:rFonts w:ascii="David" w:hAnsi="David" w:cs="David"/>
+                <w:sz w:val="24"/>
+                <w:szCs w:val="24"/>
+              </w:rPr>
+              <w:t>Layout</w:t>
+            </w:r>
+          </w:p>
+        </w:tc>
+        <w:tc>
+          <w:tcPr>
+            <w:tcW w:w="3006" w:type="dxa"/>
+          </w:tcPr>
+          <w:p>
+            <w:pPr>
+              <w:pStyle w:val="4"/>
+              <w:spacing w:line="276" w:lineRule="auto"/>
+              <w:jc w:val="center"/>
+              <w:outlineLvl w:val="3"/>
+              <w:rPr>
+                <w:rFonts w:ascii="David" w:hAnsi="David" w:cs="David" w:hint="cs"/>
+                <w:sz w:val="24"/>
+                <w:szCs w:val="24"/>
+                <w:rtl/>
+              </w:rPr>
+            </w:pPr>
+            <w:r>
+              <w:rPr>
+                <w:rFonts w:ascii="David" w:hAnsi="David" w:cs="David" w:hint="cs"/>
+                <w:sz w:val="24"/>
+                <w:szCs w:val="24"/>
+                <w:rtl/>
+              </w:rPr>
+              <w:t xml:space="preserve">לאיזה </w:t>
+            </w:r>
+            <w:r>
+              <w:rPr>
+                <w:rFonts w:ascii="David" w:hAnsi="David" w:cs="David"/>
+                <w:sz w:val="24"/>
+                <w:szCs w:val="24"/>
+              </w:rPr>
+              <w:t>Activity</w:t>
+            </w:r>
+            <w:r>
+              <w:rPr>
+                <w:rFonts w:ascii="David" w:hAnsi="David" w:cs="David" w:hint="cs"/>
+                <w:sz w:val="24"/>
+                <w:szCs w:val="24"/>
+                <w:rtl/>
+              </w:rPr>
+              <w:t xml:space="preserve"> ה </w:t>
+            </w:r>
+            <w:r>
+              <w:rPr>
+                <w:rFonts w:ascii="David" w:hAnsi="David" w:cs="David"/>
+                <w:sz w:val="24"/>
+                <w:szCs w:val="24"/>
+              </w:rPr>
+              <w:t>Layout</w:t>
+            </w:r>
+            <w:r>
+              <w:rPr>
+                <w:rFonts w:ascii="David" w:hAnsi="David" w:cs="David" w:hint="cs"/>
+                <w:sz w:val="24"/>
+                <w:szCs w:val="24"/>
+                <w:rtl/>
+              </w:rPr>
+              <w:t xml:space="preserve"> שייך</w:t>
+            </w:r>
+          </w:p>
+        </w:tc>
+        <w:tc>
+          <w:tcPr>
+            <w:tcW w:w="3007" w:type="dxa"/>
+          </w:tcPr>
+          <w:p>
+            <w:pPr>
+              <w:pStyle w:val="4"/>
+              <w:spacing w:line="276" w:lineRule="auto"/>
+              <w:jc w:val="center"/>
+              <w:outlineLvl w:val="3"/>
+              <w:rPr>
+                <w:rFonts w:ascii="David" w:hAnsi="David" w:cs="David"/>
+                <w:sz w:val="24"/>
+                <w:szCs w:val="24"/>
+                <w:rtl/>
+              </w:rPr>
+            </w:pPr>
+            <w:r>
+              <w:rPr>
+                <w:rFonts w:ascii="David" w:hAnsi="David" w:cs="David" w:hint="cs"/>
+                <w:sz w:val="24"/>
+                <w:szCs w:val="24"/>
+                <w:rtl/>
+              </w:rPr>
+              <w:t>הסבר</w:t>
+            </w:r>
+          </w:p>
+        </w:tc>
+      </w:tr>
+      <w:tr>
+        <w:tc>
+          <w:tcPr>
+            <w:tcW w:w="3006" w:type="dxa"/>
+          </w:tcPr>
+          <w:p>
+            <w:pPr>
+              <w:pStyle w:val="4"/>
+              <w:spacing w:line="276" w:lineRule="auto"/>
+              <w:outlineLvl w:val="3"/>
+              <w:rPr>
+                <w:rFonts w:ascii="David" w:hAnsi="David" w:cs="David"/>
+                <w:b w:val="0"/>
+                <w:bCs w:val="0"/>
+                <w:sz w:val="24"/>
+                <w:szCs w:val="24"/>
+                <w:rtl/>
+              </w:rPr>
+            </w:pPr>
+            <w:r>
+              <w:rPr>
+                <w:rFonts w:ascii="David" w:hAnsi="David" w:cs="David"/>
+                <w:b w:val="0"/>
+                <w:bCs w:val="0"/>
+                <w:sz w:val="24"/>
+                <w:szCs w:val="24"/>
+              </w:rPr>
+              <w:t>activity_main</w:t>
+            </w:r>
+            <w:r>
+              <w:rPr>
+                <w:rFonts w:ascii="David" w:hAnsi="David" w:cs="David"/>
+                <w:b w:val="0"/>
+                <w:bCs w:val="0"/>
+                <w:sz w:val="24"/>
+                <w:szCs w:val="24"/>
+              </w:rPr>
+              <w:t>.xml</w:t>
+            </w:r>
+          </w:p>
+        </w:tc>
+        <w:tc>
+          <w:tcPr>
+            <w:tcW w:w="3006" w:type="dxa"/>
+          </w:tcPr>
+          <w:p>
+            <w:pPr>
+              <w:pStyle w:val="4"/>
+              <w:spacing w:line="276" w:lineRule="auto"/>
+              <w:outlineLvl w:val="3"/>
+              <w:rPr>
+                <w:rFonts w:ascii="David" w:hAnsi="David" w:cs="David"/>
+                <w:b w:val="0"/>
+                <w:bCs w:val="0"/>
+                <w:sz w:val="24"/>
+                <w:szCs w:val="24"/>
+              </w:rPr>
+            </w:pPr>
+            <w:r>
+              <w:rPr>
+                <w:rFonts w:ascii="David" w:hAnsi="David" w:cs="David"/>
+                <w:b w:val="0"/>
+                <w:bCs w:val="0"/>
+                <w:sz w:val="24"/>
+                <w:szCs w:val="24"/>
+              </w:rPr>
+              <w:t>MainActivity</w:t>
+            </w:r>
+            <w:r>
+              <w:rPr>
+                <w:rFonts w:ascii="David" w:hAnsi="David" w:cs="David"/>
+                <w:b w:val="0"/>
+                <w:bCs w:val="0"/>
+                <w:sz w:val="24"/>
+                <w:szCs w:val="24"/>
+              </w:rPr>
+              <w:t>.cs</w:t>
+            </w:r>
+          </w:p>
+        </w:tc>
+        <w:tc>
+          <w:tcPr>
+            <w:tcW w:w="3007" w:type="dxa"/>
+          </w:tcPr>
+          <w:p>
+            <w:pPr>
+              <w:pStyle w:val="4"/>
+              <w:spacing w:line="276" w:lineRule="auto"/>
+              <w:outlineLvl w:val="3"/>
+              <w:rPr>
+                <w:rFonts w:ascii="David" w:hAnsi="David" w:cs="David" w:hint="cs"/>
+                <w:b w:val="0"/>
+                <w:bCs w:val="0"/>
+                <w:sz w:val="24"/>
+                <w:szCs w:val="24"/>
+                <w:rtl/>
+              </w:rPr>
+            </w:pPr>
+            <w:r>
+              <w:rPr>
+                <w:rFonts w:ascii="David" w:hAnsi="David" w:cs="David" w:hint="cs"/>
+                <w:b w:val="0"/>
+                <w:bCs w:val="0"/>
+                <w:sz w:val="24"/>
+                <w:szCs w:val="24"/>
+                <w:rtl/>
+              </w:rPr>
+              <w:t>המסך הראשי בו האפליקציה מתחילה</w:t>
+            </w:r>
+          </w:p>
+        </w:tc>
+      </w:tr>
+      <w:tr>
+        <w:tc>
+          <w:tcPr>
+            <w:tcW w:w="3006" w:type="dxa"/>
+          </w:tcPr>
+          <w:p>
+            <w:pPr>
+              <w:pStyle w:val="4"/>
+              <w:spacing w:line="276" w:lineRule="auto"/>
+              <w:jc w:val="left"/>
+              <w:outlineLvl w:val="3"/>
+              <w:rPr>
+                <w:rFonts w:ascii="David" w:hAnsi="David" w:cs="David"/>
+                <w:b w:val="0"/>
+                <w:bCs w:val="0"/>
+                <w:sz w:val="24"/>
+                <w:szCs w:val="24"/>
+                <w:rtl/>
+              </w:rPr>
+            </w:pPr>
+            <w:r>
+              <w:rPr>
+                <w:rFonts w:ascii="David" w:hAnsi="David" w:cs="David" w:hint="cs"/>
+                <w:b w:val="0"/>
+                <w:bCs w:val="0"/>
+                <w:sz w:val="24"/>
+                <w:szCs w:val="24"/>
+              </w:rPr>
+              <w:t>I</w:t>
+            </w:r>
+            <w:r>
+              <w:rPr>
+                <w:rFonts w:ascii="David" w:hAnsi="David" w:cs="David"/>
+                <w:b w:val="0"/>
+                <w:bCs w:val="0"/>
+                <w:sz w:val="24"/>
+                <w:szCs w:val="24"/>
+              </w:rPr>
+              <w:t>nfo</w:t>
+            </w:r>
+            <w:r>
+              <w:rPr>
+                <w:rFonts w:ascii="David" w:hAnsi="David" w:cs="David"/>
+                <w:b w:val="0"/>
+                <w:bCs w:val="0"/>
+                <w:sz w:val="24"/>
+                <w:szCs w:val="24"/>
+              </w:rPr>
+              <w:t>.xml</w:t>
+            </w:r>
+          </w:p>
+        </w:tc>
+        <w:tc>
+          <w:tcPr>
+            <w:tcW w:w="3006" w:type="dxa"/>
+          </w:tcPr>
+          <w:p>
+            <w:pPr>
+              <w:pStyle w:val="4"/>
+              <w:spacing w:line="276" w:lineRule="auto"/>
+              <w:outlineLvl w:val="3"/>
+              <w:rPr>
+                <w:rFonts w:ascii="David" w:hAnsi="David" w:cs="David"/>
+                <w:b w:val="0"/>
+                <w:bCs w:val="0"/>
+                <w:sz w:val="24"/>
+                <w:szCs w:val="24"/>
+                <w:rtl/>
+              </w:rPr>
+            </w:pPr>
+            <w:r>
+              <w:rPr>
+                <w:rFonts w:ascii="David" w:hAnsi="David" w:cs="David"/>
+                <w:b w:val="0"/>
+                <w:bCs w:val="0"/>
+                <w:sz w:val="24"/>
+                <w:szCs w:val="24"/>
+              </w:rPr>
+              <w:t>Inf</w:t>
+            </w:r>
+            <w:r>
+              <w:rPr>
+                <w:rFonts w:ascii="David" w:hAnsi="David" w:cs="David"/>
+                <w:b w:val="0"/>
+                <w:bCs w:val="0"/>
+                <w:sz w:val="24"/>
+                <w:szCs w:val="24"/>
+              </w:rPr>
+              <w:t>o.cs</w:t>
+            </w:r>
+          </w:p>
+        </w:tc>
+        <w:tc>
+          <w:tcPr>
+            <w:tcW w:w="3007" w:type="dxa"/>
+          </w:tcPr>
+          <w:p>
+            <w:pPr>
+              <w:pStyle w:val="4"/>
+              <w:spacing w:line="276" w:lineRule="auto"/>
+              <w:outlineLvl w:val="3"/>
+              <w:rPr>
+                <w:rFonts w:ascii="David" w:hAnsi="David" w:cs="David" w:hint="cs"/>
+                <w:b w:val="0"/>
+                <w:bCs w:val="0"/>
+                <w:sz w:val="24"/>
+                <w:szCs w:val="24"/>
+                <w:rtl/>
+              </w:rPr>
+            </w:pPr>
+            <w:r>
+              <w:rPr>
+                <w:rFonts w:ascii="David" w:hAnsi="David" w:cs="David" w:hint="cs"/>
+                <w:b w:val="0"/>
+                <w:bCs w:val="0"/>
+                <w:sz w:val="24"/>
+                <w:szCs w:val="24"/>
+                <w:rtl/>
+              </w:rPr>
+              <w:t>מסך המידע על שיעורי התלמיד</w:t>
+            </w:r>
+          </w:p>
+        </w:tc>
+      </w:tr>
+      <w:tr>
+        <w:tc>
+          <w:tcPr>
+            <w:tcW w:w="3006" w:type="dxa"/>
+          </w:tcPr>
+          <w:p>
+            <w:pPr>
+              <w:pStyle w:val="4"/>
+              <w:spacing w:line="276" w:lineRule="auto"/>
+              <w:outlineLvl w:val="3"/>
+              <w:rPr>
+                <w:rFonts w:ascii="David" w:hAnsi="David" w:cs="David"/>
+                <w:b w:val="0"/>
+                <w:bCs w:val="0"/>
+                <w:sz w:val="24"/>
+                <w:szCs w:val="24"/>
+                <w:rtl/>
+              </w:rPr>
+            </w:pPr>
+            <w:r>
+              <w:rPr>
+                <w:rFonts w:ascii="David" w:hAnsi="David" w:cs="David"/>
+                <w:b w:val="0"/>
+                <w:bCs w:val="0"/>
+                <w:sz w:val="24"/>
+                <w:szCs w:val="24"/>
+              </w:rPr>
+              <w:t>LessonSettings.xml</w:t>
+            </w:r>
+          </w:p>
+        </w:tc>
+        <w:tc>
+          <w:tcPr>
+            <w:tcW w:w="3006" w:type="dxa"/>
+          </w:tcPr>
+          <w:p>
+            <w:pPr>
+              <w:pStyle w:val="4"/>
+              <w:spacing w:line="276" w:lineRule="auto"/>
+              <w:outlineLvl w:val="3"/>
+              <w:rPr>
+                <w:rFonts w:ascii="David" w:hAnsi="David" w:cs="David"/>
+                <w:b w:val="0"/>
+                <w:bCs w:val="0"/>
+                <w:sz w:val="24"/>
+                <w:szCs w:val="24"/>
+                <w:rtl/>
+              </w:rPr>
+            </w:pPr>
+            <w:r>
+              <w:rPr>
+                <w:rFonts w:ascii="David" w:hAnsi="David" w:cs="David"/>
+                <w:b w:val="0"/>
+                <w:bCs w:val="0"/>
+                <w:sz w:val="24"/>
+                <w:szCs w:val="24"/>
+              </w:rPr>
+              <w:t>Settings.cs</w:t>
+            </w:r>
+          </w:p>
+        </w:tc>
+        <w:tc>
+          <w:tcPr>
+            <w:tcW w:w="3007" w:type="dxa"/>
+          </w:tcPr>
+          <w:p>
+            <w:pPr>
+              <w:pStyle w:val="4"/>
+              <w:spacing w:line="276" w:lineRule="auto"/>
+              <w:outlineLvl w:val="3"/>
+              <w:rPr>
+                <w:rFonts w:ascii="David" w:hAnsi="David" w:cs="David"/>
+                <w:b w:val="0"/>
+                <w:bCs w:val="0"/>
+                <w:sz w:val="24"/>
+                <w:szCs w:val="24"/>
+                <w:rtl/>
+              </w:rPr>
+            </w:pPr>
+            <w:r>
+              <w:rPr>
+                <w:rFonts w:ascii="David" w:hAnsi="David" w:cs="David" w:hint="cs"/>
+                <w:b w:val="0"/>
+                <w:bCs w:val="0"/>
+                <w:sz w:val="24"/>
+                <w:szCs w:val="24"/>
+                <w:rtl/>
+              </w:rPr>
+              <w:t>מס</w:t>
+            </w:r>
+            <w:r>
+              <w:rPr>
+                <w:rFonts w:ascii="David" w:hAnsi="David" w:cs="David" w:hint="cs"/>
+                <w:b w:val="0"/>
+                <w:bCs w:val="0"/>
+                <w:sz w:val="24"/>
+                <w:szCs w:val="24"/>
+                <w:rtl/>
+              </w:rPr>
+              <w:t>ך</w:t>
+            </w:r>
+            <w:r>
+              <w:rPr>
+                <w:rFonts w:ascii="David" w:hAnsi="David" w:cs="David" w:hint="cs"/>
+                <w:b w:val="0"/>
+                <w:bCs w:val="0"/>
+                <w:sz w:val="24"/>
+                <w:szCs w:val="24"/>
+                <w:rtl/>
+              </w:rPr>
+              <w:t xml:space="preserve"> ההגדרות של המורה לשיעוריו</w:t>
+            </w:r>
+          </w:p>
+        </w:tc>
+      </w:tr>
+      <w:tr>
+        <w:tc>
+          <w:tcPr>
+            <w:tcW w:w="3006" w:type="dxa"/>
+          </w:tcPr>
+          <w:p>
+            <w:pPr>
+              <w:pStyle w:val="4"/>
+              <w:spacing w:line="276" w:lineRule="auto"/>
+              <w:outlineLvl w:val="3"/>
+              <w:rPr>
+                <w:rFonts w:ascii="David" w:hAnsi="David" w:cs="David"/>
+                <w:b w:val="0"/>
+                <w:bCs w:val="0"/>
+                <w:sz w:val="24"/>
+                <w:szCs w:val="24"/>
+                <w:rtl/>
+              </w:rPr>
+            </w:pPr>
+            <w:r>
+              <w:rPr>
+                <w:rFonts w:ascii="David" w:hAnsi="David" w:cs="David"/>
+                <w:b w:val="0"/>
+                <w:bCs w:val="0"/>
+                <w:sz w:val="24"/>
+                <w:szCs w:val="24"/>
+              </w:rPr>
+              <w:t>ListOfLessons.xml</w:t>
+            </w:r>
+          </w:p>
+        </w:tc>
+        <w:tc>
+          <w:tcPr>
+            <w:tcW w:w="3006" w:type="dxa"/>
+          </w:tcPr>
+          <w:p>
+            <w:pPr>
+              <w:pStyle w:val="4"/>
+              <w:spacing w:line="276" w:lineRule="auto"/>
+              <w:outlineLvl w:val="3"/>
+              <w:rPr>
+                <w:rFonts w:ascii="David" w:hAnsi="David" w:cs="David"/>
+                <w:b w:val="0"/>
+                <w:bCs w:val="0"/>
+                <w:sz w:val="24"/>
+                <w:szCs w:val="24"/>
+                <w:rtl/>
+              </w:rPr>
+            </w:pPr>
+            <w:r>
+              <w:rPr>
+                <w:rFonts w:ascii="David" w:hAnsi="David" w:cs="David"/>
+                <w:b w:val="0"/>
+                <w:bCs w:val="0"/>
+                <w:sz w:val="24"/>
+                <w:szCs w:val="24"/>
+              </w:rPr>
+              <w:t>ListOfLessons.cs</w:t>
+            </w:r>
+          </w:p>
+        </w:tc>
+        <w:tc>
+          <w:tcPr>
+            <w:tcW w:w="3007" w:type="dxa"/>
+          </w:tcPr>
+          <w:p>
+            <w:pPr>
+              <w:pStyle w:val="4"/>
+              <w:spacing w:line="276" w:lineRule="auto"/>
+              <w:outlineLvl w:val="3"/>
+              <w:rPr>
+                <w:rFonts w:ascii="David" w:hAnsi="David" w:cs="David"/>
+                <w:b w:val="0"/>
+                <w:bCs w:val="0"/>
+                <w:sz w:val="24"/>
+                <w:szCs w:val="24"/>
+                <w:rtl/>
+              </w:rPr>
+            </w:pPr>
+            <w:r>
+              <w:rPr>
+                <w:rFonts w:ascii="David" w:hAnsi="David" w:cs="David" w:hint="cs"/>
+                <w:b w:val="0"/>
+                <w:bCs w:val="0"/>
+                <w:sz w:val="24"/>
+                <w:szCs w:val="24"/>
+                <w:rtl/>
+              </w:rPr>
+              <w:t>מסך רשימת שיעורי התלמיד</w:t>
+            </w:r>
+          </w:p>
+        </w:tc>
+      </w:tr>
+      <w:tr>
+        <w:tc>
+          <w:tcPr>
+            <w:tcW w:w="3006" w:type="dxa"/>
+          </w:tcPr>
+          <w:p>
+            <w:pPr>
+              <w:pStyle w:val="4"/>
+              <w:spacing w:line="276" w:lineRule="auto"/>
+              <w:outlineLvl w:val="3"/>
+              <w:rPr>
+                <w:rFonts w:ascii="David" w:hAnsi="David" w:cs="David"/>
+                <w:b w:val="0"/>
+                <w:bCs w:val="0"/>
+                <w:sz w:val="24"/>
+                <w:szCs w:val="24"/>
+                <w:rtl/>
+              </w:rPr>
+            </w:pPr>
+            <w:r>
+              <w:rPr>
+                <w:rFonts w:ascii="David" w:hAnsi="David" w:cs="David"/>
+                <w:b w:val="0"/>
+                <w:bCs w:val="0"/>
+                <w:sz w:val="24"/>
+                <w:szCs w:val="24"/>
+              </w:rPr>
+              <w:t>ListViewOfTeachers.xml</w:t>
+            </w:r>
+          </w:p>
+        </w:tc>
+        <w:tc>
+          <w:tcPr>
+            <w:tcW w:w="3006" w:type="dxa"/>
+          </w:tcPr>
+          <w:p>
+            <w:pPr>
+              <w:pStyle w:val="4"/>
+              <w:spacing w:line="276" w:lineRule="auto"/>
+              <w:outlineLvl w:val="3"/>
+              <w:rPr>
+                <w:rFonts w:ascii="David" w:hAnsi="David" w:cs="David"/>
+                <w:b w:val="0"/>
+                <w:bCs w:val="0"/>
+                <w:sz w:val="24"/>
+                <w:szCs w:val="24"/>
+                <w:rtl/>
+              </w:rPr>
+            </w:pPr>
+            <w:r>
+              <w:rPr>
+                <w:rFonts w:ascii="David" w:hAnsi="David" w:cs="David"/>
+                <w:b w:val="0"/>
+                <w:bCs w:val="0"/>
+                <w:sz w:val="24"/>
+                <w:szCs w:val="24"/>
+              </w:rPr>
+              <w:t>PickTeacher.cs</w:t>
+            </w:r>
+          </w:p>
+        </w:tc>
+        <w:tc>
+          <w:tcPr>
+            <w:tcW w:w="3007" w:type="dxa"/>
+          </w:tcPr>
+          <w:p>
+            <w:pPr>
+              <w:pStyle w:val="4"/>
+              <w:spacing w:line="276" w:lineRule="auto"/>
+              <w:outlineLvl w:val="3"/>
+              <w:rPr>
+                <w:rFonts w:ascii="David" w:hAnsi="David" w:cs="David"/>
+                <w:b w:val="0"/>
+                <w:bCs w:val="0"/>
+                <w:sz w:val="24"/>
+                <w:szCs w:val="24"/>
+                <w:rtl/>
+              </w:rPr>
+            </w:pPr>
+            <w:r>
+              <w:rPr>
+                <w:rFonts w:ascii="David" w:hAnsi="David" w:cs="David" w:hint="cs"/>
+                <w:b w:val="0"/>
+                <w:bCs w:val="0"/>
+                <w:sz w:val="24"/>
+                <w:szCs w:val="24"/>
+                <w:rtl/>
+              </w:rPr>
+              <w:t>מסך בחירת המורה מתוך רשימה</w:t>
+            </w:r>
+          </w:p>
+        </w:tc>
+      </w:tr>
+      <w:tr>
+        <w:tc>
+          <w:tcPr>
+            <w:tcW w:w="3006" w:type="dxa"/>
+          </w:tcPr>
+          <w:p>
+            <w:pPr>
+              <w:pStyle w:val="4"/>
+              <w:spacing w:line="276" w:lineRule="auto"/>
+              <w:outlineLvl w:val="3"/>
+              <w:rPr>
+                <w:rFonts w:ascii="David" w:hAnsi="David" w:cs="David"/>
+                <w:b w:val="0"/>
+                <w:bCs w:val="0"/>
+                <w:sz w:val="24"/>
+                <w:szCs w:val="24"/>
+                <w:rtl/>
+              </w:rPr>
+            </w:pPr>
+            <w:r>
+              <w:rPr>
+                <w:rFonts w:ascii="David" w:hAnsi="David" w:cs="David"/>
+                <w:b w:val="0"/>
+                <w:bCs w:val="0"/>
+                <w:sz w:val="24"/>
+                <w:szCs w:val="24"/>
+              </w:rPr>
+              <w:t>LoginDialog.xml</w:t>
+            </w:r>
+          </w:p>
+        </w:tc>
+        <w:tc>
+          <w:tcPr>
+            <w:tcW w:w="3006" w:type="dxa"/>
+          </w:tcPr>
+          <w:p>
+            <w:pPr>
+              <w:pStyle w:val="4"/>
+              <w:spacing w:line="276" w:lineRule="auto"/>
+              <w:outlineLvl w:val="3"/>
+              <w:rPr>
+                <w:rFonts w:ascii="David" w:hAnsi="David" w:cs="David"/>
+                <w:b w:val="0"/>
+                <w:bCs w:val="0"/>
+                <w:sz w:val="24"/>
+                <w:szCs w:val="24"/>
+                <w:rtl/>
+              </w:rPr>
+            </w:pPr>
+            <w:r>
+              <w:rPr>
+                <w:rFonts w:ascii="David" w:hAnsi="David" w:cs="David"/>
+                <w:b w:val="0"/>
+                <w:bCs w:val="0"/>
+                <w:sz w:val="24"/>
+                <w:szCs w:val="24"/>
+              </w:rPr>
+              <w:t>MainActivity.cs</w:t>
+            </w:r>
+          </w:p>
+        </w:tc>
+        <w:tc>
+          <w:tcPr>
+            <w:tcW w:w="3007" w:type="dxa"/>
+          </w:tcPr>
+          <w:p>
+            <w:pPr>
+              <w:pStyle w:val="4"/>
+              <w:spacing w:line="276" w:lineRule="auto"/>
+              <w:outlineLvl w:val="3"/>
+              <w:rPr>
+                <w:rFonts w:ascii="David" w:hAnsi="David" w:cs="David"/>
+                <w:b w:val="0"/>
+                <w:bCs w:val="0"/>
+                <w:sz w:val="24"/>
+                <w:szCs w:val="24"/>
+                <w:rtl/>
+              </w:rPr>
+            </w:pPr>
+            <w:r>
+              <w:rPr>
+                <w:rFonts w:ascii="David" w:hAnsi="David" w:cs="David" w:hint="cs"/>
+                <w:b w:val="0"/>
+                <w:bCs w:val="0"/>
+                <w:sz w:val="24"/>
+                <w:szCs w:val="24"/>
+                <w:rtl/>
+              </w:rPr>
+              <w:t>מסך ההתחברות (חלון קופץ)</w:t>
+            </w:r>
+          </w:p>
+        </w:tc>
+      </w:tr>
+      <w:tr>
+        <w:tc>
+          <w:tcPr>
+            <w:tcW w:w="3006" w:type="dxa"/>
+          </w:tcPr>
+          <w:p>
+            <w:pPr>
+              <w:pStyle w:val="4"/>
+              <w:spacing w:line="276" w:lineRule="auto"/>
+              <w:outlineLvl w:val="3"/>
+              <w:rPr>
+                <w:rFonts w:ascii="David" w:hAnsi="David" w:cs="David"/>
+                <w:b w:val="0"/>
+                <w:bCs w:val="0"/>
+                <w:sz w:val="24"/>
+                <w:szCs w:val="24"/>
+                <w:rtl/>
+              </w:rPr>
+            </w:pPr>
+            <w:r>
+              <w:rPr>
+                <w:rFonts w:ascii="David" w:hAnsi="David" w:cs="David"/>
+                <w:b w:val="0"/>
+                <w:bCs w:val="0"/>
+                <w:sz w:val="24"/>
+                <w:szCs w:val="24"/>
+              </w:rPr>
+              <w:t>NewLesson.xml</w:t>
+            </w:r>
+          </w:p>
+        </w:tc>
+        <w:tc>
+          <w:tcPr>
+            <w:tcW w:w="3006" w:type="dxa"/>
+          </w:tcPr>
+          <w:p>
+            <w:pPr>
+              <w:pStyle w:val="4"/>
+              <w:spacing w:line="276" w:lineRule="auto"/>
+              <w:outlineLvl w:val="3"/>
+              <w:rPr>
+                <w:rFonts w:ascii="David" w:hAnsi="David" w:cs="David"/>
+                <w:b w:val="0"/>
+                <w:bCs w:val="0"/>
+                <w:sz w:val="24"/>
+                <w:szCs w:val="24"/>
+                <w:rtl/>
+              </w:rPr>
+            </w:pPr>
+            <w:r>
+              <w:rPr>
+                <w:rFonts w:ascii="David" w:hAnsi="David" w:cs="David"/>
+                <w:b w:val="0"/>
+                <w:bCs w:val="0"/>
+                <w:sz w:val="24"/>
+                <w:szCs w:val="24"/>
+              </w:rPr>
+              <w:t>NewLesson.cs</w:t>
+            </w:r>
+          </w:p>
+        </w:tc>
+        <w:tc>
+          <w:tcPr>
+            <w:tcW w:w="3007" w:type="dxa"/>
+          </w:tcPr>
+          <w:p>
+            <w:pPr>
+              <w:pStyle w:val="4"/>
+              <w:spacing w:line="276" w:lineRule="auto"/>
+              <w:outlineLvl w:val="3"/>
+              <w:rPr>
+                <w:rFonts w:ascii="David" w:hAnsi="David" w:cs="David"/>
+                <w:b w:val="0"/>
+                <w:bCs w:val="0"/>
+                <w:sz w:val="24"/>
+                <w:szCs w:val="24"/>
+                <w:rtl/>
+              </w:rPr>
+            </w:pPr>
+            <w:r>
+              <w:rPr>
+                <w:rFonts w:ascii="David" w:hAnsi="David" w:cs="David" w:hint="cs"/>
+                <w:b w:val="0"/>
+                <w:bCs w:val="0"/>
+                <w:sz w:val="24"/>
+                <w:szCs w:val="24"/>
+                <w:rtl/>
+              </w:rPr>
+              <w:t>מסך טופס הרשמה לשיעור חדש</w:t>
+            </w:r>
+          </w:p>
+        </w:tc>
+      </w:tr>
+      <w:tr>
+        <w:tc>
+          <w:tcPr>
+            <w:tcW w:w="3006" w:type="dxa"/>
+          </w:tcPr>
+          <w:p>
+            <w:pPr>
+              <w:pStyle w:val="4"/>
+              <w:spacing w:line="276" w:lineRule="auto"/>
+              <w:outlineLvl w:val="3"/>
+              <w:rPr>
+                <w:rFonts w:ascii="David" w:hAnsi="David" w:cs="David"/>
+                <w:b w:val="0"/>
+                <w:bCs w:val="0"/>
+                <w:sz w:val="24"/>
+                <w:szCs w:val="24"/>
+                <w:rtl/>
+              </w:rPr>
+            </w:pPr>
+            <w:r>
+              <w:rPr>
+                <w:rFonts w:ascii="David" w:hAnsi="David" w:cs="David"/>
+                <w:b w:val="0"/>
+                <w:bCs w:val="0"/>
+                <w:sz w:val="24"/>
+                <w:szCs w:val="24"/>
+              </w:rPr>
+              <w:t>OneItem.xml</w:t>
+            </w:r>
+          </w:p>
+        </w:tc>
+        <w:tc>
+          <w:tcPr>
+            <w:tcW w:w="3006" w:type="dxa"/>
+          </w:tcPr>
+          <w:p>
+            <w:pPr>
+              <w:pStyle w:val="4"/>
+              <w:spacing w:line="276" w:lineRule="auto"/>
+              <w:outlineLvl w:val="3"/>
+              <w:rPr>
+                <w:rFonts w:ascii="David" w:hAnsi="David" w:cs="David"/>
+                <w:b w:val="0"/>
+                <w:bCs w:val="0"/>
+                <w:sz w:val="24"/>
+                <w:szCs w:val="24"/>
+                <w:rtl/>
+              </w:rPr>
+            </w:pPr>
+            <w:r>
+              <w:rPr>
+                <w:rFonts w:ascii="David" w:hAnsi="David" w:cs="David"/>
+                <w:b w:val="0"/>
+                <w:bCs w:val="0"/>
+                <w:sz w:val="24"/>
+                <w:szCs w:val="24"/>
+              </w:rPr>
+              <w:t>ListOfLessons.cs</w:t>
+            </w:r>
+          </w:p>
+        </w:tc>
+        <w:tc>
+          <w:tcPr>
+            <w:tcW w:w="3007" w:type="dxa"/>
+          </w:tcPr>
+          <w:p>
+            <w:pPr>
+              <w:pStyle w:val="4"/>
+              <w:spacing w:line="276" w:lineRule="auto"/>
+              <w:outlineLvl w:val="3"/>
+              <w:rPr>
+                <w:rFonts w:ascii="David" w:hAnsi="David" w:cs="David"/>
+                <w:b w:val="0"/>
+                <w:bCs w:val="0"/>
+                <w:sz w:val="24"/>
+                <w:szCs w:val="24"/>
+                <w:rtl/>
+              </w:rPr>
+            </w:pPr>
+            <w:r>
+              <w:rPr>
+                <w:rFonts w:ascii="David" w:hAnsi="David" w:cs="David" w:hint="cs"/>
+                <w:b w:val="0"/>
+                <w:bCs w:val="0"/>
+                <w:sz w:val="24"/>
+                <w:szCs w:val="24"/>
+                <w:rtl/>
+              </w:rPr>
+              <w:t>מסך המייצג איבר אחד ברשימת שיעורי התלמיד</w:t>
+            </w:r>
+          </w:p>
+        </w:tc>
+      </w:tr>
+      <w:tr>
+        <w:tc>
+          <w:tcPr>
+            <w:tcW w:w="3006" w:type="dxa"/>
+          </w:tcPr>
+          <w:p>
+            <w:pPr>
+              <w:pStyle w:val="4"/>
+              <w:spacing w:line="276" w:lineRule="auto"/>
+              <w:outlineLvl w:val="3"/>
+              <w:rPr>
+                <w:rFonts w:ascii="David" w:hAnsi="David" w:cs="David"/>
+                <w:b w:val="0"/>
+                <w:bCs w:val="0"/>
+                <w:sz w:val="24"/>
+                <w:szCs w:val="24"/>
+                <w:rtl/>
+              </w:rPr>
+            </w:pPr>
+            <w:r>
+              <w:rPr>
+                <w:rFonts w:ascii="David" w:hAnsi="David" w:cs="David"/>
+                <w:b w:val="0"/>
+                <w:bCs w:val="0"/>
+                <w:sz w:val="24"/>
+                <w:szCs w:val="24"/>
+              </w:rPr>
+              <w:t>student_register.xml</w:t>
+            </w:r>
+          </w:p>
+        </w:tc>
+        <w:tc>
+          <w:tcPr>
+            <w:tcW w:w="3006" w:type="dxa"/>
+          </w:tcPr>
+          <w:p>
+            <w:pPr>
+              <w:pStyle w:val="4"/>
+              <w:spacing w:line="276" w:lineRule="auto"/>
+              <w:outlineLvl w:val="3"/>
+              <w:rPr>
+                <w:rFonts w:ascii="David" w:hAnsi="David" w:cs="David"/>
+                <w:b w:val="0"/>
+                <w:bCs w:val="0"/>
+                <w:sz w:val="24"/>
+                <w:szCs w:val="24"/>
+                <w:rtl/>
+              </w:rPr>
+            </w:pPr>
+            <w:r>
+              <w:rPr>
+                <w:rFonts w:ascii="David" w:hAnsi="David" w:cs="David"/>
+                <w:b w:val="0"/>
+                <w:bCs w:val="0"/>
+                <w:sz w:val="24"/>
+                <w:szCs w:val="24"/>
+              </w:rPr>
+              <w:t>StudentActivityRegister.cs</w:t>
+            </w:r>
+          </w:p>
+        </w:tc>
+        <w:tc>
+          <w:tcPr>
+            <w:tcW w:w="3007" w:type="dxa"/>
+          </w:tcPr>
+          <w:p>
+            <w:pPr>
+              <w:pStyle w:val="4"/>
+              <w:spacing w:line="276" w:lineRule="auto"/>
+              <w:outlineLvl w:val="3"/>
+              <w:rPr>
+                <w:rFonts w:ascii="David" w:hAnsi="David" w:cs="David"/>
+                <w:b w:val="0"/>
+                <w:bCs w:val="0"/>
+                <w:sz w:val="24"/>
+                <w:szCs w:val="24"/>
+                <w:rtl/>
+              </w:rPr>
+            </w:pPr>
+            <w:r>
+              <w:rPr>
+                <w:rFonts w:ascii="David" w:hAnsi="David" w:cs="David" w:hint="cs"/>
+                <w:b w:val="0"/>
+                <w:bCs w:val="0"/>
+                <w:sz w:val="24"/>
+                <w:szCs w:val="24"/>
+                <w:rtl/>
+              </w:rPr>
+              <w:t xml:space="preserve">מסך הרשמת </w:t>
+            </w:r>
+            <w:r>
+              <w:rPr>
+                <w:rFonts w:ascii="David" w:hAnsi="David" w:cs="David" w:hint="cs"/>
+                <w:b w:val="0"/>
+                <w:bCs w:val="0"/>
+                <w:sz w:val="24"/>
+                <w:szCs w:val="24"/>
+                <w:rtl/>
+              </w:rPr>
+              <w:t>התלמיד</w:t>
+            </w:r>
+          </w:p>
+        </w:tc>
+      </w:tr>
+      <w:tr>
+        <w:tc>
+          <w:tcPr>
+            <w:tcW w:w="3006" w:type="dxa"/>
+          </w:tcPr>
+          <w:p>
+            <w:pPr>
+              <w:pStyle w:val="4"/>
+              <w:spacing w:line="276" w:lineRule="auto"/>
+              <w:outlineLvl w:val="3"/>
+              <w:rPr>
+                <w:rFonts w:ascii="David" w:hAnsi="David" w:cs="David"/>
+                <w:b w:val="0"/>
+                <w:bCs w:val="0"/>
+                <w:sz w:val="24"/>
+                <w:szCs w:val="24"/>
+                <w:rtl/>
+              </w:rPr>
+            </w:pPr>
+            <w:r>
+              <w:rPr>
+                <w:rFonts w:ascii="David" w:hAnsi="David" w:cs="David"/>
+                <w:b w:val="0"/>
+                <w:bCs w:val="0"/>
+                <w:sz w:val="24"/>
+                <w:szCs w:val="24"/>
+              </w:rPr>
+              <w:t>StudentLayout.xml</w:t>
+            </w:r>
+          </w:p>
+        </w:tc>
+        <w:tc>
+          <w:tcPr>
+            <w:tcW w:w="3006" w:type="dxa"/>
+          </w:tcPr>
+          <w:p>
+            <w:pPr>
+              <w:pStyle w:val="4"/>
+              <w:spacing w:line="276" w:lineRule="auto"/>
+              <w:outlineLvl w:val="3"/>
+              <w:rPr>
+                <w:rFonts w:ascii="David" w:hAnsi="David" w:cs="David"/>
+                <w:b w:val="0"/>
+                <w:bCs w:val="0"/>
+                <w:sz w:val="24"/>
+                <w:szCs w:val="24"/>
+                <w:rtl/>
+              </w:rPr>
+            </w:pPr>
+            <w:r>
+              <w:rPr>
+                <w:rFonts w:ascii="David" w:hAnsi="David" w:cs="David"/>
+                <w:b w:val="0"/>
+                <w:bCs w:val="0"/>
+                <w:sz w:val="24"/>
+                <w:szCs w:val="24"/>
+              </w:rPr>
+              <w:t>StudentActivity.cs</w:t>
+            </w:r>
+          </w:p>
+        </w:tc>
+        <w:tc>
+          <w:tcPr>
+            <w:tcW w:w="3007" w:type="dxa"/>
+          </w:tcPr>
+          <w:p>
+            <w:pPr>
+              <w:pStyle w:val="4"/>
+              <w:spacing w:line="276" w:lineRule="auto"/>
+              <w:jc w:val="left"/>
+              <w:outlineLvl w:val="3"/>
+              <w:rPr>
+                <w:rFonts w:ascii="David" w:hAnsi="David" w:cs="David"/>
+                <w:b w:val="0"/>
+                <w:bCs w:val="0"/>
+                <w:sz w:val="24"/>
+                <w:szCs w:val="24"/>
+                <w:rtl/>
+              </w:rPr>
+            </w:pPr>
+            <w:r>
+              <w:rPr>
+                <w:rFonts w:ascii="David" w:hAnsi="David" w:cs="David" w:hint="cs"/>
+                <w:b w:val="0"/>
+                <w:bCs w:val="0"/>
+                <w:sz w:val="24"/>
+                <w:szCs w:val="24"/>
+                <w:rtl/>
+              </w:rPr>
+              <w:t xml:space="preserve">מסך משני </w:t>
+            </w:r>
+            <w:r>
+              <w:rPr>
+                <w:rFonts w:ascii="David" w:hAnsi="David" w:cs="David"/>
+                <w:b w:val="0"/>
+                <w:bCs w:val="0"/>
+                <w:sz w:val="24"/>
+                <w:szCs w:val="24"/>
+                <w:rtl/>
+              </w:rPr>
+              <w:t>–</w:t>
+            </w:r>
+            <w:r>
+              <w:rPr>
+                <w:rFonts w:ascii="David" w:hAnsi="David" w:cs="David" w:hint="cs"/>
+                <w:b w:val="0"/>
+                <w:bCs w:val="0"/>
+                <w:sz w:val="24"/>
+                <w:szCs w:val="24"/>
+                <w:rtl/>
+              </w:rPr>
+              <w:t xml:space="preserve"> המסך הראשי לתלמיד לאחר התחברותו כתלמיד</w:t>
+            </w:r>
+          </w:p>
+        </w:tc>
+      </w:tr>
+      <w:tr>
+        <w:tc>
+          <w:tcPr>
+            <w:tcW w:w="3006" w:type="dxa"/>
+          </w:tcPr>
+          <w:p>
+            <w:pPr>
+              <w:pStyle w:val="4"/>
+              <w:spacing w:line="276" w:lineRule="auto"/>
+              <w:outlineLvl w:val="3"/>
+              <w:rPr>
+                <w:rFonts w:ascii="David" w:hAnsi="David" w:cs="David"/>
+                <w:b w:val="0"/>
+                <w:bCs w:val="0"/>
+                <w:sz w:val="24"/>
+                <w:szCs w:val="24"/>
+                <w:rtl/>
+              </w:rPr>
+            </w:pPr>
+            <w:r>
+              <w:rPr>
+                <w:rFonts w:ascii="David" w:hAnsi="David" w:cs="David"/>
+                <w:b w:val="0"/>
+                <w:bCs w:val="0"/>
+                <w:sz w:val="24"/>
+                <w:szCs w:val="24"/>
+              </w:rPr>
+              <w:t>teacher_register.xml</w:t>
+            </w:r>
+          </w:p>
+        </w:tc>
+        <w:tc>
+          <w:tcPr>
+            <w:tcW w:w="3006" w:type="dxa"/>
+          </w:tcPr>
+          <w:p>
+            <w:pPr>
+              <w:pStyle w:val="4"/>
+              <w:spacing w:line="276" w:lineRule="auto"/>
+              <w:outlineLvl w:val="3"/>
+              <w:rPr>
+                <w:rFonts w:ascii="David" w:hAnsi="David" w:cs="David"/>
+                <w:b w:val="0"/>
+                <w:bCs w:val="0"/>
+                <w:sz w:val="24"/>
+                <w:szCs w:val="24"/>
+                <w:rtl/>
+              </w:rPr>
+            </w:pPr>
+            <w:r>
+              <w:rPr>
+                <w:rFonts w:ascii="David" w:hAnsi="David" w:cs="David"/>
+                <w:b w:val="0"/>
+                <w:bCs w:val="0"/>
+                <w:sz w:val="24"/>
+                <w:szCs w:val="24"/>
+              </w:rPr>
+              <w:t>TeacherActivityRegister.cs</w:t>
+            </w:r>
+          </w:p>
+        </w:tc>
+        <w:tc>
+          <w:tcPr>
+            <w:tcW w:w="3007" w:type="dxa"/>
+          </w:tcPr>
+          <w:p>
+            <w:pPr>
+              <w:pStyle w:val="4"/>
+              <w:spacing w:line="276" w:lineRule="auto"/>
+              <w:outlineLvl w:val="3"/>
+              <w:rPr>
+                <w:rFonts w:ascii="David" w:hAnsi="David" w:cs="David"/>
+                <w:b w:val="0"/>
+                <w:bCs w:val="0"/>
+                <w:sz w:val="24"/>
+                <w:szCs w:val="24"/>
+                <w:rtl/>
+              </w:rPr>
+            </w:pPr>
+            <w:r>
+              <w:rPr>
+                <w:rFonts w:ascii="David" w:hAnsi="David" w:cs="David" w:hint="cs"/>
+                <w:b w:val="0"/>
+                <w:bCs w:val="0"/>
+                <w:sz w:val="24"/>
+                <w:szCs w:val="24"/>
+                <w:rtl/>
+              </w:rPr>
+              <w:t>מסך הרשמת המורה</w:t>
+            </w:r>
+          </w:p>
+        </w:tc>
+      </w:tr>
+      <w:tr>
+        <w:tc>
+          <w:tcPr>
+            <w:tcW w:w="3006" w:type="dxa"/>
+          </w:tcPr>
+          <w:p>
+            <w:pPr>
+              <w:pStyle w:val="4"/>
+              <w:spacing w:line="276" w:lineRule="auto"/>
+              <w:outlineLvl w:val="3"/>
+              <w:rPr>
+                <w:rFonts w:ascii="David" w:hAnsi="David" w:cs="David"/>
+                <w:b w:val="0"/>
+                <w:bCs w:val="0"/>
+                <w:sz w:val="24"/>
+                <w:szCs w:val="24"/>
+                <w:rtl/>
+              </w:rPr>
+            </w:pPr>
+            <w:r>
+              <w:rPr>
+                <w:rFonts w:ascii="David" w:hAnsi="David" w:cs="David"/>
+                <w:b w:val="0"/>
+                <w:bCs w:val="0"/>
+                <w:sz w:val="24"/>
+                <w:szCs w:val="24"/>
+              </w:rPr>
+              <w:t>TeacherLayout.xml</w:t>
+            </w:r>
+          </w:p>
+        </w:tc>
+        <w:tc>
+          <w:tcPr>
+            <w:tcW w:w="3006" w:type="dxa"/>
+          </w:tcPr>
+          <w:p>
+            <w:pPr>
+              <w:pStyle w:val="4"/>
+              <w:spacing w:line="276" w:lineRule="auto"/>
+              <w:outlineLvl w:val="3"/>
+              <w:rPr>
+                <w:rFonts w:ascii="David" w:hAnsi="David" w:cs="David"/>
+                <w:b w:val="0"/>
+                <w:bCs w:val="0"/>
+                <w:sz w:val="24"/>
+                <w:szCs w:val="24"/>
+                <w:rtl/>
+              </w:rPr>
+            </w:pPr>
+            <w:r>
+              <w:rPr>
+                <w:rFonts w:ascii="David" w:hAnsi="David" w:cs="David"/>
+                <w:b w:val="0"/>
+                <w:bCs w:val="0"/>
+                <w:sz w:val="24"/>
+                <w:szCs w:val="24"/>
+              </w:rPr>
+              <w:t>TeacherActivity.cs</w:t>
+            </w:r>
+          </w:p>
+        </w:tc>
+        <w:tc>
+          <w:tcPr>
+            <w:tcW w:w="3007" w:type="dxa"/>
+          </w:tcPr>
+          <w:p>
+            <w:pPr>
+              <w:pStyle w:val="4"/>
+              <w:spacing w:line="276" w:lineRule="auto"/>
+              <w:jc w:val="left"/>
+              <w:outlineLvl w:val="3"/>
+              <w:rPr>
+                <w:rFonts w:ascii="David" w:hAnsi="David" w:cs="David"/>
+                <w:b w:val="0"/>
+                <w:bCs w:val="0"/>
+                <w:sz w:val="24"/>
+                <w:szCs w:val="24"/>
+                <w:rtl/>
+              </w:rPr>
+            </w:pPr>
+            <w:r>
+              <w:rPr>
+                <w:rFonts w:ascii="David" w:hAnsi="David" w:cs="David" w:hint="cs"/>
+                <w:b w:val="0"/>
+                <w:bCs w:val="0"/>
+                <w:sz w:val="24"/>
+                <w:szCs w:val="24"/>
+                <w:rtl/>
+              </w:rPr>
+              <w:t xml:space="preserve">מסך משני </w:t>
+            </w:r>
+            <w:r>
+              <w:rPr>
+                <w:rFonts w:ascii="David" w:hAnsi="David" w:cs="David"/>
+                <w:b w:val="0"/>
+                <w:bCs w:val="0"/>
+                <w:sz w:val="24"/>
+                <w:szCs w:val="24"/>
+                <w:rtl/>
+              </w:rPr>
+              <w:t>–</w:t>
+            </w:r>
+            <w:r>
+              <w:rPr>
+                <w:rFonts w:ascii="David" w:hAnsi="David" w:cs="David" w:hint="cs"/>
+                <w:b w:val="0"/>
+                <w:bCs w:val="0"/>
+                <w:sz w:val="24"/>
+                <w:szCs w:val="24"/>
+                <w:rtl/>
+              </w:rPr>
+              <w:t xml:space="preserve"> המסך הראשי </w:t>
+            </w:r>
+            <w:r>
+              <w:rPr>
+                <w:rFonts w:ascii="David" w:hAnsi="David" w:cs="David" w:hint="cs"/>
+                <w:b w:val="0"/>
+                <w:bCs w:val="0"/>
+                <w:sz w:val="24"/>
+                <w:szCs w:val="24"/>
+                <w:rtl/>
+              </w:rPr>
+              <w:t>למורה</w:t>
+            </w:r>
+            <w:r>
+              <w:rPr>
+                <w:rFonts w:ascii="David" w:hAnsi="David" w:cs="David" w:hint="cs"/>
+                <w:b w:val="0"/>
+                <w:bCs w:val="0"/>
+                <w:sz w:val="24"/>
+                <w:szCs w:val="24"/>
+                <w:rtl/>
+              </w:rPr>
+              <w:t xml:space="preserve"> לאחר התחברותו </w:t>
+            </w:r>
+            <w:r>
+              <w:rPr>
+                <w:rFonts w:ascii="David" w:hAnsi="David" w:cs="David" w:hint="cs"/>
+                <w:b w:val="0"/>
+                <w:bCs w:val="0"/>
+                <w:sz w:val="24"/>
+                <w:szCs w:val="24"/>
+                <w:rtl/>
+              </w:rPr>
+              <w:t>כמורה</w:t>
+            </w:r>
+          </w:p>
+        </w:tc>
+      </w:tr>
+      <w:tr>
+        <w:tc>
+          <w:tcPr>
+            <w:tcW w:w="3006" w:type="dxa"/>
+          </w:tcPr>
+          <w:p>
+            <w:pPr>
+              <w:pStyle w:val="4"/>
+              <w:spacing w:line="276" w:lineRule="auto"/>
+              <w:outlineLvl w:val="3"/>
+              <w:rPr>
+                <w:rFonts w:ascii="David" w:hAnsi="David" w:cs="David"/>
+                <w:b w:val="0"/>
+                <w:bCs w:val="0"/>
+                <w:sz w:val="24"/>
+                <w:szCs w:val="24"/>
+                <w:rtl/>
+              </w:rPr>
+            </w:pPr>
+            <w:r>
+              <w:rPr>
+                <w:rFonts w:ascii="David" w:hAnsi="David" w:cs="David"/>
+                <w:b w:val="0"/>
+                <w:bCs w:val="0"/>
+                <w:sz w:val="24"/>
+                <w:szCs w:val="24"/>
+              </w:rPr>
+              <w:t>WhatsNewCheckList.xml</w:t>
+            </w:r>
+          </w:p>
+        </w:tc>
+        <w:tc>
+          <w:tcPr>
+            <w:tcW w:w="3006" w:type="dxa"/>
+          </w:tcPr>
+          <w:p>
+            <w:pPr>
+              <w:pStyle w:val="4"/>
+              <w:spacing w:line="276" w:lineRule="auto"/>
+              <w:outlineLvl w:val="3"/>
+              <w:rPr>
+                <w:rFonts w:ascii="David" w:hAnsi="David" w:cs="David"/>
+                <w:b w:val="0"/>
+                <w:bCs w:val="0"/>
+                <w:sz w:val="24"/>
+                <w:szCs w:val="24"/>
+                <w:rtl/>
+              </w:rPr>
+            </w:pPr>
+            <w:r>
+              <w:rPr>
+                <w:rFonts w:ascii="David" w:hAnsi="David" w:cs="David"/>
+                <w:b w:val="0"/>
+                <w:bCs w:val="0"/>
+                <w:sz w:val="24"/>
+                <w:szCs w:val="24"/>
+              </w:rPr>
+              <w:t>WhatsNewActivity.cs</w:t>
+            </w:r>
+          </w:p>
+        </w:tc>
+        <w:tc>
+          <w:tcPr>
+            <w:tcW w:w="3007" w:type="dxa"/>
+          </w:tcPr>
+          <w:p>
+            <w:pPr>
+              <w:pStyle w:val="4"/>
+              <w:spacing w:line="276" w:lineRule="auto"/>
+              <w:outlineLvl w:val="3"/>
+              <w:rPr>
+                <w:rFonts w:ascii="David" w:hAnsi="David" w:cs="David"/>
+                <w:b w:val="0"/>
+                <w:bCs w:val="0"/>
+                <w:sz w:val="24"/>
+                <w:szCs w:val="24"/>
+                <w:rtl/>
+              </w:rPr>
+            </w:pPr>
+            <w:r>
+              <w:rPr>
+                <w:rFonts w:ascii="David" w:hAnsi="David" w:cs="David" w:hint="cs"/>
+                <w:b w:val="0"/>
+                <w:bCs w:val="0"/>
+                <w:sz w:val="24"/>
+                <w:szCs w:val="24"/>
+                <w:rtl/>
+              </w:rPr>
+              <w:t>מסך בחירת אבני דרך לרישיון הנהיגה</w:t>
+            </w:r>
+          </w:p>
+        </w:tc>
+      </w:tr>
+    </w:tbl>
+    <w:p>
+      <w:pPr>
+        <w:rPr>
+          <w:rtl/>
+        </w:rPr>
+      </w:pPr>
     </w:p>
     <w:p>
       <w:pPr>
+        <w:bidi w:val="0"/>
+        <w:spacing w:line="240" w:lineRule="auto"/>
+        <w:jc w:val="left"/>
+        <w:rPr>
+          <w:rtl/>
+        </w:rPr>
+      </w:pPr>
+      <w:r>
+        <w:rPr>
+          <w:rtl/>
+        </w:rPr>
+        <w:br w:type="page"/>
+      </w:r>
+    </w:p>
+    <w:p/>
+    <w:p>
+      <w:pPr>
         <w:pStyle w:val="4"/>
         <w:spacing w:line="276" w:lineRule="auto"/>
         <w:rPr>
@@ -11591,73 +13103,6 @@
           <w:rtl/>
         </w:rPr>
       </w:pPr>
-      <w:bookmarkStart w:id="33" w:name="_Toc29994035"/>
-      <w:r>
-        <w:rPr>
-          <w:rFonts w:ascii="David" w:hAnsi="David" w:cs="David"/>
-        </w:rPr>
-        <w:t>Layouts</w:t>
-      </w:r>
-      <w:bookmarkEnd w:id="33"/>
-    </w:p>
-    <w:p>
-      <w:pPr>
-        <w:spacing w:line="276" w:lineRule="auto"/>
-        <w:rPr>
-          <w:rFonts w:ascii="David" w:hAnsi="David"/>
-          <w:color w:val="0000FF"/>
-          <w:rtl/>
-        </w:rPr>
-      </w:pPr>
-      <w:r>
-        <w:rPr>
-          <w:rFonts w:ascii="David" w:hAnsi="David"/>
-          <w:color w:val="0000FF"/>
-          <w:rtl/>
-        </w:rPr>
-        <w:t>פרטו את קבצי ה-</w:t>
-      </w:r>
-      <w:r>
-        <w:rPr>
-          <w:rFonts w:ascii="David" w:hAnsi="David"/>
-          <w:color w:val="0000FF"/>
-        </w:rPr>
-        <w:t>XML</w:t>
-      </w:r>
-      <w:r>
-        <w:rPr>
-          <w:rFonts w:ascii="David" w:hAnsi="David"/>
-          <w:color w:val="0000FF"/>
-          <w:rtl/>
-        </w:rPr>
-        <w:t xml:space="preserve"> וציינו לאיזה </w:t>
-      </w:r>
-      <w:r>
-        <w:rPr>
-          <w:rFonts w:ascii="David" w:hAnsi="David"/>
-          <w:color w:val="0000FF"/>
-        </w:rPr>
-        <w:t xml:space="preserve">Activity </w:t>
-      </w:r>
-      <w:r>
-        <w:rPr>
-          <w:rFonts w:ascii="David" w:hAnsi="David"/>
-          <w:color w:val="0000FF"/>
-          <w:rtl/>
-        </w:rPr>
-        <w:t xml:space="preserve"> כל אחד מהם מתאים.</w:t>
-      </w:r>
-    </w:p>
-    <w:p>
-      <w:pPr>
-        <w:pStyle w:val="4"/>
-        <w:spacing w:line="276" w:lineRule="auto"/>
-        <w:rPr>
-          <w:rFonts w:ascii="David" w:hAnsi="David" w:cs="David"/>
-          <w:rtl/>
-        </w:rPr>
-      </w:pPr>
-      <w:bookmarkStart w:id="34" w:name="_Toc29994036"/>
       <w:r>
         <w:rPr>
           <w:rFonts w:ascii="David" w:hAnsi="David" w:cs="David"/>
@@ -11666,54 +13111,273 @@
       </w:r>
       <w:bookmarkEnd w:id="34"/>
     </w:p>
-    <w:p>
-      <w:pPr>
-        <w:spacing w:line="276" w:lineRule="auto"/>
-        <w:rPr>
-          <w:rFonts w:ascii="David" w:hAnsi="David"/>
-          <w:color w:val="0000FF"/>
-          <w:rtl/>
-        </w:rPr>
-      </w:pPr>
-      <w:r>
-        <w:rPr>
-          <w:rFonts w:ascii="David" w:hAnsi="David"/>
-          <w:color w:val="0000FF"/>
-          <w:rtl/>
-        </w:rPr>
-        <w:t>פרטו את קבצי ה-</w:t>
-      </w:r>
-      <w:r>
-        <w:rPr>
-          <w:rFonts w:ascii="David" w:hAnsi="David"/>
-          <w:color w:val="0000FF"/>
-        </w:rPr>
-        <w:t>XML</w:t>
-      </w:r>
-      <w:r>
-        <w:rPr>
-          <w:rFonts w:ascii="David" w:hAnsi="David"/>
-          <w:color w:val="0000FF"/>
-          <w:rtl/>
-        </w:rPr>
-        <w:t xml:space="preserve"> וציינו איזה תפריט כל אחד מהם מממש ובאיזה </w:t>
-      </w:r>
-      <w:r>
-        <w:rPr>
-          <w:rFonts w:ascii="David" w:hAnsi="David"/>
-          <w:color w:val="0000FF"/>
-        </w:rPr>
-        <w:t>Activity</w:t>
-      </w:r>
-      <w:r>
-        <w:rPr>
-          <w:rFonts w:ascii="David" w:hAnsi="David"/>
-          <w:color w:val="0000FF"/>
-          <w:rtl/>
-        </w:rPr>
-        <w:t xml:space="preserve"> נעשה בו שימוש.</w:t>
-      </w:r>
-    </w:p>
+    <w:tbl>
+      <w:tblPr>
+        <w:tblStyle w:val="a8"/>
+        <w:bidiVisual/>
+        <w:tblW w:w="0" w:type="auto"/>
+        <w:tblLook w:val="04A0" w:firstRow="1" w:lastRow="0" w:firstColumn="1" w:lastColumn="0" w:noHBand="0" w:noVBand="1"/>
+      </w:tblPr>
+      <w:tblGrid>
+        <w:gridCol w:w="3006"/>
+        <w:gridCol w:w="3006"/>
+        <w:gridCol w:w="3007"/>
+      </w:tblGrid>
+      <w:tr>
+        <w:tc>
+          <w:tcPr>
+            <w:tcW w:w="3006" w:type="dxa"/>
+          </w:tcPr>
+          <w:p>
+            <w:pPr>
+              <w:spacing w:line="276" w:lineRule="auto"/>
+              <w:rPr>
+                <w:rFonts w:ascii="David" w:hAnsi="David" w:hint="cs"/>
+                <w:b/>
+                <w:bCs/>
+              </w:rPr>
+            </w:pPr>
+            <w:r>
+              <w:rPr>
+                <w:rFonts w:ascii="David" w:hAnsi="David" w:hint="cs"/>
+                <w:b/>
+                <w:bCs/>
+                <w:rtl/>
+              </w:rPr>
+              <w:t xml:space="preserve">שם ה </w:t>
+            </w:r>
+            <w:r>
+              <w:rPr>
+                <w:rFonts w:ascii="David" w:hAnsi="David"/>
+                <w:b/>
+                <w:bCs/>
+              </w:rPr>
+              <w:t>Menu</w:t>
+            </w:r>
+          </w:p>
+        </w:tc>
+        <w:tc>
+          <w:tcPr>
+            <w:tcW w:w="3006" w:type="dxa"/>
+          </w:tcPr>
+          <w:p>
+            <w:pPr>
+              <w:spacing w:line="276" w:lineRule="auto"/>
+              <w:rPr>
+                <w:rFonts w:ascii="David" w:hAnsi="David" w:hint="cs"/>
+                <w:b/>
+                <w:bCs/>
+                <w:rtl/>
+              </w:rPr>
+            </w:pPr>
+            <w:r>
+              <w:rPr>
+                <w:rFonts w:ascii="David" w:hAnsi="David" w:hint="cs"/>
+                <w:b/>
+                <w:bCs/>
+                <w:rtl/>
+              </w:rPr>
+              <w:t xml:space="preserve">לאיזה </w:t>
+            </w:r>
+            <w:r>
+              <w:rPr>
+                <w:rFonts w:ascii="David" w:hAnsi="David"/>
+                <w:b/>
+                <w:bCs/>
+              </w:rPr>
+              <w:t>Activity</w:t>
+            </w:r>
+            <w:r>
+              <w:rPr>
+                <w:rFonts w:ascii="David" w:hAnsi="David" w:hint="cs"/>
+                <w:b/>
+                <w:bCs/>
+                <w:rtl/>
+              </w:rPr>
+              <w:t xml:space="preserve"> ה </w:t>
+            </w:r>
+            <w:r>
+              <w:rPr>
+                <w:rFonts w:ascii="David" w:hAnsi="David"/>
+                <w:b/>
+                <w:bCs/>
+              </w:rPr>
+              <w:t>Menu</w:t>
+            </w:r>
+            <w:r>
+              <w:rPr>
+                <w:rFonts w:ascii="David" w:hAnsi="David" w:hint="cs"/>
+                <w:b/>
+                <w:bCs/>
+                <w:rtl/>
+              </w:rPr>
+              <w:t xml:space="preserve"> שייך</w:t>
+            </w:r>
+          </w:p>
+        </w:tc>
+        <w:tc>
+          <w:tcPr>
+            <w:tcW w:w="3007" w:type="dxa"/>
+          </w:tcPr>
+          <w:p>
+            <w:pPr>
+              <w:spacing w:line="276" w:lineRule="auto"/>
+              <w:rPr>
+                <w:rFonts w:ascii="David" w:hAnsi="David"/>
+                <w:rtl/>
+              </w:rPr>
+            </w:pPr>
+            <w:r>
+              <w:rPr>
+                <w:rFonts w:ascii="David" w:hAnsi="David" w:hint="cs"/>
+                <w:rtl/>
+              </w:rPr>
+              <w:t>הסבר</w:t>
+            </w:r>
+          </w:p>
+        </w:tc>
+      </w:tr>
+      <w:tr>
+        <w:tc>
+          <w:tcPr>
+            <w:tcW w:w="3006" w:type="dxa"/>
+          </w:tcPr>
+          <w:p>
+            <w:pPr>
+              <w:spacing w:line="276" w:lineRule="auto"/>
+              <w:rPr>
+                <w:rFonts w:ascii="David" w:hAnsi="David"/>
+                <w:rtl/>
+              </w:rPr>
+            </w:pPr>
+            <w:r>
+              <w:rPr>
+                <w:rFonts w:ascii="David" w:hAnsi="David"/>
+              </w:rPr>
+              <w:t>mnuMainActivity</w:t>
+            </w:r>
+          </w:p>
+        </w:tc>
+        <w:tc>
+          <w:tcPr>
+            <w:tcW w:w="3006" w:type="dxa"/>
+          </w:tcPr>
+          <w:p>
+            <w:pPr>
+              <w:spacing w:line="276" w:lineRule="auto"/>
+              <w:rPr>
+                <w:rFonts w:ascii="David" w:hAnsi="David" w:hint="cs"/>
+                <w:rtl/>
+              </w:rPr>
+            </w:pPr>
+            <w:r>
+              <w:rPr>
+                <w:rFonts w:ascii="David" w:hAnsi="David" w:hint="cs"/>
+                <w:rtl/>
+              </w:rPr>
+              <w:t xml:space="preserve">כל ה </w:t>
+            </w:r>
+            <w:r>
+              <w:rPr>
+                <w:rFonts w:ascii="David" w:hAnsi="David"/>
+              </w:rPr>
+              <w:t>Activities</w:t>
+            </w:r>
+          </w:p>
+        </w:tc>
+        <w:tc>
+          <w:tcPr>
+            <w:tcW w:w="3007" w:type="dxa"/>
+          </w:tcPr>
+          <w:p>
+            <w:pPr>
+              <w:spacing w:line="276" w:lineRule="auto"/>
+              <w:jc w:val="left"/>
+              <w:rPr>
+                <w:rFonts w:ascii="David" w:hAnsi="David"/>
+                <w:rtl/>
+              </w:rPr>
+            </w:pPr>
+            <w:r>
+              <w:rPr>
+                <w:rFonts w:ascii="David" w:hAnsi="David" w:hint="cs"/>
+                <w:rtl/>
+              </w:rPr>
+              <w:t>חוזר למסך הראשי שהאפליקציה התחילה בו</w:t>
+            </w:r>
+          </w:p>
+        </w:tc>
+      </w:tr>
+      <w:tr>
+        <w:tc>
+          <w:tcPr>
+            <w:tcW w:w="3006" w:type="dxa"/>
+          </w:tcPr>
+          <w:p>
+            <w:pPr>
+              <w:spacing w:line="276" w:lineRule="auto"/>
+              <w:rPr>
+                <w:rFonts w:ascii="David" w:hAnsi="David"/>
+                <w:rtl/>
+              </w:rPr>
+            </w:pPr>
+            <w:r>
+              <w:rPr>
+                <w:rFonts w:ascii="David" w:hAnsi="David"/>
+              </w:rPr>
+              <w:t>mnuExit</w:t>
+            </w:r>
+          </w:p>
+        </w:tc>
+        <w:tc>
+          <w:tcPr>
+            <w:tcW w:w="3006" w:type="dxa"/>
+          </w:tcPr>
+          <w:p>
+            <w:pPr>
+              <w:spacing w:line="276" w:lineRule="auto"/>
+              <w:rPr>
+                <w:rFonts w:ascii="David" w:hAnsi="David"/>
+                <w:rtl/>
+              </w:rPr>
+            </w:pPr>
+            <w:r>
+              <w:rPr>
+                <w:rFonts w:ascii="David" w:hAnsi="David" w:hint="cs"/>
+                <w:rtl/>
+              </w:rPr>
+              <w:t xml:space="preserve">כל ה </w:t>
+            </w:r>
+            <w:r>
+              <w:rPr>
+                <w:rFonts w:ascii="David" w:hAnsi="David"/>
+              </w:rPr>
+              <w:t>Activities</w:t>
+            </w:r>
+          </w:p>
+        </w:tc>
+        <w:tc>
+          <w:tcPr>
+            <w:tcW w:w="3007" w:type="dxa"/>
+          </w:tcPr>
+          <w:p>
+            <w:pPr>
+              <w:spacing w:line="276" w:lineRule="auto"/>
+              <w:rPr>
+                <w:rFonts w:ascii="David" w:hAnsi="David"/>
+              </w:rPr>
+            </w:pPr>
+            <w:r>
+              <w:rPr>
+                <w:rFonts w:ascii="David" w:hAnsi="David" w:hint="cs"/>
+                <w:rtl/>
+              </w:rPr>
+              <w:t>יוצא מהפליקציה</w:t>
+            </w:r>
+          </w:p>
+        </w:tc>
+      </w:tr>
+    </w:tbl>
     <w:p>
       <w:pPr>
         <w:spacing w:line="276" w:lineRule="auto"/>
@@ -18381,61 +20045,6 @@
           <w:rtl/>
         </w:rPr>
       </w:pPr>
-    </w:p>
-    <w:p>
-      <w:pPr>
-        <w:pStyle w:val="2"/>
-        <w:pageBreakBefore/>
-        <w:spacing w:line="276" w:lineRule="auto"/>
-        <w:rPr>
-          <w:rFonts w:ascii="David" w:hAnsi="David" w:cs="David"/>
-          <w:rtl/>
-        </w:rPr>
-      </w:pPr>
-      <w:bookmarkStart w:id="73" w:name="_Toc29994044"/>
-      <w:bookmarkStart w:id="74" w:name="_Toc39329442"/>
-      <w:r>
-        <w:rPr>
-          <w:rFonts w:ascii="David" w:hAnsi="David" w:cs="David"/>
-          <w:rtl/>
-        </w:rPr>
-        <w:lastRenderedPageBreak/>
-        <w:t xml:space="preserve">כללי </w:t>
-      </w:r>
-      <w:r>
-        <w:rPr>
-          <w:rFonts w:ascii="David" w:hAnsi="David" w:cs="David"/>
-          <w:rtl/>
-        </w:rPr>
-        <w:t xml:space="preserve">משחק </w:t>
-      </w:r>
-      <w:r>
-        <w:rPr>
-          <w:rFonts w:ascii="David" w:hAnsi="David" w:cs="David"/>
-          <w:rtl/>
-        </w:rPr>
-        <w:t>(אופציונלי)</w:t>
-      </w:r>
-      <w:bookmarkEnd w:id="73"/>
-      <w:bookmarkEnd w:id="74"/>
-    </w:p>
-    <w:p>
-      <w:pPr>
-        <w:spacing w:line="276" w:lineRule="auto"/>
-        <w:rPr>
-          <w:rFonts w:ascii="David" w:hAnsi="David"/>
-          <w:color w:val="0000FF"/>
-          <w:rtl/>
-        </w:rPr>
-      </w:pPr>
-      <w:r>
-        <w:rPr>
-          <w:rFonts w:ascii="David" w:hAnsi="David"/>
-          <w:color w:val="0000FF"/>
-          <w:rtl/>
-        </w:rPr>
-        <w:t>(אם מדובר במשחק מוכר)</w:t>
-      </w:r>
     </w:p>
     <w:sectPr>
       <w:headerReference w:type="default" r:id="rId28"/>
@@ -26922,7 +28531,7 @@
 </file>
 
 <file path=customXml/itemProps1.xml><?xml version="1.0" encoding="utf-8"?>
-<ds:datastoreItem xmlns:ds="http://schemas.openxmlformats.org/officeDocument/2006/customXml" ds:itemID="{EA69026F-7EB4-464C-A0D8-3A83AF261E22}">
+<ds:datastoreItem xmlns:ds="http://schemas.openxmlformats.org/officeDocument/2006/customXml" ds:itemID="{A0A69D25-4755-4A45-9DEE-A5BE8CDB37EF}">
   <ds:schemaRefs>
     <ds:schemaRef ds:uri="http://schemas.openxmlformats.org/officeDocument/2006/bibliography"/>
   </ds:schemaRefs>

</xml_diff>

<commit_message>
Added the drables section (just the Icon) and also Added the Icon to the Title page.
</commit_message>
<xml_diff>
--- a/Driving Lessons Manager.docx
+++ b/Driving Lessons Manager.docx
@@ -89,6 +89,25 @@
         <w:spacing w:line="276" w:lineRule="auto"/>
         <w:rPr>
           <w:rFonts w:ascii="David" w:hAnsi="David"/>
+          <w:sz w:val="64"/>
+          <w:szCs w:val="64"/>
+        </w:rPr>
+      </w:pPr>
+      <w:r>
+        <w:rPr>
+          <w:rFonts w:ascii="David" w:hAnsi="David"/>
+          <w:sz w:val="64"/>
+          <w:szCs w:val="64"/>
+        </w:rPr>
+        <w:t>Driving Lessons Manager</w:t>
+      </w:r>
+    </w:p>
+    <w:p>
+      <w:pPr>
+        <w:pStyle w:val="Title1"/>
+        <w:spacing w:line="276" w:lineRule="auto"/>
+        <w:rPr>
+          <w:rFonts w:ascii="David" w:hAnsi="David"/>
           <w:sz w:val="24"/>
           <w:szCs w:val="24"/>
           <w:u w:val="none"/>
@@ -97,10 +116,69 @@
       <w:r>
         <w:rPr>
           <w:rFonts w:ascii="David" w:hAnsi="David"/>
+          <w:b w:val="0"/>
+          <w:bCs w:val="0"/>
+          <w:noProof/>
           <w:sz w:val="64"/>
           <w:szCs w:val="64"/>
-        </w:rPr>
-        <w:t>Driving Lessons Manager</w:t>
+          <w:u w:val="none"/>
+        </w:rPr>
+        <w:drawing>
+          <wp:anchor distT="0" distB="0" distL="114300" distR="114300" simplePos="0" relativeHeight="251695616" behindDoc="1" locked="0" layoutInCell="1" allowOverlap="1" wp14:anchorId="45F3BBFC" wp14:editId="1B2F456E">
+            <wp:simplePos x="0" y="0"/>
+            <wp:positionH relativeFrom="margin">
+              <wp:align>left</wp:align>
+            </wp:positionH>
+            <wp:positionV relativeFrom="paragraph">
+              <wp:posOffset>64770</wp:posOffset>
+            </wp:positionV>
+            <wp:extent cx="2133600" cy="2133600"/>
+            <wp:effectExtent l="0" t="0" r="0" b="0"/>
+            <wp:wrapNone/>
+            <wp:docPr id="102" name="תמונה 102"/>
+            <wp:cNvGraphicFramePr>
+              <a:graphicFrameLocks xmlns:a="http://schemas.openxmlformats.org/drawingml/2006/main" noChangeAspect="1"/>
+            </wp:cNvGraphicFramePr>
+            <a:graphic xmlns:a="http://schemas.openxmlformats.org/drawingml/2006/main">
+              <a:graphicData uri="http://schemas.openxmlformats.org/drawingml/2006/picture">
+                <pic:pic xmlns:pic="http://schemas.openxmlformats.org/drawingml/2006/picture">
+                  <pic:nvPicPr>
+                    <pic:cNvPr id="0" name="Picture 16"/>
+                    <pic:cNvPicPr>
+                      <a:picLocks noChangeAspect="1" noChangeArrowheads="1"/>
+                    </pic:cNvPicPr>
+                  </pic:nvPicPr>
+                  <pic:blipFill>
+                    <a:blip r:embed="rId9">
+                      <a:extLst>
+                        <a:ext uri="{28A0092B-C50C-407E-A947-70E740481C1C}">
+                          <a14:useLocalDpi xmlns:a14="http://schemas.microsoft.com/office/drawing/2010/main" val="0"/>
+                        </a:ext>
+                      </a:extLst>
+                    </a:blip>
+                    <a:srcRect/>
+                    <a:stretch>
+                      <a:fillRect/>
+                    </a:stretch>
+                  </pic:blipFill>
+                  <pic:spPr bwMode="auto">
+                    <a:xfrm>
+                      <a:off x="0" y="0"/>
+                      <a:ext cx="2133600" cy="2133600"/>
+                    </a:xfrm>
+                    <a:prstGeom prst="rect">
+                      <a:avLst/>
+                    </a:prstGeom>
+                    <a:noFill/>
+                    <a:ln>
+                      <a:noFill/>
+                    </a:ln>
+                  </pic:spPr>
+                </pic:pic>
+              </a:graphicData>
+            </a:graphic>
+          </wp:anchor>
+        </w:drawing>
       </w:r>
       <w:r>
         <w:rPr>
@@ -5385,7 +5463,25 @@
           <w:sz w:val="24"/>
           <w:rtl/>
         </w:rPr>
-        <w:t>קרה והייתי צריך לבטל, לדחות או להקדים את השיעור וזה כבר סיפור בפני עצמו, בשל העובדה שצריך היה להזיז תלמידים אחרים, בתקווה שהם יכולים כמובן, דבר שלקח זמן והיה מייאש. מוטיבציה נוספת לפרויקט היא שהרעיון הכללי לאיך שהאפליקציה תיראה ותעבוד כבר היה בראש שלי מתחילת העבודה על הפרויקט, דבר שהקל על מהלך העבודה לעומת מקרה אחר בו הייתי עובד על הפרויקט ללא רעיון כללי בראש</w:t>
+        <w:t xml:space="preserve">קרה והייתי צריך לבטל, לדחות או להקדים את השיעור וזה כבר סיפור בפני עצמו, בשל העובדה שצריך היה להזיז תלמידים אחרים, בתקווה שהם יכולים כמובן, דבר שלקח זמן והיה מייאש. מוטיבציה נוספת לפרויקט היא שהרעיון הכללי </w:t>
+      </w:r>
+      <w:proofErr w:type="spellStart"/>
+      <w:r>
+        <w:rPr>
+          <w:rFonts w:ascii="David" w:hAnsi="David"/>
+          <w:sz w:val="24"/>
+          <w:rtl/>
+        </w:rPr>
+        <w:t>לאיך</w:t>
+      </w:r>
+      <w:proofErr w:type="spellEnd"/>
+      <w:r>
+        <w:rPr>
+          <w:rFonts w:ascii="David" w:hAnsi="David"/>
+          <w:sz w:val="24"/>
+          <w:rtl/>
+        </w:rPr>
+        <w:t xml:space="preserve"> שהאפליקציה תיראה ותעבוד כבר היה בראש שלי מתחילת העבודה על הפרויקט, דבר שהקל על מהלך העבודה לעומת מקרה אחר בו הייתי עובד על הפרויקט ללא רעיון כללי בראש</w:t>
       </w:r>
       <w:r>
         <w:rPr>
@@ -5614,12 +5710,14 @@
         </w:rPr>
         <w:t xml:space="preserve">, עלי לקרוא לפונקציה </w:t>
       </w:r>
+      <w:proofErr w:type="spellStart"/>
       <w:r>
         <w:rPr>
           <w:rFonts w:ascii="David" w:hAnsi="David"/>
         </w:rPr>
         <w:t>SelectAll</w:t>
       </w:r>
+      <w:proofErr w:type="spellEnd"/>
       <w:r>
         <w:rPr>
           <w:rFonts w:ascii="David" w:hAnsi="David"/>
@@ -6351,12 +6449,14 @@
         </w:rPr>
         <w:t xml:space="preserve">במשפט </w:t>
       </w:r>
+      <w:proofErr w:type="spellStart"/>
       <w:r>
         <w:rPr>
           <w:rFonts w:ascii="David" w:hAnsi="David"/>
         </w:rPr>
         <w:t>sql</w:t>
       </w:r>
+      <w:proofErr w:type="spellEnd"/>
       <w:r>
         <w:rPr>
           <w:rFonts w:ascii="David" w:hAnsi="David"/>
@@ -6388,7 +6488,23 @@
           <w:rFonts w:ascii="David" w:hAnsi="David"/>
           <w:rtl/>
         </w:rPr>
-        <w:t>. משפט שכזה הוא קשה לכתיב, במיוחד גם כשלא מבינים ויודעים לעומק את כל הדרכים המדויקות שלימו שבו, וזאת משום שאם ישנה טעות אז קשה מאוד לעלות עליה, שכן הודעת השגיאה אינה מראה באופן מדויק היכן הבעיה וכיד לפתור אותה, אם בכלל.</w:t>
+        <w:t xml:space="preserve">. משפט שכזה הוא קשה לכתיב, במיוחד גם </w:t>
+      </w:r>
+      <w:proofErr w:type="spellStart"/>
+      <w:r>
+        <w:rPr>
+          <w:rFonts w:ascii="David" w:hAnsi="David"/>
+          <w:rtl/>
+        </w:rPr>
+        <w:t>כשלא</w:t>
+      </w:r>
+      <w:proofErr w:type="spellEnd"/>
+      <w:r>
+        <w:rPr>
+          <w:rFonts w:ascii="David" w:hAnsi="David"/>
+          <w:rtl/>
+        </w:rPr>
+        <w:t xml:space="preserve"> מבינים ויודעים לעומק את כל הדרכים המדויקות שלימו שבו, וזאת משום שאם ישנה טעות אז קשה מאוד לעלות עליה, שכן הודעת השגיאה אינה מראה באופן מדויק היכן הבעיה וכיד לפתור אותה, אם בכלל.</w:t>
       </w:r>
     </w:p>
     <w:p>
@@ -6476,7 +6592,23 @@
           <w:rFonts w:ascii="David" w:hAnsi="David"/>
           <w:rtl/>
         </w:rPr>
-        <w:t xml:space="preserve">הקושי פה היה להפוך את הכל לרשימה ולהעביר אותה כמו שהיא למסך אחר. לא משנה כמה ניסיתי, לא הצלחתי להעביר את הרשימה כמו שהיא. לכן, נאלצתי להמיר את הרשימה בעזרת לולאת </w:t>
+        <w:t xml:space="preserve">הקושי פה היה להפוך את </w:t>
+      </w:r>
+      <w:proofErr w:type="spellStart"/>
+      <w:r>
+        <w:rPr>
+          <w:rFonts w:ascii="David" w:hAnsi="David"/>
+          <w:rtl/>
+        </w:rPr>
+        <w:t>הכל</w:t>
+      </w:r>
+      <w:proofErr w:type="spellEnd"/>
+      <w:r>
+        <w:rPr>
+          <w:rFonts w:ascii="David" w:hAnsi="David"/>
+          <w:rtl/>
+        </w:rPr>
+        <w:t xml:space="preserve"> לרשימה ולהעביר אותה כמו שהיא למסך אחר. לא משנה כמה ניסיתי, לא הצלחתי להעביר את הרשימה כמו שהיא. לכן, נאלצתי להמיר את הרשימה בעזרת לולאת </w:t>
       </w:r>
       <w:r>
         <w:rPr>
@@ -6631,7 +6763,7 @@
             <wp:cNvGraphicFramePr/>
             <a:graphic xmlns:a="http://schemas.openxmlformats.org/drawingml/2006/main">
               <a:graphicData uri="http://schemas.openxmlformats.org/drawingml/2006/diagram">
-                <dgm:relIds xmlns:dgm="http://schemas.openxmlformats.org/drawingml/2006/diagram" xmlns:r="http://schemas.openxmlformats.org/officeDocument/2006/relationships" r:dm="rId9" r:lo="rId10" r:qs="rId11" r:cs="rId12"/>
+                <dgm:relIds xmlns:dgm="http://schemas.openxmlformats.org/drawingml/2006/diagram" xmlns:r="http://schemas.openxmlformats.org/officeDocument/2006/relationships" r:dm="rId10" r:lo="rId11" r:qs="rId12" r:cs="rId13"/>
               </a:graphicData>
             </a:graphic>
           </wp:inline>
@@ -6783,7 +6915,7 @@
           </mc:Choice>
           <mc:Fallback>
             <w:pict>
-              <v:rect w14:anchorId="21FE3985" id=" 59" o:spid="_x0000_s1026" style="position:absolute;margin-left:69.75pt;margin-top:13.95pt;width:311.5pt;height:458.25pt;z-index:251662848;visibility:visible;mso-wrap-style:square;mso-width-percent:0;mso-height-percent:0;mso-wrap-distance-left:9pt;mso-wrap-distance-top:0;mso-wrap-distance-right:9pt;mso-wrap-distance-bottom:0;mso-position-horizontal:absolute;mso-position-horizontal-relative:text;mso-position-vertical:absolute;mso-position-vertical-relative:text;mso-width-percent:0;mso-height-percent:0;mso-width-relative:page;mso-height-relative:page;v-text-anchor:top" o:gfxdata="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">
+              <v:rect w14:anchorId="4DB8AE9B" id=" 59" o:spid="_x0000_s1026" style="position:absolute;margin-left:69.75pt;margin-top:13.95pt;width:311.5pt;height:458.25pt;z-index:251662848;visibility:visible;mso-wrap-style:square;mso-width-percent:0;mso-height-percent:0;mso-wrap-distance-left:9pt;mso-wrap-distance-top:0;mso-wrap-distance-right:9pt;mso-wrap-distance-bottom:0;mso-position-horizontal:absolute;mso-position-horizontal-relative:text;mso-position-vertical:absolute;mso-position-vertical-relative:text;mso-width-percent:0;mso-height-percent:0;mso-width-relative:page;mso-height-relative:page;v-text-anchor:top" o:gfxdata="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">
                 <v:path arrowok="t"/>
               </v:rect>
             </w:pict>
@@ -7057,7 +7189,7 @@
           </mc:Choice>
           <mc:Fallback>
             <w:pict>
-              <v:shapetype w14:anchorId="52E5E23B" id="_x0000_t32" coordsize="21600,21600" o:spt="32" o:oned="t" path="m,l21600,21600e" filled="f">
+              <v:shapetype w14:anchorId="495FB6F1" id="_x0000_t32" coordsize="21600,21600" o:spt="32" o:oned="t" path="m,l21600,21600e" filled="f">
                 <v:path arrowok="t" fillok="f" o:connecttype="none"/>
                 <o:lock v:ext="edit" shapetype="t"/>
               </v:shapetype>
@@ -7138,7 +7270,7 @@
           </mc:Choice>
           <mc:Fallback>
             <w:pict>
-              <v:shape w14:anchorId="056167F9" id=" 94" o:spid="_x0000_s1026" type="#_x0000_t32" style="position:absolute;margin-left:33.75pt;margin-top:165.3pt;width:117pt;height:180.75pt;z-index:251684352;visibility:visible;mso-wrap-style:square;mso-width-percent:0;mso-height-percent:0;mso-wrap-distance-left:9pt;mso-wrap-distance-top:0;mso-wrap-distance-right:9pt;mso-wrap-distance-bottom:0;mso-position-horizontal:absolute;mso-position-horizontal-relative:text;mso-position-vertical:absolute;mso-position-vertical-relative:text;mso-width-percent:0;mso-height-percent:0;mso-width-relative:page;mso-height-relative:page" o:gfxdata="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" strokeweight="1.5pt">
+              <v:shape w14:anchorId="0807AAEE" id=" 94" o:spid="_x0000_s1026" type="#_x0000_t32" style="position:absolute;margin-left:33.75pt;margin-top:165.3pt;width:117pt;height:180.75pt;z-index:251684352;visibility:visible;mso-wrap-style:square;mso-width-percent:0;mso-height-percent:0;mso-wrap-distance-left:9pt;mso-wrap-distance-top:0;mso-wrap-distance-right:9pt;mso-wrap-distance-bottom:0;mso-position-horizontal:absolute;mso-position-horizontal-relative:text;mso-position-vertical:absolute;mso-position-vertical-relative:text;mso-width-percent:0;mso-height-percent:0;mso-width-relative:page;mso-height-relative:page" o:gfxdata="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" strokeweight="1.5pt">
                 <o:lock v:ext="edit" shapetype="f"/>
               </v:shape>
             </w:pict>
@@ -7717,7 +7849,7 @@
           </mc:Choice>
           <mc:Fallback>
             <w:pict>
-              <v:shape w14:anchorId="4022031C" id=" 97" o:spid="_x0000_s1026" type="#_x0000_t32" style="position:absolute;margin-left:318.75pt;margin-top:121.35pt;width:92.75pt;height:153pt;flip:y;z-index:251678208;visibility:visible;mso-wrap-style:square;mso-width-percent:0;mso-height-percent:0;mso-wrap-distance-left:9pt;mso-wrap-distance-top:0;mso-wrap-distance-right:9pt;mso-wrap-distance-bottom:0;mso-position-horizontal:absolute;mso-position-horizontal-relative:text;mso-position-vertical:absolute;mso-position-vertical-relative:text;mso-width-percent:0;mso-height-percent:0;mso-width-relative:page;mso-height-relative:page" o:gfxdata="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" strokeweight="1.5pt">
+              <v:shape w14:anchorId="778965C9" id=" 97" o:spid="_x0000_s1026" type="#_x0000_t32" style="position:absolute;margin-left:318.75pt;margin-top:121.35pt;width:92.75pt;height:153pt;flip:y;z-index:251678208;visibility:visible;mso-wrap-style:square;mso-width-percent:0;mso-height-percent:0;mso-wrap-distance-left:9pt;mso-wrap-distance-top:0;mso-wrap-distance-right:9pt;mso-wrap-distance-bottom:0;mso-position-horizontal:absolute;mso-position-horizontal-relative:text;mso-position-vertical:absolute;mso-position-vertical-relative:text;mso-width-percent:0;mso-height-percent:0;mso-width-relative:page;mso-height-relative:page" o:gfxdata="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" strokeweight="1.5pt">
                 <o:lock v:ext="edit" shapetype="f"/>
               </v:shape>
             </w:pict>
@@ -7794,7 +7926,7 @@
           </mc:Choice>
           <mc:Fallback>
             <w:pict>
-              <v:shape w14:anchorId="57F398B9" id=" 93" o:spid="_x0000_s1026" type="#_x0000_t32" style="position:absolute;margin-left:21.75pt;margin-top:93.6pt;width:135.75pt;height:45pt;flip:y;z-index:251682304;visibility:visible;mso-wrap-style:square;mso-width-percent:0;mso-height-percent:0;mso-wrap-distance-left:9pt;mso-wrap-distance-top:0;mso-wrap-distance-right:9pt;mso-wrap-distance-bottom:0;mso-position-horizontal:absolute;mso-position-horizontal-relative:text;mso-position-vertical:absolute;mso-position-vertical-relative:text;mso-width-percent:0;mso-height-percent:0;mso-width-relative:page;mso-height-relative:page" o:gfxdata="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" strokeweight="1.5pt">
+              <v:shape w14:anchorId="67B7AA3D" id=" 93" o:spid="_x0000_s1026" type="#_x0000_t32" style="position:absolute;margin-left:21.75pt;margin-top:93.6pt;width:135.75pt;height:45pt;flip:y;z-index:251682304;visibility:visible;mso-wrap-style:square;mso-width-percent:0;mso-height-percent:0;mso-wrap-distance-left:9pt;mso-wrap-distance-top:0;mso-wrap-distance-right:9pt;mso-wrap-distance-bottom:0;mso-position-horizontal:absolute;mso-position-horizontal-relative:text;mso-position-vertical:absolute;mso-position-vertical-relative:text;mso-width-percent:0;mso-height-percent:0;mso-width-relative:page;mso-height-relative:page" o:gfxdata="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" strokeweight="1.5pt">
                 <o:lock v:ext="edit" shapetype="f"/>
               </v:shape>
             </w:pict>
@@ -7871,7 +8003,7 @@
           </mc:Choice>
           <mc:Fallback>
             <w:pict>
-              <v:shape w14:anchorId="255EBF28" id=" 93" o:spid="_x0000_s1026" type="#_x0000_t32" style="position:absolute;margin-left:26.25pt;margin-top:27.6pt;width:133.25pt;height:87.75pt;flip:y;z-index:251680256;visibility:visible;mso-wrap-style:square;mso-width-percent:0;mso-height-percent:0;mso-wrap-distance-left:9pt;mso-wrap-distance-top:0;mso-wrap-distance-right:9pt;mso-wrap-distance-bottom:0;mso-position-horizontal:absolute;mso-position-horizontal-relative:text;mso-position-vertical:absolute;mso-position-vertical-relative:text;mso-width-percent:0;mso-height-percent:0;mso-width-relative:page;mso-height-relative:page" o:gfxdata="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" strokeweight="1.5pt">
+              <v:shape w14:anchorId="45C26395" id=" 93" o:spid="_x0000_s1026" type="#_x0000_t32" style="position:absolute;margin-left:26.25pt;margin-top:27.6pt;width:133.25pt;height:87.75pt;flip:y;z-index:251680256;visibility:visible;mso-wrap-style:square;mso-width-percent:0;mso-height-percent:0;mso-wrap-distance-left:9pt;mso-wrap-distance-top:0;mso-wrap-distance-right:9pt;mso-wrap-distance-bottom:0;mso-position-horizontal:absolute;mso-position-horizontal-relative:text;mso-position-vertical:absolute;mso-position-vertical-relative:text;mso-width-percent:0;mso-height-percent:0;mso-width-relative:page;mso-height-relative:page" o:gfxdata="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" strokeweight="1.5pt">
                 <o:lock v:ext="edit" shapetype="f"/>
               </v:shape>
             </w:pict>
@@ -8425,7 +8557,7 @@
           </mc:Choice>
           <mc:Fallback>
             <w:pict>
-              <v:shape w14:anchorId="0F0CC1B2" id=" 93" o:spid="_x0000_s1026" type="#_x0000_t32" style="position:absolute;margin-left:21pt;margin-top:146.95pt;width:139pt;height:6.5pt;z-index:251674112;visibility:visible;mso-wrap-style:square;mso-width-percent:0;mso-height-percent:0;mso-wrap-distance-left:9pt;mso-wrap-distance-top:0;mso-wrap-distance-right:9pt;mso-wrap-distance-bottom:0;mso-position-horizontal:absolute;mso-position-horizontal-relative:text;mso-position-vertical:absolute;mso-position-vertical-relative:text;mso-width-percent:0;mso-height-percent:0;mso-width-relative:page;mso-height-relative:page" o:gfxdata="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" strokeweight="1.5pt">
+              <v:shape w14:anchorId="48A7944B" id=" 93" o:spid="_x0000_s1026" type="#_x0000_t32" style="position:absolute;margin-left:21pt;margin-top:146.95pt;width:139pt;height:6.5pt;z-index:251674112;visibility:visible;mso-wrap-style:square;mso-width-percent:0;mso-height-percent:0;mso-wrap-distance-left:9pt;mso-wrap-distance-top:0;mso-wrap-distance-right:9pt;mso-wrap-distance-bottom:0;mso-position-horizontal:absolute;mso-position-horizontal-relative:text;mso-position-vertical:absolute;mso-position-vertical-relative:text;mso-width-percent:0;mso-height-percent:0;mso-width-relative:page;mso-height-relative:page" o:gfxdata="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" strokeweight="1.5pt">
                 <o:lock v:ext="edit" shapetype="f"/>
               </v:shape>
             </w:pict>
@@ -8502,7 +8634,7 @@
           </mc:Choice>
           <mc:Fallback>
             <w:pict>
-              <v:shape w14:anchorId="7AD64666" id=" 94" o:spid="_x0000_s1026" type="#_x0000_t32" style="position:absolute;margin-left:21.5pt;margin-top:155.6pt;width:150.2pt;height:52.5pt;z-index:251675136;visibility:visible;mso-wrap-style:square;mso-width-percent:0;mso-height-percent:0;mso-wrap-distance-left:9pt;mso-wrap-distance-top:0;mso-wrap-distance-right:9pt;mso-wrap-distance-bottom:0;mso-position-horizontal:absolute;mso-position-horizontal-relative:text;mso-position-vertical:absolute;mso-position-vertical-relative:text;mso-width-percent:0;mso-height-percent:0;mso-width-relative:page;mso-height-relative:page" o:gfxdata="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" strokeweight="1.5pt">
+              <v:shape w14:anchorId="13FB7F9E" id=" 94" o:spid="_x0000_s1026" type="#_x0000_t32" style="position:absolute;margin-left:21.5pt;margin-top:155.6pt;width:150.2pt;height:52.5pt;z-index:251675136;visibility:visible;mso-wrap-style:square;mso-width-percent:0;mso-height-percent:0;mso-wrap-distance-left:9pt;mso-wrap-distance-top:0;mso-wrap-distance-right:9pt;mso-wrap-distance-bottom:0;mso-position-horizontal:absolute;mso-position-horizontal-relative:text;mso-position-vertical:absolute;mso-position-vertical-relative:text;mso-width-percent:0;mso-height-percent:0;mso-width-relative:page;mso-height-relative:page" o:gfxdata="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" strokeweight="1.5pt">
                 <o:lock v:ext="edit" shapetype="f"/>
               </v:shape>
             </w:pict>
@@ -9209,7 +9341,7 @@
                     </pic:cNvPicPr>
                   </pic:nvPicPr>
                   <pic:blipFill>
-                    <a:blip r:embed="rId14">
+                    <a:blip r:embed="rId15">
                       <a:extLst>
                         <a:ext uri="{28A0092B-C50C-407E-A947-70E740481C1C}">
                           <a14:useLocalDpi xmlns:a14="http://schemas.microsoft.com/office/drawing/2010/main" val="0"/>
@@ -9287,7 +9419,7 @@
                     </pic:cNvPicPr>
                   </pic:nvPicPr>
                   <pic:blipFill>
-                    <a:blip r:embed="rId15">
+                    <a:blip r:embed="rId16">
                       <a:extLst>
                         <a:ext uri="{28A0092B-C50C-407E-A947-70E740481C1C}">
                           <a14:useLocalDpi xmlns:a14="http://schemas.microsoft.com/office/drawing/2010/main" val="0"/>
@@ -9370,7 +9502,7 @@
                     </pic:cNvPicPr>
                   </pic:nvPicPr>
                   <pic:blipFill>
-                    <a:blip r:embed="rId16">
+                    <a:blip r:embed="rId17">
                       <a:extLst>
                         <a:ext uri="{28A0092B-C50C-407E-A947-70E740481C1C}">
                           <a14:useLocalDpi xmlns:a14="http://schemas.microsoft.com/office/drawing/2010/main" val="0"/>
@@ -9435,7 +9567,7 @@
                     </pic:cNvPicPr>
                   </pic:nvPicPr>
                   <pic:blipFill>
-                    <a:blip r:embed="rId17">
+                    <a:blip r:embed="rId18">
                       <a:extLst>
                         <a:ext uri="{28A0092B-C50C-407E-A947-70E740481C1C}">
                           <a14:useLocalDpi xmlns:a14="http://schemas.microsoft.com/office/drawing/2010/main" val="0"/>
@@ -9584,7 +9716,7 @@
                     </pic:cNvPicPr>
                   </pic:nvPicPr>
                   <pic:blipFill>
-                    <a:blip r:embed="rId18">
+                    <a:blip r:embed="rId19">
                       <a:extLst>
                         <a:ext uri="{28A0092B-C50C-407E-A947-70E740481C1C}">
                           <a14:useLocalDpi xmlns:a14="http://schemas.microsoft.com/office/drawing/2010/main" val="0"/>
@@ -9680,7 +9812,7 @@
                     </pic:cNvPicPr>
                   </pic:nvPicPr>
                   <pic:blipFill>
-                    <a:blip r:embed="rId19">
+                    <a:blip r:embed="rId20">
                       <a:extLst>
                         <a:ext uri="{28A0092B-C50C-407E-A947-70E740481C1C}">
                           <a14:useLocalDpi xmlns:a14="http://schemas.microsoft.com/office/drawing/2010/main" val="0"/>
@@ -9738,6 +9870,7 @@
           <w:rtl/>
         </w:rPr>
       </w:pPr>
+      <w:proofErr w:type="spellStart"/>
       <w:r>
         <w:rPr>
           <w:rFonts w:ascii="David" w:hAnsi="David" w:cs="David"/>
@@ -9745,6 +9878,7 @@
         <w:lastRenderedPageBreak/>
         <w:t>Driving_Lessons_Manger</w:t>
       </w:r>
+      <w:proofErr w:type="spellEnd"/>
     </w:p>
     <w:p>
       <w:pPr>
@@ -9776,7 +9910,7 @@
                     </pic:cNvPicPr>
                   </pic:nvPicPr>
                   <pic:blipFill>
-                    <a:blip r:embed="rId20">
+                    <a:blip r:embed="rId21">
                       <a:extLst>
                         <a:ext uri="{28A0092B-C50C-407E-A947-70E740481C1C}">
                           <a14:useLocalDpi xmlns:a14="http://schemas.microsoft.com/office/drawing/2010/main" val="0"/>
@@ -9838,7 +9972,7 @@
                     </pic:cNvPicPr>
                   </pic:nvPicPr>
                   <pic:blipFill>
-                    <a:blip r:embed="rId21">
+                    <a:blip r:embed="rId22">
                       <a:extLst>
                         <a:ext uri="{28A0092B-C50C-407E-A947-70E740481C1C}">
                           <a14:useLocalDpi xmlns:a14="http://schemas.microsoft.com/office/drawing/2010/main" val="0"/>
@@ -9909,7 +10043,7 @@
                     </pic:cNvPicPr>
                   </pic:nvPicPr>
                   <pic:blipFill>
-                    <a:blip r:embed="rId22">
+                    <a:blip r:embed="rId23">
                       <a:extLst>
                         <a:ext uri="{28A0092B-C50C-407E-A947-70E740481C1C}">
                           <a14:useLocalDpi xmlns:a14="http://schemas.microsoft.com/office/drawing/2010/main" val="0"/>
@@ -9971,7 +10105,7 @@
                     </pic:cNvPicPr>
                   </pic:nvPicPr>
                   <pic:blipFill>
-                    <a:blip r:embed="rId23">
+                    <a:blip r:embed="rId24">
                       <a:extLst>
                         <a:ext uri="{28A0092B-C50C-407E-A947-70E740481C1C}">
                           <a14:useLocalDpi xmlns:a14="http://schemas.microsoft.com/office/drawing/2010/main" val="0"/>
@@ -10033,7 +10167,7 @@
                     </pic:cNvPicPr>
                   </pic:nvPicPr>
                   <pic:blipFill>
-                    <a:blip r:embed="rId24">
+                    <a:blip r:embed="rId25">
                       <a:extLst>
                         <a:ext uri="{28A0092B-C50C-407E-A947-70E740481C1C}">
                           <a14:useLocalDpi xmlns:a14="http://schemas.microsoft.com/office/drawing/2010/main" val="0"/>
@@ -10914,6 +11048,7 @@
         </w:rPr>
       </w:pPr>
       <w:bookmarkStart w:id="20" w:name="_Toc29994024"/>
+      <w:proofErr w:type="spellStart"/>
       <w:r>
         <w:rPr>
           <w:rFonts w:ascii="David" w:hAnsi="David" w:cs="David"/>
@@ -10921,6 +11056,7 @@
         <w:t>SoundService</w:t>
       </w:r>
       <w:bookmarkEnd w:id="20"/>
+      <w:proofErr w:type="spellEnd"/>
     </w:p>
     <w:p>
       <w:pPr>
@@ -10962,6 +11098,7 @@
         </w:rPr>
         <w:t xml:space="preserve"> מופעל ע"י </w:t>
       </w:r>
+      <w:proofErr w:type="spellStart"/>
       <w:r>
         <w:rPr>
           <w:rFonts w:ascii="David" w:hAnsi="David"/>
@@ -10969,6 +11106,7 @@
         </w:rPr>
         <w:t>onStart</w:t>
       </w:r>
+      <w:proofErr w:type="spellEnd"/>
       <w:r>
         <w:rPr>
           <w:rFonts w:ascii="David" w:hAnsi="David"/>
@@ -10977,6 +11115,7 @@
         </w:rPr>
         <w:t xml:space="preserve"> ב-</w:t>
       </w:r>
+      <w:proofErr w:type="spellStart"/>
       <w:r>
         <w:rPr>
           <w:rFonts w:ascii="David" w:hAnsi="David"/>
@@ -10984,6 +11123,7 @@
         </w:rPr>
         <w:t>GameActivity</w:t>
       </w:r>
+      <w:proofErr w:type="spellEnd"/>
       <w:r>
         <w:rPr>
           <w:rFonts w:ascii="David" w:hAnsi="David"/>
@@ -11003,6 +11143,7 @@
         </w:rPr>
       </w:pPr>
       <w:bookmarkStart w:id="21" w:name="_Toc29994025"/>
+      <w:proofErr w:type="spellStart"/>
       <w:r>
         <w:rPr>
           <w:rFonts w:ascii="David" w:hAnsi="David" w:cs="David"/>
@@ -11010,6 +11151,7 @@
         <w:t>VibratorService</w:t>
       </w:r>
       <w:bookmarkEnd w:id="21"/>
+      <w:proofErr w:type="spellEnd"/>
     </w:p>
     <w:p>
       <w:pPr>
@@ -11029,6 +11171,7 @@
         </w:rPr>
         <w:t>שירות של המערכת, המפעיל את הרטט במכשיר. נעשה בו שימוש ב-</w:t>
       </w:r>
+      <w:proofErr w:type="spellStart"/>
       <w:r>
         <w:rPr>
           <w:rFonts w:ascii="David" w:hAnsi="David"/>
@@ -11036,6 +11179,7 @@
         </w:rPr>
         <w:t>GameActivity</w:t>
       </w:r>
+      <w:proofErr w:type="spellEnd"/>
       <w:r>
         <w:rPr>
           <w:rFonts w:ascii="David" w:hAnsi="David"/>
@@ -11207,6 +11351,7 @@
         </w:rPr>
       </w:pPr>
       <w:bookmarkStart w:id="24" w:name="_Toc29994027"/>
+      <w:proofErr w:type="spellStart"/>
       <w:r>
         <w:rPr>
           <w:rFonts w:ascii="David" w:hAnsi="David" w:cs="David"/>
@@ -11214,6 +11359,7 @@
         <w:t>FinalAnimationThread</w:t>
       </w:r>
       <w:bookmarkEnd w:id="24"/>
+      <w:proofErr w:type="spellEnd"/>
     </w:p>
     <w:p>
       <w:pPr>
@@ -11233,6 +11379,7 @@
         </w:rPr>
         <w:t>מנהל את האנימציה במשחק. מופעל ע"י ה-</w:t>
       </w:r>
+      <w:proofErr w:type="spellStart"/>
       <w:r>
         <w:rPr>
           <w:rFonts w:ascii="David" w:hAnsi="David"/>
@@ -11240,6 +11387,7 @@
         </w:rPr>
         <w:t>GameActivity</w:t>
       </w:r>
+      <w:proofErr w:type="spellEnd"/>
       <w:r>
         <w:rPr>
           <w:rFonts w:ascii="David" w:hAnsi="David"/>
@@ -11253,8 +11401,17 @@
           <w:rFonts w:ascii="David" w:hAnsi="David"/>
           <w:color w:val="0000FF"/>
         </w:rPr>
-        <w:t xml:space="preserve"> GameActivity</w:t>
-      </w:r>
+        <w:t xml:space="preserve"> </w:t>
+      </w:r>
+      <w:proofErr w:type="spellStart"/>
+      <w:r>
+        <w:rPr>
+          <w:rFonts w:ascii="David" w:hAnsi="David"/>
+          <w:color w:val="0000FF"/>
+        </w:rPr>
+        <w:t>GameActivity</w:t>
+      </w:r>
+      <w:proofErr w:type="spellEnd"/>
       <w:r>
         <w:rPr>
           <w:rFonts w:ascii="David" w:hAnsi="David"/>
@@ -11278,6 +11435,7 @@
         </w:rPr>
         <w:t xml:space="preserve">  הממומש ע"י המחלקה </w:t>
       </w:r>
+      <w:proofErr w:type="spellStart"/>
       <w:r>
         <w:rPr>
           <w:rFonts w:ascii="David" w:hAnsi="David"/>
@@ -11285,6 +11443,7 @@
         </w:rPr>
         <w:t>AnimationHandler</w:t>
       </w:r>
+      <w:proofErr w:type="spellEnd"/>
       <w:r>
         <w:rPr>
           <w:rFonts w:ascii="David" w:hAnsi="David"/>
@@ -11509,7 +11668,23 @@
           <w:rFonts w:ascii="David" w:hAnsi="David" w:hint="cs"/>
           <w:rtl/>
         </w:rPr>
-        <w:t>במהלך הפרויקט היה לי בראש, עוד מתחילתו, את העיצוב. ידעתי מראש איפה אני רוצה שכל כפתור יהיה, כל מסך ייראה וכו'.</w:t>
+        <w:t xml:space="preserve">במהלך הפרויקט היה לי בראש, עוד מתחילתו, את העיצוב. ידעתי מראש איפה אני רוצה שכל כפתור יהיה, כל מסך ייראה </w:t>
+      </w:r>
+      <w:proofErr w:type="spellStart"/>
+      <w:r>
+        <w:rPr>
+          <w:rFonts w:ascii="David" w:hAnsi="David" w:hint="cs"/>
+          <w:rtl/>
+        </w:rPr>
+        <w:t>וכו</w:t>
+      </w:r>
+      <w:proofErr w:type="spellEnd"/>
+      <w:r>
+        <w:rPr>
+          <w:rFonts w:ascii="David" w:hAnsi="David" w:hint="cs"/>
+          <w:rtl/>
+        </w:rPr>
+        <w:t>'.</w:t>
       </w:r>
     </w:p>
     <w:p>
@@ -11756,6 +11931,7 @@
                 <w:szCs w:val="24"/>
               </w:rPr>
             </w:pPr>
+            <w:proofErr w:type="spellStart"/>
             <w:r>
               <w:rPr>
                 <w:rFonts w:ascii="David" w:hAnsi="David" w:cs="David"/>
@@ -11776,6 +11952,7 @@
               </w:rPr>
               <w:t>.cs</w:t>
             </w:r>
+            <w:proofErr w:type="spellEnd"/>
           </w:p>
         </w:tc>
         <w:tc>
@@ -11880,6 +12057,7 @@
                 <w:rtl/>
               </w:rPr>
             </w:pPr>
+            <w:proofErr w:type="spellStart"/>
             <w:r>
               <w:rPr>
                 <w:rFonts w:ascii="David" w:hAnsi="David" w:cs="David"/>
@@ -11900,6 +12078,7 @@
               </w:rPr>
               <w:t>o.cs</w:t>
             </w:r>
+            <w:proofErr w:type="spellEnd"/>
           </w:p>
         </w:tc>
         <w:tc>
@@ -11983,6 +12162,7 @@
                 <w:rtl/>
               </w:rPr>
             </w:pPr>
+            <w:proofErr w:type="spellStart"/>
             <w:r>
               <w:rPr>
                 <w:rFonts w:ascii="David" w:hAnsi="David" w:cs="David"/>
@@ -11993,6 +12173,7 @@
               </w:rPr>
               <w:t>Settings.cs</w:t>
             </w:r>
+            <w:proofErr w:type="spellEnd"/>
           </w:p>
         </w:tc>
         <w:tc>
@@ -12098,6 +12279,7 @@
                 <w:rtl/>
               </w:rPr>
             </w:pPr>
+            <w:proofErr w:type="spellStart"/>
             <w:r>
               <w:rPr>
                 <w:rFonts w:ascii="David" w:hAnsi="David" w:cs="David"/>
@@ -12108,6 +12290,7 @@
               </w:rPr>
               <w:t>ListOfLessons.cs</w:t>
             </w:r>
+            <w:proofErr w:type="spellEnd"/>
           </w:p>
         </w:tc>
         <w:tc>
@@ -12191,6 +12374,7 @@
                 <w:rtl/>
               </w:rPr>
             </w:pPr>
+            <w:proofErr w:type="spellStart"/>
             <w:r>
               <w:rPr>
                 <w:rFonts w:ascii="David" w:hAnsi="David" w:cs="David"/>
@@ -12201,6 +12385,7 @@
               </w:rPr>
               <w:t>PickTeacher.cs</w:t>
             </w:r>
+            <w:proofErr w:type="spellEnd"/>
           </w:p>
         </w:tc>
         <w:tc>
@@ -12284,6 +12469,7 @@
                 <w:rtl/>
               </w:rPr>
             </w:pPr>
+            <w:proofErr w:type="spellStart"/>
             <w:r>
               <w:rPr>
                 <w:rFonts w:ascii="David" w:hAnsi="David" w:cs="David"/>
@@ -12294,6 +12480,7 @@
               </w:rPr>
               <w:t>MainActivity.cs</w:t>
             </w:r>
+            <w:proofErr w:type="spellEnd"/>
           </w:p>
         </w:tc>
         <w:tc>
@@ -12377,6 +12564,7 @@
                 <w:rtl/>
               </w:rPr>
             </w:pPr>
+            <w:proofErr w:type="spellStart"/>
             <w:r>
               <w:rPr>
                 <w:rFonts w:ascii="David" w:hAnsi="David" w:cs="David"/>
@@ -12387,6 +12575,7 @@
               </w:rPr>
               <w:t>NewLesson.cs</w:t>
             </w:r>
+            <w:proofErr w:type="spellEnd"/>
           </w:p>
         </w:tc>
         <w:tc>
@@ -12470,6 +12659,7 @@
                 <w:rtl/>
               </w:rPr>
             </w:pPr>
+            <w:proofErr w:type="spellStart"/>
             <w:r>
               <w:rPr>
                 <w:rFonts w:ascii="David" w:hAnsi="David" w:cs="David"/>
@@ -12480,6 +12670,7 @@
               </w:rPr>
               <w:t>ListOfLessons.cs</w:t>
             </w:r>
+            <w:proofErr w:type="spellEnd"/>
           </w:p>
         </w:tc>
         <w:tc>
@@ -12563,6 +12754,7 @@
                 <w:rtl/>
               </w:rPr>
             </w:pPr>
+            <w:proofErr w:type="spellStart"/>
             <w:r>
               <w:rPr>
                 <w:rFonts w:ascii="David" w:hAnsi="David" w:cs="David"/>
@@ -12573,6 +12765,7 @@
               </w:rPr>
               <w:t>StudentActivityRegister.cs</w:t>
             </w:r>
+            <w:proofErr w:type="spellEnd"/>
           </w:p>
         </w:tc>
         <w:tc>
@@ -12667,6 +12860,7 @@
                 <w:rtl/>
               </w:rPr>
             </w:pPr>
+            <w:proofErr w:type="spellStart"/>
             <w:r>
               <w:rPr>
                 <w:rFonts w:ascii="David" w:hAnsi="David" w:cs="David"/>
@@ -12677,6 +12871,7 @@
               </w:rPr>
               <w:t>StudentActivity.cs</w:t>
             </w:r>
+            <w:proofErr w:type="spellEnd"/>
           </w:p>
         </w:tc>
         <w:tc>
@@ -12783,6 +12978,7 @@
                 <w:rtl/>
               </w:rPr>
             </w:pPr>
+            <w:proofErr w:type="spellStart"/>
             <w:r>
               <w:rPr>
                 <w:rFonts w:ascii="David" w:hAnsi="David" w:cs="David"/>
@@ -12793,6 +12989,7 @@
               </w:rPr>
               <w:t>TeacherActivityRegister.cs</w:t>
             </w:r>
+            <w:proofErr w:type="spellEnd"/>
           </w:p>
         </w:tc>
         <w:tc>
@@ -12876,6 +13073,7 @@
                 <w:rtl/>
               </w:rPr>
             </w:pPr>
+            <w:proofErr w:type="spellStart"/>
             <w:r>
               <w:rPr>
                 <w:rFonts w:ascii="David" w:hAnsi="David" w:cs="David"/>
@@ -12886,6 +13084,7 @@
               </w:rPr>
               <w:t>TeacherActivity.cs</w:t>
             </w:r>
+            <w:proofErr w:type="spellEnd"/>
           </w:p>
         </w:tc>
         <w:tc>
@@ -13025,6 +13224,7 @@
                 <w:rtl/>
               </w:rPr>
             </w:pPr>
+            <w:proofErr w:type="spellStart"/>
             <w:r>
               <w:rPr>
                 <w:rFonts w:ascii="David" w:hAnsi="David" w:cs="David"/>
@@ -13035,6 +13235,7 @@
               </w:rPr>
               <w:t>WhatsNewActivity.cs</w:t>
             </w:r>
+            <w:proofErr w:type="spellEnd"/>
           </w:p>
         </w:tc>
         <w:tc>
@@ -13250,12 +13451,14 @@
                 <w:rtl/>
               </w:rPr>
             </w:pPr>
+            <w:proofErr w:type="spellStart"/>
             <w:r>
               <w:rPr>
                 <w:rFonts w:ascii="David" w:hAnsi="David"/>
               </w:rPr>
               <w:t>mnuMainActivity</w:t>
             </w:r>
+            <w:proofErr w:type="spellEnd"/>
           </w:p>
         </w:tc>
         <w:tc>
@@ -13321,12 +13524,14 @@
                 <w:rtl/>
               </w:rPr>
             </w:pPr>
+            <w:proofErr w:type="spellStart"/>
             <w:r>
               <w:rPr>
                 <w:rFonts w:ascii="David" w:hAnsi="David"/>
               </w:rPr>
               <w:t>mnuExit</w:t>
             </w:r>
+            <w:proofErr w:type="spellEnd"/>
           </w:p>
         </w:tc>
         <w:tc>
@@ -13372,8 +13577,17 @@
                 <w:rFonts w:ascii="David" w:hAnsi="David" w:hint="cs"/>
                 <w:rtl/>
               </w:rPr>
-              <w:t>יוצא מהפליקציה</w:t>
-            </w:r>
+              <w:t xml:space="preserve">יוצא </w:t>
+            </w:r>
+            <w:proofErr w:type="spellStart"/>
+            <w:r>
+              <w:rPr>
+                <w:rFonts w:ascii="David" w:hAnsi="David" w:hint="cs"/>
+                <w:rtl/>
+              </w:rPr>
+              <w:t>מהפליקציה</w:t>
+            </w:r>
+            <w:proofErr w:type="spellEnd"/>
           </w:p>
         </w:tc>
       </w:tr>
@@ -13395,6 +13609,7 @@
         </w:rPr>
       </w:pPr>
       <w:bookmarkStart w:id="35" w:name="_Toc29994037"/>
+      <w:proofErr w:type="spellStart"/>
       <w:r>
         <w:rPr>
           <w:rFonts w:ascii="David" w:hAnsi="David" w:cs="David"/>
@@ -13402,23 +13617,109 @@
         <w:t>Drawables</w:t>
       </w:r>
       <w:bookmarkEnd w:id="35"/>
+      <w:proofErr w:type="spellEnd"/>
     </w:p>
     <w:p>
       <w:pPr>
-        <w:spacing w:line="276" w:lineRule="auto"/>
-        <w:rPr>
-          <w:rFonts w:ascii="David" w:hAnsi="David"/>
-          <w:color w:val="0000FF"/>
-          <w:rtl/>
-        </w:rPr>
-      </w:pPr>
-      <w:r>
-        <w:rPr>
-          <w:rFonts w:ascii="David" w:hAnsi="David"/>
-          <w:color w:val="0000FF"/>
-          <w:rtl/>
-        </w:rPr>
-        <w:t>אם יש הרבה תמונות מאותה סידרה (למשל – קלפי משחק) יש לציין מהי החוקיות של השמות שלהם, אבל אין צורך לפרט על כל אחד בנפרד.</w:t>
+        <w:jc w:val="center"/>
+        <w:rPr>
+          <w:rFonts w:ascii="David" w:hAnsi="David"/>
+          <w:sz w:val="28"/>
+          <w:szCs w:val="28"/>
+        </w:rPr>
+      </w:pPr>
+      <w:r>
+        <w:rPr>
+          <w:rFonts w:ascii="David" w:hAnsi="David"/>
+          <w:b/>
+          <w:bCs/>
+          <w:noProof/>
+          <w:sz w:val="28"/>
+          <w:szCs w:val="28"/>
+          <w:u w:val="single"/>
+        </w:rPr>
+        <w:drawing>
+          <wp:anchor distT="0" distB="0" distL="114300" distR="114300" simplePos="0" relativeHeight="251694592" behindDoc="0" locked="0" layoutInCell="1" allowOverlap="1" wp14:anchorId="2814BCC6" wp14:editId="21D65D9D">
+            <wp:simplePos x="0" y="0"/>
+            <wp:positionH relativeFrom="margin">
+              <wp:align>center</wp:align>
+            </wp:positionH>
+            <wp:positionV relativeFrom="paragraph">
+              <wp:posOffset>586740</wp:posOffset>
+            </wp:positionV>
+            <wp:extent cx="3905250" cy="3905250"/>
+            <wp:effectExtent l="0" t="0" r="0" b="0"/>
+            <wp:wrapTopAndBottom/>
+            <wp:docPr id="100" name="תמונה 100"/>
+            <wp:cNvGraphicFramePr>
+              <a:graphicFrameLocks xmlns:a="http://schemas.openxmlformats.org/drawingml/2006/main" noChangeAspect="1"/>
+            </wp:cNvGraphicFramePr>
+            <a:graphic xmlns:a="http://schemas.openxmlformats.org/drawingml/2006/main">
+              <a:graphicData uri="http://schemas.openxmlformats.org/drawingml/2006/picture">
+                <pic:pic xmlns:pic="http://schemas.openxmlformats.org/drawingml/2006/picture">
+                  <pic:nvPicPr>
+                    <pic:cNvPr id="0" name="Picture 14"/>
+                    <pic:cNvPicPr>
+                      <a:picLocks noChangeAspect="1" noChangeArrowheads="1"/>
+                    </pic:cNvPicPr>
+                  </pic:nvPicPr>
+                  <pic:blipFill>
+                    <a:blip r:embed="rId9">
+                      <a:extLst>
+                        <a:ext uri="{28A0092B-C50C-407E-A947-70E740481C1C}">
+                          <a14:useLocalDpi xmlns:a14="http://schemas.microsoft.com/office/drawing/2010/main" val="0"/>
+                        </a:ext>
+                      </a:extLst>
+                    </a:blip>
+                    <a:srcRect/>
+                    <a:stretch>
+                      <a:fillRect/>
+                    </a:stretch>
+                  </pic:blipFill>
+                  <pic:spPr bwMode="auto">
+                    <a:xfrm>
+                      <a:off x="0" y="0"/>
+                      <a:ext cx="3905250" cy="3905250"/>
+                    </a:xfrm>
+                    <a:prstGeom prst="rect">
+                      <a:avLst/>
+                    </a:prstGeom>
+                    <a:noFill/>
+                    <a:ln>
+                      <a:noFill/>
+                    </a:ln>
+                  </pic:spPr>
+                </pic:pic>
+              </a:graphicData>
+            </a:graphic>
+            <wp14:sizeRelH relativeFrom="margin">
+              <wp14:pctWidth>0</wp14:pctWidth>
+            </wp14:sizeRelH>
+            <wp14:sizeRelV relativeFrom="margin">
+              <wp14:pctHeight>0</wp14:pctHeight>
+            </wp14:sizeRelV>
+          </wp:anchor>
+        </w:drawing>
+      </w:r>
+      <w:r>
+        <w:rPr>
+          <w:rFonts w:ascii="David" w:hAnsi="David"/>
+          <w:b/>
+          <w:bCs/>
+          <w:sz w:val="28"/>
+          <w:szCs w:val="28"/>
+          <w:u w:val="single"/>
+        </w:rPr>
+        <w:t>car.png</w:t>
+      </w:r>
+      <w:r>
+        <w:rPr>
+          <w:rFonts w:ascii="David" w:hAnsi="David"/>
+          <w:sz w:val="28"/>
+          <w:szCs w:val="28"/>
+          <w:rtl/>
+        </w:rPr>
+        <w:t xml:space="preserve"> – האייקון של האפליקציה</w:t>
       </w:r>
     </w:p>
     <w:p>
@@ -13729,6 +14030,7 @@
           <w:szCs w:val="18"/>
         </w:rPr>
       </w:pPr>
+      <w:proofErr w:type="spellStart"/>
       <w:r>
         <w:rPr>
           <w:rFonts w:ascii="David" w:hAnsi="David"/>
@@ -13736,7 +14038,17 @@
           <w:sz w:val="18"/>
           <w:szCs w:val="18"/>
         </w:rPr>
-        <w:t>Settings.loadUserDetailsFromText()</w:t>
+        <w:t>Settings.loadUserDetailsFromText</w:t>
+      </w:r>
+      <w:proofErr w:type="spellEnd"/>
+      <w:r>
+        <w:rPr>
+          <w:rFonts w:ascii="David" w:hAnsi="David"/>
+          <w:color w:val="0033CC"/>
+          <w:sz w:val="18"/>
+          <w:szCs w:val="18"/>
+        </w:rPr>
+        <w:t>()</w:t>
       </w:r>
     </w:p>
     <w:p>
@@ -13755,6 +14067,7 @@
           <w:szCs w:val="18"/>
         </w:rPr>
       </w:pPr>
+      <w:proofErr w:type="spellStart"/>
       <w:r>
         <w:rPr>
           <w:rFonts w:ascii="David" w:hAnsi="David"/>
@@ -13764,6 +14077,7 @@
         </w:rPr>
         <w:t>Settings.saveUserDetailsToText</w:t>
       </w:r>
+      <w:proofErr w:type="spellEnd"/>
     </w:p>
     <w:p>
       <w:pPr>
@@ -13781,6 +14095,7 @@
           <w:szCs w:val="18"/>
         </w:rPr>
       </w:pPr>
+      <w:proofErr w:type="spellStart"/>
       <w:r>
         <w:rPr>
           <w:rFonts w:ascii="David" w:hAnsi="David"/>
@@ -13788,7 +14103,17 @@
           <w:sz w:val="18"/>
           <w:szCs w:val="18"/>
         </w:rPr>
-        <w:t>MainActivity.isNotificationVisible()</w:t>
+        <w:t>MainActivity.isNotificationVisible</w:t>
+      </w:r>
+      <w:proofErr w:type="spellEnd"/>
+      <w:r>
+        <w:rPr>
+          <w:rFonts w:ascii="David" w:hAnsi="David"/>
+          <w:color w:val="0033CC"/>
+          <w:sz w:val="18"/>
+          <w:szCs w:val="18"/>
+        </w:rPr>
+        <w:t>()</w:t>
       </w:r>
       <w:r>
         <w:rPr>
@@ -13816,6 +14141,7 @@
           <w:szCs w:val="18"/>
         </w:rPr>
       </w:pPr>
+      <w:proofErr w:type="spellStart"/>
       <w:r>
         <w:rPr>
           <w:rFonts w:ascii="David" w:hAnsi="David"/>
@@ -13823,7 +14149,17 @@
           <w:sz w:val="18"/>
           <w:szCs w:val="18"/>
         </w:rPr>
-        <w:t>Receiver.loadUserDetailsFromText()</w:t>
+        <w:t>Receiver.loadUserDetailsFromText</w:t>
+      </w:r>
+      <w:proofErr w:type="spellEnd"/>
+      <w:r>
+        <w:rPr>
+          <w:rFonts w:ascii="David" w:hAnsi="David"/>
+          <w:color w:val="0033CC"/>
+          <w:sz w:val="18"/>
+          <w:szCs w:val="18"/>
+        </w:rPr>
+        <w:t>()</w:t>
       </w:r>
       <w:r>
         <w:rPr>
@@ -13915,7 +14251,63 @@
           <w:sz w:val="19"/>
           <w:szCs w:val="19"/>
         </w:rPr>
-        <w:t>["Show notification" CheckBox state as string] ; [Email Address]; [Phone Number]; [User's Name]</w:t>
+        <w:t xml:space="preserve">["Show notification" </w:t>
+      </w:r>
+      <w:proofErr w:type="spellStart"/>
+      <w:r>
+        <w:rPr>
+          <w:rFonts w:ascii="David" w:hAnsi="David"/>
+          <w:b/>
+          <w:bCs/>
+          <w:i/>
+          <w:iCs/>
+          <w:color w:val="0000FF"/>
+          <w:sz w:val="19"/>
+          <w:szCs w:val="19"/>
+        </w:rPr>
+        <w:t>CheckBox</w:t>
+      </w:r>
+      <w:proofErr w:type="spellEnd"/>
+      <w:r>
+        <w:rPr>
+          <w:rFonts w:ascii="David" w:hAnsi="David"/>
+          <w:b/>
+          <w:bCs/>
+          <w:i/>
+          <w:iCs/>
+          <w:color w:val="0000FF"/>
+          <w:sz w:val="19"/>
+          <w:szCs w:val="19"/>
+        </w:rPr>
+        <w:t xml:space="preserve"> state as string</w:t>
+      </w:r>
+      <w:proofErr w:type="gramStart"/>
+      <w:r>
+        <w:rPr>
+          <w:rFonts w:ascii="David" w:hAnsi="David"/>
+          <w:b/>
+          <w:bCs/>
+          <w:i/>
+          <w:iCs/>
+          <w:color w:val="0000FF"/>
+          <w:sz w:val="19"/>
+          <w:szCs w:val="19"/>
+        </w:rPr>
+        <w:t>] ;</w:t>
+      </w:r>
+      <w:proofErr w:type="gramEnd"/>
+      <w:r>
+        <w:rPr>
+          <w:rFonts w:ascii="David" w:hAnsi="David"/>
+          <w:b/>
+          <w:bCs/>
+          <w:i/>
+          <w:iCs/>
+          <w:color w:val="0000FF"/>
+          <w:sz w:val="19"/>
+          <w:szCs w:val="19"/>
+        </w:rPr>
+        <w:t xml:space="preserve"> [Email Address]; [Phone Number]; [User's Name]</w:t>
       </w:r>
     </w:p>
     <w:p>
@@ -13964,14 +14356,23 @@
           <w:color w:val="0000FF"/>
         </w:rPr>
       </w:pPr>
-      <w:r>
-        <w:rPr>
-          <w:rFonts w:ascii="David" w:hAnsi="David"/>
-          <w:color w:val="0000FF"/>
-        </w:rPr>
-        <w:t xml:space="preserve">false ; </w:t>
-      </w:r>
-      <w:hyperlink r:id="rId25" w:history="1">
+      <w:proofErr w:type="gramStart"/>
+      <w:r>
+        <w:rPr>
+          <w:rFonts w:ascii="David" w:hAnsi="David"/>
+          <w:color w:val="0000FF"/>
+        </w:rPr>
+        <w:t>false ;</w:t>
+      </w:r>
+      <w:proofErr w:type="gramEnd"/>
+      <w:r>
+        <w:rPr>
+          <w:rFonts w:ascii="David" w:hAnsi="David"/>
+          <w:color w:val="0000FF"/>
+        </w:rPr>
+        <w:t xml:space="preserve"> </w:t>
+      </w:r>
+      <w:hyperlink r:id="rId26" w:history="1">
         <w:r>
           <w:rPr>
             <w:rFonts w:ascii="David" w:hAnsi="David"/>
@@ -13997,14 +14398,23 @@
           <w:color w:val="0000FF"/>
         </w:rPr>
       </w:pPr>
-      <w:r>
-        <w:rPr>
-          <w:rFonts w:ascii="David" w:hAnsi="David"/>
-          <w:color w:val="0000FF"/>
-        </w:rPr>
-        <w:t xml:space="preserve">true ; </w:t>
-      </w:r>
-      <w:hyperlink r:id="rId26" w:history="1">
+      <w:proofErr w:type="gramStart"/>
+      <w:r>
+        <w:rPr>
+          <w:rFonts w:ascii="David" w:hAnsi="David"/>
+          <w:color w:val="0000FF"/>
+        </w:rPr>
+        <w:t>true ;</w:t>
+      </w:r>
+      <w:proofErr w:type="gramEnd"/>
+      <w:r>
+        <w:rPr>
+          <w:rFonts w:ascii="David" w:hAnsi="David"/>
+          <w:color w:val="0000FF"/>
+        </w:rPr>
+        <w:t xml:space="preserve"> </w:t>
+      </w:r>
+      <w:hyperlink r:id="rId27" w:history="1">
         <w:r>
           <w:rPr>
             <w:rFonts w:ascii="David" w:hAnsi="David"/>
@@ -14374,7 +14784,7 @@
                           </pic:cNvPicPr>
                         </pic:nvPicPr>
                         <pic:blipFill>
-                          <a:blip r:embed="rId27" cstate="print">
+                          <a:blip r:embed="rId28" cstate="print">
                             <a:extLst>
                               <a:ext uri="{28A0092B-C50C-407E-A947-70E740481C1C}">
                                 <a14:useLocalDpi xmlns:a14="http://schemas.microsoft.com/office/drawing/2010/main" val="0"/>
@@ -14736,6 +15146,7 @@
                 <w:sz w:val="24"/>
               </w:rPr>
             </w:pPr>
+            <w:proofErr w:type="spellStart"/>
             <w:r>
               <w:rPr>
                 <w:rFonts w:ascii="David" w:hAnsi="David"/>
@@ -14744,6 +15155,7 @@
               </w:rPr>
               <w:t>CityNo</w:t>
             </w:r>
+            <w:proofErr w:type="spellEnd"/>
           </w:p>
         </w:tc>
         <w:tc>
@@ -14856,6 +15268,7 @@
                 <w:sz w:val="24"/>
               </w:rPr>
             </w:pPr>
+            <w:proofErr w:type="spellStart"/>
             <w:r>
               <w:rPr>
                 <w:rFonts w:ascii="David" w:hAnsi="David"/>
@@ -14864,6 +15277,7 @@
               </w:rPr>
               <w:t>BirthDate</w:t>
             </w:r>
+            <w:proofErr w:type="spellEnd"/>
           </w:p>
         </w:tc>
         <w:tc>
@@ -14879,6 +15293,7 @@
                 <w:sz w:val="24"/>
               </w:rPr>
             </w:pPr>
+            <w:proofErr w:type="spellStart"/>
             <w:r>
               <w:rPr>
                 <w:rFonts w:ascii="David" w:hAnsi="David"/>
@@ -14887,6 +15302,7 @@
               </w:rPr>
               <w:t>DateTime</w:t>
             </w:r>
+            <w:proofErr w:type="spellEnd"/>
           </w:p>
         </w:tc>
         <w:tc>
@@ -15213,7 +15629,25 @@
           <w:color w:val="0000FF"/>
           <w:rtl/>
         </w:rPr>
-        <w:t xml:space="preserve"> – מה היא עושה, לאיזה צורך היא עונה וכו'.</w:t>
+        <w:t xml:space="preserve"> – מה היא עושה, לאיזה צורך היא עונה </w:t>
+      </w:r>
+      <w:proofErr w:type="spellStart"/>
+      <w:r>
+        <w:rPr>
+          <w:rFonts w:ascii="David" w:hAnsi="David"/>
+          <w:color w:val="0000FF"/>
+          <w:rtl/>
+        </w:rPr>
+        <w:t>וכו</w:t>
+      </w:r>
+      <w:proofErr w:type="spellEnd"/>
+      <w:r>
+        <w:rPr>
+          <w:rFonts w:ascii="David" w:hAnsi="David"/>
+          <w:color w:val="0000FF"/>
+          <w:rtl/>
+        </w:rPr>
+        <w:t>'.</w:t>
       </w:r>
     </w:p>
     <w:p>
@@ -15240,13 +15674,23 @@
         </w:rPr>
         <w:t xml:space="preserve">copy-paste </w:t>
       </w:r>
-      <w:r>
-        <w:rPr>
-          <w:rFonts w:ascii="David" w:hAnsi="David"/>
-          <w:color w:val="0000FF"/>
-          <w:rtl/>
-        </w:rPr>
-        <w:t>מויקיפדיה או מאתר כלשהו).</w:t>
+      <w:proofErr w:type="spellStart"/>
+      <w:r>
+        <w:rPr>
+          <w:rFonts w:ascii="David" w:hAnsi="David"/>
+          <w:color w:val="0000FF"/>
+          <w:rtl/>
+        </w:rPr>
+        <w:t>מויקיפדיה</w:t>
+      </w:r>
+      <w:proofErr w:type="spellEnd"/>
+      <w:r>
+        <w:rPr>
+          <w:rFonts w:ascii="David" w:hAnsi="David"/>
+          <w:color w:val="0000FF"/>
+          <w:rtl/>
+        </w:rPr>
+        <w:t xml:space="preserve"> או מאתר כלשהו).</w:t>
       </w:r>
     </w:p>
     <w:p>
@@ -15380,7 +15824,43 @@
           <w:color w:val="0000FF"/>
           <w:rtl/>
         </w:rPr>
-        <w:t>הצגה גרפית של לוח המשחק דו-מימדית ותלת-מימדית מנקודת המבט של השחקן.</w:t>
+        <w:t>הצגה גרפית של לוח המשחק דו-</w:t>
+      </w:r>
+      <w:proofErr w:type="spellStart"/>
+      <w:r>
+        <w:rPr>
+          <w:rFonts w:ascii="David" w:hAnsi="David"/>
+          <w:color w:val="0000FF"/>
+          <w:rtl/>
+        </w:rPr>
+        <w:t>מימדית</w:t>
+      </w:r>
+      <w:proofErr w:type="spellEnd"/>
+      <w:r>
+        <w:rPr>
+          <w:rFonts w:ascii="David" w:hAnsi="David"/>
+          <w:color w:val="0000FF"/>
+          <w:rtl/>
+        </w:rPr>
+        <w:t xml:space="preserve"> ותלת-</w:t>
+      </w:r>
+      <w:proofErr w:type="spellStart"/>
+      <w:r>
+        <w:rPr>
+          <w:rFonts w:ascii="David" w:hAnsi="David"/>
+          <w:color w:val="0000FF"/>
+          <w:rtl/>
+        </w:rPr>
+        <w:t>מימדית</w:t>
+      </w:r>
+      <w:proofErr w:type="spellEnd"/>
+      <w:r>
+        <w:rPr>
+          <w:rFonts w:ascii="David" w:hAnsi="David"/>
+          <w:color w:val="0000FF"/>
+          <w:rtl/>
+        </w:rPr>
+        <w:t xml:space="preserve"> מנקודת המבט של השחקן.</w:t>
       </w:r>
     </w:p>
     <w:p>
@@ -18315,7 +18795,29 @@
           <w:color w:val="0000FF"/>
           <w:rtl/>
         </w:rPr>
-        <w:t xml:space="preserve"> שנפתח וכו'.</w:t>
+        <w:t xml:space="preserve"> שנפתח </w:t>
+      </w:r>
+      <w:proofErr w:type="spellStart"/>
+      <w:r>
+        <w:rPr>
+          <w:rFonts w:ascii="David" w:hAnsi="David"/>
+          <w:b/>
+          <w:bCs/>
+          <w:color w:val="0000FF"/>
+          <w:rtl/>
+        </w:rPr>
+        <w:t>וכו</w:t>
+      </w:r>
+      <w:proofErr w:type="spellEnd"/>
+      <w:r>
+        <w:rPr>
+          <w:rFonts w:ascii="David" w:hAnsi="David"/>
+          <w:b/>
+          <w:bCs/>
+          <w:color w:val="0000FF"/>
+          <w:rtl/>
+        </w:rPr>
+        <w:t>'.</w:t>
       </w:r>
     </w:p>
     <w:p>
@@ -18342,7 +18844,25 @@
           <w:color w:val="0000FF"/>
           <w:rtl/>
         </w:rPr>
-        <w:t xml:space="preserve"> ניתן להניח כי הקורא הוא אינטיליגנטי מספיק כדי לדעת לקרוא את הכתוב על הכפתורים, לכן יש צורך להרחיב רק לגבי כפתורים/אופציות בתפריט אשר אינם מובנים מאליהם או שבקוד מאחור קורים דברים שאינם טריוויאליים (למשל – כאשר בוחרים "המשך משחק" המערכת ממשיכה את המשחק האחרון, בעוד ש"התחל משחק חדש" ימחק את המשחק השמור ויתחיל חדש, אחרי שיפתח </w:t>
+        <w:t xml:space="preserve"> ניתן להניח כי הקורא הוא </w:t>
+      </w:r>
+      <w:proofErr w:type="spellStart"/>
+      <w:r>
+        <w:rPr>
+          <w:rFonts w:ascii="David" w:hAnsi="David"/>
+          <w:color w:val="0000FF"/>
+          <w:rtl/>
+        </w:rPr>
+        <w:t>אינטיליגנטי</w:t>
+      </w:r>
+      <w:proofErr w:type="spellEnd"/>
+      <w:r>
+        <w:rPr>
+          <w:rFonts w:ascii="David" w:hAnsi="David"/>
+          <w:color w:val="0000FF"/>
+          <w:rtl/>
+        </w:rPr>
+        <w:t xml:space="preserve"> מספיק כדי לדעת לקרוא את הכתוב על הכפתורים, לכן יש צורך להרחיב רק לגבי כפתורים/אופציות בתפריט אשר אינם מובנים מאליהם או שבקוד מאחור קורים דברים שאינם טריוויאליים (למשל – כאשר בוחרים "המשך משחק" המערכת ממשיכה את המשחק האחרון, בעוד ש"התחל משחק חדש" ימחק את המשחק השמור ויתחיל חדש, אחרי שיפתח </w:t>
       </w:r>
       <w:r>
         <w:rPr>
@@ -18392,6 +18912,7 @@
         </w:rPr>
         <w:t xml:space="preserve"> (למשל – ב-</w:t>
       </w:r>
+      <w:proofErr w:type="spellStart"/>
       <w:r>
         <w:rPr>
           <w:rFonts w:ascii="David" w:hAnsi="David"/>
@@ -18399,6 +18920,7 @@
         </w:rPr>
         <w:t>onPause</w:t>
       </w:r>
+      <w:proofErr w:type="spellEnd"/>
       <w:r>
         <w:rPr>
           <w:rFonts w:ascii="David" w:hAnsi="David"/>
@@ -18407,6 +18929,7 @@
         </w:rPr>
         <w:t xml:space="preserve"> שומרים לקובץ את מצב המערכת, ב-</w:t>
       </w:r>
+      <w:proofErr w:type="spellStart"/>
       <w:r>
         <w:rPr>
           <w:rFonts w:ascii="David" w:hAnsi="David"/>
@@ -18414,6 +18937,7 @@
         </w:rPr>
         <w:t>onResume</w:t>
       </w:r>
+      <w:proofErr w:type="spellEnd"/>
       <w:r>
         <w:rPr>
           <w:rFonts w:ascii="David" w:hAnsi="David"/>
@@ -18559,12 +19083,21 @@
         </w:rPr>
         <w:t>אם יש תפריטים גם על פקדים (</w:t>
       </w:r>
+      <w:proofErr w:type="spellStart"/>
       <w:r>
         <w:rPr>
           <w:rFonts w:ascii="David" w:hAnsi="David"/>
           <w:color w:val="FF0000"/>
         </w:rPr>
-        <w:t>Conext menu</w:t>
+        <w:t>Conext</w:t>
+      </w:r>
+      <w:proofErr w:type="spellEnd"/>
+      <w:r>
+        <w:rPr>
+          <w:rFonts w:ascii="David" w:hAnsi="David"/>
+          <w:color w:val="FF0000"/>
+        </w:rPr>
+        <w:t xml:space="preserve"> menu</w:t>
       </w:r>
       <w:r>
         <w:rPr>
@@ -18732,6 +19265,7 @@
         </w:rPr>
         <w:t>העתיקו מה-</w:t>
       </w:r>
+      <w:proofErr w:type="spellStart"/>
       <w:r>
         <w:rPr>
           <w:rFonts w:ascii="David" w:hAnsi="David"/>
@@ -18739,6 +19273,7 @@
         </w:rPr>
         <w:t>AndroidManifest</w:t>
       </w:r>
+      <w:proofErr w:type="spellEnd"/>
       <w:r>
         <w:rPr>
           <w:rFonts w:ascii="David" w:hAnsi="David"/>
@@ -18775,13 +19310,24 @@
           <w:rtl/>
         </w:rPr>
       </w:pPr>
-      <w:r>
-        <w:rPr>
-          <w:rFonts w:ascii="David" w:hAnsi="David"/>
-          <w:color w:val="0000FF"/>
-        </w:rPr>
-        <w:t>android.permission.VIBRATE</w:t>
-      </w:r>
+      <w:proofErr w:type="spellStart"/>
+      <w:proofErr w:type="gramStart"/>
+      <w:r>
+        <w:rPr>
+          <w:rFonts w:ascii="David" w:hAnsi="David"/>
+          <w:color w:val="0000FF"/>
+        </w:rPr>
+        <w:t>android.permission</w:t>
+      </w:r>
+      <w:proofErr w:type="gramEnd"/>
+      <w:r>
+        <w:rPr>
+          <w:rFonts w:ascii="David" w:hAnsi="David"/>
+          <w:color w:val="0000FF"/>
+        </w:rPr>
+        <w:t>.VIBRATE</w:t>
+      </w:r>
+      <w:proofErr w:type="spellEnd"/>
       <w:r>
         <w:rPr>
           <w:rFonts w:ascii="David" w:hAnsi="David"/>
@@ -18867,7 +19413,25 @@
           <w:color w:val="0000FF"/>
           <w:rtl/>
         </w:rPr>
-        <w:t>, מערכת שאינה יכולה לרוץ על אמולטור אלא רק על מכשיר פיזי וכו').</w:t>
+        <w:t xml:space="preserve">, מערכת שאינה יכולה לרוץ על </w:t>
+      </w:r>
+      <w:proofErr w:type="spellStart"/>
+      <w:r>
+        <w:rPr>
+          <w:rFonts w:ascii="David" w:hAnsi="David"/>
+          <w:color w:val="0000FF"/>
+          <w:rtl/>
+        </w:rPr>
+        <w:t>אמולטור</w:t>
+      </w:r>
+      <w:proofErr w:type="spellEnd"/>
+      <w:r>
+        <w:rPr>
+          <w:rFonts w:ascii="David" w:hAnsi="David"/>
+          <w:color w:val="0000FF"/>
+          <w:rtl/>
+        </w:rPr>
+        <w:t xml:space="preserve"> אלא רק על מכשיר פיזי וכו').</w:t>
       </w:r>
     </w:p>
     <w:p>
@@ -18885,7 +19449,25 @@
           <w:color w:val="0000FF"/>
           <w:rtl/>
         </w:rPr>
-        <w:t>כמו כן יש לציין אם המערכת מצפה שיהיו קבצים מסויימים על המכשיר (תמונות,</w:t>
+        <w:t xml:space="preserve">כמו כן יש לציין אם המערכת מצפה שיהיו קבצים </w:t>
+      </w:r>
+      <w:proofErr w:type="spellStart"/>
+      <w:r>
+        <w:rPr>
+          <w:rFonts w:ascii="David" w:hAnsi="David"/>
+          <w:color w:val="0000FF"/>
+          <w:rtl/>
+        </w:rPr>
+        <w:t>מסויימים</w:t>
+      </w:r>
+      <w:proofErr w:type="spellEnd"/>
+      <w:r>
+        <w:rPr>
+          <w:rFonts w:ascii="David" w:hAnsi="David"/>
+          <w:color w:val="0000FF"/>
+          <w:rtl/>
+        </w:rPr>
+        <w:t xml:space="preserve"> על המכשיר (תמונות,</w:t>
       </w:r>
       <w:r>
         <w:rPr>
@@ -18900,7 +19482,25 @@
           <w:color w:val="0000FF"/>
           <w:rtl/>
         </w:rPr>
-        <w:t xml:space="preserve"> מוסיקה, וידאו) וכו'. עקרונית עדיף לדאוג לספק 2-3 קבצי דוגמא בתוך ה-</w:t>
+        <w:t xml:space="preserve"> מוסיקה, וידאו) </w:t>
+      </w:r>
+      <w:proofErr w:type="spellStart"/>
+      <w:r>
+        <w:rPr>
+          <w:rFonts w:ascii="David" w:hAnsi="David"/>
+          <w:color w:val="0000FF"/>
+          <w:rtl/>
+        </w:rPr>
+        <w:t>וכו</w:t>
+      </w:r>
+      <w:proofErr w:type="spellEnd"/>
+      <w:r>
+        <w:rPr>
+          <w:rFonts w:ascii="David" w:hAnsi="David"/>
+          <w:color w:val="0000FF"/>
+          <w:rtl/>
+        </w:rPr>
+        <w:t>'. עקרונית עדיף לדאוג לספק 2-3 קבצי דוגמא בתוך ה-</w:t>
       </w:r>
       <w:r>
         <w:rPr>
@@ -18928,12 +19528,21 @@
         </w:rPr>
       </w:pPr>
       <w:bookmarkStart w:id="64" w:name="_Toc29994013"/>
+      <w:proofErr w:type="spellStart"/>
       <w:r>
         <w:rPr>
           <w:rFonts w:ascii="David" w:hAnsi="David" w:cs="David"/>
           <w:rtl/>
         </w:rPr>
-        <w:t xml:space="preserve">גירסת </w:t>
+        <w:t>גירסת</w:t>
+      </w:r>
+      <w:proofErr w:type="spellEnd"/>
+      <w:r>
+        <w:rPr>
+          <w:rFonts w:ascii="David" w:hAnsi="David" w:cs="David"/>
+          <w:rtl/>
+        </w:rPr>
+        <w:t xml:space="preserve"> </w:t>
       </w:r>
       <w:r>
         <w:rPr>
@@ -18965,7 +19574,25 @@
           <w:color w:val="0000FF"/>
           <w:rtl/>
         </w:rPr>
-        <w:t xml:space="preserve">מהי גירסת </w:t>
+        <w:t xml:space="preserve">מהי </w:t>
+      </w:r>
+      <w:proofErr w:type="spellStart"/>
+      <w:r>
+        <w:rPr>
+          <w:rFonts w:ascii="David" w:hAnsi="David"/>
+          <w:color w:val="0000FF"/>
+          <w:rtl/>
+        </w:rPr>
+        <w:t>גירסת</w:t>
+      </w:r>
+      <w:proofErr w:type="spellEnd"/>
+      <w:r>
+        <w:rPr>
+          <w:rFonts w:ascii="David" w:hAnsi="David"/>
+          <w:color w:val="0000FF"/>
+          <w:rtl/>
+        </w:rPr>
+        <w:t xml:space="preserve"> </w:t>
       </w:r>
       <w:r>
         <w:rPr>
@@ -19013,7 +19640,25 @@
           <w:color w:val="0000FF"/>
           <w:rtl/>
         </w:rPr>
-        <w:t xml:space="preserve"> גירסת </w:t>
+        <w:t xml:space="preserve"> </w:t>
+      </w:r>
+      <w:proofErr w:type="spellStart"/>
+      <w:r>
+        <w:rPr>
+          <w:rFonts w:ascii="David" w:hAnsi="David"/>
+          <w:color w:val="0000FF"/>
+          <w:rtl/>
+        </w:rPr>
+        <w:t>גירסת</w:t>
+      </w:r>
+      <w:proofErr w:type="spellEnd"/>
+      <w:r>
+        <w:rPr>
+          <w:rFonts w:ascii="David" w:hAnsi="David"/>
+          <w:color w:val="0000FF"/>
+          <w:rtl/>
+        </w:rPr>
+        <w:t xml:space="preserve"> </w:t>
       </w:r>
       <w:r>
         <w:rPr>
@@ -19065,7 +19710,25 @@
           <w:color w:val="0000FF"/>
           <w:rtl/>
         </w:rPr>
-        <w:t>ציינו על איזה מכשירים / אמולטורים נבדקה המערכת.</w:t>
+        <w:t xml:space="preserve">ציינו על איזה מכשירים / </w:t>
+      </w:r>
+      <w:proofErr w:type="spellStart"/>
+      <w:r>
+        <w:rPr>
+          <w:rFonts w:ascii="David" w:hAnsi="David"/>
+          <w:color w:val="0000FF"/>
+          <w:rtl/>
+        </w:rPr>
+        <w:t>אמולטורים</w:t>
+      </w:r>
+      <w:proofErr w:type="spellEnd"/>
+      <w:r>
+        <w:rPr>
+          <w:rFonts w:ascii="David" w:hAnsi="David"/>
+          <w:color w:val="0000FF"/>
+          <w:rtl/>
+        </w:rPr>
+        <w:t xml:space="preserve"> נבדקה המערכת.</w:t>
       </w:r>
     </w:p>
     <w:p>
@@ -19125,14 +19788,25 @@
           <w:rtl/>
         </w:rPr>
       </w:pPr>
-      <w:r>
-        <w:rPr>
-          <w:rFonts w:ascii="David" w:hAnsi="David"/>
-          <w:color w:val="0000FF"/>
-          <w:rtl/>
-        </w:rPr>
-        <w:t xml:space="preserve">אמולטור </w:t>
-      </w:r>
+      <w:proofErr w:type="spellStart"/>
+      <w:r>
+        <w:rPr>
+          <w:rFonts w:ascii="David" w:hAnsi="David"/>
+          <w:color w:val="0000FF"/>
+          <w:rtl/>
+        </w:rPr>
+        <w:t>אמולטור</w:t>
+      </w:r>
+      <w:proofErr w:type="spellEnd"/>
+      <w:r>
+        <w:rPr>
+          <w:rFonts w:ascii="David" w:hAnsi="David"/>
+          <w:color w:val="0000FF"/>
+          <w:rtl/>
+        </w:rPr>
+        <w:t xml:space="preserve"> </w:t>
+      </w:r>
+      <w:proofErr w:type="spellStart"/>
       <w:r>
         <w:rPr>
           <w:rFonts w:ascii="David" w:hAnsi="David"/>
@@ -19140,6 +19814,7 @@
         </w:rPr>
         <w:t>GennyMotion</w:t>
       </w:r>
+      <w:proofErr w:type="spellEnd"/>
       <w:r>
         <w:rPr>
           <w:rFonts w:ascii="David" w:hAnsi="David"/>
@@ -19176,7 +19851,25 @@
           <w:color w:val="0000FF"/>
           <w:rtl/>
         </w:rPr>
-        <w:t xml:space="preserve"> גירסת </w:t>
+        <w:t xml:space="preserve"> </w:t>
+      </w:r>
+      <w:proofErr w:type="spellStart"/>
+      <w:r>
+        <w:rPr>
+          <w:rFonts w:ascii="David" w:hAnsi="David"/>
+          <w:color w:val="0000FF"/>
+          <w:rtl/>
+        </w:rPr>
+        <w:t>גירסת</w:t>
+      </w:r>
+      <w:proofErr w:type="spellEnd"/>
+      <w:r>
+        <w:rPr>
+          <w:rFonts w:ascii="David" w:hAnsi="David"/>
+          <w:color w:val="0000FF"/>
+          <w:rtl/>
+        </w:rPr>
+        <w:t xml:space="preserve"> </w:t>
       </w:r>
       <w:r>
         <w:rPr>
@@ -19590,6 +20283,7 @@
         </w:rPr>
       </w:pPr>
       <w:bookmarkStart w:id="67" w:name="_Toc39329438"/>
+      <w:proofErr w:type="spellStart"/>
       <w:r>
         <w:rPr>
           <w:rFonts w:ascii="David" w:hAnsi="David" w:cs="David"/>
@@ -19598,6 +20292,7 @@
         <w:t>ביבליוגראפיה</w:t>
       </w:r>
       <w:bookmarkEnd w:id="67"/>
+      <w:proofErr w:type="spellEnd"/>
     </w:p>
     <w:p>
       <w:pPr>
@@ -19797,7 +20492,25 @@
           <w:color w:val="0000FF"/>
           <w:rtl/>
         </w:rPr>
-        <w:t>כאן עליכם להעתיק את קוד התכנית.</w:t>
+        <w:t xml:space="preserve">כאן עליכם להעתיק את קוד </w:t>
+      </w:r>
+      <w:proofErr w:type="spellStart"/>
+      <w:r>
+        <w:rPr>
+          <w:rFonts w:ascii="David" w:hAnsi="David"/>
+          <w:color w:val="0000FF"/>
+          <w:rtl/>
+        </w:rPr>
+        <w:t>התכנית</w:t>
+      </w:r>
+      <w:proofErr w:type="spellEnd"/>
+      <w:r>
+        <w:rPr>
+          <w:rFonts w:ascii="David" w:hAnsi="David"/>
+          <w:color w:val="0000FF"/>
+          <w:rtl/>
+        </w:rPr>
+        <w:t>.</w:t>
       </w:r>
     </w:p>
     <w:p>
@@ -20047,8 +20760,8 @@
       </w:pPr>
     </w:p>
     <w:sectPr>
-      <w:headerReference w:type="default" r:id="rId28"/>
-      <w:footerReference w:type="default" r:id="rId29"/>
+      <w:headerReference w:type="default" r:id="rId29"/>
+      <w:footerReference w:type="default" r:id="rId30"/>
       <w:endnotePr>
         <w:numFmt w:val="lowerLetter"/>
       </w:endnotePr>
@@ -24577,7 +25290,7 @@
   <dgm:whole/>
   <dgm:extLst>
     <a:ext uri="http://schemas.microsoft.com/office/drawing/2008/diagram">
-      <dsp:dataModelExt xmlns:dsp="http://schemas.microsoft.com/office/drawing/2008/diagram" relId="rId13" minVer="http://schemas.openxmlformats.org/drawingml/2006/diagram"/>
+      <dsp:dataModelExt xmlns:dsp="http://schemas.microsoft.com/office/drawing/2008/diagram" relId="rId14" minVer="http://schemas.openxmlformats.org/drawingml/2006/diagram"/>
     </a:ext>
   </dgm:extLst>
 </dgm:dataModel>
@@ -28531,7 +29244,7 @@
 </file>
 
 <file path=customXml/itemProps1.xml><?xml version="1.0" encoding="utf-8"?>
-<ds:datastoreItem xmlns:ds="http://schemas.openxmlformats.org/officeDocument/2006/customXml" ds:itemID="{A0A69D25-4755-4A45-9DEE-A5BE8CDB37EF}">
+<ds:datastoreItem xmlns:ds="http://schemas.openxmlformats.org/officeDocument/2006/customXml" ds:itemID="{6BFE891E-6C0B-4829-AD45-DFD49FBC8CF9}">
   <ds:schemaRefs>
     <ds:schemaRef ds:uri="http://schemas.openxmlformats.org/officeDocument/2006/bibliography"/>
   </ds:schemaRefs>

</xml_diff>

<commit_message>
Added for the Activities Pictures (Finished?).
</commit_message>
<xml_diff>
--- a/Driving Lessons Manager.docx
+++ b/Driving Lessons Manager.docx
@@ -6915,7 +6915,7 @@
           </mc:Choice>
           <mc:Fallback>
             <w:pict>
-              <v:rect w14:anchorId="455CDC38" id=" 59" o:spid="_x0000_s1026" style="position:absolute;margin-left:69.75pt;margin-top:13.95pt;width:311.5pt;height:458.25pt;z-index:251662848;visibility:visible;mso-wrap-style:square;mso-width-percent:0;mso-height-percent:0;mso-wrap-distance-left:9pt;mso-wrap-distance-top:0;mso-wrap-distance-right:9pt;mso-wrap-distance-bottom:0;mso-position-horizontal:absolute;mso-position-horizontal-relative:text;mso-position-vertical:absolute;mso-position-vertical-relative:text;mso-width-percent:0;mso-height-percent:0;mso-width-relative:page;mso-height-relative:page;v-text-anchor:top" o:gfxdata="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">
+              <v:rect w14:anchorId="563C9FC7" id=" 59" o:spid="_x0000_s1026" style="position:absolute;margin-left:69.75pt;margin-top:13.95pt;width:311.5pt;height:458.25pt;z-index:251662848;visibility:visible;mso-wrap-style:square;mso-width-percent:0;mso-height-percent:0;mso-wrap-distance-left:9pt;mso-wrap-distance-top:0;mso-wrap-distance-right:9pt;mso-wrap-distance-bottom:0;mso-position-horizontal:absolute;mso-position-horizontal-relative:text;mso-position-vertical:absolute;mso-position-vertical-relative:text;mso-width-percent:0;mso-height-percent:0;mso-width-relative:page;mso-height-relative:page;v-text-anchor:top" o:gfxdata="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">
                 <v:path arrowok="t"/>
               </v:rect>
             </w:pict>
@@ -7189,7 +7189,7 @@
           </mc:Choice>
           <mc:Fallback>
             <w:pict>
-              <v:shapetype w14:anchorId="2712EB43" id="_x0000_t32" coordsize="21600,21600" o:spt="32" o:oned="t" path="m,l21600,21600e" filled="f">
+              <v:shapetype w14:anchorId="7F03CB5E" id="_x0000_t32" coordsize="21600,21600" o:spt="32" o:oned="t" path="m,l21600,21600e" filled="f">
                 <v:path arrowok="t" fillok="f" o:connecttype="none"/>
                 <o:lock v:ext="edit" shapetype="t"/>
               </v:shapetype>
@@ -7270,7 +7270,7 @@
           </mc:Choice>
           <mc:Fallback>
             <w:pict>
-              <v:shape w14:anchorId="661EE3F2" id=" 94" o:spid="_x0000_s1026" type="#_x0000_t32" style="position:absolute;margin-left:33.75pt;margin-top:165.3pt;width:117pt;height:180.75pt;z-index:251684352;visibility:visible;mso-wrap-style:square;mso-width-percent:0;mso-height-percent:0;mso-wrap-distance-left:9pt;mso-wrap-distance-top:0;mso-wrap-distance-right:9pt;mso-wrap-distance-bottom:0;mso-position-horizontal:absolute;mso-position-horizontal-relative:text;mso-position-vertical:absolute;mso-position-vertical-relative:text;mso-width-percent:0;mso-height-percent:0;mso-width-relative:page;mso-height-relative:page" o:gfxdata="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" strokeweight="1.5pt">
+              <v:shape w14:anchorId="4E6F9F71" id=" 94" o:spid="_x0000_s1026" type="#_x0000_t32" style="position:absolute;margin-left:33.75pt;margin-top:165.3pt;width:117pt;height:180.75pt;z-index:251684352;visibility:visible;mso-wrap-style:square;mso-width-percent:0;mso-height-percent:0;mso-wrap-distance-left:9pt;mso-wrap-distance-top:0;mso-wrap-distance-right:9pt;mso-wrap-distance-bottom:0;mso-position-horizontal:absolute;mso-position-horizontal-relative:text;mso-position-vertical:absolute;mso-position-vertical-relative:text;mso-width-percent:0;mso-height-percent:0;mso-width-relative:page;mso-height-relative:page" o:gfxdata="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" strokeweight="1.5pt">
                 <o:lock v:ext="edit" shapetype="f"/>
               </v:shape>
             </w:pict>
@@ -7849,7 +7849,7 @@
           </mc:Choice>
           <mc:Fallback>
             <w:pict>
-              <v:shape w14:anchorId="00906FC8" id=" 97" o:spid="_x0000_s1026" type="#_x0000_t32" style="position:absolute;margin-left:318.75pt;margin-top:121.35pt;width:92.75pt;height:153pt;flip:y;z-index:251678208;visibility:visible;mso-wrap-style:square;mso-width-percent:0;mso-height-percent:0;mso-wrap-distance-left:9pt;mso-wrap-distance-top:0;mso-wrap-distance-right:9pt;mso-wrap-distance-bottom:0;mso-position-horizontal:absolute;mso-position-horizontal-relative:text;mso-position-vertical:absolute;mso-position-vertical-relative:text;mso-width-percent:0;mso-height-percent:0;mso-width-relative:page;mso-height-relative:page" o:gfxdata="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" strokeweight="1.5pt">
+              <v:shape w14:anchorId="6DFE5018" id=" 97" o:spid="_x0000_s1026" type="#_x0000_t32" style="position:absolute;margin-left:318.75pt;margin-top:121.35pt;width:92.75pt;height:153pt;flip:y;z-index:251678208;visibility:visible;mso-wrap-style:square;mso-width-percent:0;mso-height-percent:0;mso-wrap-distance-left:9pt;mso-wrap-distance-top:0;mso-wrap-distance-right:9pt;mso-wrap-distance-bottom:0;mso-position-horizontal:absolute;mso-position-horizontal-relative:text;mso-position-vertical:absolute;mso-position-vertical-relative:text;mso-width-percent:0;mso-height-percent:0;mso-width-relative:page;mso-height-relative:page" o:gfxdata="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" strokeweight="1.5pt">
                 <o:lock v:ext="edit" shapetype="f"/>
               </v:shape>
             </w:pict>
@@ -7926,7 +7926,7 @@
           </mc:Choice>
           <mc:Fallback>
             <w:pict>
-              <v:shape w14:anchorId="0AE4A880" id=" 93" o:spid="_x0000_s1026" type="#_x0000_t32" style="position:absolute;margin-left:21.75pt;margin-top:93.6pt;width:135.75pt;height:45pt;flip:y;z-index:251682304;visibility:visible;mso-wrap-style:square;mso-width-percent:0;mso-height-percent:0;mso-wrap-distance-left:9pt;mso-wrap-distance-top:0;mso-wrap-distance-right:9pt;mso-wrap-distance-bottom:0;mso-position-horizontal:absolute;mso-position-horizontal-relative:text;mso-position-vertical:absolute;mso-position-vertical-relative:text;mso-width-percent:0;mso-height-percent:0;mso-width-relative:page;mso-height-relative:page" o:gfxdata="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" strokeweight="1.5pt">
+              <v:shape w14:anchorId="03EE5AC5" id=" 93" o:spid="_x0000_s1026" type="#_x0000_t32" style="position:absolute;margin-left:21.75pt;margin-top:93.6pt;width:135.75pt;height:45pt;flip:y;z-index:251682304;visibility:visible;mso-wrap-style:square;mso-width-percent:0;mso-height-percent:0;mso-wrap-distance-left:9pt;mso-wrap-distance-top:0;mso-wrap-distance-right:9pt;mso-wrap-distance-bottom:0;mso-position-horizontal:absolute;mso-position-horizontal-relative:text;mso-position-vertical:absolute;mso-position-vertical-relative:text;mso-width-percent:0;mso-height-percent:0;mso-width-relative:page;mso-height-relative:page" o:gfxdata="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" strokeweight="1.5pt">
                 <o:lock v:ext="edit" shapetype="f"/>
               </v:shape>
             </w:pict>
@@ -8003,7 +8003,7 @@
           </mc:Choice>
           <mc:Fallback>
             <w:pict>
-              <v:shape w14:anchorId="007CD3B5" id=" 93" o:spid="_x0000_s1026" type="#_x0000_t32" style="position:absolute;margin-left:26.25pt;margin-top:27.6pt;width:133.25pt;height:87.75pt;flip:y;z-index:251680256;visibility:visible;mso-wrap-style:square;mso-width-percent:0;mso-height-percent:0;mso-wrap-distance-left:9pt;mso-wrap-distance-top:0;mso-wrap-distance-right:9pt;mso-wrap-distance-bottom:0;mso-position-horizontal:absolute;mso-position-horizontal-relative:text;mso-position-vertical:absolute;mso-position-vertical-relative:text;mso-width-percent:0;mso-height-percent:0;mso-width-relative:page;mso-height-relative:page" o:gfxdata="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" strokeweight="1.5pt">
+              <v:shape w14:anchorId="7162D550" id=" 93" o:spid="_x0000_s1026" type="#_x0000_t32" style="position:absolute;margin-left:26.25pt;margin-top:27.6pt;width:133.25pt;height:87.75pt;flip:y;z-index:251680256;visibility:visible;mso-wrap-style:square;mso-width-percent:0;mso-height-percent:0;mso-wrap-distance-left:9pt;mso-wrap-distance-top:0;mso-wrap-distance-right:9pt;mso-wrap-distance-bottom:0;mso-position-horizontal:absolute;mso-position-horizontal-relative:text;mso-position-vertical:absolute;mso-position-vertical-relative:text;mso-width-percent:0;mso-height-percent:0;mso-width-relative:page;mso-height-relative:page" o:gfxdata="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" strokeweight="1.5pt">
                 <o:lock v:ext="edit" shapetype="f"/>
               </v:shape>
             </w:pict>
@@ -8557,7 +8557,7 @@
           </mc:Choice>
           <mc:Fallback>
             <w:pict>
-              <v:shape w14:anchorId="205537A5" id=" 93" o:spid="_x0000_s1026" type="#_x0000_t32" style="position:absolute;margin-left:21pt;margin-top:146.95pt;width:139pt;height:6.5pt;z-index:251674112;visibility:visible;mso-wrap-style:square;mso-width-percent:0;mso-height-percent:0;mso-wrap-distance-left:9pt;mso-wrap-distance-top:0;mso-wrap-distance-right:9pt;mso-wrap-distance-bottom:0;mso-position-horizontal:absolute;mso-position-horizontal-relative:text;mso-position-vertical:absolute;mso-position-vertical-relative:text;mso-width-percent:0;mso-height-percent:0;mso-width-relative:page;mso-height-relative:page" o:gfxdata="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" strokeweight="1.5pt">
+              <v:shape w14:anchorId="7BDA9256" id=" 93" o:spid="_x0000_s1026" type="#_x0000_t32" style="position:absolute;margin-left:21pt;margin-top:146.95pt;width:139pt;height:6.5pt;z-index:251674112;visibility:visible;mso-wrap-style:square;mso-width-percent:0;mso-height-percent:0;mso-wrap-distance-left:9pt;mso-wrap-distance-top:0;mso-wrap-distance-right:9pt;mso-wrap-distance-bottom:0;mso-position-horizontal:absolute;mso-position-horizontal-relative:text;mso-position-vertical:absolute;mso-position-vertical-relative:text;mso-width-percent:0;mso-height-percent:0;mso-width-relative:page;mso-height-relative:page" o:gfxdata="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" strokeweight="1.5pt">
                 <o:lock v:ext="edit" shapetype="f"/>
               </v:shape>
             </w:pict>
@@ -8634,7 +8634,7 @@
           </mc:Choice>
           <mc:Fallback>
             <w:pict>
-              <v:shape w14:anchorId="4AADEF47" id=" 94" o:spid="_x0000_s1026" type="#_x0000_t32" style="position:absolute;margin-left:21.5pt;margin-top:155.6pt;width:150.2pt;height:52.5pt;z-index:251675136;visibility:visible;mso-wrap-style:square;mso-width-percent:0;mso-height-percent:0;mso-wrap-distance-left:9pt;mso-wrap-distance-top:0;mso-wrap-distance-right:9pt;mso-wrap-distance-bottom:0;mso-position-horizontal:absolute;mso-position-horizontal-relative:text;mso-position-vertical:absolute;mso-position-vertical-relative:text;mso-width-percent:0;mso-height-percent:0;mso-width-relative:page;mso-height-relative:page" o:gfxdata="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" strokeweight="1.5pt">
+              <v:shape w14:anchorId="7C32A155" id=" 94" o:spid="_x0000_s1026" type="#_x0000_t32" style="position:absolute;margin-left:21.5pt;margin-top:155.6pt;width:150.2pt;height:52.5pt;z-index:251675136;visibility:visible;mso-wrap-style:square;mso-width-percent:0;mso-height-percent:0;mso-wrap-distance-left:9pt;mso-wrap-distance-top:0;mso-wrap-distance-right:9pt;mso-wrap-distance-bottom:0;mso-position-horizontal:absolute;mso-position-horizontal-relative:text;mso-position-vertical:absolute;mso-position-vertical-relative:text;mso-width-percent:0;mso-height-percent:0;mso-width-relative:page;mso-height-relative:page" o:gfxdata="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" strokeweight="1.5pt">
                 <o:lock v:ext="edit" shapetype="f"/>
               </v:shape>
             </w:pict>
@@ -9388,19 +9388,28 @@
           <w:rtl/>
         </w:rPr>
       </w:pPr>
+    </w:p>
+    <w:p>
+      <w:pPr>
+        <w:jc w:val="left"/>
+        <w:rPr>
+          <w:rFonts w:ascii="David" w:hAnsi="David"/>
+          <w:rtl/>
+        </w:rPr>
+      </w:pPr>
       <w:r>
         <w:rPr>
           <w:rFonts w:ascii="David" w:hAnsi="David"/>
           <w:noProof/>
         </w:rPr>
         <w:drawing>
-          <wp:anchor distT="0" distB="0" distL="114300" distR="114300" simplePos="0" relativeHeight="251686400" behindDoc="0" locked="0" layoutInCell="1" allowOverlap="1" wp14:anchorId="0EE9AA73" wp14:editId="222D76E8">
+          <wp:anchor distT="0" distB="0" distL="114300" distR="114300" simplePos="0" relativeHeight="251686400" behindDoc="0" locked="0" layoutInCell="1" allowOverlap="1" wp14:anchorId="0EE9AA73" wp14:editId="2D89A964">
             <wp:simplePos x="0" y="0"/>
             <wp:positionH relativeFrom="margin">
               <wp:align>center</wp:align>
             </wp:positionH>
             <wp:positionV relativeFrom="paragraph">
-              <wp:posOffset>4713605</wp:posOffset>
+              <wp:posOffset>4907280</wp:posOffset>
             </wp:positionV>
             <wp:extent cx="2800350" cy="1619250"/>
             <wp:effectExtent l="0" t="0" r="0" b="0"/>
@@ -9453,15 +9462,6 @@
     </w:p>
     <w:p>
       <w:pPr>
-        <w:jc w:val="left"/>
-        <w:rPr>
-          <w:rFonts w:ascii="David" w:hAnsi="David"/>
-          <w:rtl/>
-        </w:rPr>
-      </w:pPr>
-    </w:p>
-    <w:p>
-      <w:pPr>
         <w:pStyle w:val="3"/>
         <w:spacing w:line="276" w:lineRule="auto"/>
         <w:rPr>
@@ -9472,10 +9472,78 @@
       <w:bookmarkStart w:id="15" w:name="_Toc39329416"/>
       <w:r>
         <w:rPr>
+          <w:rFonts w:ascii="David" w:hAnsi="David"/>
+          <w:noProof/>
+        </w:rPr>
+        <w:lastRenderedPageBreak/>
+        <w:drawing>
+          <wp:anchor distT="0" distB="0" distL="114300" distR="114300" simplePos="0" relativeHeight="251749888" behindDoc="0" locked="0" layoutInCell="1" allowOverlap="1" wp14:anchorId="7A12F51D" wp14:editId="75928647">
+            <wp:simplePos x="0" y="0"/>
+            <wp:positionH relativeFrom="page">
+              <wp:posOffset>342900</wp:posOffset>
+            </wp:positionH>
+            <wp:positionV relativeFrom="paragraph">
+              <wp:posOffset>5009515</wp:posOffset>
+            </wp:positionV>
+            <wp:extent cx="2791460" cy="2676525"/>
+            <wp:effectExtent l="0" t="0" r="8890" b="9525"/>
+            <wp:wrapTopAndBottom/>
+            <wp:docPr id="146" name="תמונה 146"/>
+            <wp:cNvGraphicFramePr>
+              <a:graphicFrameLocks xmlns:a="http://schemas.openxmlformats.org/drawingml/2006/main" noChangeAspect="1"/>
+            </wp:cNvGraphicFramePr>
+            <a:graphic xmlns:a="http://schemas.openxmlformats.org/drawingml/2006/main">
+              <a:graphicData uri="http://schemas.openxmlformats.org/drawingml/2006/picture">
+                <pic:pic xmlns:pic="http://schemas.openxmlformats.org/drawingml/2006/picture">
+                  <pic:nvPicPr>
+                    <pic:cNvPr id="0" name="Picture 17"/>
+                    <pic:cNvPicPr>
+                      <a:picLocks noChangeAspect="1" noChangeArrowheads="1"/>
+                    </pic:cNvPicPr>
+                  </pic:nvPicPr>
+                  <pic:blipFill>
+                    <a:blip r:embed="rId17">
+                      <a:extLst>
+                        <a:ext uri="{28A0092B-C50C-407E-A947-70E740481C1C}">
+                          <a14:useLocalDpi xmlns:a14="http://schemas.microsoft.com/office/drawing/2010/main" val="0"/>
+                        </a:ext>
+                      </a:extLst>
+                    </a:blip>
+                    <a:srcRect/>
+                    <a:stretch>
+                      <a:fillRect/>
+                    </a:stretch>
+                  </pic:blipFill>
+                  <pic:spPr bwMode="auto">
+                    <a:xfrm>
+                      <a:off x="0" y="0"/>
+                      <a:ext cx="2791460" cy="2676525"/>
+                    </a:xfrm>
+                    <a:prstGeom prst="rect">
+                      <a:avLst/>
+                    </a:prstGeom>
+                    <a:noFill/>
+                    <a:ln>
+                      <a:noFill/>
+                    </a:ln>
+                  </pic:spPr>
+                </pic:pic>
+              </a:graphicData>
+            </a:graphic>
+            <wp14:sizeRelH relativeFrom="margin">
+              <wp14:pctWidth>0</wp14:pctWidth>
+            </wp14:sizeRelH>
+            <wp14:sizeRelV relativeFrom="margin">
+              <wp14:pctHeight>0</wp14:pctHeight>
+            </wp14:sizeRelV>
+          </wp:anchor>
+        </w:drawing>
+      </w:r>
+      <w:r>
+        <w:rPr>
           <w:rFonts w:ascii="David" w:hAnsi="David" w:cs="David"/>
           <w:noProof/>
         </w:rPr>
-        <w:lastRenderedPageBreak/>
         <w:drawing>
           <wp:anchor distT="0" distB="0" distL="114300" distR="114300" simplePos="0" relativeHeight="251685376" behindDoc="0" locked="0" layoutInCell="1" allowOverlap="1" wp14:anchorId="3272CE9D" wp14:editId="312832D8">
             <wp:simplePos x="0" y="0"/>
@@ -9502,7 +9570,7 @@
                     </pic:cNvPicPr>
                   </pic:nvPicPr>
                   <pic:blipFill>
-                    <a:blip r:embed="rId17">
+                    <a:blip r:embed="rId18">
                       <a:extLst>
                         <a:ext uri="{28A0092B-C50C-407E-A947-70E740481C1C}">
                           <a14:useLocalDpi xmlns:a14="http://schemas.microsoft.com/office/drawing/2010/main" val="0"/>
@@ -9567,7 +9635,7 @@
                     </pic:cNvPicPr>
                   </pic:nvPicPr>
                   <pic:blipFill>
-                    <a:blip r:embed="rId18">
+                    <a:blip r:embed="rId19">
                       <a:extLst>
                         <a:ext uri="{28A0092B-C50C-407E-A947-70E740481C1C}">
                           <a14:useLocalDpi xmlns:a14="http://schemas.microsoft.com/office/drawing/2010/main" val="0"/>
@@ -9681,7 +9749,6 @@
         <w:rPr>
           <w:rFonts w:ascii="David" w:hAnsi="David" w:cs="David"/>
         </w:rPr>
-        <w:lastRenderedPageBreak/>
         <w:t>DAL</w:t>
       </w:r>
     </w:p>
@@ -9716,7 +9783,7 @@
                     </pic:cNvPicPr>
                   </pic:nvPicPr>
                   <pic:blipFill>
-                    <a:blip r:embed="rId19">
+                    <a:blip r:embed="rId20">
                       <a:extLst>
                         <a:ext uri="{28A0092B-C50C-407E-A947-70E740481C1C}">
                           <a14:useLocalDpi xmlns:a14="http://schemas.microsoft.com/office/drawing/2010/main" val="0"/>
@@ -9812,7 +9879,7 @@
                     </pic:cNvPicPr>
                   </pic:nvPicPr>
                   <pic:blipFill>
-                    <a:blip r:embed="rId20">
+                    <a:blip r:embed="rId21">
                       <a:extLst>
                         <a:ext uri="{28A0092B-C50C-407E-A947-70E740481C1C}">
                           <a14:useLocalDpi xmlns:a14="http://schemas.microsoft.com/office/drawing/2010/main" val="0"/>
@@ -9910,7 +9977,7 @@
                     </pic:cNvPicPr>
                   </pic:nvPicPr>
                   <pic:blipFill>
-                    <a:blip r:embed="rId21">
+                    <a:blip r:embed="rId22">
                       <a:extLst>
                         <a:ext uri="{28A0092B-C50C-407E-A947-70E740481C1C}">
                           <a14:useLocalDpi xmlns:a14="http://schemas.microsoft.com/office/drawing/2010/main" val="0"/>
@@ -9972,7 +10039,7 @@
                     </pic:cNvPicPr>
                   </pic:nvPicPr>
                   <pic:blipFill>
-                    <a:blip r:embed="rId22">
+                    <a:blip r:embed="rId23">
                       <a:extLst>
                         <a:ext uri="{28A0092B-C50C-407E-A947-70E740481C1C}">
                           <a14:useLocalDpi xmlns:a14="http://schemas.microsoft.com/office/drawing/2010/main" val="0"/>
@@ -10043,7 +10110,7 @@
                     </pic:cNvPicPr>
                   </pic:nvPicPr>
                   <pic:blipFill>
-                    <a:blip r:embed="rId23">
+                    <a:blip r:embed="rId24">
                       <a:extLst>
                         <a:ext uri="{28A0092B-C50C-407E-A947-70E740481C1C}">
                           <a14:useLocalDpi xmlns:a14="http://schemas.microsoft.com/office/drawing/2010/main" val="0"/>
@@ -10105,7 +10172,7 @@
                     </pic:cNvPicPr>
                   </pic:nvPicPr>
                   <pic:blipFill>
-                    <a:blip r:embed="rId24">
+                    <a:blip r:embed="rId25">
                       <a:extLst>
                         <a:ext uri="{28A0092B-C50C-407E-A947-70E740481C1C}">
                           <a14:useLocalDpi xmlns:a14="http://schemas.microsoft.com/office/drawing/2010/main" val="0"/>
@@ -10167,7 +10234,7 @@
                     </pic:cNvPicPr>
                   </pic:nvPicPr>
                   <pic:blipFill>
-                    <a:blip r:embed="rId25">
+                    <a:blip r:embed="rId26">
                       <a:extLst>
                         <a:ext uri="{28A0092B-C50C-407E-A947-70E740481C1C}">
                           <a14:useLocalDpi xmlns:a14="http://schemas.microsoft.com/office/drawing/2010/main" val="0"/>
@@ -10732,49 +10799,7 @@
           <w:rFonts w:ascii="David" w:hAnsi="David" w:hint="cs"/>
           <w:rtl/>
         </w:rPr>
-        <w:t xml:space="preserve">מסך </w:t>
-      </w:r>
-      <w:r>
-        <w:rPr>
-          <w:rFonts w:ascii="David" w:hAnsi="David" w:hint="cs"/>
-          <w:rtl/>
-        </w:rPr>
-        <w:t>המורה</w:t>
-      </w:r>
-      <w:r>
-        <w:rPr>
-          <w:rFonts w:ascii="David" w:hAnsi="David" w:hint="cs"/>
-          <w:rtl/>
-        </w:rPr>
-        <w:t xml:space="preserve">. לאחר </w:t>
-      </w:r>
-      <w:r>
-        <w:rPr>
-          <w:rFonts w:ascii="David" w:hAnsi="David" w:hint="cs"/>
-          <w:rtl/>
-        </w:rPr>
-        <w:t>שמורה</w:t>
-      </w:r>
-      <w:r>
-        <w:rPr>
-          <w:rFonts w:ascii="David" w:hAnsi="David" w:hint="cs"/>
-          <w:rtl/>
-        </w:rPr>
-        <w:t xml:space="preserve"> מתחבר, הוא מגיע למסך הזה. כאן </w:t>
-      </w:r>
-      <w:r>
-        <w:rPr>
-          <w:rFonts w:ascii="David" w:hAnsi="David" w:hint="cs"/>
-          <w:rtl/>
-        </w:rPr>
-        <w:t>המורה</w:t>
-      </w:r>
-      <w:r>
-        <w:rPr>
-          <w:rFonts w:ascii="David" w:hAnsi="David" w:hint="cs"/>
-          <w:rtl/>
-        </w:rPr>
-        <w:t xml:space="preserve"> יכול לגשת לכל מסך אשר מיועד לו.</w:t>
+        <w:t>מסך המורה. לאחר שמורה מתחבר, הוא מגיע למסך הזה. כאן המורה יכול לגשת לכל מסך אשר מיועד לו.</w:t>
       </w:r>
     </w:p>
     <w:p>
@@ -10823,75 +10848,20 @@
           <w:rFonts w:ascii="David" w:hAnsi="David" w:hint="cs"/>
           <w:rtl/>
         </w:rPr>
-        <w:t xml:space="preserve">מסך ההרשמה </w:t>
+        <w:t xml:space="preserve">מסך ההרשמה למורה. כאן המשתמש יכול להירשם כמורה ומסך זה מטפל בכך. בסיום ההרשמה של המורה במערכת, המשתמש מועבר למסך </w:t>
+      </w:r>
+      <w:r>
+        <w:rPr>
+          <w:rFonts w:ascii="David" w:hAnsi="David"/>
+        </w:rPr>
+        <w:t>TeacherActivity</w:t>
       </w:r>
       <w:r>
         <w:rPr>
           <w:rFonts w:ascii="David" w:hAnsi="David" w:hint="cs"/>
           <w:rtl/>
         </w:rPr>
-        <w:t>למורה</w:t>
-      </w:r>
-      <w:r>
-        <w:rPr>
-          <w:rFonts w:ascii="David" w:hAnsi="David" w:hint="cs"/>
-          <w:rtl/>
-        </w:rPr>
-        <w:t xml:space="preserve">. כאן המשתמש יכול להירשם </w:t>
-      </w:r>
-      <w:r>
-        <w:rPr>
-          <w:rFonts w:ascii="David" w:hAnsi="David" w:hint="cs"/>
-          <w:rtl/>
-        </w:rPr>
-        <w:t>כמורה</w:t>
-      </w:r>
-      <w:r>
-        <w:rPr>
-          <w:rFonts w:ascii="David" w:hAnsi="David" w:hint="cs"/>
-          <w:rtl/>
-        </w:rPr>
-        <w:t xml:space="preserve"> ומסך זה מטפל בכך. בסיום ההרשמה של </w:t>
-      </w:r>
-      <w:r>
-        <w:rPr>
-          <w:rFonts w:ascii="David" w:hAnsi="David" w:hint="cs"/>
-          <w:rtl/>
-        </w:rPr>
-        <w:t>המורה</w:t>
-      </w:r>
-      <w:r>
-        <w:rPr>
-          <w:rFonts w:ascii="David" w:hAnsi="David" w:hint="cs"/>
-          <w:rtl/>
-        </w:rPr>
-        <w:t xml:space="preserve"> במערכת, המשתמש מועבר למסך </w:t>
-      </w:r>
-      <w:r>
-        <w:rPr>
-          <w:rFonts w:ascii="David" w:hAnsi="David"/>
-        </w:rPr>
-        <w:t>Teacher</w:t>
-      </w:r>
-      <w:r>
-        <w:rPr>
-          <w:rFonts w:ascii="David" w:hAnsi="David"/>
-        </w:rPr>
-        <w:t>Activity</w:t>
-      </w:r>
-      <w:r>
-        <w:rPr>
-          <w:rFonts w:ascii="David" w:hAnsi="David" w:hint="cs"/>
-          <w:rtl/>
-        </w:rPr>
-        <w:t xml:space="preserve"> אשר צוין קודם לכן</w:t>
-      </w:r>
-      <w:r>
-        <w:rPr>
-          <w:rFonts w:ascii="David" w:hAnsi="David" w:hint="cs"/>
-          <w:rtl/>
-        </w:rPr>
-        <w:t>.</w:t>
+        <w:t xml:space="preserve"> אשר צוין קודם לכן.</w:t>
       </w:r>
     </w:p>
     <w:p>
@@ -13137,40 +13107,7 @@
                 <w:szCs w:val="24"/>
                 <w:rtl/>
               </w:rPr>
-              <w:t xml:space="preserve"> המסך הראשי </w:t>
-            </w:r>
-            <w:r>
-              <w:rPr>
-                <w:rFonts w:ascii="David" w:hAnsi="David" w:cs="David" w:hint="cs"/>
-                <w:b w:val="0"/>
-                <w:bCs w:val="0"/>
-                <w:sz w:val="24"/>
-                <w:szCs w:val="24"/>
-                <w:rtl/>
-              </w:rPr>
-              <w:t>למורה</w:t>
-            </w:r>
-            <w:r>
-              <w:rPr>
-                <w:rFonts w:ascii="David" w:hAnsi="David" w:cs="David" w:hint="cs"/>
-                <w:b w:val="0"/>
-                <w:bCs w:val="0"/>
-                <w:sz w:val="24"/>
-                <w:szCs w:val="24"/>
-                <w:rtl/>
-              </w:rPr>
-              <w:t xml:space="preserve"> לאחר התחברותו </w:t>
-            </w:r>
-            <w:r>
-              <w:rPr>
-                <w:rFonts w:ascii="David" w:hAnsi="David" w:cs="David" w:hint="cs"/>
-                <w:b w:val="0"/>
-                <w:bCs w:val="0"/>
-                <w:sz w:val="24"/>
-                <w:szCs w:val="24"/>
-                <w:rtl/>
-              </w:rPr>
-              <w:t>כמורה</w:t>
+              <w:t xml:space="preserve"> המסך הראשי למורה לאחר התחברותו כמורה</w:t>
             </w:r>
           </w:p>
         </w:tc>
@@ -13832,14 +13769,7 @@
           <w:rFonts w:ascii="David" w:hAnsi="David" w:hint="cs"/>
           <w:rtl/>
         </w:rPr>
-        <w:t>, קישור פקדים לעיצוב שלהם, דיאלוגים ועוד</w:t>
-      </w:r>
-      <w:r>
-        <w:rPr>
-          <w:rFonts w:ascii="David" w:hAnsi="David" w:hint="cs"/>
-          <w:rtl/>
-        </w:rPr>
-        <w:t>.</w:t>
+        <w:t>, קישור פקדים לעיצוב שלהם, דיאלוגים ועוד.</w:t>
       </w:r>
       <w:bookmarkStart w:id="36" w:name="_Toc29994040"/>
       <w:bookmarkStart w:id="37" w:name="_Toc39329426"/>
@@ -14133,7 +14063,7 @@
                           </pic:cNvPicPr>
                         </pic:nvPicPr>
                         <pic:blipFill>
-                          <a:blip r:embed="rId26" cstate="print">
+                          <a:blip r:embed="rId27" cstate="print">
                             <a:extLst>
                               <a:ext uri="{28A0092B-C50C-407E-A947-70E740481C1C}">
                                 <a14:useLocalDpi xmlns:a14="http://schemas.microsoft.com/office/drawing/2010/main" val="0"/>
@@ -14388,14 +14318,7 @@
                 <w:rFonts w:ascii="David" w:hAnsi="David"/>
                 <w:sz w:val="24"/>
               </w:rPr>
-              <w:t>L</w:t>
-            </w:r>
-            <w:r>
-              <w:rPr>
-                <w:rFonts w:ascii="David" w:hAnsi="David"/>
-                <w:sz w:val="24"/>
-              </w:rPr>
-              <w:t>essonTypeNo</w:t>
+              <w:t>LessonTypeNo</w:t>
             </w:r>
             <w:proofErr w:type="spellEnd"/>
           </w:p>
@@ -15074,7 +14997,7 @@
                           </pic:cNvPicPr>
                         </pic:nvPicPr>
                         <pic:blipFill>
-                          <a:blip r:embed="rId26" cstate="print">
+                          <a:blip r:embed="rId27" cstate="print">
                             <a:extLst>
                               <a:ext uri="{28A0092B-C50C-407E-A947-70E740481C1C}">
                                 <a14:useLocalDpi xmlns:a14="http://schemas.microsoft.com/office/drawing/2010/main" val="0"/>
@@ -15346,7 +15269,7 @@
                           </pic:cNvPicPr>
                         </pic:nvPicPr>
                         <pic:blipFill>
-                          <a:blip r:embed="rId26" cstate="print">
+                          <a:blip r:embed="rId27" cstate="print">
                             <a:extLst>
                               <a:ext uri="{28A0092B-C50C-407E-A947-70E740481C1C}">
                                 <a14:useLocalDpi xmlns:a14="http://schemas.microsoft.com/office/drawing/2010/main" val="0"/>
@@ -16091,7 +16014,7 @@
                           </pic:cNvPicPr>
                         </pic:nvPicPr>
                         <pic:blipFill>
-                          <a:blip r:embed="rId26" cstate="print">
+                          <a:blip r:embed="rId27" cstate="print">
                             <a:extLst>
                               <a:ext uri="{28A0092B-C50C-407E-A947-70E740481C1C}">
                                 <a14:useLocalDpi xmlns:a14="http://schemas.microsoft.com/office/drawing/2010/main" val="0"/>
@@ -16355,7 +16278,7 @@
                           </pic:cNvPicPr>
                         </pic:nvPicPr>
                         <pic:blipFill>
-                          <a:blip r:embed="rId26" cstate="print">
+                          <a:blip r:embed="rId27" cstate="print">
                             <a:extLst>
                               <a:ext uri="{28A0092B-C50C-407E-A947-70E740481C1C}">
                                 <a14:useLocalDpi xmlns:a14="http://schemas.microsoft.com/office/drawing/2010/main" val="0"/>
@@ -16932,7 +16855,7 @@
                           </pic:cNvPicPr>
                         </pic:nvPicPr>
                         <pic:blipFill>
-                          <a:blip r:embed="rId26" cstate="print">
+                          <a:blip r:embed="rId27" cstate="print">
                             <a:extLst>
                               <a:ext uri="{28A0092B-C50C-407E-A947-70E740481C1C}">
                                 <a14:useLocalDpi xmlns:a14="http://schemas.microsoft.com/office/drawing/2010/main" val="0"/>
@@ -17528,7 +17451,7 @@
                           </pic:cNvPicPr>
                         </pic:nvPicPr>
                         <pic:blipFill>
-                          <a:blip r:embed="rId26" cstate="print">
+                          <a:blip r:embed="rId27" cstate="print">
                             <a:extLst>
                               <a:ext uri="{28A0092B-C50C-407E-A947-70E740481C1C}">
                                 <a14:useLocalDpi xmlns:a14="http://schemas.microsoft.com/office/drawing/2010/main" val="0"/>
@@ -17941,23 +17864,7 @@
                 <w:sz w:val="24"/>
                 <w:rtl/>
               </w:rPr>
-              <w:t xml:space="preserve">תאריך </w:t>
-            </w:r>
-            <w:r>
-              <w:rPr>
-                <w:rFonts w:ascii="David" w:hAnsi="David" w:hint="cs"/>
-                <w:sz w:val="24"/>
-                <w:rtl/>
-              </w:rPr>
-              <w:t>ה</w:t>
-            </w:r>
-            <w:r>
-              <w:rPr>
-                <w:rFonts w:ascii="David" w:hAnsi="David" w:hint="cs"/>
-                <w:sz w:val="24"/>
-                <w:rtl/>
-              </w:rPr>
-              <w:t>שיעור</w:t>
+              <w:t>תאריך השיעור</w:t>
             </w:r>
           </w:p>
         </w:tc>
@@ -18477,7 +18384,7 @@
           </mc:Choice>
           <mc:Fallback>
             <w:pict>
-              <v:shape w14:anchorId="5BB4EA5F" id="מחבר חץ ישר 141" o:spid="_x0000_s1026" type="#_x0000_t32" style="position:absolute;margin-left:44.25pt;margin-top:172.25pt;width:35.25pt;height:53.25pt;z-index:251740672;visibility:visible;mso-wrap-style:square;mso-width-percent:0;mso-height-percent:0;mso-wrap-distance-left:9pt;mso-wrap-distance-top:0;mso-wrap-distance-right:9pt;mso-wrap-distance-bottom:0;mso-position-horizontal:absolute;mso-position-horizontal-relative:text;mso-position-vertical:absolute;mso-position-vertical-relative:text;mso-width-percent:0;mso-height-percent:0;mso-width-relative:margin;mso-height-relative:margin" o:gfxdata="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" strokecolor="black [3213]">
+              <v:shape w14:anchorId="740D31AF" id="מחבר חץ ישר 141" o:spid="_x0000_s1026" type="#_x0000_t32" style="position:absolute;margin-left:44.25pt;margin-top:172.25pt;width:35.25pt;height:53.25pt;z-index:251740672;visibility:visible;mso-wrap-style:square;mso-width-percent:0;mso-height-percent:0;mso-wrap-distance-left:9pt;mso-wrap-distance-top:0;mso-wrap-distance-right:9pt;mso-wrap-distance-bottom:0;mso-position-horizontal:absolute;mso-position-horizontal-relative:text;mso-position-vertical:absolute;mso-position-vertical-relative:text;mso-width-percent:0;mso-height-percent:0;mso-width-relative:margin;mso-height-relative:margin" o:gfxdata="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" strokecolor="black [3213]">
                 <v:stroke startarrow="block" endarrow="block"/>
               </v:shape>
             </w:pict>
@@ -18557,7 +18464,7 @@
           </mc:Choice>
           <mc:Fallback>
             <w:pict>
-              <v:shape w14:anchorId="3768FA53" id="מחבר חץ ישר 142" o:spid="_x0000_s1026" type="#_x0000_t32" style="position:absolute;margin-left:115.5pt;margin-top:172.25pt;width:44.25pt;height:52.5pt;flip:x;z-index:251742720;visibility:visible;mso-wrap-style:square;mso-width-percent:0;mso-height-percent:0;mso-wrap-distance-left:9pt;mso-wrap-distance-top:0;mso-wrap-distance-right:9pt;mso-wrap-distance-bottom:0;mso-position-horizontal:absolute;mso-position-horizontal-relative:margin;mso-position-vertical:absolute;mso-position-vertical-relative:text;mso-width-percent:0;mso-height-percent:0;mso-width-relative:margin;mso-height-relative:margin" o:gfxdata="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" strokecolor="black [3213]" strokeweight="1.5pt">
+              <v:shape w14:anchorId="75BEA62C" id="מחבר חץ ישר 142" o:spid="_x0000_s1026" type="#_x0000_t32" style="position:absolute;margin-left:115.5pt;margin-top:172.25pt;width:44.25pt;height:52.5pt;flip:x;z-index:251742720;visibility:visible;mso-wrap-style:square;mso-width-percent:0;mso-height-percent:0;mso-wrap-distance-left:9pt;mso-wrap-distance-top:0;mso-wrap-distance-right:9pt;mso-wrap-distance-bottom:0;mso-position-horizontal:absolute;mso-position-horizontal-relative:margin;mso-position-vertical:absolute;mso-position-vertical-relative:text;mso-width-percent:0;mso-height-percent:0;mso-width-relative:margin;mso-height-relative:margin" o:gfxdata="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" strokecolor="black [3213]" strokeweight="1.5pt">
                 <v:stroke endarrow="open"/>
                 <o:lock v:ext="edit" shapetype="f"/>
                 <w10:wrap anchorx="margin"/>
@@ -18639,7 +18546,7 @@
           </mc:Choice>
           <mc:Fallback>
             <w:pict>
-              <v:shape w14:anchorId="49557A83" id="מחבר חץ ישר 143" o:spid="_x0000_s1026" type="#_x0000_t32" style="position:absolute;margin-left:147.75pt;margin-top:176pt;width:113.25pt;height:48pt;flip:y;z-index:251744768;visibility:visible;mso-wrap-style:square;mso-width-percent:0;mso-height-percent:0;mso-wrap-distance-left:9pt;mso-wrap-distance-top:0;mso-wrap-distance-right:9pt;mso-wrap-distance-bottom:0;mso-position-horizontal:absolute;mso-position-horizontal-relative:margin;mso-position-vertical:absolute;mso-position-vertical-relative:text;mso-width-percent:0;mso-height-percent:0;mso-width-relative:margin;mso-height-relative:margin" o:gfxdata="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" strokecolor="black [3213]" strokeweight="1.5pt">
+              <v:shape w14:anchorId="4D0CF644" id="מחבר חץ ישר 143" o:spid="_x0000_s1026" type="#_x0000_t32" style="position:absolute;margin-left:147.75pt;margin-top:176pt;width:113.25pt;height:48pt;flip:y;z-index:251744768;visibility:visible;mso-wrap-style:square;mso-width-percent:0;mso-height-percent:0;mso-wrap-distance-left:9pt;mso-wrap-distance-top:0;mso-wrap-distance-right:9pt;mso-wrap-distance-bottom:0;mso-position-horizontal:absolute;mso-position-horizontal-relative:margin;mso-position-vertical:absolute;mso-position-vertical-relative:text;mso-width-percent:0;mso-height-percent:0;mso-width-relative:margin;mso-height-relative:margin" o:gfxdata="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" strokecolor="black [3213]" strokeweight="1.5pt">
                 <v:stroke endarrow="open"/>
                 <o:lock v:ext="edit" shapetype="f"/>
                 <w10:wrap anchorx="margin"/>
@@ -18721,7 +18628,7 @@
           </mc:Choice>
           <mc:Fallback>
             <w:pict>
-              <v:shape w14:anchorId="4543DAAE" id="מחבר חץ ישר 130" o:spid="_x0000_s1026" type="#_x0000_t32" style="position:absolute;margin-left:50.25pt;margin-top:170.75pt;width:254.25pt;height:81.75pt;flip:x y;z-index:251720192;visibility:visible;mso-wrap-style:square;mso-width-percent:0;mso-height-percent:0;mso-wrap-distance-left:9pt;mso-wrap-distance-top:0;mso-wrap-distance-right:9pt;mso-wrap-distance-bottom:0;mso-position-horizontal:absolute;mso-position-horizontal-relative:margin;mso-position-vertical:absolute;mso-position-vertical-relative:text;mso-width-percent:0;mso-height-percent:0;mso-width-relative:margin;mso-height-relative:margin" o:gfxdata="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" strokecolor="black [3213]" strokeweight="1.5pt">
+              <v:shape w14:anchorId="1A04356C" id="מחבר חץ ישר 130" o:spid="_x0000_s1026" type="#_x0000_t32" style="position:absolute;margin-left:50.25pt;margin-top:170.75pt;width:254.25pt;height:81.75pt;flip:x y;z-index:251720192;visibility:visible;mso-wrap-style:square;mso-width-percent:0;mso-height-percent:0;mso-wrap-distance-left:9pt;mso-wrap-distance-top:0;mso-wrap-distance-right:9pt;mso-wrap-distance-bottom:0;mso-position-horizontal:absolute;mso-position-horizontal-relative:margin;mso-position-vertical:absolute;mso-position-vertical-relative:text;mso-width-percent:0;mso-height-percent:0;mso-width-relative:margin;mso-height-relative:margin" o:gfxdata="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" strokecolor="black [3213]" strokeweight="1.5pt">
                 <v:stroke endarrow="open"/>
                 <o:lock v:ext="edit" shapetype="f"/>
                 <w10:wrap anchorx="margin"/>
@@ -18803,7 +18710,7 @@
           </mc:Choice>
           <mc:Fallback>
             <w:pict>
-              <v:shape w14:anchorId="77C18278" id="מחבר חץ ישר 128" o:spid="_x0000_s1026" type="#_x0000_t32" style="position:absolute;margin-left:376.5pt;margin-top:174.5pt;width:50.25pt;height:76.5pt;flip:x;z-index:251716096;visibility:visible;mso-wrap-style:square;mso-width-percent:0;mso-height-percent:0;mso-wrap-distance-left:9pt;mso-wrap-distance-top:0;mso-wrap-distance-right:9pt;mso-wrap-distance-bottom:0;mso-position-horizontal:absolute;mso-position-horizontal-relative:margin;mso-position-vertical:absolute;mso-position-vertical-relative:text;mso-width-percent:0;mso-height-percent:0;mso-width-relative:margin;mso-height-relative:margin" o:gfxdata="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" strokecolor="black [3213]" strokeweight="1.5pt">
+              <v:shape w14:anchorId="5A43C172" id="מחבר חץ ישר 128" o:spid="_x0000_s1026" type="#_x0000_t32" style="position:absolute;margin-left:376.5pt;margin-top:174.5pt;width:50.25pt;height:76.5pt;flip:x;z-index:251716096;visibility:visible;mso-wrap-style:square;mso-width-percent:0;mso-height-percent:0;mso-wrap-distance-left:9pt;mso-wrap-distance-top:0;mso-wrap-distance-right:9pt;mso-wrap-distance-bottom:0;mso-position-horizontal:absolute;mso-position-horizontal-relative:margin;mso-position-vertical:absolute;mso-position-vertical-relative:text;mso-width-percent:0;mso-height-percent:0;mso-width-relative:margin;mso-height-relative:margin" o:gfxdata="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" strokecolor="black [3213]" strokeweight="1.5pt">
                 <v:stroke endarrow="open"/>
                 <o:lock v:ext="edit" shapetype="f"/>
                 <w10:wrap anchorx="margin"/>
@@ -18882,7 +18789,7 @@
           </mc:Choice>
           <mc:Fallback>
             <w:pict>
-              <v:shape w14:anchorId="798074A2" id="מחבר חץ ישר 129" o:spid="_x0000_s1026" type="#_x0000_t32" style="position:absolute;margin-left:315.75pt;margin-top:173.75pt;width:15pt;height:78.75pt;z-index:251718144;visibility:visible;mso-wrap-style:square;mso-width-percent:0;mso-height-percent:0;mso-wrap-distance-left:9pt;mso-wrap-distance-top:0;mso-wrap-distance-right:9pt;mso-wrap-distance-bottom:0;mso-position-horizontal:absolute;mso-position-horizontal-relative:text;mso-position-vertical:absolute;mso-position-vertical-relative:text;mso-width-percent:0;mso-height-percent:0;mso-width-relative:margin;mso-height-relative:margin" o:gfxdata="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" strokecolor="black [3213]">
+              <v:shape w14:anchorId="26DC8D13" id="מחבר חץ ישר 129" o:spid="_x0000_s1026" type="#_x0000_t32" style="position:absolute;margin-left:315.75pt;margin-top:173.75pt;width:15pt;height:78.75pt;z-index:251718144;visibility:visible;mso-wrap-style:square;mso-width-percent:0;mso-height-percent:0;mso-wrap-distance-left:9pt;mso-wrap-distance-top:0;mso-wrap-distance-right:9pt;mso-wrap-distance-bottom:0;mso-position-horizontal:absolute;mso-position-horizontal-relative:text;mso-position-vertical:absolute;mso-position-vertical-relative:text;mso-width-percent:0;mso-height-percent:0;mso-width-relative:margin;mso-height-relative:margin" o:gfxdata="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" strokecolor="black [3213]">
                 <v:stroke startarrow="block" endarrow="block"/>
               </v:shape>
             </w:pict>
@@ -18959,7 +18866,7 @@
           </mc:Choice>
           <mc:Fallback>
             <w:pict>
-              <v:shape w14:anchorId="6F876DA0" id="מחבר חץ ישר 123" o:spid="_x0000_s1026" type="#_x0000_t32" style="position:absolute;margin-left:362.25pt;margin-top:175.25pt;width:88.5pt;height:31.5pt;z-index:251709952;visibility:visible;mso-wrap-style:square;mso-width-percent:0;mso-height-percent:0;mso-wrap-distance-left:9pt;mso-wrap-distance-top:0;mso-wrap-distance-right:9pt;mso-wrap-distance-bottom:0;mso-position-horizontal:absolute;mso-position-horizontal-relative:text;mso-position-vertical:absolute;mso-position-vertical-relative:text;mso-width-percent:0;mso-height-percent:0;mso-width-relative:margin;mso-height-relative:margin" o:gfxdata="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" strokecolor="black [3213]">
+              <v:shape w14:anchorId="53697240" id="מחבר חץ ישר 123" o:spid="_x0000_s1026" type="#_x0000_t32" style="position:absolute;margin-left:362.25pt;margin-top:175.25pt;width:88.5pt;height:31.5pt;z-index:251709952;visibility:visible;mso-wrap-style:square;mso-width-percent:0;mso-height-percent:0;mso-wrap-distance-left:9pt;mso-wrap-distance-top:0;mso-wrap-distance-right:9pt;mso-wrap-distance-bottom:0;mso-position-horizontal:absolute;mso-position-horizontal-relative:text;mso-position-vertical:absolute;mso-position-vertical-relative:text;mso-width-percent:0;mso-height-percent:0;mso-width-relative:margin;mso-height-relative:margin" o:gfxdata="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" strokecolor="black [3213]">
                 <v:stroke startarrow="block" endarrow="block"/>
               </v:shape>
             </w:pict>
@@ -19039,7 +18946,7 @@
           </mc:Choice>
           <mc:Fallback>
             <w:pict>
-              <v:shape w14:anchorId="4AF4FC95" id="מחבר חץ ישר 120" o:spid="_x0000_s1026" type="#_x0000_t32" style="position:absolute;margin-left:93.75pt;margin-top:56.75pt;width:51.75pt;height:22.5pt;flip:x;z-index:-251609600;visibility:visible;mso-wrap-style:square;mso-width-percent:0;mso-height-percent:0;mso-wrap-distance-left:9pt;mso-wrap-distance-top:0;mso-wrap-distance-right:9pt;mso-wrap-distance-bottom:0;mso-position-horizontal:absolute;mso-position-horizontal-relative:margin;mso-position-vertical:absolute;mso-position-vertical-relative:text;mso-width-percent:0;mso-height-percent:0;mso-width-relative:margin;mso-height-relative:margin" o:gfxdata="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" strokecolor="black [3213]" strokeweight="1.5pt">
+              <v:shape w14:anchorId="6C3338A6" id="מחבר חץ ישר 120" o:spid="_x0000_s1026" type="#_x0000_t32" style="position:absolute;margin-left:93.75pt;margin-top:56.75pt;width:51.75pt;height:22.5pt;flip:x;z-index:-251609600;visibility:visible;mso-wrap-style:square;mso-width-percent:0;mso-height-percent:0;mso-wrap-distance-left:9pt;mso-wrap-distance-top:0;mso-wrap-distance-right:9pt;mso-wrap-distance-bottom:0;mso-position-horizontal:absolute;mso-position-horizontal-relative:margin;mso-position-vertical:absolute;mso-position-vertical-relative:text;mso-width-percent:0;mso-height-percent:0;mso-width-relative:margin;mso-height-relative:margin" o:gfxdata="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" strokecolor="black [3213]" strokeweight="1.5pt">
                 <v:stroke endarrow="open"/>
                 <o:lock v:ext="edit" shapetype="f"/>
                 <w10:wrap type="topAndBottom" anchorx="margin"/>
@@ -19381,7 +19288,7 @@
           </mc:Choice>
           <mc:Fallback>
             <w:pict>
-              <v:shapetype w14:anchorId="5C727254" id="_x0000_t87" coordsize="21600,21600" o:spt="87" adj="1800,10800" path="m21600,qx10800@0l10800@2qy0@11,10800@3l10800@1qy21600,21600e" filled="f">
+              <v:shapetype w14:anchorId="540225FE" id="_x0000_t87" coordsize="21600,21600" o:spt="87" adj="1800,10800" path="m21600,qx10800@0l10800@2qy0@11,10800@3l10800@1qy21600,21600e" filled="f">
                 <v:formulas>
                   <v:f eqn="val #0"/>
                   <v:f eqn="sum 21600 0 #0"/>
@@ -19480,7 +19387,7 @@
           </mc:Choice>
           <mc:Fallback>
             <w:pict>
-              <v:shape w14:anchorId="5D53CD7A" id="מחבר חץ ישר 15" o:spid="_x0000_s1026" type="#_x0000_t32" style="position:absolute;margin-left:304.5pt;margin-top:53pt;width:80.25pt;height:27.75pt;z-index:-251677184;visibility:visible;mso-wrap-style:square;mso-width-percent:0;mso-height-percent:0;mso-wrap-distance-left:9pt;mso-wrap-distance-top:0;mso-wrap-distance-right:9pt;mso-wrap-distance-bottom:0;mso-position-horizontal:absolute;mso-position-horizontal-relative:margin;mso-position-vertical:absolute;mso-position-vertical-relative:text;mso-width-percent:0;mso-height-percent:0;mso-width-relative:margin;mso-height-relative:margin" o:gfxdata="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" strokecolor="black [3213]" strokeweight="1.5pt">
+              <v:shape w14:anchorId="04778758" id="מחבר חץ ישר 15" o:spid="_x0000_s1026" type="#_x0000_t32" style="position:absolute;margin-left:304.5pt;margin-top:53pt;width:80.25pt;height:27.75pt;z-index:-251677184;visibility:visible;mso-wrap-style:square;mso-width-percent:0;mso-height-percent:0;mso-wrap-distance-left:9pt;mso-wrap-distance-top:0;mso-wrap-distance-right:9pt;mso-wrap-distance-bottom:0;mso-position-horizontal:absolute;mso-position-horizontal-relative:margin;mso-position-vertical:absolute;mso-position-vertical-relative:text;mso-width-percent:0;mso-height-percent:0;mso-width-relative:margin;mso-height-relative:margin" o:gfxdata="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" strokecolor="black [3213]" strokeweight="1.5pt">
                 <v:stroke endarrow="open"/>
                 <o:lock v:ext="edit" shapetype="f"/>
                 <w10:wrap type="topAndBottom" anchorx="margin"/>
@@ -19562,7 +19469,7 @@
           </mc:Choice>
           <mc:Fallback>
             <w:pict>
-              <v:shape w14:anchorId="3190F42D" id="סוגר מסולסל שמאלי 116" o:spid="_x0000_s1026" type="#_x0000_t87" style="position:absolute;margin-left:372.75pt;margin-top:75.5pt;width:23.25pt;height:35.25pt;rotation:90;z-index:251700736;visibility:visible;mso-wrap-style:square;mso-width-percent:0;mso-wrap-distance-left:9pt;mso-wrap-distance-top:0;mso-wrap-distance-right:9pt;mso-wrap-distance-bottom:0;mso-position-horizontal:absolute;mso-position-horizontal-relative:text;mso-position-vertical:absolute;mso-position-vertical-relative:text;mso-width-percent:0;mso-width-relative:margin;v-text-anchor:middle" o:gfxdata="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" adj="2758" strokecolor="black [3213]"/>
+              <v:shape w14:anchorId="3BFAFB75" id="סוגר מסולסל שמאלי 116" o:spid="_x0000_s1026" type="#_x0000_t87" style="position:absolute;margin-left:372.75pt;margin-top:75.5pt;width:23.25pt;height:35.25pt;rotation:90;z-index:251700736;visibility:visible;mso-wrap-style:square;mso-width-percent:0;mso-wrap-distance-left:9pt;mso-wrap-distance-top:0;mso-wrap-distance-right:9pt;mso-wrap-distance-bottom:0;mso-position-horizontal:absolute;mso-position-horizontal-relative:text;mso-position-vertical:absolute;mso-position-vertical-relative:text;mso-width-percent:0;mso-width-relative:margin;v-text-anchor:middle" o:gfxdata="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" adj="2758" strokecolor="black [3213]"/>
             </w:pict>
           </mc:Fallback>
         </mc:AlternateContent>
@@ -19951,7 +19858,7 @@
           </mc:Choice>
           <mc:Fallback>
             <w:pict>
-              <v:shapetype w14:anchorId="5AD55E76" id="_x0000_t13" coordsize="21600,21600" o:spt="13" adj="16200,5400" path="m@0,l@0@1,0@1,0@2@0@2@0,21600,21600,10800xe">
+              <v:shapetype w14:anchorId="35756FC5" id="_x0000_t13" coordsize="21600,21600" o:spt="13" adj="16200,5400" path="m@0,l@0@1,0@1,0@2@0@2@0,21600,21600,10800xe">
                 <v:stroke joinstyle="miter"/>
                 <v:formulas>
                   <v:f eqn="val #0"/>
@@ -20189,7 +20096,7 @@
           </mc:Choice>
           <mc:Fallback>
             <w:pict>
-              <v:shape w14:anchorId="24AF8364" id="מחבר חץ ישר 31" o:spid="_x0000_s1026" type="#_x0000_t32" style="position:absolute;margin-left:-72.25pt;margin-top:28.6pt;width:0;height:280.5pt;flip:y;z-index:251651584;visibility:visible;mso-wrap-style:square;mso-width-percent:0;mso-height-percent:0;mso-wrap-distance-left:3.17497mm;mso-wrap-distance-top:0;mso-wrap-distance-right:3.17497mm;mso-wrap-distance-bottom:0;mso-position-horizontal:absolute;mso-position-horizontal-relative:text;mso-position-vertical:absolute;mso-position-vertical-relative:text;mso-width-percent:0;mso-height-percent:0;mso-width-relative:margin;mso-height-relative:margin" o:gfxdata="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" strokecolor="black [3213]" strokeweight="1.5pt">
+              <v:shape w14:anchorId="7EAFFF2C" id="מחבר חץ ישר 31" o:spid="_x0000_s1026" type="#_x0000_t32" style="position:absolute;margin-left:-72.25pt;margin-top:28.6pt;width:0;height:280.5pt;flip:y;z-index:251651584;visibility:visible;mso-wrap-style:square;mso-width-percent:0;mso-height-percent:0;mso-wrap-distance-left:3.17497mm;mso-wrap-distance-top:0;mso-wrap-distance-right:3.17497mm;mso-wrap-distance-bottom:0;mso-position-horizontal:absolute;mso-position-horizontal-relative:text;mso-position-vertical:absolute;mso-position-vertical-relative:text;mso-width-percent:0;mso-height-percent:0;mso-width-relative:margin;mso-height-relative:margin" o:gfxdata="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" strokecolor="black [3213]" strokeweight="1.5pt">
                 <o:lock v:ext="edit" shapetype="f"/>
               </v:shape>
             </w:pict>
@@ -20293,7 +20200,7 @@
           </mc:Choice>
           <mc:Fallback>
             <w:pict>
-              <v:shape w14:anchorId="049398E0" id="מחבר חץ ישר 137" o:spid="_x0000_s1026" type="#_x0000_t32" style="position:absolute;margin-left:355.5pt;margin-top:243.7pt;width:10.5pt;height:81.75pt;z-index:251732480;visibility:visible;mso-wrap-style:square;mso-width-percent:0;mso-height-percent:0;mso-wrap-distance-left:9pt;mso-wrap-distance-top:0;mso-wrap-distance-right:9pt;mso-wrap-distance-bottom:0;mso-position-horizontal:absolute;mso-position-horizontal-relative:margin;mso-position-vertical:absolute;mso-position-vertical-relative:text;mso-width-percent:0;mso-height-percent:0;mso-width-relative:margin;mso-height-relative:margin" o:gfxdata="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" strokecolor="black [3213]">
+              <v:shape w14:anchorId="50068B97" id="מחבר חץ ישר 137" o:spid="_x0000_s1026" type="#_x0000_t32" style="position:absolute;margin-left:355.5pt;margin-top:243.7pt;width:10.5pt;height:81.75pt;z-index:251732480;visibility:visible;mso-wrap-style:square;mso-width-percent:0;mso-height-percent:0;mso-wrap-distance-left:9pt;mso-wrap-distance-top:0;mso-wrap-distance-right:9pt;mso-wrap-distance-bottom:0;mso-position-horizontal:absolute;mso-position-horizontal-relative:margin;mso-position-vertical:absolute;mso-position-vertical-relative:text;mso-width-percent:0;mso-height-percent:0;mso-width-relative:margin;mso-height-relative:margin" o:gfxdata="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" strokecolor="black [3213]">
                 <v:stroke startarrow="block" endarrow="block"/>
                 <w10:wrap anchorx="margin"/>
               </v:shape>
@@ -20501,7 +20408,7 @@
           </mc:Choice>
           <mc:Fallback>
             <w:pict>
-              <v:shape w14:anchorId="3D7F51F4" id="מחבר חץ ישר 145" o:spid="_x0000_s1026" type="#_x0000_t32" style="position:absolute;margin-left:96pt;margin-top:98.95pt;width:3.6pt;height:65.25pt;flip:x;z-index:251748864;visibility:visible;mso-wrap-style:square;mso-width-percent:0;mso-height-percent:0;mso-wrap-distance-left:9pt;mso-wrap-distance-top:0;mso-wrap-distance-right:9pt;mso-wrap-distance-bottom:0;mso-position-horizontal:absolute;mso-position-horizontal-relative:text;mso-position-vertical:absolute;mso-position-vertical-relative:text;mso-width-percent:0;mso-height-percent:0;mso-width-relative:margin;mso-height-relative:margin" o:gfxdata="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" strokecolor="black [3213]">
+              <v:shape w14:anchorId="069730BA" id="מחבר חץ ישר 145" o:spid="_x0000_s1026" type="#_x0000_t32" style="position:absolute;margin-left:96pt;margin-top:98.95pt;width:3.6pt;height:65.25pt;flip:x;z-index:251748864;visibility:visible;mso-wrap-style:square;mso-width-percent:0;mso-height-percent:0;mso-wrap-distance-left:9pt;mso-wrap-distance-top:0;mso-wrap-distance-right:9pt;mso-wrap-distance-bottom:0;mso-position-horizontal:absolute;mso-position-horizontal-relative:text;mso-position-vertical:absolute;mso-position-vertical-relative:text;mso-width-percent:0;mso-height-percent:0;mso-width-relative:margin;mso-height-relative:margin" o:gfxdata="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" strokecolor="black [3213]">
                 <v:stroke startarrow="block" endarrow="block"/>
               </v:shape>
             </w:pict>
@@ -20709,16 +20616,7 @@
                                 <w:sz w:val="44"/>
                                 <w:szCs w:val="44"/>
                               </w:rPr>
-                              <w:t>Teacher</w:t>
-                            </w:r>
-                            <w:r>
-                              <w:rPr>
-                                <w:b/>
-                                <w:bCs/>
-                                <w:sz w:val="44"/>
-                                <w:szCs w:val="44"/>
-                              </w:rPr>
-                              <w:t xml:space="preserve"> Activity</w:t>
+                              <w:t>Teacher Activity</w:t>
                             </w:r>
                           </w:p>
                         </w:txbxContent>
@@ -20766,16 +20664,7 @@
                           <w:sz w:val="44"/>
                           <w:szCs w:val="44"/>
                         </w:rPr>
-                        <w:t>Teacher</w:t>
-                      </w:r>
-                      <w:r>
-                        <w:rPr>
-                          <w:b/>
-                          <w:bCs/>
-                          <w:sz w:val="44"/>
-                          <w:szCs w:val="44"/>
-                        </w:rPr>
-                        <w:t xml:space="preserve"> Activity</w:t>
+                        <w:t>Teacher Activity</w:t>
                       </w:r>
                     </w:p>
                   </w:txbxContent>
@@ -20859,7 +20748,7 @@
           </mc:Choice>
           <mc:Fallback>
             <w:pict>
-              <v:shape w14:anchorId="3942995B" id="מחבר חץ ישר 139" o:spid="_x0000_s1026" type="#_x0000_t32" style="position:absolute;margin-left:282pt;margin-top:127.45pt;width:22.5pt;height:44.25pt;flip:x;z-index:251736576;visibility:visible;mso-wrap-style:square;mso-width-percent:0;mso-height-percent:0;mso-wrap-distance-left:9pt;mso-wrap-distance-top:0;mso-wrap-distance-right:9pt;mso-wrap-distance-bottom:0;mso-position-horizontal:absolute;mso-position-horizontal-relative:margin;mso-position-vertical:absolute;mso-position-vertical-relative:text;mso-width-percent:0;mso-height-percent:0;mso-width-relative:margin;mso-height-relative:margin" o:gfxdata="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" strokecolor="black [3213]" strokeweight="1.5pt">
+              <v:shape w14:anchorId="78BBDE18" id="מחבר חץ ישר 139" o:spid="_x0000_s1026" type="#_x0000_t32" style="position:absolute;margin-left:282pt;margin-top:127.45pt;width:22.5pt;height:44.25pt;flip:x;z-index:251736576;visibility:visible;mso-wrap-style:square;mso-width-percent:0;mso-height-percent:0;mso-wrap-distance-left:9pt;mso-wrap-distance-top:0;mso-wrap-distance-right:9pt;mso-wrap-distance-bottom:0;mso-position-horizontal:absolute;mso-position-horizontal-relative:margin;mso-position-vertical:absolute;mso-position-vertical-relative:text;mso-width-percent:0;mso-height-percent:0;mso-width-relative:margin;mso-height-relative:margin" o:gfxdata="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" strokecolor="black [3213]" strokeweight="1.5pt">
                 <v:stroke endarrow="open"/>
                 <o:lock v:ext="edit" shapetype="f"/>
                 <w10:wrap anchorx="margin"/>
@@ -21201,7 +21090,7 @@
           </mc:Choice>
           <mc:Fallback>
             <w:pict>
-              <v:shape w14:anchorId="535699CE" id="מחבר חץ ישר 132" o:spid="_x0000_s1026" type="#_x0000_t32" style="position:absolute;margin-left:-5.45pt;margin-top:126.7pt;width:45.75pt;height:45pt;z-index:251724288;visibility:visible;mso-wrap-style:square;mso-width-percent:0;mso-height-percent:0;mso-wrap-distance-left:9pt;mso-wrap-distance-top:0;mso-wrap-distance-right:9pt;mso-wrap-distance-bottom:0;mso-position-horizontal:right;mso-position-horizontal-relative:margin;mso-position-vertical:absolute;mso-position-vertical-relative:text;mso-width-percent:0;mso-height-percent:0;mso-width-relative:margin;mso-height-relative:margin" o:gfxdata="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" strokecolor="black [3213]" strokeweight="1.5pt">
+              <v:shape w14:anchorId="128746A0" id="מחבר חץ ישר 132" o:spid="_x0000_s1026" type="#_x0000_t32" style="position:absolute;margin-left:-5.45pt;margin-top:126.7pt;width:45.75pt;height:45pt;z-index:251724288;visibility:visible;mso-wrap-style:square;mso-width-percent:0;mso-height-percent:0;mso-wrap-distance-left:9pt;mso-wrap-distance-top:0;mso-wrap-distance-right:9pt;mso-wrap-distance-bottom:0;mso-position-horizontal:right;mso-position-horizontal-relative:margin;mso-position-vertical:absolute;mso-position-vertical-relative:text;mso-width-percent:0;mso-height-percent:0;mso-width-relative:margin;mso-height-relative:margin" o:gfxdata="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" strokecolor="black [3213]" strokeweight="1.5pt">
                 <v:stroke endarrow="open"/>
                 <o:lock v:ext="edit" shapetype="f"/>
                 <w10:wrap anchorx="margin"/>
@@ -21413,7 +21302,7 @@
           </mc:Choice>
           <mc:Fallback>
             <w:pict>
-              <v:shape w14:anchorId="01503929" id="מחבר חץ ישר 134" o:spid="_x0000_s1026" type="#_x0000_t32" style="position:absolute;margin-left:354pt;margin-top:125.95pt;width:3.6pt;height:54.75pt;z-index:251728384;visibility:visible;mso-wrap-style:square;mso-width-percent:0;mso-height-percent:0;mso-wrap-distance-left:9pt;mso-wrap-distance-top:0;mso-wrap-distance-right:9pt;mso-wrap-distance-bottom:0;mso-position-horizontal:absolute;mso-position-horizontal-relative:margin;mso-position-vertical:absolute;mso-position-vertical-relative:text;mso-width-percent:0;mso-height-percent:0;mso-width-relative:margin;mso-height-relative:margin" o:gfxdata="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" strokecolor="black [3213]" strokeweight="1.5pt">
+              <v:shape w14:anchorId="4CB25ACA" id="מחבר חץ ישר 134" o:spid="_x0000_s1026" type="#_x0000_t32" style="position:absolute;margin-left:354pt;margin-top:125.95pt;width:3.6pt;height:54.75pt;z-index:251728384;visibility:visible;mso-wrap-style:square;mso-width-percent:0;mso-height-percent:0;mso-wrap-distance-left:9pt;mso-wrap-distance-top:0;mso-wrap-distance-right:9pt;mso-wrap-distance-bottom:0;mso-position-horizontal:absolute;mso-position-horizontal-relative:margin;mso-position-vertical:absolute;mso-position-vertical-relative:text;mso-width-percent:0;mso-height-percent:0;mso-width-relative:margin;mso-height-relative:margin" o:gfxdata="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" strokecolor="black [3213]" strokeweight="1.5pt">
                 <v:stroke endarrow="open"/>
                 <o:lock v:ext="edit" shapetype="f"/>
                 <w10:wrap anchorx="margin"/>
@@ -21685,227 +21574,105 @@
     </w:p>
     <w:p>
       <w:pPr>
-        <w:pageBreakBefore/>
-        <w:spacing w:line="276" w:lineRule="auto"/>
-        <w:rPr>
-          <w:rFonts w:ascii="David" w:hAnsi="David"/>
-          <w:b/>
-          <w:bCs/>
-          <w:color w:val="0000FF"/>
-          <w:rtl/>
-        </w:rPr>
-      </w:pPr>
-      <w:r>
-        <w:rPr>
-          <w:rFonts w:ascii="David" w:hAnsi="David"/>
-          <w:b/>
-          <w:bCs/>
-          <w:color w:val="0000FF"/>
-          <w:rtl/>
-        </w:rPr>
-        <w:lastRenderedPageBreak/>
-        <w:t xml:space="preserve">יש לשים פה </w:t>
-      </w:r>
-      <w:r>
-        <w:rPr>
-          <w:rFonts w:ascii="David" w:hAnsi="David"/>
-          <w:b/>
-          <w:bCs/>
-          <w:color w:val="0000FF"/>
-          <w:rtl/>
-        </w:rPr>
-        <w:t>צילום מסך</w:t>
-      </w:r>
-      <w:r>
-        <w:rPr>
-          <w:rFonts w:ascii="David" w:hAnsi="David"/>
-          <w:b/>
-          <w:bCs/>
-          <w:color w:val="0000FF"/>
-          <w:rtl/>
-        </w:rPr>
-        <w:t xml:space="preserve"> של כל המסכים בתוכנית והסבר על התפקיד של כל מסך, כל כפתור / פקד עליו, כל תפריט (וכל אופציה בתוכו), כל </w:t>
-      </w:r>
-      <w:r>
-        <w:rPr>
-          <w:rFonts w:ascii="David" w:hAnsi="David"/>
-          <w:b/>
-          <w:bCs/>
-          <w:color w:val="0000FF"/>
-        </w:rPr>
-        <w:t>Dialog</w:t>
-      </w:r>
-      <w:r>
-        <w:rPr>
-          <w:rFonts w:ascii="David" w:hAnsi="David"/>
-          <w:b/>
-          <w:bCs/>
-          <w:color w:val="0000FF"/>
-          <w:rtl/>
-        </w:rPr>
-        <w:t xml:space="preserve"> שנפתח </w:t>
-      </w:r>
-      <w:proofErr w:type="spellStart"/>
-      <w:r>
-        <w:rPr>
-          <w:rFonts w:ascii="David" w:hAnsi="David"/>
-          <w:b/>
-          <w:bCs/>
-          <w:color w:val="0000FF"/>
-          <w:rtl/>
-        </w:rPr>
-        <w:t>וכו</w:t>
-      </w:r>
-      <w:proofErr w:type="spellEnd"/>
-      <w:r>
-        <w:rPr>
-          <w:rFonts w:ascii="David" w:hAnsi="David"/>
-          <w:b/>
-          <w:bCs/>
-          <w:color w:val="0000FF"/>
-          <w:rtl/>
-        </w:rPr>
-        <w:t>'.</w:t>
-      </w:r>
-    </w:p>
-    <w:p>
-      <w:pPr>
-        <w:spacing w:line="276" w:lineRule="auto"/>
-        <w:rPr>
-          <w:rFonts w:ascii="David" w:hAnsi="David"/>
-          <w:color w:val="0000FF"/>
-          <w:rtl/>
-        </w:rPr>
-      </w:pPr>
-      <w:r>
-        <w:rPr>
-          <w:rFonts w:ascii="David" w:hAnsi="David"/>
-          <w:color w:val="0000FF"/>
-          <w:u w:val="single"/>
-          <w:rtl/>
-        </w:rPr>
-        <w:t>הערה:</w:t>
-      </w:r>
-      <w:r>
-        <w:rPr>
-          <w:rFonts w:ascii="David" w:hAnsi="David"/>
-          <w:color w:val="0000FF"/>
-          <w:rtl/>
-        </w:rPr>
-        <w:t xml:space="preserve"> ניתן להניח כי הקורא הוא </w:t>
-      </w:r>
-      <w:proofErr w:type="spellStart"/>
-      <w:r>
-        <w:rPr>
-          <w:rFonts w:ascii="David" w:hAnsi="David"/>
-          <w:color w:val="0000FF"/>
-          <w:rtl/>
-        </w:rPr>
-        <w:t>אינטיליגנטי</w:t>
-      </w:r>
-      <w:proofErr w:type="spellEnd"/>
-      <w:r>
-        <w:rPr>
-          <w:rFonts w:ascii="David" w:hAnsi="David"/>
-          <w:color w:val="0000FF"/>
-          <w:rtl/>
-        </w:rPr>
-        <w:t xml:space="preserve"> מספיק כדי לדעת לקרוא את הכתוב על הכפתורים, לכן יש צורך להרחיב רק לגבי כפתורים/אופציות בתפריט אשר אינם מובנים מאליהם או שבקוד מאחור קורים דברים שאינם טריוויאליים (למשל – כאשר בוחרים "המשך משחק" המערכת ממשיכה את המשחק האחרון, בעוד ש"התחל משחק חדש" ימחק את המשחק השמור ויתחיל חדש, אחרי שיפתח </w:t>
-      </w:r>
-      <w:r>
-        <w:rPr>
-          <w:rFonts w:ascii="David" w:hAnsi="David"/>
-          <w:color w:val="0000FF"/>
-        </w:rPr>
-        <w:t>Dialog</w:t>
-      </w:r>
-      <w:r>
-        <w:rPr>
-          <w:rFonts w:ascii="David" w:hAnsi="David"/>
-          <w:color w:val="0000FF"/>
-          <w:rtl/>
-        </w:rPr>
-        <w:t xml:space="preserve"> שמוודא שהמשתמש מבין שזה מה שהולך לקרות).</w:t>
-      </w:r>
-    </w:p>
-    <w:p>
-      <w:pPr>
-        <w:spacing w:line="276" w:lineRule="auto"/>
-        <w:rPr>
-          <w:rFonts w:ascii="David" w:hAnsi="David"/>
-          <w:color w:val="0000FF"/>
-          <w:rtl/>
-        </w:rPr>
-      </w:pPr>
-      <w:r>
-        <w:rPr>
-          <w:rFonts w:ascii="David" w:hAnsi="David"/>
-          <w:color w:val="0000FF"/>
-          <w:rtl/>
-        </w:rPr>
-        <w:t xml:space="preserve">הערה: בכל אחד מהמסכים יש להתייחס מפורשות לדברים שקוראים כחלק ממחזור החיים של </w:t>
-      </w:r>
-      <w:r>
-        <w:rPr>
-          <w:rFonts w:ascii="David" w:hAnsi="David"/>
-          <w:color w:val="0000FF"/>
-        </w:rPr>
-        <w:t>Activity</w:t>
-      </w:r>
-      <w:r>
-        <w:rPr>
-          <w:rFonts w:ascii="David" w:hAnsi="David"/>
-          <w:color w:val="0000FF"/>
-          <w:rtl/>
-        </w:rPr>
-        <w:t xml:space="preserve"> (למשל – ב-</w:t>
-      </w:r>
-      <w:proofErr w:type="spellStart"/>
-      <w:r>
-        <w:rPr>
-          <w:rFonts w:ascii="David" w:hAnsi="David"/>
-          <w:color w:val="0000FF"/>
-        </w:rPr>
-        <w:t>onPause</w:t>
-      </w:r>
-      <w:proofErr w:type="spellEnd"/>
-      <w:r>
-        <w:rPr>
-          <w:rFonts w:ascii="David" w:hAnsi="David"/>
-          <w:color w:val="0000FF"/>
-          <w:rtl/>
-        </w:rPr>
-        <w:t xml:space="preserve"> שומרים לקובץ את מצב המערכת, ב-</w:t>
-      </w:r>
-      <w:proofErr w:type="spellStart"/>
-      <w:r>
-        <w:rPr>
-          <w:rFonts w:ascii="David" w:hAnsi="David"/>
-          <w:color w:val="0000FF"/>
-        </w:rPr>
-        <w:t>onResume</w:t>
-      </w:r>
-      <w:proofErr w:type="spellEnd"/>
-      <w:r>
-        <w:rPr>
-          <w:rFonts w:ascii="David" w:hAnsi="David"/>
-          <w:color w:val="0000FF"/>
-          <w:rtl/>
-        </w:rPr>
-        <w:t xml:space="preserve"> טוענים אותו חזרה).</w:t>
-      </w:r>
-    </w:p>
-    <w:p>
-      <w:pPr>
         <w:pStyle w:val="3"/>
         <w:spacing w:line="276" w:lineRule="auto"/>
         <w:rPr>
           <w:rFonts w:ascii="David" w:hAnsi="David" w:cs="David"/>
-          <w:rtl/>
         </w:rPr>
       </w:pPr>
       <w:bookmarkStart w:id="50" w:name="_Toc29994007"/>
       <w:bookmarkStart w:id="51" w:name="_Toc39329433"/>
+    </w:p>
+    <w:p>
+      <w:pPr>
+        <w:pStyle w:val="3"/>
+        <w:jc w:val="left"/>
+        <w:rPr>
+          <w:rFonts w:ascii="David" w:hAnsi="David" w:cs="David"/>
+        </w:rPr>
+      </w:pPr>
+      <w:r>
+        <w:rPr>
+          <w:rFonts w:ascii="David" w:hAnsi="David" w:cs="David"/>
+          <w:noProof/>
+        </w:rPr>
+        <w:drawing>
+          <wp:anchor distT="0" distB="0" distL="114300" distR="114300" simplePos="0" relativeHeight="251750912" behindDoc="1" locked="0" layoutInCell="1" allowOverlap="1" wp14:anchorId="5ADB53C5" wp14:editId="74A5458C">
+            <wp:simplePos x="0" y="0"/>
+            <wp:positionH relativeFrom="column">
+              <wp:posOffset>-819150</wp:posOffset>
+            </wp:positionH>
+            <wp:positionV relativeFrom="paragraph">
+              <wp:posOffset>522605</wp:posOffset>
+            </wp:positionV>
+            <wp:extent cx="1143000" cy="2293594"/>
+            <wp:effectExtent l="0" t="0" r="0" b="0"/>
+            <wp:wrapNone/>
+            <wp:docPr id="147" name="תמונה 147"/>
+            <wp:cNvGraphicFramePr>
+              <a:graphicFrameLocks xmlns:a="http://schemas.openxmlformats.org/drawingml/2006/main" noChangeAspect="1"/>
+            </wp:cNvGraphicFramePr>
+            <a:graphic xmlns:a="http://schemas.openxmlformats.org/drawingml/2006/main">
+              <a:graphicData uri="http://schemas.openxmlformats.org/drawingml/2006/picture">
+                <pic:pic xmlns:pic="http://schemas.openxmlformats.org/drawingml/2006/picture">
+                  <pic:nvPicPr>
+                    <pic:cNvPr id="0" name="Picture 18"/>
+                    <pic:cNvPicPr>
+                      <a:picLocks noChangeAspect="1" noChangeArrowheads="1"/>
+                    </pic:cNvPicPr>
+                  </pic:nvPicPr>
+                  <pic:blipFill>
+                    <a:blip r:embed="rId28" cstate="print">
+                      <a:extLst>
+                        <a:ext uri="{28A0092B-C50C-407E-A947-70E740481C1C}">
+                          <a14:useLocalDpi xmlns:a14="http://schemas.microsoft.com/office/drawing/2010/main" val="0"/>
+                        </a:ext>
+                      </a:extLst>
+                    </a:blip>
+                    <a:srcRect/>
+                    <a:stretch>
+                      <a:fillRect/>
+                    </a:stretch>
+                  </pic:blipFill>
+                  <pic:spPr bwMode="auto">
+                    <a:xfrm>
+                      <a:off x="0" y="0"/>
+                      <a:ext cx="1176263" cy="2360341"/>
+                    </a:xfrm>
+                    <a:prstGeom prst="rect">
+                      <a:avLst/>
+                    </a:prstGeom>
+                    <a:noFill/>
+                    <a:ln>
+                      <a:noFill/>
+                    </a:ln>
+                  </pic:spPr>
+                </pic:pic>
+              </a:graphicData>
+            </a:graphic>
+            <wp14:sizeRelH relativeFrom="margin">
+              <wp14:pctWidth>0</wp14:pctWidth>
+            </wp14:sizeRelH>
+            <wp14:sizeRelV relativeFrom="margin">
+              <wp14:pctHeight>0</wp14:pctHeight>
+            </wp14:sizeRelV>
+          </wp:anchor>
+        </w:drawing>
+      </w:r>
+      <w:r>
+        <w:rPr>
+          <w:rFonts w:ascii="David" w:hAnsi="David" w:cs="David"/>
+        </w:rPr>
+        <w:t>Activities</w:t>
+      </w:r>
+    </w:p>
+    <w:p>
+      <w:pPr>
+        <w:pStyle w:val="4"/>
+        <w:rPr>
+          <w:rFonts w:ascii="David" w:hAnsi="David" w:cs="David"/>
+        </w:rPr>
+      </w:pPr>
       <w:r>
         <w:rPr>
           <w:rFonts w:ascii="David" w:hAnsi="David" w:cs="David"/>
@@ -21917,243 +21684,2065 @@
       <w:bookmarkEnd w:id="51"/>
     </w:p>
     <w:p>
-      <w:pPr>
-        <w:spacing w:line="276" w:lineRule="auto"/>
-        <w:rPr>
-          <w:rFonts w:ascii="David" w:hAnsi="David"/>
-          <w:color w:val="FF0000"/>
-          <w:rtl/>
-        </w:rPr>
-      </w:pPr>
-      <w:r>
-        <w:rPr>
-          <w:rFonts w:ascii="David" w:hAnsi="David"/>
-          <w:color w:val="FF0000"/>
-          <w:rtl/>
-        </w:rPr>
-        <w:t>דוגמא: מסך זה מכיל את התפריט הראשי של האפליקציה והוא המסך הראשון שהמשתמש רואה ...</w:t>
-      </w:r>
-    </w:p>
-    <w:p>
-      <w:pPr>
-        <w:spacing w:line="276" w:lineRule="auto"/>
-        <w:rPr>
-          <w:rFonts w:ascii="David" w:hAnsi="David"/>
-          <w:b/>
-          <w:bCs/>
-          <w:color w:val="FF0000"/>
-          <w:rtl/>
-        </w:rPr>
-      </w:pPr>
-      <w:r>
-        <w:rPr>
-          <w:rFonts w:ascii="David" w:hAnsi="David"/>
-          <w:b/>
-          <w:bCs/>
-          <w:color w:val="FF0000"/>
-          <w:rtl/>
-        </w:rPr>
-        <w:t>יש לצרף את צילום המסך !</w:t>
-      </w:r>
-    </w:p>
+      <w:r>
+        <w:rPr>
+          <w:rFonts w:hint="cs"/>
+          <w:rtl/>
+        </w:rPr>
+        <w:t>המסך הראשון אותו רואים בעת פתיחת האפליקציה</w:t>
+      </w:r>
+    </w:p>
+    <w:p/>
+    <w:p/>
+    <w:p/>
+    <w:p/>
+    <w:p/>
+    <w:p/>
+    <w:p/>
+    <w:p/>
     <w:p>
       <w:pPr>
         <w:pStyle w:val="4"/>
-        <w:spacing w:line="276" w:lineRule="auto"/>
         <w:rPr>
           <w:rFonts w:ascii="David" w:hAnsi="David" w:cs="David"/>
-          <w:rtl/>
-        </w:rPr>
-      </w:pPr>
-      <w:bookmarkStart w:id="52" w:name="_Toc29994008"/>
+        </w:rPr>
+      </w:pPr>
+      <w:r>
+        <w:rPr>
+          <w:noProof/>
+        </w:rPr>
+        <w:drawing>
+          <wp:anchor distT="0" distB="0" distL="114300" distR="114300" simplePos="0" relativeHeight="251751936" behindDoc="1" locked="0" layoutInCell="1" allowOverlap="1" wp14:anchorId="06E1148C" wp14:editId="4FA67934">
+            <wp:simplePos x="0" y="0"/>
+            <wp:positionH relativeFrom="column">
+              <wp:posOffset>-838200</wp:posOffset>
+            </wp:positionH>
+            <wp:positionV relativeFrom="paragraph">
+              <wp:posOffset>152400</wp:posOffset>
+            </wp:positionV>
+            <wp:extent cx="1295400" cy="2647310"/>
+            <wp:effectExtent l="0" t="0" r="0" b="1270"/>
+            <wp:wrapNone/>
+            <wp:docPr id="148" name="תמונה 148"/>
+            <wp:cNvGraphicFramePr>
+              <a:graphicFrameLocks xmlns:a="http://schemas.openxmlformats.org/drawingml/2006/main" noChangeAspect="1"/>
+            </wp:cNvGraphicFramePr>
+            <a:graphic xmlns:a="http://schemas.openxmlformats.org/drawingml/2006/main">
+              <a:graphicData uri="http://schemas.openxmlformats.org/drawingml/2006/picture">
+                <pic:pic xmlns:pic="http://schemas.openxmlformats.org/drawingml/2006/picture">
+                  <pic:nvPicPr>
+                    <pic:cNvPr id="0" name="Picture 19"/>
+                    <pic:cNvPicPr>
+                      <a:picLocks noChangeAspect="1" noChangeArrowheads="1"/>
+                    </pic:cNvPicPr>
+                  </pic:nvPicPr>
+                  <pic:blipFill>
+                    <a:blip r:embed="rId29" cstate="print">
+                      <a:extLst>
+                        <a:ext uri="{28A0092B-C50C-407E-A947-70E740481C1C}">
+                          <a14:useLocalDpi xmlns:a14="http://schemas.microsoft.com/office/drawing/2010/main" val="0"/>
+                        </a:ext>
+                      </a:extLst>
+                    </a:blip>
+                    <a:srcRect/>
+                    <a:stretch>
+                      <a:fillRect/>
+                    </a:stretch>
+                  </pic:blipFill>
+                  <pic:spPr bwMode="auto">
+                    <a:xfrm>
+                      <a:off x="0" y="0"/>
+                      <a:ext cx="1328898" cy="2715768"/>
+                    </a:xfrm>
+                    <a:prstGeom prst="rect">
+                      <a:avLst/>
+                    </a:prstGeom>
+                    <a:noFill/>
+                    <a:ln>
+                      <a:noFill/>
+                    </a:ln>
+                  </pic:spPr>
+                </pic:pic>
+              </a:graphicData>
+            </a:graphic>
+            <wp14:sizeRelH relativeFrom="margin">
+              <wp14:pctWidth>0</wp14:pctWidth>
+            </wp14:sizeRelH>
+            <wp14:sizeRelV relativeFrom="margin">
+              <wp14:pctHeight>0</wp14:pctHeight>
+            </wp14:sizeRelV>
+          </wp:anchor>
+        </w:drawing>
+      </w:r>
       <w:r>
         <w:rPr>
           <w:rFonts w:ascii="David" w:hAnsi="David" w:cs="David"/>
           <w:rtl/>
         </w:rPr>
-        <w:t xml:space="preserve">תפריט </w:t>
-      </w:r>
-      <w:r>
+        <w:t>דיאלוג התחברות</w:t>
+      </w:r>
+    </w:p>
+    <w:p>
+      <w:pPr>
+        <w:rPr>
+          <w:rtl/>
+        </w:rPr>
+      </w:pPr>
+      <w:r>
+        <w:rPr>
+          <w:rFonts w:hint="cs"/>
+          <w:rtl/>
+        </w:rPr>
+        <w:t>מסך בו צריך הזין את פרטי התלמיד או המורה אליו רוצים להתחבר</w:t>
+      </w:r>
+    </w:p>
+    <w:p>
+      <w:pPr>
+        <w:rPr>
+          <w:rtl/>
+        </w:rPr>
+      </w:pPr>
+    </w:p>
+    <w:p>
+      <w:pPr>
+        <w:rPr>
+          <w:rtl/>
+        </w:rPr>
+      </w:pPr>
+    </w:p>
+    <w:p>
+      <w:pPr>
+        <w:rPr>
+          <w:rtl/>
+        </w:rPr>
+      </w:pPr>
+    </w:p>
+    <w:p>
+      <w:pPr>
+        <w:rPr>
+          <w:rtl/>
+        </w:rPr>
+      </w:pPr>
+    </w:p>
+    <w:p>
+      <w:pPr>
+        <w:rPr>
+          <w:rtl/>
+        </w:rPr>
+      </w:pPr>
+    </w:p>
+    <w:p>
+      <w:pPr>
+        <w:rPr>
+          <w:rtl/>
+        </w:rPr>
+      </w:pPr>
+    </w:p>
+    <w:p>
+      <w:pPr>
+        <w:rPr>
+          <w:rtl/>
+        </w:rPr>
+      </w:pPr>
+    </w:p>
+    <w:p>
+      <w:pPr>
+        <w:rPr>
+          <w:rtl/>
+        </w:rPr>
+      </w:pPr>
+    </w:p>
+    <w:p>
+      <w:pPr>
+        <w:rPr>
+          <w:rtl/>
+        </w:rPr>
+      </w:pPr>
+    </w:p>
+    <w:p>
+      <w:pPr>
+        <w:rPr>
+          <w:rtl/>
+        </w:rPr>
+      </w:pPr>
+    </w:p>
+    <w:p>
+      <w:pPr>
+        <w:rPr>
+          <w:rtl/>
+        </w:rPr>
+      </w:pPr>
+    </w:p>
+    <w:p>
+      <w:pPr>
+        <w:rPr>
+          <w:rtl/>
+        </w:rPr>
+      </w:pPr>
+    </w:p>
+    <w:p>
+      <w:pPr>
+        <w:pStyle w:val="4"/>
         <w:rPr>
           <w:rFonts w:ascii="David" w:hAnsi="David" w:cs="David"/>
-        </w:rPr>
-        <w:t>X</w:t>
-      </w:r>
-      <w:bookmarkEnd w:id="52"/>
-    </w:p>
-    <w:p>
-      <w:pPr>
-        <w:spacing w:line="276" w:lineRule="auto"/>
-        <w:rPr>
-          <w:rFonts w:ascii="David" w:hAnsi="David"/>
-          <w:color w:val="FF0000"/>
-          <w:rtl/>
-        </w:rPr>
-      </w:pPr>
-      <w:r>
-        <w:rPr>
-          <w:rFonts w:ascii="David" w:hAnsi="David"/>
-          <w:color w:val="FF0000"/>
-          <w:rtl/>
-        </w:rPr>
-        <w:t>שימו צילום מסך של התפריט (</w:t>
-      </w:r>
-      <w:r>
-        <w:rPr>
-          <w:rFonts w:ascii="David" w:hAnsi="David"/>
-          <w:color w:val="FF0000"/>
-        </w:rPr>
-        <w:t>Options Menu</w:t>
-      </w:r>
-      <w:r>
-        <w:rPr>
-          <w:rFonts w:ascii="David" w:hAnsi="David"/>
-          <w:color w:val="FF0000"/>
-          <w:rtl/>
-        </w:rPr>
-        <w:t>) בו אתם משתמשים במסך זה (אם יש כזה) והסבירו מהן האופציות המופיעות בו.</w:t>
-      </w:r>
-    </w:p>
-    <w:p>
-      <w:pPr>
-        <w:spacing w:line="276" w:lineRule="auto"/>
-        <w:rPr>
-          <w:rFonts w:ascii="David" w:hAnsi="David"/>
-          <w:color w:val="FF0000"/>
-          <w:rtl/>
-        </w:rPr>
-      </w:pPr>
-      <w:r>
-        <w:rPr>
-          <w:rFonts w:ascii="David" w:hAnsi="David"/>
-          <w:color w:val="FF0000"/>
-          <w:rtl/>
-        </w:rPr>
-        <w:t>אם יש תפריטים גם על פקדים (</w:t>
+          <w:rtl/>
+        </w:rPr>
+      </w:pPr>
+      <w:r>
+        <w:rPr>
+          <w:noProof/>
+        </w:rPr>
+        <w:drawing>
+          <wp:anchor distT="0" distB="0" distL="114300" distR="114300" simplePos="0" relativeHeight="251752960" behindDoc="1" locked="0" layoutInCell="1" allowOverlap="1" wp14:anchorId="2BEB9950" wp14:editId="488B966B">
+            <wp:simplePos x="0" y="0"/>
+            <wp:positionH relativeFrom="column">
+              <wp:posOffset>-819150</wp:posOffset>
+            </wp:positionH>
+            <wp:positionV relativeFrom="paragraph">
+              <wp:posOffset>164465</wp:posOffset>
+            </wp:positionV>
+            <wp:extent cx="1348548" cy="2723976"/>
+            <wp:effectExtent l="0" t="0" r="4445" b="635"/>
+            <wp:wrapNone/>
+            <wp:docPr id="149" name="תמונה 149"/>
+            <wp:cNvGraphicFramePr>
+              <a:graphicFrameLocks xmlns:a="http://schemas.openxmlformats.org/drawingml/2006/main" noChangeAspect="1"/>
+            </wp:cNvGraphicFramePr>
+            <a:graphic xmlns:a="http://schemas.openxmlformats.org/drawingml/2006/main">
+              <a:graphicData uri="http://schemas.openxmlformats.org/drawingml/2006/picture">
+                <pic:pic xmlns:pic="http://schemas.openxmlformats.org/drawingml/2006/picture">
+                  <pic:nvPicPr>
+                    <pic:cNvPr id="0" name="Picture 20"/>
+                    <pic:cNvPicPr>
+                      <a:picLocks noChangeAspect="1" noChangeArrowheads="1"/>
+                    </pic:cNvPicPr>
+                  </pic:nvPicPr>
+                  <pic:blipFill>
+                    <a:blip r:embed="rId30">
+                      <a:extLst>
+                        <a:ext uri="{28A0092B-C50C-407E-A947-70E740481C1C}">
+                          <a14:useLocalDpi xmlns:a14="http://schemas.microsoft.com/office/drawing/2010/main" val="0"/>
+                        </a:ext>
+                      </a:extLst>
+                    </a:blip>
+                    <a:srcRect/>
+                    <a:stretch>
+                      <a:fillRect/>
+                    </a:stretch>
+                  </pic:blipFill>
+                  <pic:spPr bwMode="auto">
+                    <a:xfrm>
+                      <a:off x="0" y="0"/>
+                      <a:ext cx="1360806" cy="2748736"/>
+                    </a:xfrm>
+                    <a:prstGeom prst="rect">
+                      <a:avLst/>
+                    </a:prstGeom>
+                    <a:noFill/>
+                    <a:ln>
+                      <a:noFill/>
+                    </a:ln>
+                  </pic:spPr>
+                </pic:pic>
+              </a:graphicData>
+            </a:graphic>
+            <wp14:sizeRelH relativeFrom="margin">
+              <wp14:pctWidth>0</wp14:pctWidth>
+            </wp14:sizeRelH>
+            <wp14:sizeRelV relativeFrom="margin">
+              <wp14:pctHeight>0</wp14:pctHeight>
+            </wp14:sizeRelV>
+          </wp:anchor>
+        </w:drawing>
+      </w:r>
+      <w:r>
+        <w:rPr>
+          <w:rFonts w:ascii="David" w:hAnsi="David" w:cs="David"/>
+          <w:rtl/>
+        </w:rPr>
+        <w:t>הרשמת מורה</w:t>
+      </w:r>
+    </w:p>
+    <w:p>
+      <w:r>
+        <w:rPr>
+          <w:rFonts w:hint="cs"/>
+          <w:rtl/>
+        </w:rPr>
+        <w:t xml:space="preserve">מסך ההרשמה כמורה חדש במערכת. בשעות יש לכתוב בפורמט </w:t>
+      </w:r>
+      <w:r>
+        <w:t>HH:MM</w:t>
+      </w:r>
+      <w:r>
+        <w:rPr>
+          <w:rFonts w:hint="cs"/>
+          <w:rtl/>
+        </w:rPr>
+        <w:t>.</w:t>
+      </w:r>
+    </w:p>
+    <w:p/>
+    <w:p/>
+    <w:p/>
+    <w:p/>
+    <w:p/>
+    <w:p/>
+    <w:p/>
+    <w:p/>
+    <w:p/>
+    <w:p/>
+    <w:p>
+      <w:pPr>
+        <w:pStyle w:val="4"/>
+        <w:rPr>
+          <w:rFonts w:ascii="David" w:hAnsi="David" w:cs="David"/>
+          <w:rtl/>
+        </w:rPr>
+      </w:pPr>
+      <w:r>
+        <w:rPr>
+          <w:rFonts w:hint="cs"/>
+          <w:noProof/>
+        </w:rPr>
+        <w:lastRenderedPageBreak/>
+        <w:drawing>
+          <wp:anchor distT="0" distB="0" distL="114300" distR="114300" simplePos="0" relativeHeight="251753984" behindDoc="1" locked="0" layoutInCell="1" allowOverlap="1" wp14:anchorId="51F7AF5B" wp14:editId="6AEEC063">
+            <wp:simplePos x="0" y="0"/>
+            <wp:positionH relativeFrom="column">
+              <wp:posOffset>-790575</wp:posOffset>
+            </wp:positionH>
+            <wp:positionV relativeFrom="paragraph">
+              <wp:posOffset>9525</wp:posOffset>
+            </wp:positionV>
+            <wp:extent cx="1438275" cy="2919556"/>
+            <wp:effectExtent l="0" t="0" r="0" b="0"/>
+            <wp:wrapNone/>
+            <wp:docPr id="150" name="תמונה 150"/>
+            <wp:cNvGraphicFramePr>
+              <a:graphicFrameLocks xmlns:a="http://schemas.openxmlformats.org/drawingml/2006/main" noChangeAspect="1"/>
+            </wp:cNvGraphicFramePr>
+            <a:graphic xmlns:a="http://schemas.openxmlformats.org/drawingml/2006/main">
+              <a:graphicData uri="http://schemas.openxmlformats.org/drawingml/2006/picture">
+                <pic:pic xmlns:pic="http://schemas.openxmlformats.org/drawingml/2006/picture">
+                  <pic:nvPicPr>
+                    <pic:cNvPr id="0" name="Picture 21"/>
+                    <pic:cNvPicPr>
+                      <a:picLocks noChangeAspect="1" noChangeArrowheads="1"/>
+                    </pic:cNvPicPr>
+                  </pic:nvPicPr>
+                  <pic:blipFill>
+                    <a:blip r:embed="rId31">
+                      <a:extLst>
+                        <a:ext uri="{28A0092B-C50C-407E-A947-70E740481C1C}">
+                          <a14:useLocalDpi xmlns:a14="http://schemas.microsoft.com/office/drawing/2010/main" val="0"/>
+                        </a:ext>
+                      </a:extLst>
+                    </a:blip>
+                    <a:srcRect/>
+                    <a:stretch>
+                      <a:fillRect/>
+                    </a:stretch>
+                  </pic:blipFill>
+                  <pic:spPr bwMode="auto">
+                    <a:xfrm>
+                      <a:off x="0" y="0"/>
+                      <a:ext cx="1451437" cy="2946274"/>
+                    </a:xfrm>
+                    <a:prstGeom prst="rect">
+                      <a:avLst/>
+                    </a:prstGeom>
+                    <a:noFill/>
+                    <a:ln>
+                      <a:noFill/>
+                    </a:ln>
+                  </pic:spPr>
+                </pic:pic>
+              </a:graphicData>
+            </a:graphic>
+            <wp14:sizeRelH relativeFrom="margin">
+              <wp14:pctWidth>0</wp14:pctWidth>
+            </wp14:sizeRelH>
+            <wp14:sizeRelV relativeFrom="margin">
+              <wp14:pctHeight>0</wp14:pctHeight>
+            </wp14:sizeRelV>
+          </wp:anchor>
+        </w:drawing>
+      </w:r>
+      <w:r>
+        <w:rPr>
+          <w:rFonts w:ascii="David" w:hAnsi="David" w:cs="David"/>
+          <w:rtl/>
+        </w:rPr>
+        <w:t>הרשמת תלמיד</w:t>
+      </w:r>
+    </w:p>
+    <w:p>
+      <w:pPr>
+        <w:rPr>
+          <w:rtl/>
+        </w:rPr>
+      </w:pPr>
+      <w:r>
+        <w:rPr>
+          <w:rFonts w:hint="cs"/>
+          <w:rtl/>
+        </w:rPr>
+        <w:t>מסך ההרשמה כתלמיד חדש במערכת.</w:t>
+      </w:r>
+      <w:r>
+        <w:rPr>
+          <w:rFonts w:hint="cs"/>
+          <w:rtl/>
+        </w:rPr>
+        <w:t xml:space="preserve"> הכפתור </w:t>
+      </w:r>
+      <w:r>
+        <w:t>PICK A TEACHER</w:t>
+      </w:r>
+      <w:r>
+        <w:rPr>
+          <w:rFonts w:hint="cs"/>
+          <w:rtl/>
+        </w:rPr>
+        <w:t xml:space="preserve"> מוביל</w:t>
+      </w:r>
+    </w:p>
+    <w:p>
+      <w:r>
+        <w:rPr>
+          <w:rFonts w:hint="cs"/>
+          <w:rtl/>
+        </w:rPr>
+        <w:t>לרשימת המורים הקיימים, שם יש לבור מורה על מנת לקשר אותו לתלמיד.</w:t>
+      </w:r>
+    </w:p>
+    <w:p/>
+    <w:p/>
+    <w:p/>
+    <w:p/>
+    <w:p/>
+    <w:p/>
+    <w:p/>
+    <w:p/>
+    <w:p/>
+    <w:p/>
+    <w:p/>
+    <w:p>
+      <w:pPr>
+        <w:pStyle w:val="4"/>
+        <w:rPr>
+          <w:rFonts w:ascii="David" w:hAnsi="David" w:cs="David"/>
+          <w:rtl/>
+        </w:rPr>
+      </w:pPr>
+      <w:r>
+        <w:rPr>
+          <w:rFonts w:hint="cs"/>
+          <w:noProof/>
+        </w:rPr>
+        <w:drawing>
+          <wp:anchor distT="0" distB="0" distL="114300" distR="114300" simplePos="0" relativeHeight="251755008" behindDoc="1" locked="0" layoutInCell="1" allowOverlap="1" wp14:anchorId="0EDBFC68" wp14:editId="5EFC88D9">
+            <wp:simplePos x="0" y="0"/>
+            <wp:positionH relativeFrom="page">
+              <wp:posOffset>171450</wp:posOffset>
+            </wp:positionH>
+            <wp:positionV relativeFrom="paragraph">
+              <wp:posOffset>156845</wp:posOffset>
+            </wp:positionV>
+            <wp:extent cx="1400175" cy="2832911"/>
+            <wp:effectExtent l="0" t="0" r="0" b="5715"/>
+            <wp:wrapNone/>
+            <wp:docPr id="151" name="תמונה 151"/>
+            <wp:cNvGraphicFramePr>
+              <a:graphicFrameLocks xmlns:a="http://schemas.openxmlformats.org/drawingml/2006/main" noChangeAspect="1"/>
+            </wp:cNvGraphicFramePr>
+            <a:graphic xmlns:a="http://schemas.openxmlformats.org/drawingml/2006/main">
+              <a:graphicData uri="http://schemas.openxmlformats.org/drawingml/2006/picture">
+                <pic:pic xmlns:pic="http://schemas.openxmlformats.org/drawingml/2006/picture">
+                  <pic:nvPicPr>
+                    <pic:cNvPr id="0" name="Picture 22"/>
+                    <pic:cNvPicPr>
+                      <a:picLocks noChangeAspect="1" noChangeArrowheads="1"/>
+                    </pic:cNvPicPr>
+                  </pic:nvPicPr>
+                  <pic:blipFill>
+                    <a:blip r:embed="rId32">
+                      <a:extLst>
+                        <a:ext uri="{28A0092B-C50C-407E-A947-70E740481C1C}">
+                          <a14:useLocalDpi xmlns:a14="http://schemas.microsoft.com/office/drawing/2010/main" val="0"/>
+                        </a:ext>
+                      </a:extLst>
+                    </a:blip>
+                    <a:srcRect/>
+                    <a:stretch>
+                      <a:fillRect/>
+                    </a:stretch>
+                  </pic:blipFill>
+                  <pic:spPr bwMode="auto">
+                    <a:xfrm>
+                      <a:off x="0" y="0"/>
+                      <a:ext cx="1424923" cy="2882982"/>
+                    </a:xfrm>
+                    <a:prstGeom prst="rect">
+                      <a:avLst/>
+                    </a:prstGeom>
+                    <a:noFill/>
+                    <a:ln>
+                      <a:noFill/>
+                    </a:ln>
+                  </pic:spPr>
+                </pic:pic>
+              </a:graphicData>
+            </a:graphic>
+            <wp14:sizeRelH relativeFrom="margin">
+              <wp14:pctWidth>0</wp14:pctWidth>
+            </wp14:sizeRelH>
+            <wp14:sizeRelV relativeFrom="margin">
+              <wp14:pctHeight>0</wp14:pctHeight>
+            </wp14:sizeRelV>
+          </wp:anchor>
+        </w:drawing>
+      </w:r>
+      <w:r>
+        <w:rPr>
+          <w:rFonts w:ascii="David" w:hAnsi="David" w:cs="David"/>
+          <w:rtl/>
+        </w:rPr>
+        <w:t>בחירת מורה</w:t>
+      </w:r>
+    </w:p>
+    <w:p>
+      <w:pPr>
+        <w:rPr>
+          <w:rtl/>
+        </w:rPr>
+      </w:pPr>
+      <w:r>
+        <w:rPr>
+          <w:rFonts w:hint="cs"/>
+          <w:rtl/>
+        </w:rPr>
+        <w:t>מסך עם רשימת מורים הרשומים במערכת. משומש בעת ביצירת תלמיד חדש</w:t>
+      </w:r>
+    </w:p>
+    <w:p>
+      <w:pPr>
+        <w:rPr>
+          <w:rtl/>
+        </w:rPr>
+      </w:pPr>
+      <w:r>
+        <w:rPr>
+          <w:rFonts w:hint="cs"/>
+          <w:rtl/>
+        </w:rPr>
+        <w:t>על מנת לקשר לו מורה.</w:t>
+      </w:r>
+    </w:p>
+    <w:p>
+      <w:pPr>
+        <w:rPr>
+          <w:rtl/>
+        </w:rPr>
+      </w:pPr>
+    </w:p>
+    <w:p>
+      <w:pPr>
+        <w:rPr>
+          <w:rtl/>
+        </w:rPr>
+      </w:pPr>
+    </w:p>
+    <w:p>
+      <w:pPr>
+        <w:rPr>
+          <w:rtl/>
+        </w:rPr>
+      </w:pPr>
+    </w:p>
+    <w:p>
+      <w:pPr>
+        <w:rPr>
+          <w:rtl/>
+        </w:rPr>
+      </w:pPr>
+    </w:p>
+    <w:p>
+      <w:pPr>
+        <w:rPr>
+          <w:rtl/>
+        </w:rPr>
+      </w:pPr>
+    </w:p>
+    <w:p>
+      <w:pPr>
+        <w:rPr>
+          <w:rtl/>
+        </w:rPr>
+      </w:pPr>
+    </w:p>
+    <w:p>
+      <w:pPr>
+        <w:rPr>
+          <w:rtl/>
+        </w:rPr>
+      </w:pPr>
+    </w:p>
+    <w:p>
+      <w:pPr>
+        <w:rPr>
+          <w:rtl/>
+        </w:rPr>
+      </w:pPr>
+    </w:p>
+    <w:p>
+      <w:pPr>
+        <w:rPr>
+          <w:rtl/>
+        </w:rPr>
+      </w:pPr>
+    </w:p>
+    <w:p>
+      <w:pPr>
+        <w:rPr>
+          <w:rtl/>
+        </w:rPr>
+      </w:pPr>
+      <w:r>
+        <w:rPr>
+          <w:rFonts w:hint="cs"/>
+          <w:noProof/>
+        </w:rPr>
+        <w:drawing>
+          <wp:anchor distT="0" distB="0" distL="114300" distR="114300" simplePos="0" relativeHeight="251756032" behindDoc="1" locked="0" layoutInCell="1" allowOverlap="1" wp14:anchorId="6875708B" wp14:editId="5B58DDB7">
+            <wp:simplePos x="0" y="0"/>
+            <wp:positionH relativeFrom="column">
+              <wp:posOffset>-695325</wp:posOffset>
+            </wp:positionH>
+            <wp:positionV relativeFrom="paragraph">
+              <wp:posOffset>286385</wp:posOffset>
+            </wp:positionV>
+            <wp:extent cx="1492094" cy="3028950"/>
+            <wp:effectExtent l="0" t="0" r="0" b="0"/>
+            <wp:wrapNone/>
+            <wp:docPr id="152" name="תמונה 152"/>
+            <wp:cNvGraphicFramePr>
+              <a:graphicFrameLocks xmlns:a="http://schemas.openxmlformats.org/drawingml/2006/main" noChangeAspect="1"/>
+            </wp:cNvGraphicFramePr>
+            <a:graphic xmlns:a="http://schemas.openxmlformats.org/drawingml/2006/main">
+              <a:graphicData uri="http://schemas.openxmlformats.org/drawingml/2006/picture">
+                <pic:pic xmlns:pic="http://schemas.openxmlformats.org/drawingml/2006/picture">
+                  <pic:nvPicPr>
+                    <pic:cNvPr id="0" name="Picture 23"/>
+                    <pic:cNvPicPr>
+                      <a:picLocks noChangeAspect="1" noChangeArrowheads="1"/>
+                    </pic:cNvPicPr>
+                  </pic:nvPicPr>
+                  <pic:blipFill>
+                    <a:blip r:embed="rId33">
+                      <a:extLst>
+                        <a:ext uri="{28A0092B-C50C-407E-A947-70E740481C1C}">
+                          <a14:useLocalDpi xmlns:a14="http://schemas.microsoft.com/office/drawing/2010/main" val="0"/>
+                        </a:ext>
+                      </a:extLst>
+                    </a:blip>
+                    <a:srcRect/>
+                    <a:stretch>
+                      <a:fillRect/>
+                    </a:stretch>
+                  </pic:blipFill>
+                  <pic:spPr bwMode="auto">
+                    <a:xfrm>
+                      <a:off x="0" y="0"/>
+                      <a:ext cx="1492094" cy="3028950"/>
+                    </a:xfrm>
+                    <a:prstGeom prst="rect">
+                      <a:avLst/>
+                    </a:prstGeom>
+                    <a:noFill/>
+                    <a:ln>
+                      <a:noFill/>
+                    </a:ln>
+                  </pic:spPr>
+                </pic:pic>
+              </a:graphicData>
+            </a:graphic>
+            <wp14:sizeRelH relativeFrom="margin">
+              <wp14:pctWidth>0</wp14:pctWidth>
+            </wp14:sizeRelH>
+            <wp14:sizeRelV relativeFrom="margin">
+              <wp14:pctHeight>0</wp14:pctHeight>
+            </wp14:sizeRelV>
+          </wp:anchor>
+        </w:drawing>
+      </w:r>
+    </w:p>
+    <w:p>
+      <w:pPr>
+        <w:rPr>
+          <w:rtl/>
+        </w:rPr>
+      </w:pPr>
+    </w:p>
+    <w:p>
+      <w:pPr>
+        <w:rPr>
+          <w:rtl/>
+        </w:rPr>
+      </w:pPr>
+    </w:p>
+    <w:p>
+      <w:pPr>
+        <w:rPr>
+          <w:rtl/>
+        </w:rPr>
+      </w:pPr>
+    </w:p>
+    <w:p>
+      <w:pPr>
+        <w:pStyle w:val="4"/>
+        <w:jc w:val="left"/>
+        <w:rPr>
+          <w:rFonts w:ascii="David" w:hAnsi="David" w:cs="David"/>
+          <w:rtl/>
+        </w:rPr>
+      </w:pPr>
+      <w:r>
+        <w:rPr>
+          <w:rFonts w:ascii="David" w:hAnsi="David" w:cs="David"/>
+          <w:rtl/>
+        </w:rPr>
+        <w:t>מסך תלמיד</w:t>
+      </w:r>
+    </w:p>
+    <w:p>
+      <w:pPr>
+        <w:rPr>
+          <w:rtl/>
+        </w:rPr>
+      </w:pPr>
+      <w:r>
+        <w:rPr>
+          <w:rFonts w:hint="cs"/>
+          <w:rtl/>
+        </w:rPr>
+        <w:t>המסך שאליו מועבר המשתמש לאחר שנרשם כתלמיד. מכאן יכול התלמיד</w:t>
+      </w:r>
+    </w:p>
+    <w:p>
+      <w:pPr>
+        <w:rPr>
+          <w:rtl/>
+        </w:rPr>
+      </w:pPr>
+      <w:r>
+        <w:rPr>
+          <w:rFonts w:hint="cs"/>
+          <w:rtl/>
+        </w:rPr>
+        <w:t>להתחבר כתלמיד אחר או כמורה, לצפות ברשימת השיעורים שלו, לצפות במידע אודות</w:t>
+      </w:r>
+    </w:p>
+    <w:p>
+      <w:pPr>
+        <w:rPr>
+          <w:rtl/>
+        </w:rPr>
+      </w:pPr>
+      <w:r>
+        <w:rPr>
+          <w:rFonts w:hint="cs"/>
+          <w:rtl/>
+        </w:rPr>
+        <w:t xml:space="preserve">השיעורים שלו </w:t>
+      </w:r>
+      <w:r>
+        <w:rPr>
+          <w:rFonts w:hint="cs"/>
+          <w:rtl/>
+        </w:rPr>
+        <w:t xml:space="preserve">(כפתור </w:t>
+      </w:r>
+      <w:r>
+        <w:t>Info</w:t>
+      </w:r>
+      <w:r>
+        <w:rPr>
+          <w:rFonts w:hint="cs"/>
+          <w:rtl/>
+        </w:rPr>
+        <w:t xml:space="preserve">) </w:t>
+      </w:r>
+      <w:r>
+        <w:rPr>
+          <w:rFonts w:hint="cs"/>
+          <w:rtl/>
+        </w:rPr>
+        <w:t xml:space="preserve">ולבדוק מה נותר לו מבין אבני הדרך </w:t>
+      </w:r>
+    </w:p>
+    <w:p>
+      <w:pPr>
+        <w:rPr>
+          <w:rFonts w:hint="cs"/>
+          <w:rtl/>
+        </w:rPr>
+      </w:pPr>
+      <w:r>
+        <w:rPr>
+          <w:rFonts w:hint="cs"/>
+          <w:rtl/>
+        </w:rPr>
+        <w:t>השונים בתהליך קבל</w:t>
+      </w:r>
+      <w:r>
+        <w:rPr>
+          <w:rFonts w:hint="cs"/>
+          <w:rtl/>
+        </w:rPr>
+        <w:t>ת</w:t>
+      </w:r>
+      <w:r>
+        <w:rPr>
+          <w:rFonts w:hint="cs"/>
+          <w:rtl/>
+        </w:rPr>
+        <w:t xml:space="preserve"> רישיון הנהיגה</w:t>
+      </w:r>
+      <w:r>
+        <w:rPr>
+          <w:rFonts w:hint="cs"/>
+          <w:rtl/>
+        </w:rPr>
+        <w:t xml:space="preserve"> (כפתור </w:t>
       </w:r>
       <w:proofErr w:type="spellStart"/>
       <w:r>
-        <w:rPr>
-          <w:rFonts w:ascii="David" w:hAnsi="David"/>
-          <w:color w:val="FF0000"/>
-        </w:rPr>
-        <w:t>Conext</w:t>
+        <w:t>Whats</w:t>
       </w:r>
       <w:proofErr w:type="spellEnd"/>
       <w:r>
-        <w:rPr>
-          <w:rFonts w:ascii="David" w:hAnsi="David"/>
-          <w:color w:val="FF0000"/>
-        </w:rPr>
-        <w:t xml:space="preserve"> menu</w:t>
-      </w:r>
-      <w:r>
-        <w:rPr>
-          <w:rFonts w:ascii="David" w:hAnsi="David"/>
-          <w:color w:val="FF0000"/>
-          <w:rtl/>
-        </w:rPr>
-        <w:t>) – הוסיפו אותם.</w:t>
-      </w:r>
-    </w:p>
-    <w:p>
-      <w:pPr>
-        <w:spacing w:line="276" w:lineRule="auto"/>
-        <w:rPr>
-          <w:rFonts w:ascii="David" w:hAnsi="David"/>
-          <w:color w:val="FF0000"/>
-          <w:rtl/>
-        </w:rPr>
-      </w:pPr>
-    </w:p>
-    <w:p>
-      <w:pPr>
-        <w:spacing w:line="276" w:lineRule="auto"/>
-        <w:rPr>
-          <w:rFonts w:ascii="David" w:hAnsi="David"/>
-          <w:b/>
-          <w:bCs/>
-          <w:color w:val="FF0000"/>
-          <w:rtl/>
-        </w:rPr>
-      </w:pPr>
-      <w:r>
-        <w:rPr>
-          <w:rFonts w:ascii="David" w:hAnsi="David"/>
-          <w:b/>
-          <w:bCs/>
-          <w:color w:val="FF0000"/>
-          <w:rtl/>
-        </w:rPr>
-        <w:t xml:space="preserve">שימו לב – כאשר אתם מוסיפים את המסכים והתפריטים שלכם, עליכם להעתיק את </w:t>
-      </w:r>
-      <w:r>
-        <w:rPr>
-          <w:rFonts w:ascii="David" w:hAnsi="David"/>
-          <w:b/>
-          <w:bCs/>
-          <w:color w:val="FF0000"/>
-          <w:u w:val="single"/>
-          <w:rtl/>
-        </w:rPr>
-        <w:t>העיצוב</w:t>
-      </w:r>
-      <w:r>
-        <w:rPr>
-          <w:rFonts w:ascii="David" w:hAnsi="David"/>
-          <w:b/>
-          <w:bCs/>
-          <w:color w:val="FF0000"/>
-          <w:rtl/>
-        </w:rPr>
-        <w:t xml:space="preserve"> של הכותרות של המסכים והתפריטים בדוגמאות, כדי שאלה יופיעו בתוכן העניינים.</w:t>
-      </w:r>
-    </w:p>
-    <w:p>
-      <w:pPr>
-        <w:pStyle w:val="3"/>
-        <w:spacing w:line="276" w:lineRule="auto"/>
+        <w:t xml:space="preserve"> Left</w:t>
+      </w:r>
+      <w:r>
+        <w:rPr>
+          <w:rFonts w:hint="cs"/>
+          <w:rtl/>
+        </w:rPr>
+        <w:t>)</w:t>
+      </w:r>
+      <w:r>
+        <w:rPr>
+          <w:rFonts w:hint="cs"/>
+          <w:rtl/>
+        </w:rPr>
+        <w:t>.</w:t>
+      </w:r>
+      <w:r>
+        <w:rPr>
+          <w:rtl/>
+        </w:rPr>
+        <w:br w:type="page"/>
+      </w:r>
+    </w:p>
+    <w:p>
+      <w:pPr>
+        <w:pStyle w:val="4"/>
         <w:rPr>
           <w:rFonts w:ascii="David" w:hAnsi="David" w:cs="David"/>
           <w:rtl/>
         </w:rPr>
       </w:pPr>
-      <w:bookmarkStart w:id="53" w:name="_Toc29994009"/>
-      <w:bookmarkStart w:id="54" w:name="_Toc39329434"/>
+      <w:bookmarkStart w:id="52" w:name="_Toc29994011"/>
+      <w:bookmarkStart w:id="53" w:name="_Toc39329435"/>
+      <w:r>
+        <w:rPr>
+          <w:noProof/>
+        </w:rPr>
+        <w:lastRenderedPageBreak/>
+        <w:drawing>
+          <wp:anchor distT="0" distB="0" distL="114300" distR="114300" simplePos="0" relativeHeight="251757056" behindDoc="1" locked="0" layoutInCell="1" allowOverlap="1" wp14:anchorId="40CA050A" wp14:editId="0A98CEBA">
+            <wp:simplePos x="0" y="0"/>
+            <wp:positionH relativeFrom="column">
+              <wp:posOffset>-628650</wp:posOffset>
+            </wp:positionH>
+            <wp:positionV relativeFrom="paragraph">
+              <wp:posOffset>0</wp:posOffset>
+            </wp:positionV>
+            <wp:extent cx="1991458" cy="4029075"/>
+            <wp:effectExtent l="0" t="0" r="8890" b="0"/>
+            <wp:wrapNone/>
+            <wp:docPr id="153" name="תמונה 153"/>
+            <wp:cNvGraphicFramePr>
+              <a:graphicFrameLocks xmlns:a="http://schemas.openxmlformats.org/drawingml/2006/main" noChangeAspect="1"/>
+            </wp:cNvGraphicFramePr>
+            <a:graphic xmlns:a="http://schemas.openxmlformats.org/drawingml/2006/main">
+              <a:graphicData uri="http://schemas.openxmlformats.org/drawingml/2006/picture">
+                <pic:pic xmlns:pic="http://schemas.openxmlformats.org/drawingml/2006/picture">
+                  <pic:nvPicPr>
+                    <pic:cNvPr id="0" name="Picture 24"/>
+                    <pic:cNvPicPr>
+                      <a:picLocks noChangeAspect="1" noChangeArrowheads="1"/>
+                    </pic:cNvPicPr>
+                  </pic:nvPicPr>
+                  <pic:blipFill>
+                    <a:blip r:embed="rId34">
+                      <a:extLst>
+                        <a:ext uri="{28A0092B-C50C-407E-A947-70E740481C1C}">
+                          <a14:useLocalDpi xmlns:a14="http://schemas.microsoft.com/office/drawing/2010/main" val="0"/>
+                        </a:ext>
+                      </a:extLst>
+                    </a:blip>
+                    <a:srcRect/>
+                    <a:stretch>
+                      <a:fillRect/>
+                    </a:stretch>
+                  </pic:blipFill>
+                  <pic:spPr bwMode="auto">
+                    <a:xfrm>
+                      <a:off x="0" y="0"/>
+                      <a:ext cx="1991458" cy="4029075"/>
+                    </a:xfrm>
+                    <a:prstGeom prst="rect">
+                      <a:avLst/>
+                    </a:prstGeom>
+                    <a:noFill/>
+                    <a:ln>
+                      <a:noFill/>
+                    </a:ln>
+                  </pic:spPr>
+                </pic:pic>
+              </a:graphicData>
+            </a:graphic>
+            <wp14:sizeRelH relativeFrom="margin">
+              <wp14:pctWidth>0</wp14:pctWidth>
+            </wp14:sizeRelH>
+            <wp14:sizeRelV relativeFrom="margin">
+              <wp14:pctHeight>0</wp14:pctHeight>
+            </wp14:sizeRelV>
+          </wp:anchor>
+        </w:drawing>
+      </w:r>
       <w:r>
         <w:rPr>
           <w:rFonts w:ascii="David" w:hAnsi="David" w:cs="David"/>
           <w:rtl/>
         </w:rPr>
-        <w:t>מסך משחק</w:t>
-      </w:r>
-      <w:bookmarkEnd w:id="53"/>
-      <w:bookmarkEnd w:id="54"/>
+        <w:t>רשימת שיעורי נהיגה</w:t>
+      </w:r>
+    </w:p>
+    <w:p>
+      <w:pPr>
+        <w:rPr>
+          <w:rtl/>
+        </w:rPr>
+      </w:pPr>
+      <w:r>
+        <w:rPr>
+          <w:rFonts w:hint="cs"/>
+          <w:rtl/>
+        </w:rPr>
+        <w:t>במסך זה ישנה רשימת שיעורי הנהיגה של התלמיד שהתחבר למערכת.</w:t>
+      </w:r>
+    </w:p>
+    <w:p>
+      <w:pPr>
+        <w:rPr>
+          <w:rtl/>
+        </w:rPr>
+      </w:pPr>
+    </w:p>
+    <w:p>
+      <w:pPr>
+        <w:rPr>
+          <w:rtl/>
+        </w:rPr>
+      </w:pPr>
+    </w:p>
+    <w:p>
+      <w:pPr>
+        <w:rPr>
+          <w:rtl/>
+        </w:rPr>
+      </w:pPr>
+    </w:p>
+    <w:p>
+      <w:pPr>
+        <w:rPr>
+          <w:rtl/>
+        </w:rPr>
+      </w:pPr>
+    </w:p>
+    <w:p>
+      <w:pPr>
+        <w:rPr>
+          <w:rtl/>
+        </w:rPr>
+      </w:pPr>
+    </w:p>
+    <w:p>
+      <w:pPr>
+        <w:rPr>
+          <w:rtl/>
+        </w:rPr>
+      </w:pPr>
+    </w:p>
+    <w:p>
+      <w:pPr>
+        <w:rPr>
+          <w:rtl/>
+        </w:rPr>
+      </w:pPr>
     </w:p>
     <w:p>
       <w:pPr>
         <w:pStyle w:val="4"/>
-        <w:spacing w:line="276" w:lineRule="auto"/>
         <w:rPr>
           <w:rFonts w:ascii="David" w:hAnsi="David" w:cs="David"/>
           <w:rtl/>
         </w:rPr>
       </w:pPr>
-      <w:bookmarkStart w:id="55" w:name="_Toc29994010"/>
+      <w:r>
+        <w:rPr>
+          <w:noProof/>
+        </w:rPr>
+        <w:drawing>
+          <wp:anchor distT="0" distB="0" distL="114300" distR="114300" simplePos="0" relativeHeight="251758080" behindDoc="1" locked="0" layoutInCell="1" allowOverlap="1" wp14:anchorId="202E0A26" wp14:editId="1C3BE756">
+            <wp:simplePos x="0" y="0"/>
+            <wp:positionH relativeFrom="margin">
+              <wp:posOffset>-638175</wp:posOffset>
+            </wp:positionH>
+            <wp:positionV relativeFrom="paragraph">
+              <wp:posOffset>164465</wp:posOffset>
+            </wp:positionV>
+            <wp:extent cx="1966086" cy="3990764"/>
+            <wp:effectExtent l="0" t="0" r="0" b="0"/>
+            <wp:wrapNone/>
+            <wp:docPr id="154" name="תמונה 154"/>
+            <wp:cNvGraphicFramePr>
+              <a:graphicFrameLocks xmlns:a="http://schemas.openxmlformats.org/drawingml/2006/main" noChangeAspect="1"/>
+            </wp:cNvGraphicFramePr>
+            <a:graphic xmlns:a="http://schemas.openxmlformats.org/drawingml/2006/main">
+              <a:graphicData uri="http://schemas.openxmlformats.org/drawingml/2006/picture">
+                <pic:pic xmlns:pic="http://schemas.openxmlformats.org/drawingml/2006/picture">
+                  <pic:nvPicPr>
+                    <pic:cNvPr id="0" name="Picture 25"/>
+                    <pic:cNvPicPr>
+                      <a:picLocks noChangeAspect="1" noChangeArrowheads="1"/>
+                    </pic:cNvPicPr>
+                  </pic:nvPicPr>
+                  <pic:blipFill>
+                    <a:blip r:embed="rId35">
+                      <a:extLst>
+                        <a:ext uri="{28A0092B-C50C-407E-A947-70E740481C1C}">
+                          <a14:useLocalDpi xmlns:a14="http://schemas.microsoft.com/office/drawing/2010/main" val="0"/>
+                        </a:ext>
+                      </a:extLst>
+                    </a:blip>
+                    <a:srcRect/>
+                    <a:stretch>
+                      <a:fillRect/>
+                    </a:stretch>
+                  </pic:blipFill>
+                  <pic:spPr bwMode="auto">
+                    <a:xfrm>
+                      <a:off x="0" y="0"/>
+                      <a:ext cx="1966086" cy="3990764"/>
+                    </a:xfrm>
+                    <a:prstGeom prst="rect">
+                      <a:avLst/>
+                    </a:prstGeom>
+                    <a:noFill/>
+                    <a:ln>
+                      <a:noFill/>
+                    </a:ln>
+                  </pic:spPr>
+                </pic:pic>
+              </a:graphicData>
+            </a:graphic>
+            <wp14:sizeRelH relativeFrom="margin">
+              <wp14:pctWidth>0</wp14:pctWidth>
+            </wp14:sizeRelH>
+            <wp14:sizeRelV relativeFrom="margin">
+              <wp14:pctHeight>0</wp14:pctHeight>
+            </wp14:sizeRelV>
+          </wp:anchor>
+        </w:drawing>
+      </w:r>
       <w:r>
         <w:rPr>
           <w:rFonts w:ascii="David" w:hAnsi="David" w:cs="David"/>
           <w:rtl/>
         </w:rPr>
-        <w:t xml:space="preserve">תפריט </w:t>
+        <w:t xml:space="preserve">מסך מידע </w:t>
       </w:r>
       <w:r>
         <w:rPr>
           <w:rFonts w:ascii="David" w:hAnsi="David" w:cs="David"/>
-        </w:rPr>
-        <w:t>Y</w:t>
-      </w:r>
-      <w:bookmarkEnd w:id="55"/>
+          <w:rtl/>
+        </w:rPr>
+        <w:t>על השיעורים</w:t>
+      </w:r>
+    </w:p>
+    <w:p>
+      <w:pPr>
+        <w:rPr>
+          <w:rtl/>
+        </w:rPr>
+      </w:pPr>
+      <w:r>
+        <w:rPr>
+          <w:rFonts w:hint="cs"/>
+          <w:rtl/>
+        </w:rPr>
+        <w:t>מסך אשר מציג פרטים כלליים אודות שיעורי הנהיגה של התלמיד</w:t>
+      </w:r>
+    </w:p>
+    <w:p>
+      <w:r>
+        <w:rPr>
+          <w:rFonts w:hint="cs"/>
+          <w:rtl/>
+        </w:rPr>
+        <w:t>כגון כמה כסף שולם/לא שולם או כמה שיעורים נעשו/לא נעשו.</w:t>
+      </w:r>
+    </w:p>
+    <w:p/>
+    <w:p/>
+    <w:p/>
+    <w:p/>
+    <w:p/>
+    <w:p/>
+    <w:p>
+      <w:pPr>
+        <w:pStyle w:val="4"/>
+        <w:rPr>
+          <w:rFonts w:ascii="David" w:hAnsi="David" w:cs="David"/>
+          <w:rtl/>
+        </w:rPr>
+      </w:pPr>
+      <w:r>
+        <w:rPr>
+          <w:rFonts w:hint="cs"/>
+          <w:noProof/>
+        </w:rPr>
+        <w:drawing>
+          <wp:anchor distT="0" distB="0" distL="114300" distR="114300" simplePos="0" relativeHeight="251759104" behindDoc="1" locked="0" layoutInCell="1" allowOverlap="1" wp14:anchorId="2D5910AD" wp14:editId="2C88DBF6">
+            <wp:simplePos x="0" y="0"/>
+            <wp:positionH relativeFrom="column">
+              <wp:posOffset>-685800</wp:posOffset>
+            </wp:positionH>
+            <wp:positionV relativeFrom="paragraph">
+              <wp:posOffset>165100</wp:posOffset>
+            </wp:positionV>
+            <wp:extent cx="2013585" cy="4087377"/>
+            <wp:effectExtent l="0" t="0" r="5715" b="8890"/>
+            <wp:wrapNone/>
+            <wp:docPr id="155" name="תמונה 155"/>
+            <wp:cNvGraphicFramePr>
+              <a:graphicFrameLocks xmlns:a="http://schemas.openxmlformats.org/drawingml/2006/main" noChangeAspect="1"/>
+            </wp:cNvGraphicFramePr>
+            <a:graphic xmlns:a="http://schemas.openxmlformats.org/drawingml/2006/main">
+              <a:graphicData uri="http://schemas.openxmlformats.org/drawingml/2006/picture">
+                <pic:pic xmlns:pic="http://schemas.openxmlformats.org/drawingml/2006/picture">
+                  <pic:nvPicPr>
+                    <pic:cNvPr id="0" name="Picture 26"/>
+                    <pic:cNvPicPr>
+                      <a:picLocks noChangeAspect="1" noChangeArrowheads="1"/>
+                    </pic:cNvPicPr>
+                  </pic:nvPicPr>
+                  <pic:blipFill>
+                    <a:blip r:embed="rId36">
+                      <a:extLst>
+                        <a:ext uri="{28A0092B-C50C-407E-A947-70E740481C1C}">
+                          <a14:useLocalDpi xmlns:a14="http://schemas.microsoft.com/office/drawing/2010/main" val="0"/>
+                        </a:ext>
+                      </a:extLst>
+                    </a:blip>
+                    <a:srcRect/>
+                    <a:stretch>
+                      <a:fillRect/>
+                    </a:stretch>
+                  </pic:blipFill>
+                  <pic:spPr bwMode="auto">
+                    <a:xfrm>
+                      <a:off x="0" y="0"/>
+                      <a:ext cx="2034364" cy="4129555"/>
+                    </a:xfrm>
+                    <a:prstGeom prst="rect">
+                      <a:avLst/>
+                    </a:prstGeom>
+                    <a:noFill/>
+                    <a:ln>
+                      <a:noFill/>
+                    </a:ln>
+                  </pic:spPr>
+                </pic:pic>
+              </a:graphicData>
+            </a:graphic>
+            <wp14:sizeRelH relativeFrom="margin">
+              <wp14:pctWidth>0</wp14:pctWidth>
+            </wp14:sizeRelH>
+            <wp14:sizeRelV relativeFrom="margin">
+              <wp14:pctHeight>0</wp14:pctHeight>
+            </wp14:sizeRelV>
+          </wp:anchor>
+        </w:drawing>
+      </w:r>
+      <w:r>
+        <w:rPr>
+          <w:rFonts w:ascii="David" w:hAnsi="David" w:cs="David"/>
+          <w:rtl/>
+        </w:rPr>
+        <w:t>מסך אבני דרך</w:t>
+      </w:r>
+    </w:p>
+    <w:p>
+      <w:pPr>
+        <w:rPr>
+          <w:rtl/>
+        </w:rPr>
+      </w:pPr>
+      <w:r>
+        <w:rPr>
+          <w:rFonts w:hint="cs"/>
+          <w:rtl/>
+        </w:rPr>
+        <w:t xml:space="preserve">מסך בו ניתן לעקוב אחר </w:t>
+      </w:r>
+      <w:r>
+        <w:rPr>
+          <w:rFonts w:hint="cs"/>
+          <w:rtl/>
+        </w:rPr>
+        <w:t>אבני הדאך במהלך תהליך השגת רישיון הנהיגה.</w:t>
+      </w:r>
+    </w:p>
+    <w:p>
+      <w:pPr>
+        <w:rPr>
+          <w:rtl/>
+        </w:rPr>
+      </w:pPr>
+      <w:r>
+        <w:rPr>
+          <w:rFonts w:hint="cs"/>
+          <w:rtl/>
+        </w:rPr>
+        <w:t>מבדיקת עיניים בהתחלה ועד לסוף מלווה ערב.</w:t>
+      </w:r>
+    </w:p>
+    <w:p>
+      <w:pPr>
+        <w:bidi w:val="0"/>
+        <w:spacing w:line="240" w:lineRule="auto"/>
+        <w:jc w:val="left"/>
+        <w:rPr>
+          <w:rtl/>
+        </w:rPr>
+      </w:pPr>
+      <w:r>
+        <w:rPr>
+          <w:rtl/>
+        </w:rPr>
+        <w:br w:type="page"/>
+      </w:r>
+    </w:p>
+    <w:p>
+      <w:pPr>
+        <w:pStyle w:val="4"/>
+        <w:rPr>
+          <w:rFonts w:ascii="David" w:hAnsi="David" w:cs="David"/>
+          <w:rtl/>
+        </w:rPr>
+      </w:pPr>
+      <w:r>
+        <w:rPr>
+          <w:rFonts w:ascii="David" w:hAnsi="David" w:cs="David"/>
+          <w:noProof/>
+        </w:rPr>
+        <w:lastRenderedPageBreak/>
+        <w:drawing>
+          <wp:anchor distT="0" distB="0" distL="114300" distR="114300" simplePos="0" relativeHeight="251760128" behindDoc="1" locked="0" layoutInCell="1" allowOverlap="1" wp14:anchorId="11DC82F5" wp14:editId="60A7E02C">
+            <wp:simplePos x="0" y="0"/>
+            <wp:positionH relativeFrom="column">
+              <wp:posOffset>-638175</wp:posOffset>
+            </wp:positionH>
+            <wp:positionV relativeFrom="paragraph">
+              <wp:posOffset>9525</wp:posOffset>
+            </wp:positionV>
+            <wp:extent cx="1449187" cy="2981325"/>
+            <wp:effectExtent l="0" t="0" r="0" b="0"/>
+            <wp:wrapNone/>
+            <wp:docPr id="156" name="תמונה 156"/>
+            <wp:cNvGraphicFramePr>
+              <a:graphicFrameLocks xmlns:a="http://schemas.openxmlformats.org/drawingml/2006/main" noChangeAspect="1"/>
+            </wp:cNvGraphicFramePr>
+            <a:graphic xmlns:a="http://schemas.openxmlformats.org/drawingml/2006/main">
+              <a:graphicData uri="http://schemas.openxmlformats.org/drawingml/2006/picture">
+                <pic:pic xmlns:pic="http://schemas.openxmlformats.org/drawingml/2006/picture">
+                  <pic:nvPicPr>
+                    <pic:cNvPr id="0" name="Picture 27"/>
+                    <pic:cNvPicPr>
+                      <a:picLocks noChangeAspect="1" noChangeArrowheads="1"/>
+                    </pic:cNvPicPr>
+                  </pic:nvPicPr>
+                  <pic:blipFill>
+                    <a:blip r:embed="rId37">
+                      <a:extLst>
+                        <a:ext uri="{28A0092B-C50C-407E-A947-70E740481C1C}">
+                          <a14:useLocalDpi xmlns:a14="http://schemas.microsoft.com/office/drawing/2010/main" val="0"/>
+                        </a:ext>
+                      </a:extLst>
+                    </a:blip>
+                    <a:srcRect/>
+                    <a:stretch>
+                      <a:fillRect/>
+                    </a:stretch>
+                  </pic:blipFill>
+                  <pic:spPr bwMode="auto">
+                    <a:xfrm>
+                      <a:off x="0" y="0"/>
+                      <a:ext cx="1452052" cy="2987219"/>
+                    </a:xfrm>
+                    <a:prstGeom prst="rect">
+                      <a:avLst/>
+                    </a:prstGeom>
+                    <a:noFill/>
+                    <a:ln>
+                      <a:noFill/>
+                    </a:ln>
+                  </pic:spPr>
+                </pic:pic>
+              </a:graphicData>
+            </a:graphic>
+            <wp14:sizeRelH relativeFrom="margin">
+              <wp14:pctWidth>0</wp14:pctWidth>
+            </wp14:sizeRelH>
+            <wp14:sizeRelV relativeFrom="margin">
+              <wp14:pctHeight>0</wp14:pctHeight>
+            </wp14:sizeRelV>
+          </wp:anchor>
+        </w:drawing>
+      </w:r>
+      <w:r>
+        <w:rPr>
+          <w:rFonts w:ascii="David" w:hAnsi="David" w:cs="David"/>
+          <w:rtl/>
+        </w:rPr>
+        <w:t>מסך מורה</w:t>
+      </w:r>
+    </w:p>
+    <w:p>
+      <w:pPr>
+        <w:rPr>
+          <w:rtl/>
+        </w:rPr>
+      </w:pPr>
+      <w:r>
+        <w:rPr>
+          <w:rFonts w:hint="cs"/>
+          <w:rtl/>
+        </w:rPr>
+        <w:t>המסך שאליו מועבר המשתמש לאחר שנרשם כ</w:t>
+      </w:r>
+      <w:r>
+        <w:rPr>
+          <w:rFonts w:hint="cs"/>
+          <w:rtl/>
+        </w:rPr>
+        <w:t>מורה</w:t>
+      </w:r>
+      <w:r>
+        <w:rPr>
+          <w:rFonts w:hint="cs"/>
+          <w:rtl/>
+        </w:rPr>
+        <w:t>. מכאן יכול ה</w:t>
+      </w:r>
+      <w:r>
+        <w:rPr>
+          <w:rFonts w:hint="cs"/>
+          <w:rtl/>
+        </w:rPr>
+        <w:t>מורה</w:t>
+      </w:r>
+    </w:p>
+    <w:p>
+      <w:pPr>
+        <w:rPr>
+          <w:rtl/>
+        </w:rPr>
+      </w:pPr>
+      <w:r>
+        <w:rPr>
+          <w:rFonts w:hint="cs"/>
+          <w:rtl/>
+        </w:rPr>
+        <w:t>להתחבר כ</w:t>
+      </w:r>
+      <w:r>
+        <w:rPr>
+          <w:rFonts w:hint="cs"/>
+          <w:rtl/>
+        </w:rPr>
+        <w:t>מורה</w:t>
+      </w:r>
+      <w:r>
+        <w:rPr>
+          <w:rFonts w:hint="cs"/>
+          <w:rtl/>
+        </w:rPr>
+        <w:t xml:space="preserve"> אחר או </w:t>
+      </w:r>
+      <w:r>
+        <w:rPr>
+          <w:rFonts w:hint="cs"/>
+          <w:rtl/>
+        </w:rPr>
+        <w:t>כתלמיד ולשנות את הגדרות השיעור כמורה.</w:t>
+      </w:r>
+    </w:p>
+    <w:p>
+      <w:pPr>
+        <w:rPr>
+          <w:rtl/>
+        </w:rPr>
+      </w:pPr>
+    </w:p>
+    <w:p>
+      <w:pPr>
+        <w:rPr>
+          <w:rtl/>
+        </w:rPr>
+      </w:pPr>
+    </w:p>
+    <w:p>
+      <w:pPr>
+        <w:rPr>
+          <w:rtl/>
+        </w:rPr>
+      </w:pPr>
+    </w:p>
+    <w:p>
+      <w:pPr>
+        <w:rPr>
+          <w:rtl/>
+        </w:rPr>
+      </w:pPr>
+    </w:p>
+    <w:p>
+      <w:pPr>
+        <w:rPr>
+          <w:rtl/>
+        </w:rPr>
+      </w:pPr>
+    </w:p>
+    <w:p>
+      <w:pPr>
+        <w:rPr>
+          <w:rtl/>
+        </w:rPr>
+      </w:pPr>
+    </w:p>
+    <w:p>
+      <w:pPr>
+        <w:pStyle w:val="4"/>
+        <w:rPr>
+          <w:rFonts w:ascii="David" w:hAnsi="David" w:cs="David"/>
+          <w:rtl/>
+        </w:rPr>
+      </w:pPr>
+      <w:r>
+        <w:rPr>
+          <w:rFonts w:ascii="David" w:hAnsi="David" w:cs="David"/>
+          <w:noProof/>
+        </w:rPr>
+        <w:drawing>
+          <wp:anchor distT="0" distB="0" distL="114300" distR="114300" simplePos="0" relativeHeight="251761152" behindDoc="1" locked="0" layoutInCell="1" allowOverlap="1" wp14:anchorId="76554FAF" wp14:editId="7C840089">
+            <wp:simplePos x="0" y="0"/>
+            <wp:positionH relativeFrom="column">
+              <wp:posOffset>-542925</wp:posOffset>
+            </wp:positionH>
+            <wp:positionV relativeFrom="paragraph">
+              <wp:posOffset>159385</wp:posOffset>
+            </wp:positionV>
+            <wp:extent cx="1219891" cy="2476500"/>
+            <wp:effectExtent l="0" t="0" r="0" b="0"/>
+            <wp:wrapNone/>
+            <wp:docPr id="157" name="תמונה 157"/>
+            <wp:cNvGraphicFramePr>
+              <a:graphicFrameLocks xmlns:a="http://schemas.openxmlformats.org/drawingml/2006/main" noChangeAspect="1"/>
+            </wp:cNvGraphicFramePr>
+            <a:graphic xmlns:a="http://schemas.openxmlformats.org/drawingml/2006/main">
+              <a:graphicData uri="http://schemas.openxmlformats.org/drawingml/2006/picture">
+                <pic:pic xmlns:pic="http://schemas.openxmlformats.org/drawingml/2006/picture">
+                  <pic:nvPicPr>
+                    <pic:cNvPr id="0" name="Picture 28"/>
+                    <pic:cNvPicPr>
+                      <a:picLocks noChangeAspect="1" noChangeArrowheads="1"/>
+                    </pic:cNvPicPr>
+                  </pic:nvPicPr>
+                  <pic:blipFill>
+                    <a:blip r:embed="rId38" cstate="print">
+                      <a:extLst>
+                        <a:ext uri="{28A0092B-C50C-407E-A947-70E740481C1C}">
+                          <a14:useLocalDpi xmlns:a14="http://schemas.microsoft.com/office/drawing/2010/main" val="0"/>
+                        </a:ext>
+                      </a:extLst>
+                    </a:blip>
+                    <a:srcRect/>
+                    <a:stretch>
+                      <a:fillRect/>
+                    </a:stretch>
+                  </pic:blipFill>
+                  <pic:spPr bwMode="auto">
+                    <a:xfrm>
+                      <a:off x="0" y="0"/>
+                      <a:ext cx="1219891" cy="2476500"/>
+                    </a:xfrm>
+                    <a:prstGeom prst="rect">
+                      <a:avLst/>
+                    </a:prstGeom>
+                    <a:noFill/>
+                    <a:ln>
+                      <a:noFill/>
+                    </a:ln>
+                  </pic:spPr>
+                </pic:pic>
+              </a:graphicData>
+            </a:graphic>
+            <wp14:sizeRelH relativeFrom="margin">
+              <wp14:pctWidth>0</wp14:pctWidth>
+            </wp14:sizeRelH>
+            <wp14:sizeRelV relativeFrom="margin">
+              <wp14:pctHeight>0</wp14:pctHeight>
+            </wp14:sizeRelV>
+          </wp:anchor>
+        </w:drawing>
+      </w:r>
+      <w:r>
+        <w:rPr>
+          <w:rFonts w:ascii="David" w:hAnsi="David" w:cs="David"/>
+          <w:rtl/>
+        </w:rPr>
+        <w:t>מסך הגדרות</w:t>
+      </w:r>
+    </w:p>
+    <w:p>
+      <w:pPr>
+        <w:rPr>
+          <w:rtl/>
+        </w:rPr>
+      </w:pPr>
+      <w:r>
+        <w:rPr>
+          <w:rFonts w:hint="cs"/>
+          <w:rtl/>
+        </w:rPr>
+        <w:t>זהו המסך אשר המורה יכול לתת הגדרות לשיעור שלו: מחיר השיעור</w:t>
+      </w:r>
+    </w:p>
+    <w:p>
+      <w:pPr>
+        <w:rPr>
+          <w:rtl/>
+        </w:rPr>
+      </w:pPr>
+      <w:r>
+        <w:rPr>
+          <w:rFonts w:hint="cs"/>
+          <w:rtl/>
+        </w:rPr>
+        <w:t>ומשך זמן השיעור בדקות.</w:t>
+      </w:r>
+    </w:p>
+    <w:p>
+      <w:pPr>
+        <w:rPr>
+          <w:rtl/>
+        </w:rPr>
+      </w:pPr>
+    </w:p>
+    <w:p>
+      <w:pPr>
+        <w:rPr>
+          <w:rtl/>
+        </w:rPr>
+      </w:pPr>
+    </w:p>
+    <w:p>
+      <w:pPr>
+        <w:rPr>
+          <w:rtl/>
+        </w:rPr>
+      </w:pPr>
+    </w:p>
+    <w:p>
+      <w:pPr>
+        <w:rPr>
+          <w:rtl/>
+        </w:rPr>
+      </w:pPr>
+    </w:p>
+    <w:p>
+      <w:pPr>
+        <w:rPr>
+          <w:rtl/>
+        </w:rPr>
+      </w:pPr>
+    </w:p>
+    <w:p>
+      <w:pPr>
+        <w:rPr>
+          <w:rtl/>
+        </w:rPr>
+      </w:pPr>
+    </w:p>
+    <w:p>
+      <w:pPr>
+        <w:rPr>
+          <w:rtl/>
+        </w:rPr>
+      </w:pPr>
+    </w:p>
+    <w:p>
+      <w:pPr>
+        <w:rPr>
+          <w:rtl/>
+        </w:rPr>
+      </w:pPr>
+    </w:p>
+    <w:p>
+      <w:pPr>
+        <w:rPr>
+          <w:rtl/>
+        </w:rPr>
+      </w:pPr>
+    </w:p>
+    <w:p>
+      <w:pPr>
+        <w:rPr>
+          <w:rtl/>
+        </w:rPr>
+      </w:pPr>
+    </w:p>
+    <w:p>
+      <w:pPr>
+        <w:rPr>
+          <w:rtl/>
+        </w:rPr>
+      </w:pPr>
+    </w:p>
+    <w:p>
+      <w:pPr>
+        <w:pStyle w:val="4"/>
+        <w:rPr>
+          <w:rFonts w:ascii="David" w:hAnsi="David" w:cs="David"/>
+          <w:rtl/>
+        </w:rPr>
+      </w:pPr>
+      <w:r>
+        <w:rPr>
+          <w:noProof/>
+        </w:rPr>
+        <w:drawing>
+          <wp:anchor distT="0" distB="0" distL="114300" distR="114300" simplePos="0" relativeHeight="251762176" behindDoc="1" locked="0" layoutInCell="1" allowOverlap="1" wp14:anchorId="2E8D7C23" wp14:editId="7548468D">
+            <wp:simplePos x="0" y="0"/>
+            <wp:positionH relativeFrom="column">
+              <wp:posOffset>-818515</wp:posOffset>
+            </wp:positionH>
+            <wp:positionV relativeFrom="paragraph">
+              <wp:posOffset>160655</wp:posOffset>
+            </wp:positionV>
+            <wp:extent cx="2386518" cy="1419225"/>
+            <wp:effectExtent l="0" t="0" r="0" b="0"/>
+            <wp:wrapNone/>
+            <wp:docPr id="158" name="תמונה 158"/>
+            <wp:cNvGraphicFramePr>
+              <a:graphicFrameLocks xmlns:a="http://schemas.openxmlformats.org/drawingml/2006/main" noChangeAspect="1"/>
+            </wp:cNvGraphicFramePr>
+            <a:graphic xmlns:a="http://schemas.openxmlformats.org/drawingml/2006/main">
+              <a:graphicData uri="http://schemas.openxmlformats.org/drawingml/2006/picture">
+                <pic:pic xmlns:pic="http://schemas.openxmlformats.org/drawingml/2006/picture">
+                  <pic:nvPicPr>
+                    <pic:cNvPr id="0" name="Picture 29"/>
+                    <pic:cNvPicPr>
+                      <a:picLocks noChangeAspect="1" noChangeArrowheads="1"/>
+                    </pic:cNvPicPr>
+                  </pic:nvPicPr>
+                  <pic:blipFill>
+                    <a:blip r:embed="rId39">
+                      <a:extLst>
+                        <a:ext uri="{28A0092B-C50C-407E-A947-70E740481C1C}">
+                          <a14:useLocalDpi xmlns:a14="http://schemas.microsoft.com/office/drawing/2010/main" val="0"/>
+                        </a:ext>
+                      </a:extLst>
+                    </a:blip>
+                    <a:srcRect/>
+                    <a:stretch>
+                      <a:fillRect/>
+                    </a:stretch>
+                  </pic:blipFill>
+                  <pic:spPr bwMode="auto">
+                    <a:xfrm>
+                      <a:off x="0" y="0"/>
+                      <a:ext cx="2386518" cy="1419225"/>
+                    </a:xfrm>
+                    <a:prstGeom prst="rect">
+                      <a:avLst/>
+                    </a:prstGeom>
+                    <a:noFill/>
+                    <a:ln>
+                      <a:noFill/>
+                    </a:ln>
+                  </pic:spPr>
+                </pic:pic>
+              </a:graphicData>
+            </a:graphic>
+            <wp14:sizeRelH relativeFrom="margin">
+              <wp14:pctWidth>0</wp14:pctWidth>
+            </wp14:sizeRelH>
+            <wp14:sizeRelV relativeFrom="margin">
+              <wp14:pctHeight>0</wp14:pctHeight>
+            </wp14:sizeRelV>
+          </wp:anchor>
+        </w:drawing>
+      </w:r>
+      <w:r>
+        <w:rPr>
+          <w:rFonts w:ascii="David" w:hAnsi="David" w:cs="David"/>
+          <w:rtl/>
+        </w:rPr>
+        <w:t>תפריט ראשי</w:t>
+      </w:r>
+    </w:p>
+    <w:p>
+      <w:pPr>
+        <w:rPr>
+          <w:rtl/>
+        </w:rPr>
+      </w:pPr>
+      <w:r>
+        <w:rPr>
+          <w:rFonts w:hint="cs"/>
+          <w:rtl/>
+        </w:rPr>
+        <w:t>זהו התפריט הראשי אשר ניתן לגשת ממנו מכל מסך. בתפריט ישנם</w:t>
+      </w:r>
+    </w:p>
+    <w:p>
+      <w:pPr>
+        <w:rPr>
+          <w:rtl/>
+        </w:rPr>
+      </w:pPr>
+      <w:r>
+        <w:rPr>
+          <w:rFonts w:hint="cs"/>
+          <w:rtl/>
+        </w:rPr>
+        <w:t>2 פריטים: כפתור המעביר לדף הראשי וכפתור היוצא מן האפליקציה.</w:t>
+      </w:r>
+    </w:p>
+    <w:p>
+      <w:pPr>
+        <w:rPr>
+          <w:rtl/>
+        </w:rPr>
+      </w:pPr>
+    </w:p>
+    <w:p>
+      <w:pPr>
+        <w:rPr>
+          <w:rtl/>
+        </w:rPr>
+      </w:pPr>
+    </w:p>
+    <w:p>
+      <w:pPr>
+        <w:rPr>
+          <w:rtl/>
+        </w:rPr>
+      </w:pPr>
+      <w:r>
+        <w:rPr>
+          <w:rFonts w:hint="cs"/>
+          <w:noProof/>
+        </w:rPr>
+        <w:drawing>
+          <wp:anchor distT="0" distB="0" distL="114300" distR="114300" simplePos="0" relativeHeight="251763200" behindDoc="1" locked="0" layoutInCell="1" allowOverlap="1" wp14:anchorId="3D775AC6" wp14:editId="3F31EE31">
+            <wp:simplePos x="0" y="0"/>
+            <wp:positionH relativeFrom="column">
+              <wp:posOffset>-381000</wp:posOffset>
+            </wp:positionH>
+            <wp:positionV relativeFrom="paragraph">
+              <wp:posOffset>146719</wp:posOffset>
+            </wp:positionV>
+            <wp:extent cx="1409700" cy="2885406"/>
+            <wp:effectExtent l="0" t="0" r="0" b="0"/>
+            <wp:wrapNone/>
+            <wp:docPr id="159" name="תמונה 159"/>
+            <wp:cNvGraphicFramePr>
+              <a:graphicFrameLocks xmlns:a="http://schemas.openxmlformats.org/drawingml/2006/main" noChangeAspect="1"/>
+            </wp:cNvGraphicFramePr>
+            <a:graphic xmlns:a="http://schemas.openxmlformats.org/drawingml/2006/main">
+              <a:graphicData uri="http://schemas.openxmlformats.org/drawingml/2006/picture">
+                <pic:pic xmlns:pic="http://schemas.openxmlformats.org/drawingml/2006/picture">
+                  <pic:nvPicPr>
+                    <pic:cNvPr id="0" name="Picture 30"/>
+                    <pic:cNvPicPr>
+                      <a:picLocks noChangeAspect="1" noChangeArrowheads="1"/>
+                    </pic:cNvPicPr>
+                  </pic:nvPicPr>
+                  <pic:blipFill>
+                    <a:blip r:embed="rId40">
+                      <a:extLst>
+                        <a:ext uri="{28A0092B-C50C-407E-A947-70E740481C1C}">
+                          <a14:useLocalDpi xmlns:a14="http://schemas.microsoft.com/office/drawing/2010/main" val="0"/>
+                        </a:ext>
+                      </a:extLst>
+                    </a:blip>
+                    <a:srcRect/>
+                    <a:stretch>
+                      <a:fillRect/>
+                    </a:stretch>
+                  </pic:blipFill>
+                  <pic:spPr bwMode="auto">
+                    <a:xfrm>
+                      <a:off x="0" y="0"/>
+                      <a:ext cx="1419072" cy="2904588"/>
+                    </a:xfrm>
+                    <a:prstGeom prst="rect">
+                      <a:avLst/>
+                    </a:prstGeom>
+                    <a:noFill/>
+                    <a:ln>
+                      <a:noFill/>
+                    </a:ln>
+                  </pic:spPr>
+                </pic:pic>
+              </a:graphicData>
+            </a:graphic>
+            <wp14:sizeRelH relativeFrom="margin">
+              <wp14:pctWidth>0</wp14:pctWidth>
+            </wp14:sizeRelH>
+            <wp14:sizeRelV relativeFrom="margin">
+              <wp14:pctHeight>0</wp14:pctHeight>
+            </wp14:sizeRelV>
+          </wp:anchor>
+        </w:drawing>
+      </w:r>
+    </w:p>
+    <w:p>
+      <w:pPr>
+        <w:rPr>
+          <w:rtl/>
+        </w:rPr>
+      </w:pPr>
+    </w:p>
+    <w:p>
+      <w:pPr>
+        <w:rPr>
+          <w:rtl/>
+        </w:rPr>
+      </w:pPr>
+    </w:p>
+    <w:p>
+      <w:pPr>
+        <w:rPr>
+          <w:rtl/>
+        </w:rPr>
+      </w:pPr>
+    </w:p>
+    <w:p>
+      <w:pPr>
+        <w:pStyle w:val="4"/>
+        <w:rPr>
+          <w:rFonts w:ascii="David" w:hAnsi="David" w:cs="David"/>
+          <w:rtl/>
+        </w:rPr>
+      </w:pPr>
+      <w:r>
+        <w:rPr>
+          <w:rFonts w:ascii="David" w:hAnsi="David" w:cs="David"/>
+          <w:rtl/>
+        </w:rPr>
+        <w:t>שיעור חדש</w:t>
+      </w:r>
+    </w:p>
+    <w:p>
+      <w:r>
+        <w:rPr>
+          <w:rFonts w:hint="cs"/>
+          <w:rtl/>
+        </w:rPr>
+        <w:t>במסך זה ניתן ליצור שיעור חדש ולהוסיפו לרשימת שיעורי התלמיד.</w:t>
+      </w:r>
+    </w:p>
+    <w:p/>
+    <w:p/>
+    <w:p/>
+    <w:p/>
+    <w:p/>
+    <w:p/>
+    <w:p/>
+    <w:p>
+      <w:pPr>
+        <w:pStyle w:val="4"/>
+        <w:jc w:val="left"/>
+        <w:rPr>
+          <w:rFonts w:ascii="David" w:hAnsi="David" w:cs="David"/>
+          <w:rtl/>
+        </w:rPr>
+      </w:pPr>
+      <w:r>
+        <w:rPr>
+          <w:rFonts w:hint="cs"/>
+          <w:noProof/>
+        </w:rPr>
+        <w:lastRenderedPageBreak/>
+        <w:drawing>
+          <wp:anchor distT="0" distB="0" distL="114300" distR="114300" simplePos="0" relativeHeight="251764224" behindDoc="1" locked="0" layoutInCell="1" allowOverlap="1" wp14:anchorId="18B35632" wp14:editId="6C024048">
+            <wp:simplePos x="0" y="0"/>
+            <wp:positionH relativeFrom="column">
+              <wp:posOffset>-619125</wp:posOffset>
+            </wp:positionH>
+            <wp:positionV relativeFrom="paragraph">
+              <wp:posOffset>9525</wp:posOffset>
+            </wp:positionV>
+            <wp:extent cx="2310420" cy="2876550"/>
+            <wp:effectExtent l="0" t="0" r="0" b="0"/>
+            <wp:wrapNone/>
+            <wp:docPr id="160" name="תמונה 160"/>
+            <wp:cNvGraphicFramePr>
+              <a:graphicFrameLocks xmlns:a="http://schemas.openxmlformats.org/drawingml/2006/main" noChangeAspect="1"/>
+            </wp:cNvGraphicFramePr>
+            <a:graphic xmlns:a="http://schemas.openxmlformats.org/drawingml/2006/main">
+              <a:graphicData uri="http://schemas.openxmlformats.org/drawingml/2006/picture">
+                <pic:pic xmlns:pic="http://schemas.openxmlformats.org/drawingml/2006/picture">
+                  <pic:nvPicPr>
+                    <pic:cNvPr id="0" name="Picture 31"/>
+                    <pic:cNvPicPr>
+                      <a:picLocks noChangeAspect="1" noChangeArrowheads="1"/>
+                    </pic:cNvPicPr>
+                  </pic:nvPicPr>
+                  <pic:blipFill>
+                    <a:blip r:embed="rId41">
+                      <a:extLst>
+                        <a:ext uri="{28A0092B-C50C-407E-A947-70E740481C1C}">
+                          <a14:useLocalDpi xmlns:a14="http://schemas.microsoft.com/office/drawing/2010/main" val="0"/>
+                        </a:ext>
+                      </a:extLst>
+                    </a:blip>
+                    <a:srcRect/>
+                    <a:stretch>
+                      <a:fillRect/>
+                    </a:stretch>
+                  </pic:blipFill>
+                  <pic:spPr bwMode="auto">
+                    <a:xfrm>
+                      <a:off x="0" y="0"/>
+                      <a:ext cx="2310420" cy="2876550"/>
+                    </a:xfrm>
+                    <a:prstGeom prst="rect">
+                      <a:avLst/>
+                    </a:prstGeom>
+                    <a:noFill/>
+                    <a:ln>
+                      <a:noFill/>
+                    </a:ln>
+                  </pic:spPr>
+                </pic:pic>
+              </a:graphicData>
+            </a:graphic>
+            <wp14:sizeRelH relativeFrom="margin">
+              <wp14:pctWidth>0</wp14:pctWidth>
+            </wp14:sizeRelH>
+            <wp14:sizeRelV relativeFrom="margin">
+              <wp14:pctHeight>0</wp14:pctHeight>
+            </wp14:sizeRelV>
+          </wp:anchor>
+        </w:drawing>
+      </w:r>
+      <w:proofErr w:type="spellStart"/>
+      <w:r>
+        <w:rPr>
+          <w:rFonts w:ascii="David" w:hAnsi="David" w:cs="David"/>
+          <w:rtl/>
+        </w:rPr>
+        <w:t>ספינר</w:t>
+      </w:r>
+      <w:proofErr w:type="spellEnd"/>
+      <w:r>
+        <w:rPr>
+          <w:rFonts w:ascii="David" w:hAnsi="David" w:cs="David"/>
+          <w:rtl/>
+        </w:rPr>
+        <w:t xml:space="preserve"> (</w:t>
+      </w:r>
+      <w:r>
+        <w:rPr>
+          <w:rFonts w:ascii="David" w:hAnsi="David" w:cs="David"/>
+        </w:rPr>
+        <w:t>Spinner</w:t>
+      </w:r>
+      <w:r>
+        <w:rPr>
+          <w:rFonts w:ascii="David" w:hAnsi="David" w:cs="David"/>
+          <w:rtl/>
+        </w:rPr>
+        <w:t>) במסך שיעור חדש</w:t>
+      </w:r>
+    </w:p>
+    <w:p>
+      <w:pPr>
+        <w:rPr>
+          <w:rtl/>
+        </w:rPr>
+      </w:pPr>
+      <w:proofErr w:type="spellStart"/>
+      <w:r>
+        <w:rPr>
+          <w:rFonts w:hint="cs"/>
+          <w:rtl/>
+        </w:rPr>
+        <w:t>ספינר</w:t>
+      </w:r>
+      <w:proofErr w:type="spellEnd"/>
+      <w:r>
+        <w:rPr>
+          <w:rFonts w:hint="cs"/>
+          <w:rtl/>
+        </w:rPr>
+        <w:t xml:space="preserve"> (</w:t>
+      </w:r>
+      <w:r>
+        <w:t>Spinner</w:t>
+      </w:r>
+      <w:r>
+        <w:rPr>
+          <w:rFonts w:hint="cs"/>
+          <w:rtl/>
+        </w:rPr>
+        <w:t>) המאפשר בחירה מתוך רשימה לסוג השיעור</w:t>
+      </w:r>
+    </w:p>
+    <w:p>
+      <w:pPr>
+        <w:rPr>
+          <w:rFonts w:hint="cs"/>
+          <w:rtl/>
+        </w:rPr>
+      </w:pPr>
+      <w:r>
+        <w:rPr>
+          <w:rFonts w:hint="cs"/>
+          <w:rtl/>
+        </w:rPr>
+        <w:t>המבוקש בעת יצירת שיעור חדש.</w:t>
+      </w:r>
     </w:p>
     <w:p>
       <w:pPr>
@@ -22165,8 +23754,6 @@
           <w:rtl/>
         </w:rPr>
       </w:pPr>
-      <w:bookmarkStart w:id="56" w:name="_Toc29994011"/>
-      <w:bookmarkStart w:id="57" w:name="_Toc39329435"/>
       <w:r>
         <w:rPr>
           <w:rFonts w:ascii="David" w:hAnsi="David" w:cs="David"/>
@@ -22175,8 +23762,8 @@
         <w:lastRenderedPageBreak/>
         <w:t>הרשאות</w:t>
       </w:r>
-      <w:bookmarkEnd w:id="56"/>
-      <w:bookmarkEnd w:id="57"/>
+      <w:bookmarkEnd w:id="52"/>
+      <w:bookmarkEnd w:id="53"/>
     </w:p>
     <w:p>
       <w:pPr>
@@ -22304,8 +23891,8 @@
           <w:rtl/>
         </w:rPr>
       </w:pPr>
-      <w:bookmarkStart w:id="58" w:name="_Toc29994012"/>
-      <w:bookmarkStart w:id="59" w:name="_Toc39329436"/>
+      <w:bookmarkStart w:id="54" w:name="_Toc29994012"/>
+      <w:bookmarkStart w:id="55" w:name="_Toc39329436"/>
       <w:r>
         <w:rPr>
           <w:rFonts w:ascii="David" w:hAnsi="David" w:cs="David"/>
@@ -22313,8 +23900,8 @@
         </w:rPr>
         <w:t>דרישות מיוחדות ומגבלות</w:t>
       </w:r>
-      <w:bookmarkEnd w:id="58"/>
-      <w:bookmarkEnd w:id="59"/>
+      <w:bookmarkEnd w:id="54"/>
+      <w:bookmarkEnd w:id="55"/>
     </w:p>
     <w:p>
       <w:pPr>
@@ -22475,7 +24062,7 @@
           <w:rtl/>
         </w:rPr>
       </w:pPr>
-      <w:bookmarkStart w:id="60" w:name="_Toc29994013"/>
+      <w:bookmarkStart w:id="56" w:name="_Toc29994013"/>
       <w:proofErr w:type="spellStart"/>
       <w:r>
         <w:rPr>
@@ -22505,7 +24092,7 @@
         </w:rPr>
         <w:t xml:space="preserve"> מינימלית</w:t>
       </w:r>
-      <w:bookmarkEnd w:id="60"/>
+      <w:bookmarkEnd w:id="56"/>
     </w:p>
     <w:p>
       <w:pPr>
@@ -22633,7 +24220,7 @@
           <w:rtl/>
         </w:rPr>
       </w:pPr>
-      <w:bookmarkStart w:id="61" w:name="_Toc29994014"/>
+      <w:bookmarkStart w:id="57" w:name="_Toc29994014"/>
       <w:r>
         <w:rPr>
           <w:rFonts w:ascii="David" w:hAnsi="David" w:cs="David"/>
@@ -22641,7 +24228,7 @@
         </w:rPr>
         <w:t>מכשירים עליהם נבדקה המערכת</w:t>
       </w:r>
-      <w:bookmarkEnd w:id="61"/>
+      <w:bookmarkEnd w:id="57"/>
     </w:p>
     <w:p>
       <w:pPr>
@@ -22871,7 +24458,7 @@
         </w:rPr>
         <w:br w:type="page"/>
       </w:r>
-      <w:bookmarkStart w:id="62" w:name="_Toc39329437"/>
+      <w:bookmarkStart w:id="58" w:name="_Toc39329437"/>
       <w:r>
         <w:rPr>
           <w:rFonts w:ascii="David" w:hAnsi="David" w:cs="David"/>
@@ -22880,7 +24467,7 @@
         <w:lastRenderedPageBreak/>
         <w:t>רפלקציה</w:t>
       </w:r>
-      <w:bookmarkEnd w:id="62"/>
+      <w:bookmarkEnd w:id="58"/>
     </w:p>
     <w:p>
       <w:pPr>
@@ -23230,7 +24817,7 @@
           <w:rtl/>
         </w:rPr>
       </w:pPr>
-      <w:bookmarkStart w:id="63" w:name="_Toc39329438"/>
+      <w:bookmarkStart w:id="59" w:name="_Toc39329438"/>
       <w:proofErr w:type="spellStart"/>
       <w:r>
         <w:rPr>
@@ -23239,7 +24826,7 @@
         </w:rPr>
         <w:t>ביבליוגראפיה</w:t>
       </w:r>
-      <w:bookmarkEnd w:id="63"/>
+      <w:bookmarkEnd w:id="59"/>
       <w:proofErr w:type="spellEnd"/>
     </w:p>
     <w:p>
@@ -23359,7 +24946,7 @@
           <w:rtl/>
         </w:rPr>
       </w:pPr>
-      <w:bookmarkStart w:id="64" w:name="_Toc29994042"/>
+      <w:bookmarkStart w:id="60" w:name="_Toc29994042"/>
       <w:r>
         <w:rPr>
           <w:rFonts w:ascii="David" w:hAnsi="David"/>
@@ -23378,7 +24965,7 @@
           <w:rtl/>
         </w:rPr>
       </w:pPr>
-      <w:bookmarkStart w:id="65" w:name="_Toc39329439"/>
+      <w:bookmarkStart w:id="61" w:name="_Toc39329439"/>
       <w:r>
         <w:rPr>
           <w:rFonts w:ascii="David" w:hAnsi="David" w:cs="David"/>
@@ -23387,8 +24974,8 @@
         <w:lastRenderedPageBreak/>
         <w:t>נספחים</w:t>
       </w:r>
-      <w:bookmarkEnd w:id="64"/>
-      <w:bookmarkEnd w:id="65"/>
+      <w:bookmarkEnd w:id="60"/>
+      <w:bookmarkEnd w:id="61"/>
     </w:p>
     <w:p>
       <w:pPr>
@@ -23401,8 +24988,8 @@
           <w:rtl/>
         </w:rPr>
       </w:pPr>
-      <w:bookmarkStart w:id="66" w:name="_Toc29994043"/>
-      <w:bookmarkStart w:id="67" w:name="_Toc39329440"/>
+      <w:bookmarkStart w:id="62" w:name="_Toc29994043"/>
+      <w:bookmarkStart w:id="63" w:name="_Toc39329440"/>
       <w:r>
         <w:rPr>
           <w:rFonts w:ascii="David" w:hAnsi="David" w:cs="David"/>
@@ -23412,7 +24999,7 @@
         </w:rPr>
         <w:t xml:space="preserve">תיעוד </w:t>
       </w:r>
-      <w:bookmarkEnd w:id="66"/>
+      <w:bookmarkEnd w:id="62"/>
       <w:r>
         <w:rPr>
           <w:rFonts w:ascii="David" w:hAnsi="David" w:cs="David"/>
@@ -23422,7 +25009,7 @@
         </w:rPr>
         <w:t>– קוד הפרויקט</w:t>
       </w:r>
-      <w:bookmarkEnd w:id="67"/>
+      <w:bookmarkEnd w:id="63"/>
     </w:p>
     <w:p>
       <w:pPr>
@@ -23539,7 +25126,7 @@
           <w:rtl/>
         </w:rPr>
       </w:pPr>
-      <w:bookmarkStart w:id="68" w:name="_Toc39329441"/>
+      <w:bookmarkStart w:id="64" w:name="_Toc39329441"/>
       <w:r>
         <w:rPr>
           <w:rFonts w:ascii="David" w:hAnsi="David" w:cs="David"/>
@@ -23549,7 +25136,7 @@
         </w:rPr>
         <w:t>מסמכים נוספים</w:t>
       </w:r>
-      <w:bookmarkEnd w:id="68"/>
+      <w:bookmarkEnd w:id="64"/>
     </w:p>
     <w:p>
       <w:pPr>
@@ -23708,8 +25295,8 @@
       </w:pPr>
     </w:p>
     <w:sectPr>
-      <w:headerReference w:type="default" r:id="rId27"/>
-      <w:footerReference w:type="default" r:id="rId28"/>
+      <w:headerReference w:type="default" r:id="rId42"/>
+      <w:footerReference w:type="default" r:id="rId43"/>
       <w:endnotePr>
         <w:numFmt w:val="lowerLetter"/>
       </w:endnotePr>
@@ -32192,7 +33779,7 @@
 </file>
 
 <file path=customXml/itemProps1.xml><?xml version="1.0" encoding="utf-8"?>
-<ds:datastoreItem xmlns:ds="http://schemas.openxmlformats.org/officeDocument/2006/customXml" ds:itemID="{30FD4124-2C6E-410B-A31E-4C144F938DE4}">
+<ds:datastoreItem xmlns:ds="http://schemas.openxmlformats.org/officeDocument/2006/customXml" ds:itemID="{9461068C-6656-4D8D-81D9-4389D8410F38}">
   <ds:schemaRefs>
     <ds:schemaRef ds:uri="http://schemas.openxmlformats.org/officeDocument/2006/bibliography"/>
   </ds:schemaRefs>

</xml_diff>

<commit_message>
Update Driving Lessons Manager.docx
</commit_message>
<xml_diff>
--- a/Driving Lessons Manager.docx
+++ b/Driving Lessons Manager.docx
@@ -8276,6 +8276,10 @@
                 <v:oval id=" 79" o:spid="_x0000_s1039" style="position:absolute;left:1280;top:10550;width:320;height:340;visibility:visible;mso-wrap-style:square;v-text-anchor:top" o:gfxdata="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">
                   <v:path arrowok="t"/>
                 </v:oval>
+                <v:shapetype id="_x0000_t32" coordsize="21600,21600" o:spt="32" o:oned="t" path="m,l21600,21600e" filled="f">
+                  <v:path arrowok="t" fillok="f" o:connecttype="none"/>
+                  <o:lock v:ext="edit" shapetype="t"/>
+                </v:shapetype>
                 <v:shape id=" 80" o:spid="_x0000_s1040" type="#_x0000_t32" style="position:absolute;left:1450;top:10880;width:0;height:670;visibility:visible;mso-wrap-style:square" o:connectortype="straight" o:gfxdata="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">
                   <o:lock v:ext="edit" shapetype="f"/>
                 </v:shape>
@@ -10300,9 +10304,9 @@
           <w:rFonts w:ascii="David" w:hAnsi="David" w:cs="David"/>
         </w:rPr>
       </w:pPr>
-      <w:bookmarkStart w:id="17" w:name="_Toc29994023"/>
-      <w:bookmarkStart w:id="18" w:name="_Toc39329418"/>
-      <w:bookmarkStart w:id="19" w:name="_Toc41169652"/>
+      <w:bookmarkStart w:id="17" w:name="_Toc41169652"/>
+      <w:bookmarkStart w:id="18" w:name="_Toc29994023"/>
+      <w:bookmarkStart w:id="19" w:name="_Toc39329418"/>
       <w:bookmarkEnd w:id="16"/>
       <w:r>
         <w:rPr>
@@ -10310,7 +10314,7 @@
         </w:rPr>
         <w:t>Activities</w:t>
       </w:r>
-      <w:bookmarkEnd w:id="19"/>
+      <w:bookmarkEnd w:id="17"/>
     </w:p>
     <w:p>
       <w:pPr>
@@ -10415,7 +10419,7 @@
       <w:pPr>
         <w:jc w:val="left"/>
         <w:rPr>
-          <w:rFonts w:ascii="David" w:hAnsi="David" w:hint="cs"/>
+          <w:rFonts w:ascii="David" w:hAnsi="David"/>
           <w:rtl/>
         </w:rPr>
       </w:pPr>
@@ -10423,6 +10427,17 @@
     <w:p>
       <w:pPr>
         <w:jc w:val="left"/>
+        <w:rPr>
+          <w:rFonts w:ascii="David" w:hAnsi="David"/>
+          <w:b/>
+          <w:bCs/>
+          <w:sz w:val="28"/>
+          <w:szCs w:val="32"/>
+          <w:u w:val="single"/>
+          <w:rtl/>
+        </w:rPr>
+      </w:pPr>
+      <w:r>
         <w:rPr>
           <w:rFonts w:ascii="David" w:hAnsi="David" w:hint="cs"/>
           <w:b/>
@@ -10430,21 +10445,57 @@
           <w:sz w:val="28"/>
           <w:szCs w:val="32"/>
           <w:u w:val="single"/>
-          <w:rtl/>
-        </w:rPr>
-      </w:pPr>
-      <w:r>
-        <w:rPr>
-          <w:rFonts w:ascii="David" w:hAnsi="David" w:hint="cs"/>
+        </w:rPr>
+        <w:t>L</w:t>
+      </w:r>
+      <w:r>
+        <w:rPr>
+          <w:rFonts w:ascii="David" w:hAnsi="David"/>
           <w:b/>
           <w:bCs/>
           <w:sz w:val="28"/>
           <w:szCs w:val="32"/>
           <w:u w:val="single"/>
         </w:rPr>
-        <w:t>L</w:t>
-      </w:r>
-      <w:r>
+        <w:t>istOfLesson</w:t>
+      </w:r>
+    </w:p>
+    <w:p>
+      <w:pPr>
+        <w:jc w:val="left"/>
+        <w:rPr>
+          <w:rFonts w:ascii="David" w:hAnsi="David"/>
+        </w:rPr>
+      </w:pPr>
+      <w:r>
+        <w:rPr>
+          <w:rFonts w:ascii="David" w:hAnsi="David"/>
+          <w:rtl/>
+        </w:rPr>
+        <w:t xml:space="preserve">מסך </w:t>
+      </w:r>
+      <w:r>
+        <w:rPr>
+          <w:rFonts w:ascii="David" w:hAnsi="David" w:hint="cs"/>
+          <w:rtl/>
+        </w:rPr>
+        <w:t>אשר מציג את רשימת שיעורי הנהיגה של התלמיד שהתחבר עם כפתור המעביר למסך הוספת שיעור.</w:t>
+      </w:r>
+    </w:p>
+    <w:p>
+      <w:pPr>
+        <w:jc w:val="left"/>
+        <w:rPr>
+          <w:rFonts w:ascii="David" w:hAnsi="David"/>
+          <w:b/>
+          <w:bCs/>
+          <w:u w:val="single"/>
+        </w:rPr>
+      </w:pPr>
+    </w:p>
+    <w:p>
+      <w:pPr>
+        <w:jc w:val="left"/>
         <w:rPr>
           <w:rFonts w:ascii="David" w:hAnsi="David"/>
           <w:b/>
@@ -10452,57 +10503,56 @@
           <w:sz w:val="28"/>
           <w:szCs w:val="32"/>
           <w:u w:val="single"/>
-        </w:rPr>
-        <w:t>istOfLesson</w:t>
-      </w:r>
-    </w:p>
-    <w:p>
-      <w:pPr>
-        <w:jc w:val="left"/>
-        <w:rPr>
-          <w:rFonts w:ascii="David" w:hAnsi="David"/>
-        </w:rPr>
-      </w:pPr>
-      <w:r>
-        <w:rPr>
-          <w:rFonts w:ascii="David" w:hAnsi="David"/>
-          <w:rtl/>
-        </w:rPr>
-        <w:t xml:space="preserve">מסך </w:t>
-      </w:r>
-      <w:r>
-        <w:rPr>
-          <w:rFonts w:ascii="David" w:hAnsi="David" w:hint="cs"/>
-          <w:rtl/>
-        </w:rPr>
-        <w:t>אשר מציג את רשימת שיעורי הנהיגה של התלמיד שהתחבר עם כפתור המעביר למסך הוספת שיעור.</w:t>
-      </w:r>
-    </w:p>
-    <w:p>
-      <w:pPr>
-        <w:jc w:val="left"/>
-        <w:rPr>
-          <w:rFonts w:ascii="David" w:hAnsi="David"/>
-          <w:b/>
-          <w:bCs/>
-          <w:u w:val="single"/>
-        </w:rPr>
-      </w:pPr>
-    </w:p>
-    <w:p>
-      <w:pPr>
-        <w:jc w:val="left"/>
-        <w:rPr>
-          <w:rFonts w:ascii="David" w:hAnsi="David" w:hint="cs"/>
+          <w:rtl/>
+        </w:rPr>
+      </w:pPr>
+      <w:r>
+        <w:rPr>
+          <w:rFonts w:ascii="David" w:hAnsi="David"/>
           <w:b/>
           <w:bCs/>
           <w:sz w:val="28"/>
           <w:szCs w:val="32"/>
           <w:u w:val="single"/>
-          <w:rtl/>
-        </w:rPr>
-      </w:pPr>
-      <w:r>
+        </w:rPr>
+        <w:t>NewLesson</w:t>
+      </w:r>
+    </w:p>
+    <w:p>
+      <w:pPr>
+        <w:jc w:val="left"/>
+        <w:rPr>
+          <w:rFonts w:ascii="David" w:hAnsi="David"/>
+          <w:rtl/>
+        </w:rPr>
+      </w:pPr>
+      <w:r>
+        <w:rPr>
+          <w:rFonts w:ascii="David" w:hAnsi="David"/>
+          <w:rtl/>
+        </w:rPr>
+        <w:t xml:space="preserve">מסך </w:t>
+      </w:r>
+      <w:r>
+        <w:rPr>
+          <w:rFonts w:ascii="David" w:hAnsi="David" w:hint="cs"/>
+          <w:rtl/>
+        </w:rPr>
+        <w:t>ההוספה לשיעור חדש. במסך זה ניתן להוסיף שיעור נהיגה חדש לתלמיד שהתחבר, אך אינו מטפל בבדיקה אם ניתן להוסיף את השיעור עקב נסיבות חיצוניות (שעות עבודה של המורה והתנגשויות עם שיעורי נהיגה אחרים של תלמידים אחרים).</w:t>
+      </w:r>
+    </w:p>
+    <w:p>
+      <w:pPr>
+        <w:jc w:val="left"/>
+        <w:rPr>
+          <w:rFonts w:ascii="David" w:hAnsi="David"/>
+          <w:rtl/>
+        </w:rPr>
+      </w:pPr>
+    </w:p>
+    <w:p>
+      <w:pPr>
+        <w:jc w:val="left"/>
         <w:rPr>
           <w:rFonts w:ascii="David" w:hAnsi="David"/>
           <w:b/>
@@ -10511,44 +10561,8 @@
           <w:szCs w:val="32"/>
           <w:u w:val="single"/>
         </w:rPr>
-        <w:t>NewLesson</w:t>
-      </w:r>
-    </w:p>
-    <w:p>
-      <w:pPr>
-        <w:jc w:val="left"/>
-        <w:rPr>
-          <w:rFonts w:ascii="David" w:hAnsi="David"/>
-          <w:rtl/>
-        </w:rPr>
-      </w:pPr>
-      <w:r>
-        <w:rPr>
-          <w:rFonts w:ascii="David" w:hAnsi="David"/>
-          <w:rtl/>
-        </w:rPr>
-        <w:t xml:space="preserve">מסך </w:t>
-      </w:r>
-      <w:r>
-        <w:rPr>
-          <w:rFonts w:ascii="David" w:hAnsi="David" w:hint="cs"/>
-          <w:rtl/>
-        </w:rPr>
-        <w:t>ההוספה לשיעור חדש. במסך זה ניתן להוסיף שיעור נהיגה חדש לתלמיד שהתחבר, אך אינו מטפל בבדיקה אם ניתן להוסיף את השיעור עקב נסיבות חיצוניות (שעות עבודה של המורה והתנגשויות עם שיעורי נהיגה אחרים של תלמידים אחרים).</w:t>
-      </w:r>
-    </w:p>
-    <w:p>
-      <w:pPr>
-        <w:jc w:val="left"/>
-        <w:rPr>
-          <w:rFonts w:ascii="David" w:hAnsi="David"/>
-          <w:rtl/>
-        </w:rPr>
-      </w:pPr>
-    </w:p>
-    <w:p>
-      <w:pPr>
-        <w:jc w:val="left"/>
+      </w:pPr>
+      <w:r>
         <w:rPr>
           <w:rFonts w:ascii="David" w:hAnsi="David"/>
           <w:b/>
@@ -10557,8 +10571,44 @@
           <w:szCs w:val="32"/>
           <w:u w:val="single"/>
         </w:rPr>
-      </w:pPr>
-      <w:r>
+        <w:t>PickTeacher</w:t>
+      </w:r>
+    </w:p>
+    <w:p>
+      <w:pPr>
+        <w:jc w:val="left"/>
+        <w:rPr>
+          <w:rFonts w:ascii="David" w:hAnsi="David"/>
+          <w:rtl/>
+        </w:rPr>
+      </w:pPr>
+      <w:r>
+        <w:rPr>
+          <w:rFonts w:ascii="David" w:hAnsi="David" w:hint="cs"/>
+          <w:rtl/>
+        </w:rPr>
+        <w:t>מסך עם רשימת המורים הקיימים במערכת. כאן התלמיד אשר נמצא בתהליך ההרשמה בוחר את המורה שלו</w:t>
+      </w:r>
+      <w:r>
+        <w:rPr>
+          <w:rFonts w:ascii="David" w:hAnsi="David" w:hint="cs"/>
+          <w:rtl/>
+        </w:rPr>
+        <w:t>, ומסך זה דואג לקישור של התלמיד עם המורה ביחד עם מסך ההרשמה לתלמיד.</w:t>
+      </w:r>
+    </w:p>
+    <w:p>
+      <w:pPr>
+        <w:jc w:val="left"/>
+        <w:rPr>
+          <w:rFonts w:ascii="David" w:hAnsi="David"/>
+          <w:rtl/>
+        </w:rPr>
+      </w:pPr>
+    </w:p>
+    <w:p>
+      <w:pPr>
+        <w:jc w:val="left"/>
         <w:rPr>
           <w:rFonts w:ascii="David" w:hAnsi="David"/>
           <w:b/>
@@ -10567,44 +10617,8 @@
           <w:szCs w:val="32"/>
           <w:u w:val="single"/>
         </w:rPr>
-        <w:t>PickTeacher</w:t>
-      </w:r>
-    </w:p>
-    <w:p>
-      <w:pPr>
-        <w:jc w:val="left"/>
-        <w:rPr>
-          <w:rFonts w:ascii="David" w:hAnsi="David"/>
-          <w:rtl/>
-        </w:rPr>
-      </w:pPr>
-      <w:r>
-        <w:rPr>
-          <w:rFonts w:ascii="David" w:hAnsi="David" w:hint="cs"/>
-          <w:rtl/>
-        </w:rPr>
-        <w:t>מסך עם רשימת המורים הקיימים במערכת. כאן התלמיד אשר נמצא בתהליך ההרשמה בוחר את המורה שלו</w:t>
-      </w:r>
-      <w:r>
-        <w:rPr>
-          <w:rFonts w:ascii="David" w:hAnsi="David" w:hint="cs"/>
-          <w:rtl/>
-        </w:rPr>
-        <w:t>, ומסך זה דואג לקישור של התלמיד עם המורה ביחד עם מסך ההרשמה לתלמיד.</w:t>
-      </w:r>
-    </w:p>
-    <w:p>
-      <w:pPr>
-        <w:jc w:val="left"/>
-        <w:rPr>
-          <w:rFonts w:ascii="David" w:hAnsi="David"/>
-          <w:rtl/>
-        </w:rPr>
-      </w:pPr>
-    </w:p>
-    <w:p>
-      <w:pPr>
-        <w:jc w:val="left"/>
+      </w:pPr>
+      <w:r>
         <w:rPr>
           <w:rFonts w:ascii="David" w:hAnsi="David"/>
           <w:b/>
@@ -10613,8 +10627,37 @@
           <w:szCs w:val="32"/>
           <w:u w:val="single"/>
         </w:rPr>
-      </w:pPr>
-      <w:r>
+        <w:t>Settings</w:t>
+      </w:r>
+    </w:p>
+    <w:p>
+      <w:pPr>
+        <w:jc w:val="left"/>
+        <w:rPr>
+          <w:rFonts w:ascii="David" w:hAnsi="David"/>
+          <w:rtl/>
+        </w:rPr>
+      </w:pPr>
+      <w:r>
+        <w:rPr>
+          <w:rFonts w:ascii="David" w:hAnsi="David" w:hint="cs"/>
+          <w:rtl/>
+        </w:rPr>
+        <w:t>מסך ההגדרות של המורה. כאן המרה יכול לקבוע הגדרות, כמו כמות הכסף שהוא גובה על כל שיעור נהיגה בודד ומשך זמן השיעור (מקסימום שעה).</w:t>
+      </w:r>
+    </w:p>
+    <w:p>
+      <w:pPr>
+        <w:jc w:val="left"/>
+        <w:rPr>
+          <w:rFonts w:ascii="David" w:hAnsi="David"/>
+          <w:rtl/>
+        </w:rPr>
+      </w:pPr>
+    </w:p>
+    <w:p>
+      <w:pPr>
+        <w:jc w:val="left"/>
         <w:rPr>
           <w:rFonts w:ascii="David" w:hAnsi="David"/>
           <w:b/>
@@ -10623,37 +10666,8 @@
           <w:szCs w:val="32"/>
           <w:u w:val="single"/>
         </w:rPr>
-        <w:t>Settings</w:t>
-      </w:r>
-    </w:p>
-    <w:p>
-      <w:pPr>
-        <w:jc w:val="left"/>
-        <w:rPr>
-          <w:rFonts w:ascii="David" w:hAnsi="David"/>
-          <w:rtl/>
-        </w:rPr>
-      </w:pPr>
-      <w:r>
-        <w:rPr>
-          <w:rFonts w:ascii="David" w:hAnsi="David" w:hint="cs"/>
-          <w:rtl/>
-        </w:rPr>
-        <w:t>מסך ההגדרות של המורה. כאן המרה יכול לקבוע הגדרות, כמו כמות הכסף שהוא גובה על כל שיעור נהיגה בודד ומשך זמן השיעור (מקסימום שעה).</w:t>
-      </w:r>
-    </w:p>
-    <w:p>
-      <w:pPr>
-        <w:jc w:val="left"/>
-        <w:rPr>
-          <w:rFonts w:ascii="David" w:hAnsi="David"/>
-          <w:rtl/>
-        </w:rPr>
-      </w:pPr>
-    </w:p>
-    <w:p>
-      <w:pPr>
-        <w:jc w:val="left"/>
+      </w:pPr>
+      <w:r>
         <w:rPr>
           <w:rFonts w:ascii="David" w:hAnsi="David"/>
           <w:b/>
@@ -10662,8 +10676,37 @@
           <w:szCs w:val="32"/>
           <w:u w:val="single"/>
         </w:rPr>
-      </w:pPr>
-      <w:r>
+        <w:t>StudentActivity</w:t>
+      </w:r>
+    </w:p>
+    <w:p>
+      <w:pPr>
+        <w:jc w:val="left"/>
+        <w:rPr>
+          <w:rFonts w:ascii="David" w:hAnsi="David"/>
+          <w:rtl/>
+        </w:rPr>
+      </w:pPr>
+      <w:r>
+        <w:rPr>
+          <w:rFonts w:ascii="David" w:hAnsi="David" w:hint="cs"/>
+          <w:rtl/>
+        </w:rPr>
+        <w:t>מסך התלמיד. לאחר שתלמיד מתחבר, הוא מגיע למסך הזה. כאן התלמיד יכול לגשת לכל מסך אשר מיועד לו.</w:t>
+      </w:r>
+    </w:p>
+    <w:p>
+      <w:pPr>
+        <w:jc w:val="left"/>
+        <w:rPr>
+          <w:rFonts w:ascii="David" w:hAnsi="David"/>
+          <w:rtl/>
+        </w:rPr>
+      </w:pPr>
+    </w:p>
+    <w:p>
+      <w:pPr>
+        <w:jc w:val="left"/>
         <w:rPr>
           <w:rFonts w:ascii="David" w:hAnsi="David"/>
           <w:b/>
@@ -10672,37 +10715,8 @@
           <w:szCs w:val="32"/>
           <w:u w:val="single"/>
         </w:rPr>
-        <w:t>StudentActivity</w:t>
-      </w:r>
-    </w:p>
-    <w:p>
-      <w:pPr>
-        <w:jc w:val="left"/>
-        <w:rPr>
-          <w:rFonts w:ascii="David" w:hAnsi="David"/>
-          <w:rtl/>
-        </w:rPr>
-      </w:pPr>
-      <w:r>
-        <w:rPr>
-          <w:rFonts w:ascii="David" w:hAnsi="David" w:hint="cs"/>
-          <w:rtl/>
-        </w:rPr>
-        <w:t>מסך התלמיד. לאחר שתלמיד מתחבר, הוא מגיע למסך הזה. כאן התלמיד יכול לגשת לכל מסך אשר מיועד לו.</w:t>
-      </w:r>
-    </w:p>
-    <w:p>
-      <w:pPr>
-        <w:jc w:val="left"/>
-        <w:rPr>
-          <w:rFonts w:ascii="David" w:hAnsi="David"/>
-          <w:rtl/>
-        </w:rPr>
-      </w:pPr>
-    </w:p>
-    <w:p>
-      <w:pPr>
-        <w:jc w:val="left"/>
+      </w:pPr>
+      <w:r>
         <w:rPr>
           <w:rFonts w:ascii="David" w:hAnsi="David"/>
           <w:b/>
@@ -10711,8 +10725,50 @@
           <w:szCs w:val="32"/>
           <w:u w:val="single"/>
         </w:rPr>
-      </w:pPr>
-      <w:r>
+        <w:t>StudentActivityRegister</w:t>
+      </w:r>
+    </w:p>
+    <w:p>
+      <w:pPr>
+        <w:jc w:val="left"/>
+        <w:rPr>
+          <w:rFonts w:ascii="David" w:hAnsi="David"/>
+          <w:rtl/>
+        </w:rPr>
+      </w:pPr>
+      <w:r>
+        <w:rPr>
+          <w:rFonts w:ascii="David" w:hAnsi="David" w:hint="cs"/>
+          <w:rtl/>
+        </w:rPr>
+        <w:t xml:space="preserve">מסך ההרשמה לתלמיד. כאן המשתמש יכול להירשם כתלמיד ומסך זה מטפל בכך. בסיום ההרשמה של התלמיד במערכת, המשתמש מועבר למסך </w:t>
+      </w:r>
+      <w:r>
+        <w:rPr>
+          <w:rFonts w:ascii="David" w:hAnsi="David"/>
+        </w:rPr>
+        <w:t>StudentActivity</w:t>
+      </w:r>
+      <w:r>
+        <w:rPr>
+          <w:rFonts w:ascii="David" w:hAnsi="David" w:hint="cs"/>
+          <w:rtl/>
+        </w:rPr>
+        <w:t xml:space="preserve"> אשר צוין קודם לכן.</w:t>
+      </w:r>
+    </w:p>
+    <w:p>
+      <w:pPr>
+        <w:jc w:val="left"/>
+        <w:rPr>
+          <w:rFonts w:ascii="David" w:hAnsi="David"/>
+          <w:rtl/>
+        </w:rPr>
+      </w:pPr>
+    </w:p>
+    <w:p>
+      <w:pPr>
+        <w:jc w:val="left"/>
         <w:rPr>
           <w:rFonts w:ascii="David" w:hAnsi="David"/>
           <w:b/>
@@ -10721,50 +10777,8 @@
           <w:szCs w:val="32"/>
           <w:u w:val="single"/>
         </w:rPr>
-        <w:t>StudentActivityRegister</w:t>
-      </w:r>
-    </w:p>
-    <w:p>
-      <w:pPr>
-        <w:jc w:val="left"/>
-        <w:rPr>
-          <w:rFonts w:ascii="David" w:hAnsi="David"/>
-          <w:rtl/>
-        </w:rPr>
-      </w:pPr>
-      <w:r>
-        <w:rPr>
-          <w:rFonts w:ascii="David" w:hAnsi="David" w:hint="cs"/>
-          <w:rtl/>
-        </w:rPr>
-        <w:t xml:space="preserve">מסך ההרשמה לתלמיד. כאן המשתמש יכול להירשם כתלמיד ומסך זה מטפל בכך. בסיום ההרשמה של התלמיד במערכת, המשתמש מועבר למסך </w:t>
-      </w:r>
-      <w:r>
-        <w:rPr>
-          <w:rFonts w:ascii="David" w:hAnsi="David"/>
-        </w:rPr>
-        <w:t>StudentActivity</w:t>
-      </w:r>
-      <w:r>
-        <w:rPr>
-          <w:rFonts w:ascii="David" w:hAnsi="David" w:hint="cs"/>
-          <w:rtl/>
-        </w:rPr>
-        <w:t xml:space="preserve"> אשר צוין קודם לכן.</w:t>
-      </w:r>
-    </w:p>
-    <w:p>
-      <w:pPr>
-        <w:jc w:val="left"/>
-        <w:rPr>
-          <w:rFonts w:ascii="David" w:hAnsi="David"/>
-          <w:rtl/>
-        </w:rPr>
-      </w:pPr>
-    </w:p>
-    <w:p>
-      <w:pPr>
-        <w:jc w:val="left"/>
+      </w:pPr>
+      <w:r>
         <w:rPr>
           <w:rFonts w:ascii="David" w:hAnsi="David"/>
           <w:b/>
@@ -10773,8 +10787,37 @@
           <w:szCs w:val="32"/>
           <w:u w:val="single"/>
         </w:rPr>
-      </w:pPr>
-      <w:r>
+        <w:t>TeacherActivity</w:t>
+      </w:r>
+    </w:p>
+    <w:p>
+      <w:pPr>
+        <w:jc w:val="left"/>
+        <w:rPr>
+          <w:rFonts w:ascii="David" w:hAnsi="David"/>
+          <w:rtl/>
+        </w:rPr>
+      </w:pPr>
+      <w:r>
+        <w:rPr>
+          <w:rFonts w:ascii="David" w:hAnsi="David" w:hint="cs"/>
+          <w:rtl/>
+        </w:rPr>
+        <w:t>מסך המורה. לאחר שמורה מתחבר, הוא מגיע למסך הזה. כאן המורה יכול לגשת לכל מסך אשר מיועד לו.</w:t>
+      </w:r>
+    </w:p>
+    <w:p>
+      <w:pPr>
+        <w:jc w:val="left"/>
+        <w:rPr>
+          <w:rFonts w:ascii="David" w:hAnsi="David"/>
+          <w:rtl/>
+        </w:rPr>
+      </w:pPr>
+    </w:p>
+    <w:p>
+      <w:pPr>
+        <w:jc w:val="left"/>
         <w:rPr>
           <w:rFonts w:ascii="David" w:hAnsi="David"/>
           <w:b/>
@@ -10783,37 +10826,8 @@
           <w:szCs w:val="32"/>
           <w:u w:val="single"/>
         </w:rPr>
-        <w:t>TeacherActivity</w:t>
-      </w:r>
-    </w:p>
-    <w:p>
-      <w:pPr>
-        <w:jc w:val="left"/>
-        <w:rPr>
-          <w:rFonts w:ascii="David" w:hAnsi="David"/>
-          <w:rtl/>
-        </w:rPr>
-      </w:pPr>
-      <w:r>
-        <w:rPr>
-          <w:rFonts w:ascii="David" w:hAnsi="David" w:hint="cs"/>
-          <w:rtl/>
-        </w:rPr>
-        <w:t>מסך המורה. לאחר שמורה מתחבר, הוא מגיע למסך הזה. כאן המורה יכול לגשת לכל מסך אשר מיועד לו.</w:t>
-      </w:r>
-    </w:p>
-    <w:p>
-      <w:pPr>
-        <w:jc w:val="left"/>
-        <w:rPr>
-          <w:rFonts w:ascii="David" w:hAnsi="David"/>
-          <w:rtl/>
-        </w:rPr>
-      </w:pPr>
-    </w:p>
-    <w:p>
-      <w:pPr>
-        <w:jc w:val="left"/>
+      </w:pPr>
+      <w:r>
         <w:rPr>
           <w:rFonts w:ascii="David" w:hAnsi="David"/>
           <w:b/>
@@ -10822,8 +10836,59 @@
           <w:szCs w:val="32"/>
           <w:u w:val="single"/>
         </w:rPr>
-      </w:pPr>
-      <w:r>
+        <w:t>TeacherActivityRegister</w:t>
+      </w:r>
+    </w:p>
+    <w:p>
+      <w:pPr>
+        <w:jc w:val="left"/>
+        <w:rPr>
+          <w:rFonts w:ascii="David" w:hAnsi="David"/>
+          <w:rtl/>
+        </w:rPr>
+      </w:pPr>
+      <w:r>
+        <w:rPr>
+          <w:rFonts w:ascii="David" w:hAnsi="David" w:hint="cs"/>
+          <w:rtl/>
+        </w:rPr>
+        <w:t xml:space="preserve">מסך ההרשמה למורה. כאן המשתמש יכול להירשם כמורה ומסך זה מטפל בכך. בסיום ההרשמה של המורה במערכת, המשתמש מועבר למסך </w:t>
+      </w:r>
+      <w:r>
+        <w:rPr>
+          <w:rFonts w:ascii="David" w:hAnsi="David"/>
+        </w:rPr>
+        <w:t>TeacherActivity</w:t>
+      </w:r>
+      <w:r>
+        <w:rPr>
+          <w:rFonts w:ascii="David" w:hAnsi="David" w:hint="cs"/>
+          <w:rtl/>
+        </w:rPr>
+        <w:t xml:space="preserve"> אשר צוין קודם לכן.</w:t>
+      </w:r>
+    </w:p>
+    <w:p>
+      <w:pPr>
+        <w:bidi w:val="0"/>
+        <w:spacing w:line="240" w:lineRule="auto"/>
+        <w:jc w:val="left"/>
+        <w:rPr>
+          <w:rFonts w:ascii="David" w:hAnsi="David"/>
+          <w:rtl/>
+        </w:rPr>
+      </w:pPr>
+      <w:r>
+        <w:rPr>
+          <w:rFonts w:ascii="David" w:hAnsi="David"/>
+          <w:rtl/>
+        </w:rPr>
+        <w:br w:type="page"/>
+      </w:r>
+    </w:p>
+    <w:p>
+      <w:pPr>
+        <w:jc w:val="left"/>
         <w:rPr>
           <w:rFonts w:ascii="David" w:hAnsi="David"/>
           <w:b/>
@@ -10831,60 +10896,10 @@
           <w:sz w:val="28"/>
           <w:szCs w:val="32"/>
           <w:u w:val="single"/>
-        </w:rPr>
-        <w:t>TeacherActivityRegister</w:t>
-      </w:r>
-    </w:p>
-    <w:p>
-      <w:pPr>
-        <w:jc w:val="left"/>
-        <w:rPr>
-          <w:rFonts w:ascii="David" w:hAnsi="David"/>
-          <w:rtl/>
-        </w:rPr>
-      </w:pPr>
-      <w:r>
-        <w:rPr>
-          <w:rFonts w:ascii="David" w:hAnsi="David" w:hint="cs"/>
-          <w:rtl/>
-        </w:rPr>
-        <w:t xml:space="preserve">מסך ההרשמה למורה. כאן המשתמש יכול להירשם כמורה ומסך זה מטפל בכך. בסיום ההרשמה של המורה במערכת, המשתמש מועבר למסך </w:t>
-      </w:r>
-      <w:r>
-        <w:rPr>
-          <w:rFonts w:ascii="David" w:hAnsi="David"/>
-        </w:rPr>
-        <w:t>TeacherActivity</w:t>
-      </w:r>
-      <w:r>
-        <w:rPr>
-          <w:rFonts w:ascii="David" w:hAnsi="David" w:hint="cs"/>
-          <w:rtl/>
-        </w:rPr>
-        <w:t xml:space="preserve"> אשר צוין קודם לכן.</w:t>
-      </w:r>
-    </w:p>
-    <w:p>
-      <w:pPr>
-        <w:bidi w:val="0"/>
-        <w:spacing w:line="240" w:lineRule="auto"/>
-        <w:jc w:val="left"/>
-        <w:rPr>
-          <w:rFonts w:ascii="David" w:hAnsi="David"/>
-          <w:rtl/>
-        </w:rPr>
-      </w:pPr>
-      <w:r>
-        <w:rPr>
-          <w:rFonts w:ascii="David" w:hAnsi="David"/>
-          <w:rtl/>
-        </w:rPr>
-        <w:br w:type="page"/>
-      </w:r>
-    </w:p>
-    <w:p>
-      <w:pPr>
-        <w:jc w:val="left"/>
+          <w:rtl/>
+        </w:rPr>
+      </w:pPr>
+      <w:r>
         <w:rPr>
           <w:rFonts w:ascii="David" w:hAnsi="David"/>
           <w:b/>
@@ -10892,17 +10907,6 @@
           <w:sz w:val="28"/>
           <w:szCs w:val="32"/>
           <w:u w:val="single"/>
-          <w:rtl/>
-        </w:rPr>
-      </w:pPr>
-      <w:r>
-        <w:rPr>
-          <w:rFonts w:ascii="David" w:hAnsi="David"/>
-          <w:b/>
-          <w:bCs/>
-          <w:sz w:val="28"/>
-          <w:szCs w:val="32"/>
-          <w:u w:val="single"/>
         </w:rPr>
         <w:lastRenderedPageBreak/>
         <w:t>WhatsNewActivity</w:t>
@@ -10912,7 +10916,7 @@
       <w:pPr>
         <w:jc w:val="left"/>
         <w:rPr>
-          <w:rFonts w:ascii="David" w:hAnsi="David" w:hint="cs"/>
+          <w:rFonts w:ascii="David" w:hAnsi="David"/>
           <w:rtl/>
         </w:rPr>
       </w:pPr>
@@ -10946,8 +10950,8 @@
         </w:rPr>
         <w:t>Services</w:t>
       </w:r>
-      <w:bookmarkEnd w:id="17"/>
       <w:bookmarkEnd w:id="18"/>
+      <w:bookmarkEnd w:id="19"/>
     </w:p>
     <w:p>
       <w:pPr>
@@ -11763,7 +11767,7 @@
               <w:jc w:val="center"/>
               <w:outlineLvl w:val="3"/>
               <w:rPr>
-                <w:rFonts w:ascii="David" w:hAnsi="David" w:cs="David" w:hint="cs"/>
+                <w:rFonts w:ascii="David" w:hAnsi="David" w:cs="David"/>
                 <w:sz w:val="24"/>
                 <w:szCs w:val="24"/>
                 <w:rtl/>
@@ -11935,7 +11939,7 @@
               <w:spacing w:line="276" w:lineRule="auto"/>
               <w:outlineLvl w:val="3"/>
               <w:rPr>
-                <w:rFonts w:ascii="David" w:hAnsi="David" w:cs="David" w:hint="cs"/>
+                <w:rFonts w:ascii="David" w:hAnsi="David" w:cs="David"/>
                 <w:b w:val="0"/>
                 <w:bCs w:val="0"/>
                 <w:sz w:val="24"/>
@@ -12061,7 +12065,7 @@
               <w:spacing w:line="276" w:lineRule="auto"/>
               <w:outlineLvl w:val="3"/>
               <w:rPr>
-                <w:rFonts w:ascii="David" w:hAnsi="David" w:cs="David" w:hint="cs"/>
+                <w:rFonts w:ascii="David" w:hAnsi="David" w:cs="David"/>
                 <w:b w:val="0"/>
                 <w:bCs w:val="0"/>
                 <w:sz w:val="24"/>
@@ -13270,7 +13274,7 @@
             <w:pPr>
               <w:spacing w:line="276" w:lineRule="auto"/>
               <w:rPr>
-                <w:rFonts w:ascii="David" w:hAnsi="David" w:hint="cs"/>
+                <w:rFonts w:ascii="David" w:hAnsi="David"/>
                 <w:b/>
                 <w:bCs/>
               </w:rPr>
@@ -13302,7 +13306,7 @@
             <w:pPr>
               <w:spacing w:line="276" w:lineRule="auto"/>
               <w:rPr>
-                <w:rFonts w:ascii="David" w:hAnsi="David" w:hint="cs"/>
+                <w:rFonts w:ascii="David" w:hAnsi="David"/>
                 <w:b/>
                 <w:bCs/>
                 <w:rtl/>
@@ -13406,7 +13410,7 @@
             <w:pPr>
               <w:spacing w:line="276" w:lineRule="auto"/>
               <w:rPr>
-                <w:rFonts w:ascii="David" w:hAnsi="David" w:hint="cs"/>
+                <w:rFonts w:ascii="David" w:hAnsi="David"/>
                 <w:rtl/>
               </w:rPr>
             </w:pPr>
@@ -13825,7 +13829,6 @@
     <w:p>
       <w:pPr>
         <w:rPr>
-          <w:rFonts w:hint="cs"/>
           <w:rtl/>
         </w:rPr>
       </w:pPr>
@@ -13881,7 +13884,7 @@
               <w:spacing w:line="276" w:lineRule="auto"/>
               <w:jc w:val="center"/>
               <w:rPr>
-                <w:rFonts w:ascii="David" w:hAnsi="David" w:hint="cs"/>
+                <w:rFonts w:ascii="David" w:hAnsi="David"/>
                 <w:b/>
                 <w:bCs/>
                 <w:u w:val="single"/>
@@ -14269,7 +14272,7 @@
             <w:pPr>
               <w:spacing w:line="276" w:lineRule="auto"/>
               <w:rPr>
-                <w:rFonts w:ascii="David" w:hAnsi="David" w:hint="cs"/>
+                <w:rFonts w:ascii="David" w:hAnsi="David"/>
                 <w:sz w:val="24"/>
                 <w:rtl/>
               </w:rPr>
@@ -14815,7 +14818,7 @@
               <w:spacing w:line="276" w:lineRule="auto"/>
               <w:jc w:val="center"/>
               <w:rPr>
-                <w:rFonts w:ascii="David" w:hAnsi="David" w:hint="cs"/>
+                <w:rFonts w:ascii="David" w:hAnsi="David"/>
                 <w:b/>
                 <w:bCs/>
                 <w:u w:val="single"/>
@@ -15201,7 +15204,7 @@
             <w:pPr>
               <w:spacing w:line="276" w:lineRule="auto"/>
               <w:rPr>
-                <w:rFonts w:ascii="David" w:hAnsi="David" w:hint="cs"/>
+                <w:rFonts w:ascii="David" w:hAnsi="David"/>
                 <w:sz w:val="24"/>
                 <w:rtl/>
               </w:rPr>
@@ -16218,7 +16221,7 @@
             <w:pPr>
               <w:spacing w:line="276" w:lineRule="auto"/>
               <w:rPr>
-                <w:rFonts w:ascii="David" w:hAnsi="David" w:hint="cs"/>
+                <w:rFonts w:ascii="David" w:hAnsi="David"/>
                 <w:sz w:val="24"/>
                 <w:rtl/>
               </w:rPr>
@@ -16955,7 +16958,7 @@
             <w:pPr>
               <w:spacing w:line="276" w:lineRule="auto"/>
               <w:rPr>
-                <w:rFonts w:ascii="David" w:hAnsi="David" w:hint="cs"/>
+                <w:rFonts w:ascii="David" w:hAnsi="David"/>
                 <w:sz w:val="24"/>
                 <w:rtl/>
               </w:rPr>
@@ -17054,7 +17057,7 @@
               <w:spacing w:line="276" w:lineRule="auto"/>
               <w:jc w:val="left"/>
               <w:rPr>
-                <w:rFonts w:ascii="David" w:hAnsi="David" w:hint="cs"/>
+                <w:rFonts w:ascii="David" w:hAnsi="David"/>
                 <w:sz w:val="24"/>
                 <w:rtl/>
               </w:rPr>
@@ -17171,7 +17174,7 @@
               <w:spacing w:line="276" w:lineRule="auto"/>
               <w:jc w:val="left"/>
               <w:rPr>
-                <w:rFonts w:ascii="David" w:hAnsi="David" w:hint="cs"/>
+                <w:rFonts w:ascii="David" w:hAnsi="David"/>
                 <w:sz w:val="24"/>
                 <w:rtl/>
               </w:rPr>
@@ -17657,7 +17660,7 @@
             <w:pPr>
               <w:spacing w:line="276" w:lineRule="auto"/>
               <w:rPr>
-                <w:rFonts w:ascii="David" w:hAnsi="David" w:hint="cs"/>
+                <w:rFonts w:ascii="David" w:hAnsi="David"/>
                 <w:sz w:val="24"/>
                 <w:rtl/>
               </w:rPr>
@@ -17755,7 +17758,7 @@
             <w:pPr>
               <w:spacing w:line="276" w:lineRule="auto"/>
               <w:rPr>
-                <w:rFonts w:ascii="David" w:hAnsi="David" w:hint="cs"/>
+                <w:rFonts w:ascii="David" w:hAnsi="David"/>
                 <w:sz w:val="24"/>
                 <w:rtl/>
               </w:rPr>
@@ -17815,7 +17818,7 @@
             <w:pPr>
               <w:spacing w:line="276" w:lineRule="auto"/>
               <w:rPr>
-                <w:rFonts w:ascii="David" w:hAnsi="David" w:hint="cs"/>
+                <w:rFonts w:ascii="David" w:hAnsi="David"/>
                 <w:sz w:val="24"/>
                 <w:rtl/>
               </w:rPr>
@@ -17913,7 +17916,7 @@
             <w:pPr>
               <w:spacing w:line="276" w:lineRule="auto"/>
               <w:rPr>
-                <w:rFonts w:ascii="David" w:hAnsi="David" w:hint="cs"/>
+                <w:rFonts w:ascii="David" w:hAnsi="David"/>
                 <w:sz w:val="24"/>
                 <w:rtl/>
               </w:rPr>
@@ -18059,7 +18062,6 @@
       <w:pPr>
         <w:jc w:val="left"/>
         <w:rPr>
-          <w:rFonts w:hint="cs"/>
           <w:rtl/>
         </w:rPr>
       </w:pPr>
@@ -22485,7 +22487,6 @@
     <w:p>
       <w:pPr>
         <w:rPr>
-          <w:rFonts w:hint="cs"/>
           <w:rtl/>
         </w:rPr>
       </w:pPr>
@@ -23045,63 +23046,21 @@
           <w:rFonts w:hint="cs"/>
           <w:rtl/>
         </w:rPr>
-        <w:t>המסך שאליו מועבר המשתמש לאחר שנרשם כ</w:t>
-      </w:r>
+        <w:t>המסך שאליו מועבר המשתמש לאחר שנרשם כמורה. מכאן יכול המורה</w:t>
+      </w:r>
+    </w:p>
+    <w:p>
+      <w:pPr>
+        <w:rPr>
+          <w:rtl/>
+        </w:rPr>
+      </w:pPr>
       <w:r>
         <w:rPr>
           <w:rFonts w:hint="cs"/>
           <w:rtl/>
         </w:rPr>
-        <w:t>מורה</w:t>
-      </w:r>
-      <w:r>
-        <w:rPr>
-          <w:rFonts w:hint="cs"/>
-          <w:rtl/>
-        </w:rPr>
-        <w:t>. מכאן יכול ה</w:t>
-      </w:r>
-      <w:r>
-        <w:rPr>
-          <w:rFonts w:hint="cs"/>
-          <w:rtl/>
-        </w:rPr>
-        <w:t>מורה</w:t>
-      </w:r>
-    </w:p>
-    <w:p>
-      <w:pPr>
-        <w:rPr>
-          <w:rtl/>
-        </w:rPr>
-      </w:pPr>
-      <w:r>
-        <w:rPr>
-          <w:rFonts w:hint="cs"/>
-          <w:rtl/>
-        </w:rPr>
-        <w:t>להתחבר כ</w:t>
-      </w:r>
-      <w:r>
-        <w:rPr>
-          <w:rFonts w:hint="cs"/>
-          <w:rtl/>
-        </w:rPr>
-        <w:t>מורה</w:t>
-      </w:r>
-      <w:r>
-        <w:rPr>
-          <w:rFonts w:hint="cs"/>
-          <w:rtl/>
-        </w:rPr>
-        <w:t xml:space="preserve"> אחר או </w:t>
-      </w:r>
-      <w:r>
-        <w:rPr>
-          <w:rFonts w:hint="cs"/>
-          <w:rtl/>
-        </w:rPr>
-        <w:t>כתלמיד ולשנות את הגדרות השיעור כמורה.</w:t>
+        <w:t>להתחבר כמורה אחר או כתלמיד ולשנות את הגדרות השיעור כמורה.</w:t>
       </w:r>
     </w:p>
     <w:p>
@@ -23732,7 +23691,6 @@
     <w:p>
       <w:pPr>
         <w:rPr>
-          <w:rFonts w:hint="cs"/>
           <w:rtl/>
         </w:rPr>
       </w:pPr>
@@ -24745,7 +24703,6 @@
         <w:rPr>
           <w:rFonts w:ascii="David" w:hAnsi="David"/>
           <w:color w:val="0000FF"/>
-          <w:rtl/>
         </w:rPr>
       </w:pPr>
       <w:r>
@@ -24792,6 +24749,94 @@
         <w:rPr>
           <w:rFonts w:ascii="David" w:hAnsi="David"/>
           <w:color w:val="0000FF"/>
+        </w:rPr>
+        <w:t>.</w:t>
+      </w:r>
+    </w:p>
+    <w:p>
+      <w:pPr>
+        <w:jc w:val="left"/>
+        <w:rPr>
+          <w:rFonts w:ascii="David" w:hAnsi="David"/>
+          <w:sz w:val="24"/>
+          <w:rtl/>
+        </w:rPr>
+      </w:pPr>
+      <w:r>
+        <w:br/>
+      </w:r>
+      <w:r>
+        <w:rPr>
+          <w:rFonts w:ascii="David" w:hAnsi="David"/>
+          <w:sz w:val="24"/>
+          <w:rtl/>
+        </w:rPr>
+        <w:t>הייתה מאתגרת הייתי צריך ללמוד</w:t>
+      </w:r>
+      <w:r>
+        <w:rPr>
+          <w:rFonts w:ascii="David" w:hAnsi="David"/>
+          <w:sz w:val="24"/>
+        </w:rPr>
+        <w:t xml:space="preserve"> Unity </w:t>
+      </w:r>
+      <w:r>
+        <w:rPr>
+          <w:rFonts w:ascii="David" w:hAnsi="David"/>
+          <w:sz w:val="24"/>
+          <w:rtl/>
+        </w:rPr>
+        <w:t>ברמה שאוכל ליצור משחק ורק בעזרת האינטרנט ועזרה מחברים היו מספר קשיים בדרך שעקבו אותי עם ההתקדמות ובחלק מהם לא הייתה שום תשובה או פתרון באינטרנט לכן הייתי צריך לחקור דברים בעצמי ולהבין איך דברים עובדים ולחפש דברים שמזכירים את הבעיות באינטרנט עד שהצלחתי לפתור את חלקם או "לעקוף" אותם לדוגמה הסרבר היה בהתחלה די בעייתי אבל אחרי שהבנתי איך הוא עובד ומה עושים ואיך עושים זה נהיה הרבה יותר פשוט ומובן וברור וזה גם נותן הרגשה טובה כשאתה מצליח לפתור בעיה שהייתה לך בפרויקט</w:t>
+      </w:r>
+      <w:r>
+        <w:rPr>
+          <w:rFonts w:ascii="David" w:hAnsi="David"/>
+          <w:sz w:val="24"/>
+        </w:rPr>
+        <w:t xml:space="preserve">. </w:t>
+      </w:r>
+      <w:r>
+        <w:rPr>
+          <w:rFonts w:ascii="David" w:hAnsi="David"/>
+          <w:sz w:val="24"/>
+          <w:rtl/>
+        </w:rPr>
+        <w:t>בנוסף לכך אפשר לראות את המשחק שיצרתי לא רק בתוכנה אלא גם חשיבה יצירתית ולחשוב מחוץ לקופסה ופתרון בעיות בצורה יצירתית מה שנמצא גם בכל בעיה או מכשול בחיינו ולא רק בעולם התוכנה</w:t>
+      </w:r>
+      <w:r>
+        <w:rPr>
+          <w:rFonts w:ascii="David" w:hAnsi="David"/>
+          <w:sz w:val="24"/>
+        </w:rPr>
+        <w:t xml:space="preserve">. </w:t>
+      </w:r>
+      <w:r>
+        <w:rPr>
+          <w:rFonts w:ascii="David" w:hAnsi="David"/>
+          <w:sz w:val="24"/>
+          <w:rtl/>
+        </w:rPr>
+        <w:t>וכמובן למרות שהקשיים יכולים להיות מאוד מתישים ובעיתיים לא וויתרתי וישבתי שעות כדי לפתור את הבעיות השונות שהיו וזה היה שווה את זה וההרגשה בסוף, ההרגשה של "סיימתי את הפרויקט" זה משמח וממלא אותי באושר</w:t>
+      </w:r>
+      <w:r>
+        <w:rPr>
+          <w:rFonts w:ascii="David" w:hAnsi="David"/>
+          <w:sz w:val="24"/>
+        </w:rPr>
+        <w:t xml:space="preserve">. </w:t>
+      </w:r>
+      <w:r>
+        <w:rPr>
+          <w:rFonts w:ascii="David" w:hAnsi="David"/>
+          <w:sz w:val="24"/>
+          <w:rtl/>
+        </w:rPr>
+        <w:t>בסופו של דבר אני שמח שעשיתי את הפרויקט ואני שמח שהצלחתי לסיים בזמן</w:t>
+      </w:r>
+      <w:r>
+        <w:rPr>
+          <w:rFonts w:ascii="David" w:hAnsi="David"/>
+          <w:sz w:val="24"/>
         </w:rPr>
         <w:t>.</w:t>
       </w:r>
@@ -25344,6 +25389,7 @@
         <w:docPartUnique/>
       </w:docPartObj>
     </w:sdtPr>
+    <w:sdtEndPr/>
     <w:sdtContent>
       <w:sdt>
         <w:sdtPr>
@@ -25356,6 +25402,7 @@
             <w:docPartUnique/>
           </w:docPartObj>
         </w:sdtPr>
+        <w:sdtEndPr/>
         <w:sdtContent>
           <w:p>
             <w:pPr>
@@ -33779,7 +33826,7 @@
 </file>
 
 <file path=customXml/itemProps1.xml><?xml version="1.0" encoding="utf-8"?>
-<ds:datastoreItem xmlns:ds="http://schemas.openxmlformats.org/officeDocument/2006/customXml" ds:itemID="{9461068C-6656-4D8D-81D9-4389D8410F38}">
+<ds:datastoreItem xmlns:ds="http://schemas.openxmlformats.org/officeDocument/2006/customXml" ds:itemID="{09BA86E4-36A6-4F96-B400-0543FAD5CF86}">
   <ds:schemaRefs>
     <ds:schemaRef ds:uri="http://schemas.openxmlformats.org/officeDocument/2006/bibliography"/>
   </ds:schemaRefs>

</xml_diff>

<commit_message>
Added Broadcast Reaceiver of Airplane Mode
</commit_message>
<xml_diff>
--- a/Driving Lessons Manager.docx
+++ b/Driving Lessons Manager.docx
@@ -10089,6 +10089,74 @@
         </w:rPr>
         <w:lastRenderedPageBreak/>
         <w:drawing>
+          <wp:anchor distT="0" distB="0" distL="114300" distR="114300" simplePos="0" relativeHeight="251765248" behindDoc="0" locked="0" layoutInCell="1" allowOverlap="1" wp14:anchorId="538C37FF" wp14:editId="6B518AB3">
+            <wp:simplePos x="0" y="0"/>
+            <wp:positionH relativeFrom="margin">
+              <wp:align>right</wp:align>
+            </wp:positionH>
+            <wp:positionV relativeFrom="paragraph">
+              <wp:posOffset>4229100</wp:posOffset>
+            </wp:positionV>
+            <wp:extent cx="2135505" cy="1752600"/>
+            <wp:effectExtent l="0" t="0" r="0" b="0"/>
+            <wp:wrapTopAndBottom/>
+            <wp:docPr id="4" name="תמונה 4"/>
+            <wp:cNvGraphicFramePr>
+              <a:graphicFrameLocks xmlns:a="http://schemas.openxmlformats.org/drawingml/2006/main" noChangeAspect="1"/>
+            </wp:cNvGraphicFramePr>
+            <a:graphic xmlns:a="http://schemas.openxmlformats.org/drawingml/2006/main">
+              <a:graphicData uri="http://schemas.openxmlformats.org/drawingml/2006/picture">
+                <pic:pic xmlns:pic="http://schemas.openxmlformats.org/drawingml/2006/picture">
+                  <pic:nvPicPr>
+                    <pic:cNvPr id="0" name="Picture 1"/>
+                    <pic:cNvPicPr>
+                      <a:picLocks noChangeAspect="1" noChangeArrowheads="1"/>
+                    </pic:cNvPicPr>
+                  </pic:nvPicPr>
+                  <pic:blipFill>
+                    <a:blip r:embed="rId24">
+                      <a:extLst>
+                        <a:ext uri="{28A0092B-C50C-407E-A947-70E740481C1C}">
+                          <a14:useLocalDpi xmlns:a14="http://schemas.microsoft.com/office/drawing/2010/main" val="0"/>
+                        </a:ext>
+                      </a:extLst>
+                    </a:blip>
+                    <a:srcRect/>
+                    <a:stretch>
+                      <a:fillRect/>
+                    </a:stretch>
+                  </pic:blipFill>
+                  <pic:spPr bwMode="auto">
+                    <a:xfrm>
+                      <a:off x="0" y="0"/>
+                      <a:ext cx="2135505" cy="1752600"/>
+                    </a:xfrm>
+                    <a:prstGeom prst="rect">
+                      <a:avLst/>
+                    </a:prstGeom>
+                    <a:noFill/>
+                    <a:ln>
+                      <a:noFill/>
+                    </a:ln>
+                  </pic:spPr>
+                </pic:pic>
+              </a:graphicData>
+            </a:graphic>
+            <wp14:sizeRelH relativeFrom="margin">
+              <wp14:pctWidth>0</wp14:pctWidth>
+            </wp14:sizeRelH>
+            <wp14:sizeRelV relativeFrom="margin">
+              <wp14:pctHeight>0</wp14:pctHeight>
+            </wp14:sizeRelV>
+          </wp:anchor>
+        </w:drawing>
+      </w:r>
+      <w:r>
+        <w:rPr>
+          <w:rFonts w:ascii="David" w:hAnsi="David"/>
+          <w:noProof/>
+        </w:rPr>
+        <w:drawing>
           <wp:anchor distT="0" distB="0" distL="114300" distR="114300" simplePos="0" relativeHeight="251689472" behindDoc="0" locked="0" layoutInCell="1" allowOverlap="1" wp14:anchorId="043AD367" wp14:editId="63D4EEF3">
             <wp:simplePos x="0" y="0"/>
             <wp:positionH relativeFrom="margin">
@@ -10114,7 +10182,7 @@
                     </pic:cNvPicPr>
                   </pic:nvPicPr>
                   <pic:blipFill>
-                    <a:blip r:embed="rId24">
+                    <a:blip r:embed="rId25">
                       <a:extLst>
                         <a:ext uri="{28A0092B-C50C-407E-A947-70E740481C1C}">
                           <a14:useLocalDpi xmlns:a14="http://schemas.microsoft.com/office/drawing/2010/main" val="0"/>
@@ -10176,7 +10244,7 @@
                     </pic:cNvPicPr>
                   </pic:nvPicPr>
                   <pic:blipFill>
-                    <a:blip r:embed="rId25">
+                    <a:blip r:embed="rId26">
                       <a:extLst>
                         <a:ext uri="{28A0092B-C50C-407E-A947-70E740481C1C}">
                           <a14:useLocalDpi xmlns:a14="http://schemas.microsoft.com/office/drawing/2010/main" val="0"/>
@@ -10238,7 +10306,7 @@
                     </pic:cNvPicPr>
                   </pic:nvPicPr>
                   <pic:blipFill>
-                    <a:blip r:embed="rId26">
+                    <a:blip r:embed="rId27">
                       <a:extLst>
                         <a:ext uri="{28A0092B-C50C-407E-A947-70E740481C1C}">
                           <a14:useLocalDpi xmlns:a14="http://schemas.microsoft.com/office/drawing/2010/main" val="0"/>
@@ -11526,48 +11594,114 @@
     </w:p>
     <w:p>
       <w:pPr>
-        <w:spacing w:line="276" w:lineRule="auto"/>
-        <w:jc w:val="left"/>
-        <w:rPr>
-          <w:rFonts w:ascii="David" w:hAnsi="David"/>
-          <w:color w:val="0000FF"/>
-          <w:rtl/>
-        </w:rPr>
-      </w:pPr>
-      <w:r>
-        <w:rPr>
-          <w:rFonts w:ascii="David" w:hAnsi="David"/>
-          <w:color w:val="0000FF"/>
-          <w:rtl/>
-        </w:rPr>
-        <w:t xml:space="preserve">אופציונלי: באיזה </w:t>
-      </w:r>
-      <w:r>
-        <w:rPr>
-          <w:rFonts w:ascii="David" w:hAnsi="David"/>
-          <w:color w:val="0000FF"/>
-        </w:rPr>
-        <w:t>Content Providers</w:t>
-      </w:r>
-      <w:r>
-        <w:rPr>
-          <w:rFonts w:ascii="David" w:hAnsi="David"/>
-          <w:color w:val="0000FF"/>
-          <w:rtl/>
-        </w:rPr>
-        <w:t xml:space="preserve"> משתמשים במערכת ואיזה מחלקות מממשות אותם / משתמשות בהם.</w:t>
+        <w:pStyle w:val="4"/>
+        <w:rPr>
+          <w:rFonts w:ascii="David" w:hAnsi="David" w:cs="David"/>
+        </w:rPr>
+      </w:pPr>
+      <w:r>
+        <w:rPr>
+          <w:rFonts w:ascii="David" w:hAnsi="David" w:cs="David"/>
+        </w:rPr>
+        <w:t>Airplane Receiver</w:t>
       </w:r>
     </w:p>
     <w:p>
       <w:pPr>
-        <w:spacing w:line="276" w:lineRule="auto"/>
-        <w:jc w:val="left"/>
-        <w:rPr>
-          <w:rFonts w:ascii="David" w:hAnsi="David"/>
-          <w:color w:val="0000FF"/>
-          <w:rtl/>
-        </w:rPr>
-      </w:pPr>
+        <w:rPr>
+          <w:rFonts w:ascii="David" w:hAnsi="David"/>
+          <w:sz w:val="24"/>
+        </w:rPr>
+      </w:pPr>
+      <w:r>
+        <w:rPr>
+          <w:rFonts w:ascii="David" w:hAnsi="David"/>
+          <w:sz w:val="24"/>
+          <w:rtl/>
+        </w:rPr>
+        <w:t xml:space="preserve">השתמשתי </w:t>
+      </w:r>
+      <w:proofErr w:type="spellStart"/>
+      <w:r>
+        <w:rPr>
+          <w:rFonts w:ascii="David" w:hAnsi="David"/>
+          <w:sz w:val="24"/>
+          <w:rtl/>
+        </w:rPr>
+        <w:t>ברסיבר</w:t>
+      </w:r>
+      <w:proofErr w:type="spellEnd"/>
+      <w:r>
+        <w:rPr>
+          <w:rFonts w:ascii="David" w:hAnsi="David"/>
+          <w:sz w:val="24"/>
+          <w:rtl/>
+        </w:rPr>
+        <w:t xml:space="preserve"> של מצב טיסה </w:t>
+      </w:r>
+      <w:r>
+        <w:rPr>
+          <w:rFonts w:ascii="David" w:hAnsi="David" w:hint="cs"/>
+          <w:sz w:val="24"/>
+          <w:rtl/>
+        </w:rPr>
+        <w:t>כדי</w:t>
+      </w:r>
+      <w:r>
+        <w:rPr>
+          <w:rFonts w:ascii="David" w:hAnsi="David"/>
+          <w:sz w:val="24"/>
+          <w:rtl/>
+        </w:rPr>
+        <w:t xml:space="preserve"> להודיע למשתמש </w:t>
+      </w:r>
+      <w:r>
+        <w:rPr>
+          <w:rFonts w:ascii="David" w:hAnsi="David" w:hint="cs"/>
+          <w:sz w:val="24"/>
+          <w:rtl/>
+        </w:rPr>
+        <w:t xml:space="preserve">אם מצב הטיסה מופעל או כבוי בהודעת </w:t>
+      </w:r>
+      <w:r>
+        <w:rPr>
+          <w:rFonts w:ascii="David" w:hAnsi="David"/>
+          <w:sz w:val="24"/>
+        </w:rPr>
+        <w:t>Toast</w:t>
+      </w:r>
+      <w:r>
+        <w:rPr>
+          <w:rFonts w:ascii="David" w:hAnsi="David" w:hint="cs"/>
+          <w:sz w:val="24"/>
+          <w:rtl/>
+        </w:rPr>
+        <w:t xml:space="preserve"> קצרה ופשוטה</w:t>
+      </w:r>
+      <w:r>
+        <w:rPr>
+          <w:rFonts w:ascii="David" w:hAnsi="David"/>
+          <w:sz w:val="24"/>
+          <w:rtl/>
+        </w:rPr>
+        <w:t xml:space="preserve"> במסך ה</w:t>
+      </w:r>
+      <w:r>
+        <w:rPr>
+          <w:rFonts w:ascii="David" w:hAnsi="David" w:hint="cs"/>
+          <w:sz w:val="24"/>
+          <w:rtl/>
+        </w:rPr>
+        <w:t>ראשי</w:t>
+      </w:r>
+      <w:r>
+        <w:rPr>
+          <w:rFonts w:ascii="David" w:hAnsi="David" w:hint="cs"/>
+          <w:sz w:val="24"/>
+          <w:rtl/>
+        </w:rPr>
+        <w:t>.</w:t>
+      </w:r>
     </w:p>
     <w:p>
       <w:pPr>
@@ -14066,7 +14200,7 @@
                           </pic:cNvPicPr>
                         </pic:nvPicPr>
                         <pic:blipFill>
-                          <a:blip r:embed="rId27" cstate="print">
+                          <a:blip r:embed="rId28" cstate="print">
                             <a:extLst>
                               <a:ext uri="{28A0092B-C50C-407E-A947-70E740481C1C}">
                                 <a14:useLocalDpi xmlns:a14="http://schemas.microsoft.com/office/drawing/2010/main" val="0"/>
@@ -15000,7 +15134,7 @@
                           </pic:cNvPicPr>
                         </pic:nvPicPr>
                         <pic:blipFill>
-                          <a:blip r:embed="rId27" cstate="print">
+                          <a:blip r:embed="rId28" cstate="print">
                             <a:extLst>
                               <a:ext uri="{28A0092B-C50C-407E-A947-70E740481C1C}">
                                 <a14:useLocalDpi xmlns:a14="http://schemas.microsoft.com/office/drawing/2010/main" val="0"/>
@@ -15272,7 +15406,7 @@
                           </pic:cNvPicPr>
                         </pic:nvPicPr>
                         <pic:blipFill>
-                          <a:blip r:embed="rId27" cstate="print">
+                          <a:blip r:embed="rId28" cstate="print">
                             <a:extLst>
                               <a:ext uri="{28A0092B-C50C-407E-A947-70E740481C1C}">
                                 <a14:useLocalDpi xmlns:a14="http://schemas.microsoft.com/office/drawing/2010/main" val="0"/>
@@ -16017,7 +16151,7 @@
                           </pic:cNvPicPr>
                         </pic:nvPicPr>
                         <pic:blipFill>
-                          <a:blip r:embed="rId27" cstate="print">
+                          <a:blip r:embed="rId28" cstate="print">
                             <a:extLst>
                               <a:ext uri="{28A0092B-C50C-407E-A947-70E740481C1C}">
                                 <a14:useLocalDpi xmlns:a14="http://schemas.microsoft.com/office/drawing/2010/main" val="0"/>
@@ -16281,7 +16415,7 @@
                           </pic:cNvPicPr>
                         </pic:nvPicPr>
                         <pic:blipFill>
-                          <a:blip r:embed="rId27" cstate="print">
+                          <a:blip r:embed="rId28" cstate="print">
                             <a:extLst>
                               <a:ext uri="{28A0092B-C50C-407E-A947-70E740481C1C}">
                                 <a14:useLocalDpi xmlns:a14="http://schemas.microsoft.com/office/drawing/2010/main" val="0"/>
@@ -16858,7 +16992,7 @@
                           </pic:cNvPicPr>
                         </pic:nvPicPr>
                         <pic:blipFill>
-                          <a:blip r:embed="rId27" cstate="print">
+                          <a:blip r:embed="rId28" cstate="print">
                             <a:extLst>
                               <a:ext uri="{28A0092B-C50C-407E-A947-70E740481C1C}">
                                 <a14:useLocalDpi xmlns:a14="http://schemas.microsoft.com/office/drawing/2010/main" val="0"/>
@@ -17454,7 +17588,7 @@
                           </pic:cNvPicPr>
                         </pic:nvPicPr>
                         <pic:blipFill>
-                          <a:blip r:embed="rId27" cstate="print">
+                          <a:blip r:embed="rId28" cstate="print">
                             <a:extLst>
                               <a:ext uri="{28A0092B-C50C-407E-A947-70E740481C1C}">
                                 <a14:useLocalDpi xmlns:a14="http://schemas.microsoft.com/office/drawing/2010/main" val="0"/>
@@ -21624,7 +21758,7 @@
                     </pic:cNvPicPr>
                   </pic:nvPicPr>
                   <pic:blipFill>
-                    <a:blip r:embed="rId28" cstate="print">
+                    <a:blip r:embed="rId29" cstate="print">
                       <a:extLst>
                         <a:ext uri="{28A0092B-C50C-407E-A947-70E740481C1C}">
                           <a14:useLocalDpi xmlns:a14="http://schemas.microsoft.com/office/drawing/2010/main" val="0"/>
@@ -21739,7 +21873,7 @@
                     </pic:cNvPicPr>
                   </pic:nvPicPr>
                   <pic:blipFill>
-                    <a:blip r:embed="rId29" cstate="print">
+                    <a:blip r:embed="rId30" cstate="print">
                       <a:extLst>
                         <a:ext uri="{28A0092B-C50C-407E-A947-70E740481C1C}">
                           <a14:useLocalDpi xmlns:a14="http://schemas.microsoft.com/office/drawing/2010/main" val="0"/>
@@ -21920,7 +22054,7 @@
                     </pic:cNvPicPr>
                   </pic:nvPicPr>
                   <pic:blipFill>
-                    <a:blip r:embed="rId30">
+                    <a:blip r:embed="rId31">
                       <a:extLst>
                         <a:ext uri="{28A0092B-C50C-407E-A947-70E740481C1C}">
                           <a14:useLocalDpi xmlns:a14="http://schemas.microsoft.com/office/drawing/2010/main" val="0"/>
@@ -22034,7 +22168,7 @@
                     </pic:cNvPicPr>
                   </pic:nvPicPr>
                   <pic:blipFill>
-                    <a:blip r:embed="rId31">
+                    <a:blip r:embed="rId32">
                       <a:extLst>
                         <a:ext uri="{28A0092B-C50C-407E-A947-70E740481C1C}">
                           <a14:useLocalDpi xmlns:a14="http://schemas.microsoft.com/office/drawing/2010/main" val="0"/>
@@ -22169,7 +22303,7 @@
                     </pic:cNvPicPr>
                   </pic:nvPicPr>
                   <pic:blipFill>
-                    <a:blip r:embed="rId32">
+                    <a:blip r:embed="rId33">
                       <a:extLst>
                         <a:ext uri="{28A0092B-C50C-407E-A947-70E740481C1C}">
                           <a14:useLocalDpi xmlns:a14="http://schemas.microsoft.com/office/drawing/2010/main" val="0"/>
@@ -22342,7 +22476,7 @@
                     </pic:cNvPicPr>
                   </pic:nvPicPr>
                   <pic:blipFill>
-                    <a:blip r:embed="rId33">
+                    <a:blip r:embed="rId34">
                       <a:extLst>
                         <a:ext uri="{28A0092B-C50C-407E-A947-70E740481C1C}">
                           <a14:useLocalDpi xmlns:a14="http://schemas.microsoft.com/office/drawing/2010/main" val="0"/>
@@ -22588,7 +22722,7 @@
                     </pic:cNvPicPr>
                   </pic:nvPicPr>
                   <pic:blipFill>
-                    <a:blip r:embed="rId34">
+                    <a:blip r:embed="rId35">
                       <a:extLst>
                         <a:ext uri="{28A0092B-C50C-407E-A947-70E740481C1C}">
                           <a14:useLocalDpi xmlns:a14="http://schemas.microsoft.com/office/drawing/2010/main" val="0"/>
@@ -22734,7 +22868,7 @@
                     </pic:cNvPicPr>
                   </pic:nvPicPr>
                   <pic:blipFill>
-                    <a:blip r:embed="rId35">
+                    <a:blip r:embed="rId36">
                       <a:extLst>
                         <a:ext uri="{28A0092B-C50C-407E-A947-70E740481C1C}">
                           <a14:useLocalDpi xmlns:a14="http://schemas.microsoft.com/office/drawing/2010/main" val="0"/>
@@ -22854,7 +22988,7 @@
                     </pic:cNvPicPr>
                   </pic:nvPicPr>
                   <pic:blipFill>
-                    <a:blip r:embed="rId36">
+                    <a:blip r:embed="rId37">
                       <a:extLst>
                         <a:ext uri="{28A0092B-C50C-407E-A947-70E740481C1C}">
                           <a14:useLocalDpi xmlns:a14="http://schemas.microsoft.com/office/drawing/2010/main" val="0"/>
@@ -22917,7 +23051,21 @@
           <w:rFonts w:hint="cs"/>
           <w:rtl/>
         </w:rPr>
-        <w:t>אבני הדאך במהלך תהליך השגת רישיון הנהיגה.</w:t>
+        <w:t>אבני הד</w:t>
+      </w:r>
+      <w:r>
+        <w:rPr>
+          <w:rFonts w:hint="cs"/>
+          <w:rtl/>
+        </w:rPr>
+        <w:t>ר</w:t>
+      </w:r>
+      <w:r>
+        <w:rPr>
+          <w:rFonts w:hint="cs"/>
+          <w:rtl/>
+        </w:rPr>
+        <w:t>ך במהלך תהליך השגת רישיון הנהיגה.</w:t>
       </w:r>
     </w:p>
     <w:p>
@@ -22990,7 +23138,7 @@
                     </pic:cNvPicPr>
                   </pic:nvPicPr>
                   <pic:blipFill>
-                    <a:blip r:embed="rId37">
+                    <a:blip r:embed="rId38">
                       <a:extLst>
                         <a:ext uri="{28A0092B-C50C-407E-A947-70E740481C1C}">
                           <a14:useLocalDpi xmlns:a14="http://schemas.microsoft.com/office/drawing/2010/main" val="0"/>
@@ -23144,7 +23292,7 @@
                     </pic:cNvPicPr>
                   </pic:nvPicPr>
                   <pic:blipFill>
-                    <a:blip r:embed="rId38" cstate="print">
+                    <a:blip r:embed="rId39" cstate="print">
                       <a:extLst>
                         <a:ext uri="{28A0092B-C50C-407E-A947-70E740481C1C}">
                           <a14:useLocalDpi xmlns:a14="http://schemas.microsoft.com/office/drawing/2010/main" val="0"/>
@@ -23332,7 +23480,7 @@
                     </pic:cNvPicPr>
                   </pic:nvPicPr>
                   <pic:blipFill>
-                    <a:blip r:embed="rId39">
+                    <a:blip r:embed="rId40">
                       <a:extLst>
                         <a:ext uri="{28A0092B-C50C-407E-A947-70E740481C1C}">
                           <a14:useLocalDpi xmlns:a14="http://schemas.microsoft.com/office/drawing/2010/main" val="0"/>
@@ -23456,7 +23604,7 @@
                     </pic:cNvPicPr>
                   </pic:nvPicPr>
                   <pic:blipFill>
-                    <a:blip r:embed="rId40">
+                    <a:blip r:embed="rId41">
                       <a:extLst>
                         <a:ext uri="{28A0092B-C50C-407E-A947-70E740481C1C}">
                           <a14:useLocalDpi xmlns:a14="http://schemas.microsoft.com/office/drawing/2010/main" val="0"/>
@@ -23588,7 +23736,7 @@
                     </pic:cNvPicPr>
                   </pic:nvPicPr>
                   <pic:blipFill>
-                    <a:blip r:embed="rId41">
+                    <a:blip r:embed="rId42">
                       <a:extLst>
                         <a:ext uri="{28A0092B-C50C-407E-A947-70E740481C1C}">
                           <a14:useLocalDpi xmlns:a14="http://schemas.microsoft.com/office/drawing/2010/main" val="0"/>
@@ -23728,106 +23876,15 @@
         <w:spacing w:line="276" w:lineRule="auto"/>
         <w:rPr>
           <w:rFonts w:ascii="David" w:hAnsi="David"/>
-          <w:color w:val="0000FF"/>
-          <w:rtl/>
-        </w:rPr>
-      </w:pPr>
-      <w:r>
-        <w:rPr>
-          <w:rFonts w:ascii="David" w:hAnsi="David"/>
-          <w:color w:val="0000FF"/>
-          <w:rtl/>
-        </w:rPr>
-        <w:t>פירוט ההרשאות שהאפליקציה דורשת והסבר על כל הרשאה.</w:t>
-      </w:r>
-    </w:p>
-    <w:p>
-      <w:pPr>
-        <w:spacing w:line="276" w:lineRule="auto"/>
-        <w:rPr>
-          <w:rFonts w:ascii="David" w:hAnsi="David"/>
-          <w:color w:val="0000FF"/>
-          <w:rtl/>
-        </w:rPr>
-      </w:pPr>
-      <w:r>
-        <w:rPr>
-          <w:rFonts w:ascii="David" w:hAnsi="David"/>
-          <w:color w:val="0000FF"/>
-          <w:rtl/>
-        </w:rPr>
-        <w:t>העתיקו מה-</w:t>
-      </w:r>
-      <w:proofErr w:type="spellStart"/>
-      <w:r>
-        <w:rPr>
-          <w:rFonts w:ascii="David" w:hAnsi="David"/>
-          <w:color w:val="0000FF"/>
-        </w:rPr>
-        <w:t>AndroidManifest</w:t>
-      </w:r>
-      <w:proofErr w:type="spellEnd"/>
-      <w:r>
-        <w:rPr>
-          <w:rFonts w:ascii="David" w:hAnsi="David"/>
-          <w:color w:val="0000FF"/>
-          <w:rtl/>
-        </w:rPr>
-        <w:t xml:space="preserve"> את השמות והסבירו מה כל אחד עושה.</w:t>
-      </w:r>
-    </w:p>
-    <w:p>
-      <w:pPr>
-        <w:spacing w:line="276" w:lineRule="auto"/>
-        <w:rPr>
-          <w:rFonts w:ascii="David" w:hAnsi="David"/>
-          <w:color w:val="0000FF"/>
-          <w:rtl/>
-        </w:rPr>
-      </w:pPr>
-      <w:r>
-        <w:rPr>
-          <w:rFonts w:ascii="David" w:hAnsi="David"/>
-          <w:color w:val="0000FF"/>
-          <w:rtl/>
-        </w:rPr>
-        <w:t xml:space="preserve">דוגמא: </w:t>
-      </w:r>
-    </w:p>
-    <w:p>
-      <w:pPr>
-        <w:spacing w:line="276" w:lineRule="auto"/>
-        <w:rPr>
-          <w:rFonts w:ascii="David" w:hAnsi="David"/>
-          <w:color w:val="0000FF"/>
-          <w:rtl/>
-        </w:rPr>
-      </w:pPr>
-      <w:proofErr w:type="spellStart"/>
-      <w:proofErr w:type="gramStart"/>
-      <w:r>
-        <w:rPr>
-          <w:rFonts w:ascii="David" w:hAnsi="David"/>
-          <w:color w:val="0000FF"/>
-        </w:rPr>
-        <w:t>android.permission</w:t>
-      </w:r>
-      <w:proofErr w:type="gramEnd"/>
-      <w:r>
-        <w:rPr>
-          <w:rFonts w:ascii="David" w:hAnsi="David"/>
-          <w:color w:val="0000FF"/>
-        </w:rPr>
-        <w:t>.VIBRATE</w:t>
-      </w:r>
-      <w:proofErr w:type="spellEnd"/>
-      <w:r>
-        <w:rPr>
-          <w:rFonts w:ascii="David" w:hAnsi="David"/>
-          <w:color w:val="0000FF"/>
-          <w:rtl/>
-        </w:rPr>
-        <w:t xml:space="preserve"> – נדרשת כדי לאפשר שימוש ברטט במכשיר.</w:t>
+          <w:rtl/>
+        </w:rPr>
+      </w:pPr>
+      <w:r>
+        <w:rPr>
+          <w:rFonts w:ascii="David" w:hAnsi="David" w:hint="cs"/>
+          <w:rtl/>
+        </w:rPr>
+        <w:t>אין הרשאות מיוחדות על מנת שהאפליקציה תוכל לרוץ/לעבוד באופן חלק/בכלל.</w:t>
       </w:r>
     </w:p>
     <w:p>
@@ -24017,7 +24074,6 @@
         <w:spacing w:line="276" w:lineRule="auto"/>
         <w:rPr>
           <w:rFonts w:ascii="David" w:hAnsi="David" w:cs="David"/>
-          <w:rtl/>
         </w:rPr>
       </w:pPr>
       <w:bookmarkStart w:id="56" w:name="_Toc29994013"/>
@@ -24054,119 +24110,19 @@
     </w:p>
     <w:p>
       <w:pPr>
-        <w:spacing w:line="276" w:lineRule="auto"/>
-        <w:rPr>
-          <w:rFonts w:ascii="David" w:hAnsi="David"/>
-          <w:color w:val="0000FF"/>
-          <w:rtl/>
-        </w:rPr>
-      </w:pPr>
-      <w:r>
-        <w:rPr>
-          <w:rFonts w:ascii="David" w:hAnsi="David"/>
-          <w:color w:val="0000FF"/>
-          <w:rtl/>
-        </w:rPr>
-        <w:t xml:space="preserve">מהי </w:t>
-      </w:r>
-      <w:proofErr w:type="spellStart"/>
-      <w:r>
-        <w:rPr>
-          <w:rFonts w:ascii="David" w:hAnsi="David"/>
-          <w:color w:val="0000FF"/>
-          <w:rtl/>
-        </w:rPr>
-        <w:t>גירסת</w:t>
-      </w:r>
-      <w:proofErr w:type="spellEnd"/>
-      <w:r>
-        <w:rPr>
-          <w:rFonts w:ascii="David" w:hAnsi="David"/>
-          <w:color w:val="0000FF"/>
-          <w:rtl/>
-        </w:rPr>
-        <w:t xml:space="preserve"> </w:t>
-      </w:r>
-      <w:r>
-        <w:rPr>
-          <w:rFonts w:ascii="David" w:hAnsi="David"/>
-          <w:color w:val="0000FF"/>
-        </w:rPr>
-        <w:t>Android</w:t>
-      </w:r>
-      <w:r>
-        <w:rPr>
-          <w:rFonts w:ascii="David" w:hAnsi="David"/>
-          <w:color w:val="0000FF"/>
-          <w:rtl/>
-        </w:rPr>
-        <w:t xml:space="preserve"> המינימלית שנדרשת כדי להריץ את האפליקציה?</w:t>
-      </w:r>
-    </w:p>
-    <w:p>
-      <w:pPr>
-        <w:spacing w:line="276" w:lineRule="auto"/>
-        <w:rPr>
-          <w:rFonts w:ascii="David" w:hAnsi="David"/>
-          <w:color w:val="0000FF"/>
-          <w:rtl/>
-        </w:rPr>
-      </w:pPr>
-      <w:r>
-        <w:rPr>
-          <w:rFonts w:ascii="David" w:hAnsi="David"/>
-          <w:color w:val="0000FF"/>
-          <w:rtl/>
-        </w:rPr>
-        <w:t xml:space="preserve">לדוגמא: </w:t>
-      </w:r>
-      <w:r>
-        <w:rPr>
-          <w:rFonts w:ascii="David" w:hAnsi="David"/>
-          <w:color w:val="0000FF"/>
-        </w:rPr>
-        <w:t>Android 4.4.2</w:t>
-      </w:r>
-      <w:r>
-        <w:rPr>
-          <w:rFonts w:ascii="David" w:hAnsi="David"/>
-          <w:color w:val="0000FF"/>
-          <w:rtl/>
-        </w:rPr>
-        <w:t xml:space="preserve"> </w:t>
-      </w:r>
-      <w:proofErr w:type="spellStart"/>
-      <w:r>
-        <w:rPr>
-          <w:rFonts w:ascii="David" w:hAnsi="David"/>
-          <w:color w:val="0000FF"/>
-          <w:rtl/>
-        </w:rPr>
-        <w:t>גירסת</w:t>
-      </w:r>
-      <w:proofErr w:type="spellEnd"/>
-      <w:r>
-        <w:rPr>
-          <w:rFonts w:ascii="David" w:hAnsi="David"/>
-          <w:color w:val="0000FF"/>
-          <w:rtl/>
-        </w:rPr>
-        <w:t xml:space="preserve"> </w:t>
-      </w:r>
-      <w:r>
-        <w:rPr>
-          <w:rFonts w:ascii="David" w:hAnsi="David"/>
-          <w:color w:val="0000FF"/>
-        </w:rPr>
-        <w:t xml:space="preserve">API </w:t>
-      </w:r>
-      <w:r>
-        <w:rPr>
-          <w:rFonts w:ascii="David" w:hAnsi="David"/>
-          <w:color w:val="0000FF"/>
-          <w:rtl/>
-        </w:rPr>
-        <w:t xml:space="preserve">  19  </w:t>
+        <w:rPr>
+          <w:rFonts w:hint="cs"/>
+          <w:sz w:val="24"/>
+          <w:szCs w:val="28"/>
+          <w:rtl/>
+        </w:rPr>
+      </w:pPr>
+      <w:r>
+        <w:rPr>
+          <w:sz w:val="24"/>
+          <w:szCs w:val="28"/>
+        </w:rPr>
+        <w:t>Android 5.0 (API Level 21 – Lollipop)</w:t>
       </w:r>
     </w:p>
     <w:p>
@@ -24378,6 +24334,70 @@
           <w:rtl/>
         </w:rPr>
         <w:t xml:space="preserve"> 17</w:t>
+      </w:r>
+    </w:p>
+    <w:p>
+      <w:pPr>
+        <w:spacing w:line="276" w:lineRule="auto"/>
+        <w:rPr>
+          <w:rFonts w:ascii="David" w:hAnsi="David" w:hint="cs"/>
+          <w:rtl/>
+        </w:rPr>
+      </w:pPr>
+      <w:proofErr w:type="spellStart"/>
+      <w:r>
+        <w:rPr>
+          <w:rFonts w:ascii="David" w:hAnsi="David" w:hint="cs"/>
+          <w:rtl/>
+        </w:rPr>
+        <w:t>אימולטור</w:t>
+      </w:r>
+      <w:proofErr w:type="spellEnd"/>
+      <w:r>
+        <w:rPr>
+          <w:rFonts w:ascii="David" w:hAnsi="David" w:hint="cs"/>
+          <w:rtl/>
+        </w:rPr>
+        <w:t xml:space="preserve"> </w:t>
+      </w:r>
+      <w:r>
+        <w:rPr>
+          <w:rFonts w:ascii="David" w:hAnsi="David"/>
+        </w:rPr>
+        <w:t>Android Accelerator X64</w:t>
+      </w:r>
+      <w:r>
+        <w:rPr>
+          <w:rFonts w:ascii="David" w:hAnsi="David" w:hint="cs"/>
+          <w:rtl/>
+        </w:rPr>
+        <w:t xml:space="preserve"> המריץ </w:t>
+      </w:r>
+      <w:r>
+        <w:rPr>
+          <w:rFonts w:ascii="David" w:hAnsi="David"/>
+        </w:rPr>
+        <w:t>Android 5.0</w:t>
+      </w:r>
+      <w:r>
+        <w:rPr>
+          <w:rFonts w:ascii="David" w:hAnsi="David" w:hint="cs"/>
+          <w:rtl/>
+        </w:rPr>
+        <w:t xml:space="preserve"> גרסת </w:t>
+      </w:r>
+      <w:r>
+        <w:rPr>
+          <w:rFonts w:ascii="David" w:hAnsi="David"/>
+        </w:rPr>
+        <w:t>API</w:t>
+      </w:r>
+      <w:r>
+        <w:rPr>
+          <w:rFonts w:ascii="David" w:hAnsi="David" w:hint="cs"/>
+          <w:rtl/>
+        </w:rPr>
+        <w:t xml:space="preserve"> 18.</w:t>
       </w:r>
     </w:p>
     <w:p>
@@ -24755,7 +24775,6 @@
     </w:p>
     <w:p>
       <w:pPr>
-        <w:jc w:val="left"/>
         <w:rPr>
           <w:rFonts w:ascii="David" w:hAnsi="David"/>
           <w:sz w:val="24"/>
@@ -24766,19 +24785,22 @@
         <w:br/>
       </w:r>
       <w:r>
+        <w:br/>
+      </w:r>
+      <w:r>
         <w:rPr>
           <w:rFonts w:ascii="David" w:hAnsi="David"/>
           <w:sz w:val="24"/>
           <w:rtl/>
         </w:rPr>
-        <w:t>הייתה מאתגרת הייתי צריך ללמוד</w:t>
+        <w:t>העבודה על הפרויקט לא הייתה קלה היא דרשה ממני להשקיע הרבה זמן והרבה כוח</w:t>
       </w:r>
       <w:r>
         <w:rPr>
           <w:rFonts w:ascii="David" w:hAnsi="David"/>
           <w:sz w:val="24"/>
         </w:rPr>
-        <w:t xml:space="preserve"> Unity </w:t>
+        <w:t xml:space="preserve">. </w:t>
       </w:r>
       <w:r>
         <w:rPr>
@@ -24786,7 +24808,7 @@
           <w:sz w:val="24"/>
           <w:rtl/>
         </w:rPr>
-        <w:t>ברמה שאוכל ליצור משחק ורק בעזרת האינטרנט ועזרה מחברים היו מספר קשיים בדרך שעקבו אותי עם ההתקדמות ובחלק מהם לא הייתה שום תשובה או פתרון באינטרנט לכן הייתי צריך לחקור דברים בעצמי ולהבין איך דברים עובדים ולחפש דברים שמזכירים את הבעיות באינטרנט עד שהצלחתי לפתור את חלקם או "לעקוף" אותם לדוגמה הסרבר היה בהתחלה די בעייתי אבל אחרי שהבנתי איך הוא עובד ומה עושים ואיך עושים זה נהיה הרבה יותר פשוט ומובן וברור וזה גם נותן הרגשה טובה כשאתה מצליח לפתור בעיה שהייתה לך בפרויקט</w:t>
+        <w:t>היו מלא מצבים בהם לא ידעתי מה לעשות ומצאתי את עצמי מחפש שעות באינטרנט על מנת למצוא פתרון מסוים</w:t>
       </w:r>
       <w:r>
         <w:rPr>
@@ -24801,7 +24823,7 @@
           <w:sz w:val="24"/>
           <w:rtl/>
         </w:rPr>
-        <w:t>בנוסף לכך אפשר לראות את המשחק שיצרתי לא רק בתוכנה אלא גם חשיבה יצירתית ולחשוב מחוץ לקופסה ופתרון בעיות בצורה יצירתית מה שנמצא גם בכל בעיה או מכשול בחיינו ולא רק בעולם התוכנה</w:t>
+        <w:t>בעקבות הפרויקט אני קיבלתי הרבה דברים – למדתי איך לארגן את הזמן שלי, הבנתי מה עליי לעשות כאשר אני נתקע בבעיה, למדתי איך להתמודד עם אתגרים, הבנתי איך עליי לייעל את האלגוריתם שלי על מנת שיהיה מובן וחכם</w:t>
       </w:r>
       <w:r>
         <w:rPr>
@@ -24816,13 +24838,28 @@
           <w:sz w:val="24"/>
           <w:rtl/>
         </w:rPr>
-        <w:t>וכמובן למרות שהקשיים יכולים להיות מאוד מתישים ובעיתיים לא וויתרתי וישבתי שעות כדי לפתור את הבעיות השונות שהיו וזה היה שווה את זה וההרגשה בסוף, ההרגשה של "סיימתי את הפרויקט" זה משמח וממלא אותי באושר</w:t>
+        <w:t>האתגר העיקרי ביותר באפליקציה היה תהליך קביעת השיעור אך הבאתי לבעיה זו מענה בכך שפתחתי את הקלאס</w:t>
       </w:r>
       <w:r>
         <w:rPr>
           <w:rFonts w:ascii="David" w:hAnsi="David"/>
           <w:sz w:val="24"/>
         </w:rPr>
+        <w:t xml:space="preserve"> schedule </w:t>
+      </w:r>
+      <w:r>
+        <w:rPr>
+          <w:rFonts w:ascii="David" w:hAnsi="David"/>
+          <w:sz w:val="24"/>
+          <w:rtl/>
+        </w:rPr>
+        <w:t>קלאס זה הוא לוח הזמנים של המורה וכך יכולתי להציג לתלמיד את השעות הנכונות בהן המורה עובד וכאשר אין לו שיעור</w:t>
+      </w:r>
+      <w:r>
+        <w:rPr>
+          <w:rFonts w:ascii="David" w:hAnsi="David"/>
+          <w:sz w:val="24"/>
+        </w:rPr>
         <w:t xml:space="preserve">. </w:t>
       </w:r>
       <w:r>
@@ -24831,14 +24868,70 @@
           <w:sz w:val="24"/>
           <w:rtl/>
         </w:rPr>
-        <w:t>בסופו של דבר אני שמח שעשיתי את הפרויקט ואני שמח שהצלחתי לסיים בזמן</w:t>
+        <w:t>אם הייתי מתחיל את הפרויקט שלי היום הייתי אומר שעליי להשקיע יותר בתיק הפרויקט אשר עשיתי בתחילת הדרך</w:t>
       </w:r>
       <w:r>
         <w:rPr>
           <w:rFonts w:ascii="David" w:hAnsi="David"/>
           <w:sz w:val="24"/>
         </w:rPr>
-        <w:t>.</w:t>
+        <w:t xml:space="preserve">. </w:t>
+      </w:r>
+      <w:r>
+        <w:rPr>
+          <w:rFonts w:ascii="David" w:hAnsi="David"/>
+          <w:sz w:val="24"/>
+          <w:rtl/>
+        </w:rPr>
+        <w:t>ברגע שהייתי משקיע בתיק הפרויקט יותר ככה הייתי מגיע לאפליקציה שלי מוכן יותר וממוקד במטרה</w:t>
+      </w:r>
+      <w:r>
+        <w:rPr>
+          <w:rFonts w:ascii="David" w:hAnsi="David"/>
+          <w:sz w:val="24"/>
+        </w:rPr>
+        <w:t xml:space="preserve">. </w:t>
+      </w:r>
+      <w:r>
+        <w:rPr>
+          <w:rFonts w:ascii="David" w:hAnsi="David"/>
+          <w:sz w:val="24"/>
+          <w:rtl/>
+        </w:rPr>
+        <w:t xml:space="preserve">בתחילת הפרויקט נתקלתי במלא בעיות וכל הזמן </w:t>
+      </w:r>
+      <w:proofErr w:type="spellStart"/>
+      <w:r>
+        <w:rPr>
+          <w:rFonts w:ascii="David" w:hAnsi="David"/>
+          <w:sz w:val="24"/>
+          <w:rtl/>
+        </w:rPr>
+        <w:t>התפזרתי</w:t>
+      </w:r>
+      <w:proofErr w:type="spellEnd"/>
+      <w:r>
+        <w:rPr>
+          <w:rFonts w:ascii="David" w:hAnsi="David"/>
+          <w:sz w:val="24"/>
+          <w:rtl/>
+        </w:rPr>
+        <w:t xml:space="preserve"> אך אורי המורה שלי כל הזמן דאג לעזור לי ולמקד אותי</w:t>
+      </w:r>
+      <w:r>
+        <w:rPr>
+          <w:rFonts w:ascii="David" w:hAnsi="David"/>
+          <w:sz w:val="24"/>
+        </w:rPr>
+        <w:t xml:space="preserve">. </w:t>
+      </w:r>
+      <w:r>
+        <w:rPr>
+          <w:rFonts w:ascii="David" w:hAnsi="David"/>
+          <w:sz w:val="24"/>
+          <w:rtl/>
+        </w:rPr>
+        <w:t>בנוסף אם הייתי יודע איך לנהל את הזמן שלי בצורה טובה יותר היה עליי הרבה פחות לחץ וכך הייתי עובד בצורה יעילה יותר עם ראש נקי.</w:t>
       </w:r>
     </w:p>
     <w:p>
@@ -24863,16 +24956,14 @@
         </w:rPr>
       </w:pPr>
       <w:bookmarkStart w:id="59" w:name="_Toc39329438"/>
-      <w:proofErr w:type="spellStart"/>
       <w:r>
         <w:rPr>
           <w:rFonts w:ascii="David" w:hAnsi="David" w:cs="David"/>
           <w:rtl/>
         </w:rPr>
-        <w:t>ביבליוגראפיה</w:t>
+        <w:t>ביבליוגרפיה</w:t>
       </w:r>
       <w:bookmarkEnd w:id="59"/>
-      <w:proofErr w:type="spellEnd"/>
     </w:p>
     <w:p>
       <w:pPr>
@@ -25138,210 +25229,9 @@
         </w:rPr>
       </w:pPr>
     </w:p>
-    <w:p>
-      <w:pPr>
-        <w:spacing w:line="276" w:lineRule="auto"/>
-        <w:jc w:val="left"/>
-        <w:rPr>
-          <w:rFonts w:ascii="David" w:hAnsi="David"/>
-          <w:color w:val="0000FF"/>
-          <w:rtl/>
-        </w:rPr>
-      </w:pPr>
-    </w:p>
-    <w:p>
-      <w:pPr>
-        <w:spacing w:line="276" w:lineRule="auto"/>
-        <w:jc w:val="left"/>
-        <w:rPr>
-          <w:rFonts w:ascii="David" w:hAnsi="David"/>
-          <w:color w:val="0000FF"/>
-          <w:rtl/>
-        </w:rPr>
-      </w:pPr>
-    </w:p>
-    <w:p>
-      <w:pPr>
-        <w:pStyle w:val="2"/>
-        <w:spacing w:line="276" w:lineRule="auto"/>
-        <w:rPr>
-          <w:rFonts w:ascii="David" w:hAnsi="David" w:cs="David"/>
-          <w:i w:val="0"/>
-          <w:iCs w:val="0"/>
-          <w:rtl/>
-        </w:rPr>
-      </w:pPr>
-      <w:bookmarkStart w:id="64" w:name="_Toc39329441"/>
-      <w:r>
-        <w:rPr>
-          <w:rFonts w:ascii="David" w:hAnsi="David" w:cs="David"/>
-          <w:i w:val="0"/>
-          <w:iCs w:val="0"/>
-          <w:rtl/>
-        </w:rPr>
-        <w:t>מסמכים נוספים</w:t>
-      </w:r>
-      <w:bookmarkEnd w:id="64"/>
-    </w:p>
-    <w:p>
-      <w:pPr>
-        <w:spacing w:line="276" w:lineRule="auto"/>
-        <w:rPr>
-          <w:rFonts w:ascii="David" w:hAnsi="David"/>
-          <w:color w:val="0000FF"/>
-          <w:rtl/>
-        </w:rPr>
-      </w:pPr>
-      <w:r>
-        <w:rPr>
-          <w:rFonts w:ascii="David" w:hAnsi="David"/>
-          <w:color w:val="0000FF"/>
-          <w:rtl/>
-        </w:rPr>
-        <w:t>כל מסמך שכתבתם, או מצאתם במקור מידע כל שהוא שעזר לכם:</w:t>
-      </w:r>
-    </w:p>
-    <w:p>
-      <w:pPr>
-        <w:pStyle w:val="af0"/>
-        <w:numPr>
-          <w:ilvl w:val="0"/>
-          <w:numId w:val="6"/>
-        </w:numPr>
-        <w:spacing w:line="276" w:lineRule="auto"/>
-        <w:rPr>
-          <w:rFonts w:ascii="David" w:hAnsi="David"/>
-          <w:color w:val="0000FF"/>
-        </w:rPr>
-      </w:pPr>
-      <w:r>
-        <w:rPr>
-          <w:rFonts w:ascii="David" w:hAnsi="David"/>
-          <w:color w:val="0000FF"/>
-          <w:rtl/>
-        </w:rPr>
-        <w:t xml:space="preserve"> בגיבוש הרעיון.</w:t>
-      </w:r>
-    </w:p>
-    <w:p>
-      <w:pPr>
-        <w:pStyle w:val="af0"/>
-        <w:numPr>
-          <w:ilvl w:val="0"/>
-          <w:numId w:val="6"/>
-        </w:numPr>
-        <w:spacing w:line="276" w:lineRule="auto"/>
-        <w:rPr>
-          <w:rFonts w:ascii="David" w:hAnsi="David"/>
-          <w:color w:val="0000FF"/>
-        </w:rPr>
-      </w:pPr>
-      <w:r>
-        <w:rPr>
-          <w:rFonts w:ascii="David" w:hAnsi="David"/>
-          <w:color w:val="0000FF"/>
-          <w:rtl/>
-        </w:rPr>
-        <w:t>בפיתוח התוכנה.</w:t>
-      </w:r>
-    </w:p>
-    <w:p>
-      <w:pPr>
-        <w:pStyle w:val="af0"/>
-        <w:numPr>
-          <w:ilvl w:val="0"/>
-          <w:numId w:val="6"/>
-        </w:numPr>
-        <w:spacing w:line="276" w:lineRule="auto"/>
-        <w:rPr>
-          <w:rFonts w:ascii="David" w:hAnsi="David"/>
-          <w:color w:val="0000FF"/>
-        </w:rPr>
-      </w:pPr>
-      <w:r>
-        <w:rPr>
-          <w:rFonts w:ascii="David" w:hAnsi="David"/>
-          <w:color w:val="0000FF"/>
-          <w:rtl/>
-        </w:rPr>
-        <w:t>בתיבת הקוד.</w:t>
-      </w:r>
-    </w:p>
-    <w:p>
-      <w:pPr>
-        <w:pStyle w:val="af0"/>
-        <w:numPr>
-          <w:ilvl w:val="0"/>
-          <w:numId w:val="6"/>
-        </w:numPr>
-        <w:spacing w:line="276" w:lineRule="auto"/>
-        <w:rPr>
-          <w:rFonts w:ascii="David" w:hAnsi="David"/>
-          <w:color w:val="0000FF"/>
-        </w:rPr>
-      </w:pPr>
-      <w:r>
-        <w:rPr>
-          <w:rFonts w:ascii="David" w:hAnsi="David"/>
-          <w:color w:val="0000FF"/>
-          <w:rtl/>
-        </w:rPr>
-        <w:t>בבדיקות התקינות.</w:t>
-      </w:r>
-    </w:p>
-    <w:p>
-      <w:pPr>
-        <w:spacing w:line="276" w:lineRule="auto"/>
-        <w:rPr>
-          <w:rFonts w:ascii="David" w:hAnsi="David"/>
-          <w:color w:val="0000FF"/>
-          <w:rtl/>
-        </w:rPr>
-      </w:pPr>
-    </w:p>
-    <w:p>
-      <w:pPr>
-        <w:spacing w:line="276" w:lineRule="auto"/>
-        <w:rPr>
-          <w:rFonts w:ascii="David" w:hAnsi="David"/>
-          <w:color w:val="0000FF"/>
-          <w:rtl/>
-        </w:rPr>
-      </w:pPr>
-      <w:r>
-        <w:rPr>
-          <w:rFonts w:ascii="David" w:hAnsi="David"/>
-          <w:color w:val="0000FF"/>
-          <w:rtl/>
-        </w:rPr>
-        <w:t>חלק זה אופציונאלי</w:t>
-      </w:r>
-    </w:p>
-    <w:p>
-      <w:pPr>
-        <w:spacing w:line="276" w:lineRule="auto"/>
-        <w:jc w:val="left"/>
-        <w:rPr>
-          <w:rFonts w:ascii="David" w:hAnsi="David"/>
-          <w:color w:val="0000FF"/>
-          <w:rtl/>
-        </w:rPr>
-      </w:pPr>
-    </w:p>
-    <w:p>
-      <w:pPr>
-        <w:spacing w:line="276" w:lineRule="auto"/>
-        <w:jc w:val="left"/>
-        <w:rPr>
-          <w:rFonts w:ascii="David" w:hAnsi="David"/>
-          <w:color w:val="0000FF"/>
-          <w:rtl/>
-        </w:rPr>
-      </w:pPr>
-    </w:p>
     <w:sectPr>
-      <w:headerReference w:type="default" r:id="rId42"/>
-      <w:footerReference w:type="default" r:id="rId43"/>
+      <w:headerReference w:type="default" r:id="rId43"/>
+      <w:footerReference w:type="default" r:id="rId44"/>
       <w:endnotePr>
         <w:numFmt w:val="lowerLetter"/>
       </w:endnotePr>
@@ -25389,7 +25279,6 @@
         <w:docPartUnique/>
       </w:docPartObj>
     </w:sdtPr>
-    <w:sdtEndPr/>
     <w:sdtContent>
       <w:sdt>
         <w:sdtPr>
@@ -25402,7 +25291,6 @@
             <w:docPartUnique/>
           </w:docPartObj>
         </w:sdtPr>
-        <w:sdtEndPr/>
         <w:sdtContent>
           <w:p>
             <w:pPr>
@@ -33826,7 +33714,7 @@
 </file>
 
 <file path=customXml/itemProps1.xml><?xml version="1.0" encoding="utf-8"?>
-<ds:datastoreItem xmlns:ds="http://schemas.openxmlformats.org/officeDocument/2006/customXml" ds:itemID="{09BA86E4-36A6-4F96-B400-0543FAD5CF86}">
+<ds:datastoreItem xmlns:ds="http://schemas.openxmlformats.org/officeDocument/2006/customXml" ds:itemID="{1640D331-6B8C-4898-AD8D-811C966CE582}">
   <ds:schemaRefs>
     <ds:schemaRef ds:uri="http://schemas.openxmlformats.org/officeDocument/2006/bibliography"/>
   </ds:schemaRefs>

</xml_diff>

<commit_message>
Added "Reflection" (about the writing and making of the project).
</commit_message>
<xml_diff>
--- a/Driving Lessons Manager.docx
+++ b/Driving Lessons Manager.docx
@@ -13844,7 +13844,6 @@
           <w:rtl/>
         </w:rPr>
       </w:pPr>
-      <w:proofErr w:type="gramStart"/>
       <w:r>
         <w:rPr>
           <w:rFonts w:ascii="David" w:hAnsi="David"/>
@@ -13854,19 +13853,7 @@
           <w:szCs w:val="28"/>
           <w:u w:val="single"/>
         </w:rPr>
-        <w:t>Xamarin.Android.Support.v</w:t>
-      </w:r>
-      <w:proofErr w:type="gramEnd"/>
-      <w:r>
-        <w:rPr>
-          <w:rFonts w:ascii="David" w:hAnsi="David"/>
-          <w:b/>
-          <w:bCs/>
-          <w:sz w:val="28"/>
-          <w:szCs w:val="28"/>
-          <w:u w:val="single"/>
-        </w:rPr>
-        <w:t>7.App</w:t>
+        <w:t>Xamarin.Android.Support.v7.App</w:t>
       </w:r>
     </w:p>
     <w:p>
@@ -23854,7 +23841,7 @@
       <w:pPr>
         <w:pStyle w:val="3"/>
         <w:pageBreakBefore/>
-        <w:spacing w:line="276" w:lineRule="auto"/>
+        <w:spacing w:line="360" w:lineRule="auto"/>
         <w:rPr>
           <w:rFonts w:ascii="David" w:hAnsi="David" w:cs="David"/>
           <w:rtl/>
@@ -23873,7 +23860,7 @@
     </w:p>
     <w:p>
       <w:pPr>
-        <w:spacing w:line="276" w:lineRule="auto"/>
+        <w:spacing w:line="360" w:lineRule="auto"/>
         <w:rPr>
           <w:rFonts w:ascii="David" w:hAnsi="David"/>
           <w:rtl/>
@@ -23889,18 +23876,36 @@
     </w:p>
     <w:p>
       <w:pPr>
-        <w:spacing w:line="276" w:lineRule="auto"/>
-        <w:rPr>
-          <w:rFonts w:ascii="David" w:hAnsi="David"/>
-          <w:color w:val="FF0000"/>
+        <w:spacing w:line="360" w:lineRule="auto"/>
+        <w:rPr>
+          <w:rFonts w:ascii="David" w:hAnsi="David"/>
           <w:rtl/>
         </w:rPr>
       </w:pPr>
     </w:p>
     <w:p>
       <w:pPr>
+        <w:spacing w:line="360" w:lineRule="auto"/>
+        <w:rPr>
+          <w:rFonts w:ascii="David" w:hAnsi="David"/>
+          <w:rtl/>
+        </w:rPr>
+      </w:pPr>
+    </w:p>
+    <w:p>
+      <w:pPr>
+        <w:spacing w:line="360" w:lineRule="auto"/>
+        <w:rPr>
+          <w:rFonts w:ascii="David" w:hAnsi="David"/>
+          <w:color w:val="FF0000"/>
+          <w:rtl/>
+        </w:rPr>
+      </w:pPr>
+    </w:p>
+    <w:p>
+      <w:pPr>
         <w:pStyle w:val="3"/>
-        <w:spacing w:line="276" w:lineRule="auto"/>
+        <w:spacing w:line="360" w:lineRule="auto"/>
         <w:rPr>
           <w:rFonts w:ascii="David" w:hAnsi="David" w:cs="David"/>
           <w:rtl/>
@@ -23920,7 +23925,7 @@
     </w:p>
     <w:p>
       <w:pPr>
-        <w:spacing w:line="276" w:lineRule="auto"/>
+        <w:spacing w:line="360" w:lineRule="auto"/>
         <w:rPr>
           <w:rFonts w:ascii="David" w:hAnsi="David"/>
           <w:color w:val="0000FF"/>
@@ -23986,7 +23991,7 @@
     </w:p>
     <w:p>
       <w:pPr>
-        <w:spacing w:line="276" w:lineRule="auto"/>
+        <w:spacing w:line="360" w:lineRule="auto"/>
         <w:rPr>
           <w:rFonts w:ascii="David" w:hAnsi="David"/>
           <w:color w:val="0000FF"/>
@@ -24070,8 +24075,28 @@
     </w:p>
     <w:p>
       <w:pPr>
+        <w:spacing w:line="360" w:lineRule="auto"/>
+        <w:rPr>
+          <w:rFonts w:ascii="David" w:hAnsi="David"/>
+          <w:color w:val="0000FF"/>
+          <w:rtl/>
+        </w:rPr>
+      </w:pPr>
+    </w:p>
+    <w:p>
+      <w:pPr>
+        <w:spacing w:line="360" w:lineRule="auto"/>
+        <w:rPr>
+          <w:rFonts w:ascii="David" w:hAnsi="David"/>
+          <w:color w:val="0000FF"/>
+          <w:rtl/>
+        </w:rPr>
+      </w:pPr>
+    </w:p>
+    <w:p>
+      <w:pPr>
         <w:pStyle w:val="4"/>
-        <w:spacing w:line="276" w:lineRule="auto"/>
+        <w:spacing w:line="360" w:lineRule="auto"/>
         <w:rPr>
           <w:rFonts w:ascii="David" w:hAnsi="David" w:cs="David"/>
         </w:rPr>
@@ -24110,6 +24135,34 @@
     </w:p>
     <w:p>
       <w:pPr>
+        <w:spacing w:line="360" w:lineRule="auto"/>
+        <w:rPr>
+          <w:sz w:val="24"/>
+          <w:szCs w:val="28"/>
+          <w:rtl/>
+        </w:rPr>
+      </w:pPr>
+      <w:r>
+        <w:rPr>
+          <w:sz w:val="24"/>
+          <w:szCs w:val="28"/>
+        </w:rPr>
+        <w:t>Android 5.0 (API Level 21 – Lollipop)</w:t>
+      </w:r>
+    </w:p>
+    <w:p>
+      <w:pPr>
+        <w:spacing w:line="360" w:lineRule="auto"/>
+        <w:rPr>
+          <w:sz w:val="24"/>
+          <w:szCs w:val="28"/>
+          <w:rtl/>
+        </w:rPr>
+      </w:pPr>
+    </w:p>
+    <w:p>
+      <w:pPr>
+        <w:spacing w:line="360" w:lineRule="auto"/>
         <w:rPr>
           <w:rFonts w:hint="cs"/>
           <w:sz w:val="24"/>
@@ -24117,18 +24170,11 @@
           <w:rtl/>
         </w:rPr>
       </w:pPr>
-      <w:r>
-        <w:rPr>
-          <w:sz w:val="24"/>
-          <w:szCs w:val="28"/>
-        </w:rPr>
-        <w:t>Android 5.0 (API Level 21 – Lollipop)</w:t>
-      </w:r>
     </w:p>
     <w:p>
       <w:pPr>
         <w:pStyle w:val="4"/>
-        <w:spacing w:line="276" w:lineRule="auto"/>
+        <w:spacing w:line="360" w:lineRule="auto"/>
         <w:rPr>
           <w:rFonts w:ascii="David" w:hAnsi="David" w:cs="David"/>
           <w:rtl/>
@@ -24146,68 +24192,125 @@
     </w:p>
     <w:p>
       <w:pPr>
-        <w:spacing w:line="276" w:lineRule="auto"/>
-        <w:rPr>
-          <w:rFonts w:ascii="David" w:hAnsi="David"/>
-          <w:color w:val="0000FF"/>
-          <w:rtl/>
-        </w:rPr>
-      </w:pPr>
-      <w:r>
-        <w:rPr>
-          <w:rFonts w:ascii="David" w:hAnsi="David"/>
-          <w:color w:val="0000FF"/>
-          <w:rtl/>
-        </w:rPr>
-        <w:t xml:space="preserve">ציינו על איזה מכשירים / </w:t>
-      </w:r>
+        <w:spacing w:line="360" w:lineRule="auto"/>
+        <w:rPr>
+          <w:rFonts w:ascii="David" w:hAnsi="David" w:hint="cs"/>
+          <w:sz w:val="24"/>
+          <w:rtl/>
+        </w:rPr>
+      </w:pPr>
       <w:proofErr w:type="spellStart"/>
       <w:r>
         <w:rPr>
-          <w:rFonts w:ascii="David" w:hAnsi="David"/>
-          <w:color w:val="0000FF"/>
-          <w:rtl/>
-        </w:rPr>
-        <w:t>אמולטורים</w:t>
+          <w:rFonts w:ascii="David" w:hAnsi="David" w:hint="cs"/>
+          <w:sz w:val="24"/>
+          <w:rtl/>
+        </w:rPr>
+        <w:t>אימולטור</w:t>
       </w:r>
       <w:proofErr w:type="spellEnd"/>
       <w:r>
         <w:rPr>
-          <w:rFonts w:ascii="David" w:hAnsi="David"/>
-          <w:color w:val="0000FF"/>
-          <w:rtl/>
-        </w:rPr>
-        <w:t xml:space="preserve"> נבדקה המערכת.</w:t>
+          <w:rFonts w:ascii="David" w:hAnsi="David" w:hint="cs"/>
+          <w:sz w:val="24"/>
+          <w:rtl/>
+        </w:rPr>
+        <w:t xml:space="preserve"> </w:t>
+      </w:r>
+      <w:r>
+        <w:rPr>
+          <w:rFonts w:ascii="David" w:hAnsi="David"/>
+          <w:sz w:val="24"/>
+        </w:rPr>
+        <w:t>Android Accelerator X64</w:t>
+      </w:r>
+      <w:r>
+        <w:rPr>
+          <w:rFonts w:ascii="David" w:hAnsi="David" w:hint="cs"/>
+          <w:sz w:val="24"/>
+          <w:rtl/>
+        </w:rPr>
+        <w:t xml:space="preserve"> המריץ </w:t>
+      </w:r>
+      <w:r>
+        <w:rPr>
+          <w:rFonts w:ascii="David" w:hAnsi="David"/>
+          <w:sz w:val="24"/>
+        </w:rPr>
+        <w:t>Android 5.0</w:t>
+      </w:r>
+      <w:r>
+        <w:rPr>
+          <w:rFonts w:ascii="David" w:hAnsi="David" w:hint="cs"/>
+          <w:sz w:val="24"/>
+          <w:rtl/>
+        </w:rPr>
+        <w:t xml:space="preserve"> גרסת </w:t>
+      </w:r>
+      <w:r>
+        <w:rPr>
+          <w:rFonts w:ascii="David" w:hAnsi="David"/>
+          <w:sz w:val="24"/>
+        </w:rPr>
+        <w:t>API</w:t>
+      </w:r>
+      <w:r>
+        <w:rPr>
+          <w:rFonts w:ascii="David" w:hAnsi="David" w:hint="cs"/>
+          <w:sz w:val="24"/>
+          <w:rtl/>
+        </w:rPr>
+        <w:t xml:space="preserve"> </w:t>
+      </w:r>
+      <w:r>
+        <w:rPr>
+          <w:rFonts w:ascii="David" w:hAnsi="David" w:hint="cs"/>
+          <w:sz w:val="24"/>
+          <w:rtl/>
+        </w:rPr>
+        <w:t>21.</w:t>
       </w:r>
     </w:p>
     <w:p>
       <w:pPr>
-        <w:spacing w:line="276" w:lineRule="auto"/>
-        <w:rPr>
-          <w:rFonts w:ascii="David" w:hAnsi="David"/>
-          <w:color w:val="0000FF"/>
-          <w:rtl/>
-        </w:rPr>
-      </w:pPr>
-      <w:r>
-        <w:rPr>
-          <w:rFonts w:ascii="David" w:hAnsi="David"/>
-          <w:color w:val="0000FF"/>
-          <w:rtl/>
-        </w:rPr>
-        <w:t xml:space="preserve">לדוגמא: </w:t>
-      </w:r>
-      <w:r>
-        <w:rPr>
-          <w:rFonts w:ascii="David" w:hAnsi="David"/>
-          <w:color w:val="0000FF"/>
-        </w:rPr>
-        <w:t>LG Nexus 4</w:t>
-      </w:r>
-      <w:r>
-        <w:rPr>
-          <w:rFonts w:ascii="David" w:hAnsi="David"/>
-          <w:color w:val="0000FF"/>
+        <w:spacing w:line="360" w:lineRule="auto"/>
+        <w:rPr>
+          <w:rFonts w:ascii="David" w:hAnsi="David"/>
+          <w:sz w:val="24"/>
+          <w:rtl/>
+        </w:rPr>
+      </w:pPr>
+      <w:proofErr w:type="spellStart"/>
+      <w:r>
+        <w:rPr>
+          <w:rFonts w:ascii="David" w:hAnsi="David" w:hint="cs"/>
+          <w:sz w:val="24"/>
+          <w:rtl/>
+        </w:rPr>
+        <w:t>אימולטור</w:t>
+      </w:r>
+      <w:proofErr w:type="spellEnd"/>
+      <w:r>
+        <w:rPr>
+          <w:rFonts w:ascii="David" w:hAnsi="David" w:hint="cs"/>
+          <w:sz w:val="24"/>
+          <w:rtl/>
+        </w:rPr>
+        <w:t xml:space="preserve"> </w:t>
+      </w:r>
+      <w:proofErr w:type="spellStart"/>
+      <w:r>
+        <w:rPr>
+          <w:rFonts w:ascii="David" w:hAnsi="David"/>
+          <w:sz w:val="24"/>
+        </w:rPr>
+        <w:t>my_emolator</w:t>
+      </w:r>
+      <w:proofErr w:type="spellEnd"/>
+      <w:r>
+        <w:rPr>
+          <w:rFonts w:ascii="David" w:hAnsi="David" w:hint="cs"/>
+          <w:sz w:val="24"/>
           <w:rtl/>
         </w:rPr>
         <w:t xml:space="preserve"> המריץ </w:t>
@@ -24215,200 +24318,81 @@
       <w:r>
         <w:rPr>
           <w:rFonts w:ascii="David" w:hAnsi="David"/>
-          <w:color w:val="0000FF"/>
-        </w:rPr>
-        <w:t>Android 5.0.1</w:t>
-      </w:r>
-      <w:r>
-        <w:rPr>
-          <w:rFonts w:ascii="David" w:hAnsi="David"/>
-          <w:color w:val="0000FF"/>
-          <w:rtl/>
-        </w:rPr>
-        <w:t xml:space="preserve"> </w:t>
+          <w:sz w:val="24"/>
+        </w:rPr>
+        <w:t>Android 7.1</w:t>
+      </w:r>
+      <w:r>
+        <w:rPr>
+          <w:rFonts w:ascii="David" w:hAnsi="David" w:hint="cs"/>
+          <w:sz w:val="24"/>
+          <w:rtl/>
+        </w:rPr>
+        <w:t xml:space="preserve"> המריץ גרסת </w:t>
+      </w:r>
+      <w:r>
+        <w:rPr>
+          <w:rFonts w:ascii="David" w:hAnsi="David"/>
+          <w:sz w:val="24"/>
+        </w:rPr>
+        <w:t>API</w:t>
+      </w:r>
+      <w:r>
+        <w:rPr>
+          <w:rFonts w:ascii="David" w:hAnsi="David" w:hint="cs"/>
+          <w:sz w:val="24"/>
+          <w:rtl/>
+        </w:rPr>
+        <w:t xml:space="preserve"> 25.</w:t>
       </w:r>
     </w:p>
     <w:p>
       <w:pPr>
-        <w:spacing w:line="276" w:lineRule="auto"/>
-        <w:rPr>
-          <w:rFonts w:ascii="David" w:hAnsi="David"/>
-          <w:color w:val="0000FF"/>
-          <w:rtl/>
-        </w:rPr>
-      </w:pPr>
-      <w:proofErr w:type="spellStart"/>
-      <w:r>
-        <w:rPr>
-          <w:rFonts w:ascii="David" w:hAnsi="David"/>
-          <w:color w:val="0000FF"/>
-          <w:rtl/>
-        </w:rPr>
-        <w:t>אמולטור</w:t>
-      </w:r>
-      <w:proofErr w:type="spellEnd"/>
-      <w:r>
-        <w:rPr>
-          <w:rFonts w:ascii="David" w:hAnsi="David"/>
-          <w:color w:val="0000FF"/>
-          <w:rtl/>
-        </w:rPr>
-        <w:t xml:space="preserve"> </w:t>
-      </w:r>
-      <w:proofErr w:type="spellStart"/>
-      <w:r>
-        <w:rPr>
-          <w:rFonts w:ascii="David" w:hAnsi="David"/>
-          <w:color w:val="0000FF"/>
-        </w:rPr>
-        <w:t>GennyMotion</w:t>
-      </w:r>
-      <w:proofErr w:type="spellEnd"/>
-      <w:r>
-        <w:rPr>
-          <w:rFonts w:ascii="David" w:hAnsi="David"/>
-          <w:color w:val="0000FF"/>
-          <w:rtl/>
-        </w:rPr>
-        <w:t xml:space="preserve"> המבצע אמולציה ל-</w:t>
-      </w:r>
-      <w:r>
-        <w:rPr>
-          <w:rFonts w:ascii="David" w:hAnsi="David"/>
-          <w:color w:val="0000FF"/>
-        </w:rPr>
-        <w:t>Samsung Galaxy S3</w:t>
-      </w:r>
-      <w:r>
-        <w:rPr>
-          <w:rFonts w:ascii="David" w:hAnsi="David"/>
-          <w:color w:val="0000FF"/>
-          <w:rtl/>
-        </w:rPr>
-        <w:t xml:space="preserve"> המריץ </w:t>
-      </w:r>
-      <w:r>
-        <w:rPr>
-          <w:rFonts w:ascii="David" w:hAnsi="David"/>
-          <w:color w:val="0000FF"/>
-        </w:rPr>
-        <w:t xml:space="preserve">Android 4.2.2 </w:t>
-      </w:r>
-      <w:r>
-        <w:rPr>
-          <w:rFonts w:ascii="David" w:hAnsi="David"/>
-          <w:color w:val="0000FF"/>
-          <w:rtl/>
-        </w:rPr>
-        <w:t xml:space="preserve"> </w:t>
-      </w:r>
-      <w:proofErr w:type="spellStart"/>
-      <w:r>
-        <w:rPr>
-          <w:rFonts w:ascii="David" w:hAnsi="David"/>
-          <w:color w:val="0000FF"/>
-          <w:rtl/>
-        </w:rPr>
-        <w:t>גירסת</w:t>
-      </w:r>
-      <w:proofErr w:type="spellEnd"/>
-      <w:r>
-        <w:rPr>
-          <w:rFonts w:ascii="David" w:hAnsi="David"/>
-          <w:color w:val="0000FF"/>
-          <w:rtl/>
-        </w:rPr>
-        <w:t xml:space="preserve"> </w:t>
-      </w:r>
-      <w:r>
-        <w:rPr>
-          <w:rFonts w:ascii="David" w:hAnsi="David"/>
-          <w:color w:val="0000FF"/>
-        </w:rPr>
-        <w:t xml:space="preserve">API </w:t>
-      </w:r>
-      <w:r>
-        <w:rPr>
-          <w:rFonts w:ascii="David" w:hAnsi="David"/>
-          <w:color w:val="0000FF"/>
-          <w:rtl/>
-        </w:rPr>
-        <w:t xml:space="preserve"> 17</w:t>
-      </w:r>
-    </w:p>
-    <w:p>
-      <w:pPr>
-        <w:spacing w:line="276" w:lineRule="auto"/>
+        <w:spacing w:line="360" w:lineRule="auto"/>
         <w:rPr>
           <w:rFonts w:ascii="David" w:hAnsi="David" w:hint="cs"/>
-          <w:rtl/>
-        </w:rPr>
-      </w:pPr>
-      <w:proofErr w:type="spellStart"/>
+          <w:sz w:val="24"/>
+          <w:rtl/>
+        </w:rPr>
+      </w:pPr>
       <w:r>
         <w:rPr>
           <w:rFonts w:ascii="David" w:hAnsi="David" w:hint="cs"/>
-          <w:rtl/>
-        </w:rPr>
-        <w:t>אימולטור</w:t>
-      </w:r>
-      <w:proofErr w:type="spellEnd"/>
+          <w:sz w:val="24"/>
+          <w:rtl/>
+        </w:rPr>
+        <w:t xml:space="preserve">טלפון אישי המריץ </w:t>
+      </w:r>
+      <w:r>
+        <w:rPr>
+          <w:rFonts w:ascii="David" w:hAnsi="David"/>
+          <w:sz w:val="24"/>
+        </w:rPr>
+        <w:t>Android 10</w:t>
+      </w:r>
       <w:r>
         <w:rPr>
           <w:rFonts w:ascii="David" w:hAnsi="David" w:hint="cs"/>
-          <w:rtl/>
-        </w:rPr>
-        <w:t xml:space="preserve"> </w:t>
-      </w:r>
-      <w:r>
-        <w:rPr>
-          <w:rFonts w:ascii="David" w:hAnsi="David"/>
-        </w:rPr>
-        <w:t>Android Accelerator X64</w:t>
+          <w:sz w:val="24"/>
+          <w:rtl/>
+        </w:rPr>
+        <w:t xml:space="preserve"> גרסת </w:t>
+      </w:r>
+      <w:r>
+        <w:rPr>
+          <w:rFonts w:ascii="David" w:hAnsi="David"/>
+          <w:sz w:val="24"/>
+        </w:rPr>
+        <w:t>API</w:t>
       </w:r>
       <w:r>
         <w:rPr>
           <w:rFonts w:ascii="David" w:hAnsi="David" w:hint="cs"/>
-          <w:rtl/>
-        </w:rPr>
-        <w:t xml:space="preserve"> המריץ </w:t>
-      </w:r>
-      <w:r>
-        <w:rPr>
-          <w:rFonts w:ascii="David" w:hAnsi="David"/>
-        </w:rPr>
-        <w:t>Android 5.0</w:t>
-      </w:r>
-      <w:r>
-        <w:rPr>
-          <w:rFonts w:ascii="David" w:hAnsi="David" w:hint="cs"/>
-          <w:rtl/>
-        </w:rPr>
-        <w:t xml:space="preserve"> גרסת </w:t>
-      </w:r>
-      <w:r>
-        <w:rPr>
-          <w:rFonts w:ascii="David" w:hAnsi="David"/>
-        </w:rPr>
-        <w:t>API</w:t>
-      </w:r>
-      <w:r>
-        <w:rPr>
-          <w:rFonts w:ascii="David" w:hAnsi="David" w:hint="cs"/>
-          <w:rtl/>
-        </w:rPr>
-        <w:t xml:space="preserve"> 18.</w:t>
-      </w:r>
-    </w:p>
-    <w:p>
-      <w:pPr>
-        <w:spacing w:line="276" w:lineRule="auto"/>
-        <w:rPr>
-          <w:rFonts w:ascii="David" w:hAnsi="David"/>
-          <w:color w:val="FF0000"/>
-          <w:rtl/>
-        </w:rPr>
-      </w:pPr>
+          <w:sz w:val="24"/>
+          <w:rtl/>
+        </w:rPr>
+        <w:t xml:space="preserve"> 29.</w:t>
+      </w:r>
     </w:p>
     <w:p>
       <w:pPr>
@@ -24449,7 +24433,8 @@
     </w:p>
     <w:p>
       <w:pPr>
-        <w:spacing w:line="276" w:lineRule="auto"/>
+        <w:spacing w:line="360" w:lineRule="auto"/>
+        <w:jc w:val="left"/>
         <w:rPr>
           <w:rFonts w:ascii="David" w:hAnsi="David"/>
           <w:color w:val="0000FF"/>
@@ -24458,490 +24443,343 @@
       </w:pPr>
       <w:r>
         <w:rPr>
-          <w:rFonts w:ascii="David" w:hAnsi="David"/>
-          <w:color w:val="0000FF"/>
-          <w:rtl/>
-        </w:rPr>
-        <w:t xml:space="preserve">חלק זה הינו חשוב ביותר, ואין להקל בו ראש כלל. </w:t>
+          <w:rFonts w:ascii="David" w:hAnsi="David" w:hint="cs"/>
+          <w:sz w:val="24"/>
+          <w:rtl/>
+        </w:rPr>
+        <w:t>עבורי, העבודה על הפרויקט הייתה קשה</w:t>
+      </w:r>
+      <w:r>
+        <w:rPr>
+          <w:rFonts w:ascii="David" w:hAnsi="David" w:hint="cs"/>
+          <w:sz w:val="24"/>
+          <w:rtl/>
+        </w:rPr>
+        <w:t xml:space="preserve">, עמוסה ומעיקה. התמודדתי עם קשיים רבים אשר לעיתים לקח לי זמן רב להתגבר עליהם כמו שעות, ימים, שבועות ולעיתים כלל לא התגברתי </w:t>
+      </w:r>
+      <w:r>
+        <w:rPr>
+          <w:rFonts w:ascii="David" w:hAnsi="David"/>
+          <w:sz w:val="24"/>
+          <w:rtl/>
+        </w:rPr>
+        <w:t>–</w:t>
+      </w:r>
+      <w:r>
+        <w:rPr>
+          <w:rFonts w:ascii="David" w:hAnsi="David" w:hint="cs"/>
+          <w:sz w:val="24"/>
+          <w:rtl/>
+        </w:rPr>
+        <w:t xml:space="preserve"> "פשוט" החלפתי את דרך העבודה שלי על ידי שינוי חלקים רבים. עם זאת, מהלך העבודה לא תמיד היה כה מייגע ואף לעיתים "זרם" באופן מאוד חלק ומהיר.</w:t>
       </w:r>
     </w:p>
     <w:p>
       <w:pPr>
-        <w:spacing w:line="276" w:lineRule="auto"/>
-        <w:rPr>
-          <w:rFonts w:ascii="David" w:hAnsi="David"/>
-          <w:color w:val="0000FF"/>
-          <w:rtl/>
-        </w:rPr>
-      </w:pPr>
-      <w:r>
-        <w:rPr>
-          <w:rFonts w:ascii="David" w:hAnsi="David"/>
-          <w:color w:val="0000FF"/>
-          <w:rtl/>
-        </w:rPr>
-        <w:t>התלמיד ישקף</w:t>
-      </w:r>
-      <w:r>
-        <w:rPr>
-          <w:rFonts w:ascii="David" w:hAnsi="David"/>
-          <w:color w:val="0000FF"/>
-          <w:rtl/>
-        </w:rPr>
-        <w:t>:</w:t>
-      </w:r>
+        <w:spacing w:line="360" w:lineRule="auto"/>
+        <w:jc w:val="left"/>
+        <w:rPr>
+          <w:rFonts w:ascii="David" w:hAnsi="David"/>
+          <w:sz w:val="24"/>
+        </w:rPr>
+      </w:pPr>
     </w:p>
     <w:p>
       <w:pPr>
-        <w:pStyle w:val="af0"/>
-        <w:numPr>
-          <w:ilvl w:val="0"/>
-          <w:numId w:val="6"/>
-        </w:numPr>
-        <w:spacing w:line="276" w:lineRule="auto"/>
-        <w:rPr>
-          <w:rFonts w:ascii="David" w:hAnsi="David"/>
-          <w:color w:val="0000FF"/>
-        </w:rPr>
-      </w:pPr>
-      <w:r>
-        <w:rPr>
-          <w:rFonts w:ascii="David" w:hAnsi="David"/>
-          <w:color w:val="0000FF"/>
-        </w:rPr>
-        <w:t xml:space="preserve"> </w:t>
-      </w:r>
-      <w:r>
-        <w:rPr>
-          <w:rFonts w:ascii="David" w:hAnsi="David"/>
-          <w:color w:val="0000FF"/>
-          <w:rtl/>
-        </w:rPr>
-        <w:t>איך הייתה עבורו העבודה על הפרויקט</w:t>
+        <w:spacing w:line="360" w:lineRule="auto"/>
+        <w:jc w:val="left"/>
+        <w:rPr>
+          <w:rFonts w:ascii="David" w:hAnsi="David"/>
+          <w:sz w:val="24"/>
+          <w:rtl/>
+        </w:rPr>
+      </w:pPr>
+      <w:r>
+        <w:rPr>
+          <w:rFonts w:ascii="David" w:hAnsi="David" w:hint="cs"/>
+          <w:sz w:val="24"/>
+          <w:rtl/>
+        </w:rPr>
+        <w:t xml:space="preserve">מרבית הבעיות שהיו לי היו מורכבות ולא פשוטות, אך הצלחתי בסופו של סבר להתמודד עימן (או לפחות עם רובן). אחד מהאתגרים העיקריים היה קביעת שיעור חדש. כאשר משתמש קובע שיעור חדש, המערכת צריכה לבדוק זמינות של השיעור אצל המורה מבחינת שיעורים אחרים וגם אם השיעור הוא בשעות העבודה. תחילה, הסתבכתי ממש בהוספת השיעור למבנה הנתונים, שכן הייתה לי טעות במשפט ה </w:t>
+      </w:r>
+      <w:proofErr w:type="spellStart"/>
+      <w:r>
+        <w:rPr>
+          <w:rFonts w:ascii="David" w:hAnsi="David"/>
+          <w:sz w:val="24"/>
+        </w:rPr>
+        <w:t>sql</w:t>
+      </w:r>
+      <w:proofErr w:type="spellEnd"/>
+      <w:r>
+        <w:rPr>
+          <w:rFonts w:ascii="David" w:hAnsi="David" w:hint="cs"/>
+          <w:sz w:val="24"/>
+          <w:rtl/>
+        </w:rPr>
+        <w:t xml:space="preserve">. לאחר מכן, הסתבכתי בבדיקה עם השיעורים האחרים הקיימים. בסך </w:t>
+      </w:r>
+      <w:proofErr w:type="spellStart"/>
+      <w:r>
+        <w:rPr>
+          <w:rFonts w:ascii="David" w:hAnsi="David" w:hint="cs"/>
+          <w:sz w:val="24"/>
+          <w:rtl/>
+        </w:rPr>
+        <w:t>הכל</w:t>
+      </w:r>
+      <w:proofErr w:type="spellEnd"/>
+      <w:r>
+        <w:rPr>
+          <w:rFonts w:ascii="David" w:hAnsi="David" w:hint="cs"/>
+          <w:sz w:val="24"/>
+          <w:rtl/>
+        </w:rPr>
+        <w:t>, לקח כי כשבוע לפתור את הבעיות הקשורות לכך, דבר אשר עיכב אותי מאוד במהלך כתיבת הפרויקט</w:t>
+      </w:r>
+      <w:r>
+        <w:rPr>
+          <w:rFonts w:ascii="David" w:hAnsi="David" w:hint="cs"/>
+          <w:sz w:val="24"/>
+          <w:rtl/>
+        </w:rPr>
+        <w:t>, שכן חלק זה הוא חשוב ביותר בפרויקט שלי.</w:t>
       </w:r>
     </w:p>
     <w:p>
       <w:pPr>
-        <w:pStyle w:val="af0"/>
-        <w:numPr>
-          <w:ilvl w:val="0"/>
-          <w:numId w:val="6"/>
-        </w:numPr>
-        <w:spacing w:line="276" w:lineRule="auto"/>
-        <w:rPr>
-          <w:rFonts w:ascii="David" w:hAnsi="David"/>
-          <w:color w:val="0000FF"/>
-        </w:rPr>
-      </w:pPr>
-      <w:r>
-        <w:rPr>
-          <w:rFonts w:ascii="David" w:hAnsi="David"/>
-          <w:color w:val="0000FF"/>
-          <w:rtl/>
-        </w:rPr>
-        <w:t xml:space="preserve"> מה הוא קיבל</w:t>
-      </w:r>
+        <w:spacing w:line="360" w:lineRule="auto"/>
+        <w:jc w:val="left"/>
+        <w:rPr>
+          <w:rFonts w:ascii="David" w:hAnsi="David"/>
+          <w:sz w:val="24"/>
+          <w:rtl/>
+        </w:rPr>
+      </w:pPr>
     </w:p>
     <w:p>
       <w:pPr>
-        <w:pStyle w:val="af0"/>
-        <w:numPr>
-          <w:ilvl w:val="0"/>
-          <w:numId w:val="6"/>
-        </w:numPr>
-        <w:spacing w:line="276" w:lineRule="auto"/>
-        <w:rPr>
-          <w:rFonts w:ascii="David" w:hAnsi="David"/>
-          <w:color w:val="0000FF"/>
-        </w:rPr>
-      </w:pPr>
-      <w:r>
-        <w:rPr>
-          <w:rFonts w:ascii="David" w:hAnsi="David"/>
-          <w:color w:val="0000FF"/>
-          <w:rtl/>
-        </w:rPr>
-        <w:t xml:space="preserve"> אילו כלים הוא לוקח אתו להמשך</w:t>
+        <w:spacing w:line="360" w:lineRule="auto"/>
+        <w:jc w:val="left"/>
+        <w:rPr>
+          <w:rtl/>
+        </w:rPr>
+      </w:pPr>
+      <w:r>
+        <w:rPr>
+          <w:rtl/>
+        </w:rPr>
+        <w:t xml:space="preserve">בעקבות הפרויקט </w:t>
+      </w:r>
+      <w:r>
+        <w:rPr>
+          <w:rFonts w:hint="cs"/>
+          <w:rtl/>
+        </w:rPr>
+        <w:t xml:space="preserve">הזה, </w:t>
+      </w:r>
+      <w:r>
+        <w:rPr>
+          <w:rtl/>
+        </w:rPr>
+        <w:t>קיבלתי דברים</w:t>
+      </w:r>
+      <w:r>
+        <w:rPr>
+          <w:rFonts w:hint="cs"/>
+          <w:rtl/>
+        </w:rPr>
+        <w:t xml:space="preserve"> רבים. </w:t>
+      </w:r>
+      <w:r>
+        <w:rPr>
+          <w:rtl/>
+        </w:rPr>
+        <w:t>ל</w:t>
+      </w:r>
+      <w:r>
+        <w:rPr>
+          <w:rFonts w:hint="cs"/>
+          <w:rtl/>
+        </w:rPr>
+        <w:t>משל, למדתי כיצד להתמודד עם קשיים ואתגרים, ל</w:t>
+      </w:r>
+      <w:r>
+        <w:rPr>
+          <w:rtl/>
+        </w:rPr>
+        <w:t xml:space="preserve">מדתי איך </w:t>
+      </w:r>
+      <w:r>
+        <w:rPr>
+          <w:rFonts w:hint="cs"/>
+          <w:rtl/>
+        </w:rPr>
+        <w:t xml:space="preserve">לארגן </w:t>
+      </w:r>
+      <w:r>
+        <w:rPr>
+          <w:rtl/>
+        </w:rPr>
+        <w:t>את הזמן שלי</w:t>
+      </w:r>
+      <w:r>
+        <w:rPr>
+          <w:rFonts w:hint="cs"/>
+          <w:rtl/>
+        </w:rPr>
+        <w:t xml:space="preserve"> בצורה הפשוטה ויעילה ככל האפשר</w:t>
+      </w:r>
+      <w:r>
+        <w:rPr>
+          <w:rtl/>
+        </w:rPr>
+        <w:t>,</w:t>
+      </w:r>
+      <w:r>
+        <w:rPr>
+          <w:rFonts w:hint="cs"/>
+          <w:rtl/>
+        </w:rPr>
+        <w:t xml:space="preserve"> למדתי איך לכתוב קוד בצורה פשוטה יותר המובנת לא רק לי אלא גם לקורא אחר ועוד.</w:t>
       </w:r>
     </w:p>
     <w:p>
       <w:pPr>
-        <w:pStyle w:val="af0"/>
-        <w:numPr>
-          <w:ilvl w:val="0"/>
-          <w:numId w:val="6"/>
-        </w:numPr>
-        <w:spacing w:line="276" w:lineRule="auto"/>
-        <w:rPr>
-          <w:rFonts w:ascii="David" w:hAnsi="David"/>
-          <w:color w:val="0000FF"/>
-        </w:rPr>
-      </w:pPr>
-      <w:r>
-        <w:rPr>
-          <w:rFonts w:ascii="David" w:hAnsi="David"/>
-          <w:color w:val="0000FF"/>
-          <w:rtl/>
-        </w:rPr>
-        <w:t>מה הקשיים / אתגרים שעמדו בפניו</w:t>
-      </w:r>
+        <w:spacing w:line="360" w:lineRule="auto"/>
+        <w:jc w:val="left"/>
+        <w:rPr>
+          <w:rtl/>
+        </w:rPr>
+      </w:pPr>
     </w:p>
     <w:p>
       <w:pPr>
-        <w:pStyle w:val="af0"/>
-        <w:numPr>
-          <w:ilvl w:val="0"/>
-          <w:numId w:val="6"/>
-        </w:numPr>
-        <w:spacing w:line="276" w:lineRule="auto"/>
-        <w:rPr>
-          <w:rFonts w:ascii="David" w:hAnsi="David"/>
-          <w:color w:val="0000FF"/>
-        </w:rPr>
-      </w:pPr>
-      <w:r>
-        <w:rPr>
-          <w:rFonts w:ascii="David" w:hAnsi="David"/>
-          <w:color w:val="0000FF"/>
-          <w:rtl/>
-        </w:rPr>
-        <w:t>מה המסקנות של</w:t>
-      </w:r>
-      <w:r>
-        <w:rPr>
-          <w:rFonts w:ascii="David" w:hAnsi="David"/>
-          <w:color w:val="0000FF"/>
-          <w:rtl/>
-        </w:rPr>
-        <w:t>ו</w:t>
+        <w:spacing w:line="360" w:lineRule="auto"/>
+        <w:jc w:val="left"/>
+        <w:rPr>
+          <w:rtl/>
+        </w:rPr>
+      </w:pPr>
+      <w:r>
+        <w:rPr>
+          <w:rFonts w:hint="cs"/>
+          <w:rtl/>
+        </w:rPr>
+        <w:t>אם הייתי מתחיל היום את הפרויקט, עם כל הידע אשר צברתי במהלך הדרך, הייתי עובד בצורה שונה לגמרי. תחילה, הייתי משקיע בספר הפרויקט עוד בתחילת העבודה, כלומר, כותב בו כמה שיותר עוד לפני כתיבת הפרויקט עצמו. שנית, הייתי מחלק את זמן העבודה שלי בצורה טובה יותר. עד כה ניהלתי את הזמן שלי בצורה לא יעילה בכלל וניתן לומר כמעט בוודאות כי הדבר לא בא לטובתי בכלל. בנוסף, הייתי כמובן עובד עם ראש נקי יותר וממוקד יותר, שכן הייתי יודע מה לכתוב ובאיזו דרך ומקום.</w:t>
       </w:r>
     </w:p>
     <w:p>
       <w:pPr>
-        <w:pStyle w:val="af0"/>
-        <w:numPr>
-          <w:ilvl w:val="0"/>
-          <w:numId w:val="6"/>
-        </w:numPr>
-        <w:spacing w:line="276" w:lineRule="auto"/>
-        <w:rPr>
-          <w:rFonts w:ascii="David" w:hAnsi="David"/>
-          <w:color w:val="0000FF"/>
-        </w:rPr>
-      </w:pPr>
-      <w:r>
-        <w:rPr>
-          <w:rFonts w:ascii="David" w:hAnsi="David"/>
-          <w:color w:val="0000FF"/>
-          <w:rtl/>
-        </w:rPr>
-        <w:t>מה הוא היה עושה אחרת לו היה מתחיל היום</w:t>
-      </w:r>
+        <w:spacing w:line="360" w:lineRule="auto"/>
+        <w:jc w:val="left"/>
+        <w:rPr>
+          <w:rtl/>
+        </w:rPr>
+      </w:pPr>
     </w:p>
     <w:p>
       <w:pPr>
-        <w:pStyle w:val="af0"/>
-        <w:numPr>
-          <w:ilvl w:val="0"/>
-          <w:numId w:val="6"/>
-        </w:numPr>
-        <w:spacing w:line="276" w:lineRule="auto"/>
-        <w:rPr>
-          <w:rFonts w:ascii="David" w:hAnsi="David"/>
-          <w:color w:val="0000FF"/>
-        </w:rPr>
-      </w:pPr>
-      <w:r>
-        <w:rPr>
-          <w:rFonts w:ascii="David" w:hAnsi="David"/>
-          <w:color w:val="0000FF"/>
-          <w:rtl/>
-        </w:rPr>
-        <w:t>מה אם היה קורה אחרת</w:t>
-      </w:r>
-      <w:r>
-        <w:rPr>
-          <w:rFonts w:ascii="David" w:hAnsi="David"/>
-          <w:color w:val="0000FF"/>
-          <w:rtl/>
-        </w:rPr>
-        <w:t xml:space="preserve"> -</w:t>
-      </w:r>
-      <w:r>
-        <w:rPr>
-          <w:rFonts w:ascii="David" w:hAnsi="David"/>
-          <w:color w:val="0000FF"/>
-          <w:rtl/>
-        </w:rPr>
-        <w:t xml:space="preserve"> העבודה הייתה יעילה יותר עבורו</w:t>
+        <w:spacing w:line="360" w:lineRule="auto"/>
+        <w:jc w:val="left"/>
+        <w:rPr>
+          <w:rtl/>
+        </w:rPr>
+      </w:pPr>
+      <w:r>
+        <w:rPr>
+          <w:rFonts w:hint="cs"/>
+          <w:rtl/>
+        </w:rPr>
+        <w:t>יתר על כן, במידה ו</w:t>
+      </w:r>
+      <w:r>
+        <w:rPr>
+          <w:rFonts w:hint="cs"/>
+          <w:rtl/>
+        </w:rPr>
+        <w:t>עבודתי הייתה יעילה יותר וממוקדת יותר, דבר זה היה משפיע ישירות על החיים שלי. העבודה על הפרויקט הזה גרם לי להשקיע זמן רב ולקח ממני הרבה מאוד מהבריאות האישית שלי, בגלל שעבדתי בצורה לא נכונה אשר התבטאה בכך שלעיתים נשארתי ער בלילות לבנים על מנת שאוכל לעבוד כמה שיותר על הפרויקט ואולי גם לסיים אותו. וכן, במשך זמן רב יום הפרויקט הסתיים בסימן שאלה, שכן לא חשבתי שאוכל בכלל לסיים אותו.</w:t>
       </w:r>
     </w:p>
     <w:p>
       <w:pPr>
-        <w:pStyle w:val="af0"/>
-        <w:numPr>
-          <w:ilvl w:val="0"/>
-          <w:numId w:val="6"/>
-        </w:numPr>
-        <w:spacing w:line="276" w:lineRule="auto"/>
-        <w:rPr>
-          <w:rFonts w:ascii="David" w:hAnsi="David"/>
-          <w:color w:val="0000FF"/>
-        </w:rPr>
-      </w:pPr>
-      <w:r>
-        <w:rPr>
-          <w:rFonts w:ascii="David" w:hAnsi="David"/>
-          <w:color w:val="0000FF"/>
-          <w:rtl/>
-        </w:rPr>
-        <w:t>ועוד שאלות חקר עצמי לשיקולכם</w:t>
-      </w:r>
-      <w:r>
-        <w:rPr>
-          <w:rFonts w:ascii="David" w:hAnsi="David"/>
-          <w:color w:val="0000FF"/>
-        </w:rPr>
-        <w:t xml:space="preserve">. </w:t>
-      </w:r>
+        <w:spacing w:line="360" w:lineRule="auto"/>
+        <w:jc w:val="left"/>
+        <w:rPr>
+          <w:rtl/>
+        </w:rPr>
+      </w:pPr>
     </w:p>
     <w:p>
       <w:pPr>
-        <w:spacing w:line="276" w:lineRule="auto"/>
-        <w:ind w:left="360"/>
-        <w:rPr>
-          <w:rFonts w:ascii="David" w:hAnsi="David"/>
-          <w:color w:val="0000FF"/>
-          <w:rtl/>
-        </w:rPr>
-      </w:pPr>
+        <w:spacing w:line="360" w:lineRule="auto"/>
+        <w:jc w:val="left"/>
+        <w:rPr>
+          <w:rtl/>
+        </w:rPr>
+      </w:pPr>
+      <w:r>
+        <w:rPr>
+          <w:rFonts w:hint="cs"/>
+          <w:rtl/>
+        </w:rPr>
+        <w:t xml:space="preserve">בסופו של יום, העבודה על הפרויקט הזה וספר הפרויקט שלו לא היוותה עבורי דבר משמח ומקל במיוחד. אך יחד עם זאת, העבודה על הפרויקט הזה חישלה אותי וגרמה לי להבין שאם אני רוצה לעשות משהו במידה מספיקה </w:t>
+      </w:r>
+      <w:r>
+        <w:rPr>
+          <w:rtl/>
+        </w:rPr>
+        <w:t>–</w:t>
+      </w:r>
+      <w:r>
+        <w:rPr>
+          <w:rFonts w:hint="cs"/>
+          <w:rtl/>
+        </w:rPr>
+        <w:t xml:space="preserve"> אני יכול ומסוגל לעשות אותו, גם אם זה אומר להקריב </w:t>
+      </w:r>
+      <w:r>
+        <w:rPr>
+          <w:rFonts w:hint="cs"/>
+          <w:rtl/>
+        </w:rPr>
+        <w:t xml:space="preserve">מההנאה שלי ומהמותרות שלי בחיים למשך תקופה </w:t>
+      </w:r>
+      <w:r>
+        <w:rPr>
+          <w:rFonts w:hint="cs"/>
+          <w:rtl/>
+        </w:rPr>
+        <w:t>מסוימת</w:t>
+      </w:r>
+      <w:r>
+        <w:rPr>
+          <w:rFonts w:hint="cs"/>
+          <w:rtl/>
+        </w:rPr>
+        <w:t>. כמובן שהייתי שמח אם היינו מתחילים עם הפרויקט בשלב מוקדם יותר, משום שזה יכול היה לעזור לי מאוד, אך זה כבר מאוחר מידי להתחרט על דברים ולפחות הספקתי לסיים את הפרויקט כשיצאתי עם כלים אשר יכולים לעזור לי בהמשך החיים שלי.</w:t>
+      </w:r>
     </w:p>
     <w:p>
       <w:pPr>
-        <w:spacing w:line="276" w:lineRule="auto"/>
-        <w:ind w:left="360"/>
-        <w:rPr>
-          <w:rFonts w:ascii="David" w:hAnsi="David"/>
-          <w:color w:val="0000FF"/>
-        </w:rPr>
-      </w:pPr>
-      <w:r>
-        <w:rPr>
-          <w:rFonts w:ascii="David" w:hAnsi="David"/>
-          <w:color w:val="0000FF"/>
-          <w:rtl/>
-        </w:rPr>
-        <w:t xml:space="preserve">מצופה מתלמיד שעבד כמעט שנה </w:t>
-      </w:r>
-      <w:r>
-        <w:rPr>
-          <w:rFonts w:ascii="David" w:hAnsi="David"/>
-          <w:color w:val="0000FF"/>
-          <w:rtl/>
-        </w:rPr>
-        <w:t>(</w:t>
-      </w:r>
-      <w:r>
-        <w:rPr>
-          <w:rFonts w:ascii="David" w:hAnsi="David"/>
-          <w:color w:val="0000FF"/>
-          <w:rtl/>
-        </w:rPr>
-        <w:t>ולעיתים אף יותר</w:t>
-      </w:r>
-      <w:r>
-        <w:rPr>
-          <w:rFonts w:ascii="David" w:hAnsi="David"/>
-          <w:color w:val="0000FF"/>
-          <w:rtl/>
-        </w:rPr>
-        <w:t>)</w:t>
-      </w:r>
-      <w:r>
-        <w:rPr>
-          <w:rFonts w:ascii="David" w:hAnsi="David"/>
-          <w:color w:val="0000FF"/>
-          <w:rtl/>
-        </w:rPr>
-        <w:t xml:space="preserve"> על פרויקט שלפחות ימלא חצי עד עמוד שלם בחלק זה של הרפלקציה</w:t>
-      </w:r>
-      <w:r>
-        <w:rPr>
-          <w:rFonts w:ascii="David" w:hAnsi="David"/>
-          <w:color w:val="0000FF"/>
-        </w:rPr>
-        <w:t>.</w:t>
+        <w:bidi w:val="0"/>
+        <w:spacing w:line="240" w:lineRule="auto"/>
+        <w:jc w:val="left"/>
+        <w:rPr>
+          <w:rtl/>
+        </w:rPr>
+      </w:pPr>
+      <w:r>
+        <w:rPr>
+          <w:rtl/>
+        </w:rPr>
+        <w:br w:type="page"/>
       </w:r>
     </w:p>
     <w:p>
       <w:pPr>
-        <w:rPr>
-          <w:rFonts w:ascii="David" w:hAnsi="David"/>
-          <w:sz w:val="24"/>
-          <w:rtl/>
-        </w:rPr>
-      </w:pPr>
-      <w:r>
-        <w:br/>
-      </w:r>
-      <w:r>
-        <w:br/>
-      </w:r>
-      <w:r>
-        <w:rPr>
-          <w:rFonts w:ascii="David" w:hAnsi="David"/>
-          <w:sz w:val="24"/>
-          <w:rtl/>
-        </w:rPr>
-        <w:t>העבודה על הפרויקט לא הייתה קלה היא דרשה ממני להשקיע הרבה זמן והרבה כוח</w:t>
-      </w:r>
-      <w:r>
-        <w:rPr>
-          <w:rFonts w:ascii="David" w:hAnsi="David"/>
-          <w:sz w:val="24"/>
-        </w:rPr>
-        <w:t xml:space="preserve">. </w:t>
-      </w:r>
-      <w:r>
-        <w:rPr>
-          <w:rFonts w:ascii="David" w:hAnsi="David"/>
-          <w:sz w:val="24"/>
-          <w:rtl/>
-        </w:rPr>
-        <w:t>היו מלא מצבים בהם לא ידעתי מה לעשות ומצאתי את עצמי מחפש שעות באינטרנט על מנת למצוא פתרון מסוים</w:t>
-      </w:r>
-      <w:r>
-        <w:rPr>
-          <w:rFonts w:ascii="David" w:hAnsi="David"/>
-          <w:sz w:val="24"/>
-        </w:rPr>
-        <w:t xml:space="preserve">. </w:t>
-      </w:r>
-      <w:r>
-        <w:rPr>
-          <w:rFonts w:ascii="David" w:hAnsi="David"/>
-          <w:sz w:val="24"/>
-          <w:rtl/>
-        </w:rPr>
-        <w:t>בעקבות הפרויקט אני קיבלתי הרבה דברים – למדתי איך לארגן את הזמן שלי, הבנתי מה עליי לעשות כאשר אני נתקע בבעיה, למדתי איך להתמודד עם אתגרים, הבנתי איך עליי לייעל את האלגוריתם שלי על מנת שיהיה מובן וחכם</w:t>
-      </w:r>
-      <w:r>
-        <w:rPr>
-          <w:rFonts w:ascii="David" w:hAnsi="David"/>
-          <w:sz w:val="24"/>
-        </w:rPr>
-        <w:t xml:space="preserve">. </w:t>
-      </w:r>
-      <w:r>
-        <w:rPr>
-          <w:rFonts w:ascii="David" w:hAnsi="David"/>
-          <w:sz w:val="24"/>
-          <w:rtl/>
-        </w:rPr>
-        <w:t>האתגר העיקרי ביותר באפליקציה היה תהליך קביעת השיעור אך הבאתי לבעיה זו מענה בכך שפתחתי את הקלאס</w:t>
-      </w:r>
-      <w:r>
-        <w:rPr>
-          <w:rFonts w:ascii="David" w:hAnsi="David"/>
-          <w:sz w:val="24"/>
-        </w:rPr>
-        <w:t xml:space="preserve"> schedule </w:t>
-      </w:r>
-      <w:r>
-        <w:rPr>
-          <w:rFonts w:ascii="David" w:hAnsi="David"/>
-          <w:sz w:val="24"/>
-          <w:rtl/>
-        </w:rPr>
-        <w:t>קלאס זה הוא לוח הזמנים של המורה וכך יכולתי להציג לתלמיד את השעות הנכונות בהן המורה עובד וכאשר אין לו שיעור</w:t>
-      </w:r>
-      <w:r>
-        <w:rPr>
-          <w:rFonts w:ascii="David" w:hAnsi="David"/>
-          <w:sz w:val="24"/>
-        </w:rPr>
-        <w:t xml:space="preserve">. </w:t>
-      </w:r>
-      <w:r>
-        <w:rPr>
-          <w:rFonts w:ascii="David" w:hAnsi="David"/>
-          <w:sz w:val="24"/>
-          <w:rtl/>
-        </w:rPr>
-        <w:t>אם הייתי מתחיל את הפרויקט שלי היום הייתי אומר שעליי להשקיע יותר בתיק הפרויקט אשר עשיתי בתחילת הדרך</w:t>
-      </w:r>
-      <w:r>
-        <w:rPr>
-          <w:rFonts w:ascii="David" w:hAnsi="David"/>
-          <w:sz w:val="24"/>
-        </w:rPr>
-        <w:t xml:space="preserve">. </w:t>
-      </w:r>
-      <w:r>
-        <w:rPr>
-          <w:rFonts w:ascii="David" w:hAnsi="David"/>
-          <w:sz w:val="24"/>
-          <w:rtl/>
-        </w:rPr>
-        <w:t>ברגע שהייתי משקיע בתיק הפרויקט יותר ככה הייתי מגיע לאפליקציה שלי מוכן יותר וממוקד במטרה</w:t>
-      </w:r>
-      <w:r>
-        <w:rPr>
-          <w:rFonts w:ascii="David" w:hAnsi="David"/>
-          <w:sz w:val="24"/>
-        </w:rPr>
-        <w:t xml:space="preserve">. </w:t>
-      </w:r>
-      <w:r>
-        <w:rPr>
-          <w:rFonts w:ascii="David" w:hAnsi="David"/>
-          <w:sz w:val="24"/>
-          <w:rtl/>
-        </w:rPr>
-        <w:t xml:space="preserve">בתחילת הפרויקט נתקלתי במלא בעיות וכל הזמן </w:t>
-      </w:r>
-      <w:proofErr w:type="spellStart"/>
-      <w:r>
-        <w:rPr>
-          <w:rFonts w:ascii="David" w:hAnsi="David"/>
-          <w:sz w:val="24"/>
-          <w:rtl/>
-        </w:rPr>
-        <w:t>התפזרתי</w:t>
-      </w:r>
-      <w:proofErr w:type="spellEnd"/>
-      <w:r>
-        <w:rPr>
-          <w:rFonts w:ascii="David" w:hAnsi="David"/>
-          <w:sz w:val="24"/>
-          <w:rtl/>
-        </w:rPr>
-        <w:t xml:space="preserve"> אך אורי המורה שלי כל הזמן דאג לעזור לי ולמקד אותי</w:t>
-      </w:r>
-      <w:r>
-        <w:rPr>
-          <w:rFonts w:ascii="David" w:hAnsi="David"/>
-          <w:sz w:val="24"/>
-        </w:rPr>
-        <w:t xml:space="preserve">. </w:t>
-      </w:r>
-      <w:r>
-        <w:rPr>
-          <w:rFonts w:ascii="David" w:hAnsi="David"/>
-          <w:sz w:val="24"/>
-          <w:rtl/>
-        </w:rPr>
-        <w:t>בנוסף אם הייתי יודע איך לנהל את הזמן שלי בצורה טובה יותר היה עליי הרבה פחות לחץ וכך הייתי עובד בצורה יעילה יותר עם ראש נקי.</w:t>
-      </w:r>
-    </w:p>
-    <w:p>
-      <w:pPr>
-        <w:pStyle w:val="2"/>
-        <w:spacing w:line="276" w:lineRule="auto"/>
-        <w:rPr>
-          <w:rFonts w:ascii="David" w:hAnsi="David" w:cs="David"/>
-          <w:i w:val="0"/>
-          <w:iCs w:val="0"/>
+        <w:jc w:val="left"/>
+        <w:rPr>
           <w:rtl/>
         </w:rPr>
       </w:pPr>
@@ -24967,104 +24805,50 @@
     </w:p>
     <w:p>
       <w:pPr>
-        <w:spacing w:line="276" w:lineRule="auto"/>
-        <w:rPr>
-          <w:rFonts w:ascii="David" w:hAnsi="David"/>
-          <w:color w:val="0000FF"/>
-          <w:rtl/>
-        </w:rPr>
-      </w:pPr>
-      <w:r>
-        <w:rPr>
-          <w:rFonts w:ascii="David" w:hAnsi="David"/>
-          <w:color w:val="0000FF"/>
-          <w:rtl/>
-        </w:rPr>
-        <w:t>מקורות מידע שנעזרת בהם:</w:t>
+        <w:ind w:left="360"/>
+        <w:jc w:val="left"/>
+      </w:pPr>
+      <w:proofErr w:type="spellStart"/>
+      <w:r>
+        <w:t>stackOverFlow</w:t>
+      </w:r>
+      <w:proofErr w:type="spellEnd"/>
+      <w:r>
+        <w:t xml:space="preserve"> (https://stackoverflow.com/)</w:t>
       </w:r>
     </w:p>
     <w:p>
       <w:pPr>
-        <w:pStyle w:val="af0"/>
-        <w:numPr>
-          <w:ilvl w:val="0"/>
-          <w:numId w:val="6"/>
-        </w:numPr>
-        <w:spacing w:line="276" w:lineRule="auto"/>
-        <w:rPr>
-          <w:rFonts w:ascii="David" w:hAnsi="David"/>
-          <w:color w:val="0000FF"/>
-        </w:rPr>
-      </w:pPr>
-      <w:r>
-        <w:rPr>
-          <w:rFonts w:ascii="David" w:hAnsi="David"/>
-          <w:color w:val="0000FF"/>
-          <w:rtl/>
-        </w:rPr>
-        <w:t xml:space="preserve"> ללימוד הנושא</w:t>
+        <w:ind w:left="360"/>
+        <w:jc w:val="left"/>
+      </w:pPr>
+      <w:r>
+        <w:t>Xamarin Forums (https://forums.xamarin.com/)</w:t>
       </w:r>
     </w:p>
     <w:p>
       <w:pPr>
-        <w:pStyle w:val="af0"/>
-        <w:numPr>
-          <w:ilvl w:val="0"/>
-          <w:numId w:val="6"/>
-        </w:numPr>
-        <w:spacing w:line="276" w:lineRule="auto"/>
-        <w:rPr>
-          <w:rFonts w:ascii="David" w:hAnsi="David"/>
-          <w:color w:val="0000FF"/>
-        </w:rPr>
-      </w:pPr>
-      <w:r>
-        <w:rPr>
-          <w:rFonts w:ascii="David" w:hAnsi="David"/>
-          <w:color w:val="0000FF"/>
-          <w:rtl/>
-        </w:rPr>
-        <w:t>לגיבוש הרעיון</w:t>
+        <w:ind w:left="360"/>
+        <w:jc w:val="left"/>
+      </w:pPr>
+      <w:r>
+        <w:t>Xamarin Docs (https://docs.microsoft.com/en-us/xamarin/)</w:t>
       </w:r>
     </w:p>
     <w:p>
       <w:pPr>
-        <w:pStyle w:val="af0"/>
-        <w:numPr>
-          <w:ilvl w:val="0"/>
-          <w:numId w:val="6"/>
-        </w:numPr>
-        <w:spacing w:line="276" w:lineRule="auto"/>
-        <w:rPr>
-          <w:rFonts w:ascii="David" w:hAnsi="David"/>
-          <w:color w:val="0000FF"/>
-          <w:rtl/>
-        </w:rPr>
-      </w:pPr>
-      <w:r>
-        <w:rPr>
-          <w:rFonts w:ascii="David" w:hAnsi="David"/>
-          <w:color w:val="0000FF"/>
-          <w:rtl/>
-        </w:rPr>
-        <w:t>לכתיבת הקוד</w:t>
-      </w:r>
-    </w:p>
-    <w:p>
-      <w:pPr>
-        <w:bidi w:val="0"/>
-        <w:spacing w:line="276" w:lineRule="auto"/>
+        <w:ind w:left="360"/>
         <w:jc w:val="left"/>
-        <w:rPr>
-          <w:rFonts w:ascii="David" w:hAnsi="David"/>
-          <w:b/>
-          <w:bCs/>
-          <w:kern w:val="28"/>
-          <w:sz w:val="48"/>
-          <w:szCs w:val="48"/>
-          <w:u w:val="single"/>
-        </w:rPr>
-      </w:pPr>
+      </w:pPr>
+      <w:r>
+        <w:rPr>
+          <w:rtl/>
+        </w:rPr>
+        <w:t>האתר של המורה שלנו</w:t>
+      </w:r>
+      <w:r>
+        <w:t xml:space="preserve"> (http://hivun.co.il/students/xamarin/xamarin.html)</w:t>
+      </w:r>
     </w:p>
     <w:p>
       <w:pPr>
@@ -25938,6 +25722,118 @@
     </w:lvl>
   </w:abstractNum>
   <w:abstractNum w:abstractNumId="4" w15:restartNumberingAfterBreak="0">
+    <w:nsid w:val="2BAC1F8C"/>
+    <w:multiLevelType w:val="hybridMultilevel"/>
+    <w:tmpl w:val="C152D9DE"/>
+    <w:lvl w:ilvl="0" w:tplc="7542E932">
+      <w:numFmt w:val="bullet"/>
+      <w:lvlText w:val="•"/>
+      <w:lvlJc w:val="left"/>
+      <w:pPr>
+        <w:ind w:left="4290" w:hanging="3930"/>
+      </w:pPr>
+      <w:rPr>
+        <w:rFonts w:ascii="Times New Roman" w:eastAsia="Times New Roman" w:hAnsi="Times New Roman" w:cs="Times New Roman" w:hint="default"/>
+      </w:rPr>
+    </w:lvl>
+    <w:lvl w:ilvl="1" w:tplc="04090003" w:tentative="1">
+      <w:start w:val="1"/>
+      <w:numFmt w:val="bullet"/>
+      <w:lvlText w:val="o"/>
+      <w:lvlJc w:val="left"/>
+      <w:pPr>
+        <w:ind w:left="1440" w:hanging="360"/>
+      </w:pPr>
+      <w:rPr>
+        <w:rFonts w:ascii="Courier New" w:hAnsi="Courier New" w:cs="Courier New" w:hint="default"/>
+      </w:rPr>
+    </w:lvl>
+    <w:lvl w:ilvl="2" w:tplc="04090005" w:tentative="1">
+      <w:start w:val="1"/>
+      <w:numFmt w:val="bullet"/>
+      <w:lvlText w:val=""/>
+      <w:lvlJc w:val="left"/>
+      <w:pPr>
+        <w:ind w:left="2160" w:hanging="360"/>
+      </w:pPr>
+      <w:rPr>
+        <w:rFonts w:ascii="Wingdings" w:hAnsi="Wingdings" w:hint="default"/>
+      </w:rPr>
+    </w:lvl>
+    <w:lvl w:ilvl="3" w:tplc="04090001" w:tentative="1">
+      <w:start w:val="1"/>
+      <w:numFmt w:val="bullet"/>
+      <w:lvlText w:val=""/>
+      <w:lvlJc w:val="left"/>
+      <w:pPr>
+        <w:ind w:left="2880" w:hanging="360"/>
+      </w:pPr>
+      <w:rPr>
+        <w:rFonts w:ascii="Symbol" w:hAnsi="Symbol" w:hint="default"/>
+      </w:rPr>
+    </w:lvl>
+    <w:lvl w:ilvl="4" w:tplc="04090003" w:tentative="1">
+      <w:start w:val="1"/>
+      <w:numFmt w:val="bullet"/>
+      <w:lvlText w:val="o"/>
+      <w:lvlJc w:val="left"/>
+      <w:pPr>
+        <w:ind w:left="3600" w:hanging="360"/>
+      </w:pPr>
+      <w:rPr>
+        <w:rFonts w:ascii="Courier New" w:hAnsi="Courier New" w:cs="Courier New" w:hint="default"/>
+      </w:rPr>
+    </w:lvl>
+    <w:lvl w:ilvl="5" w:tplc="04090005" w:tentative="1">
+      <w:start w:val="1"/>
+      <w:numFmt w:val="bullet"/>
+      <w:lvlText w:val=""/>
+      <w:lvlJc w:val="left"/>
+      <w:pPr>
+        <w:ind w:left="4320" w:hanging="360"/>
+      </w:pPr>
+      <w:rPr>
+        <w:rFonts w:ascii="Wingdings" w:hAnsi="Wingdings" w:hint="default"/>
+      </w:rPr>
+    </w:lvl>
+    <w:lvl w:ilvl="6" w:tplc="04090001" w:tentative="1">
+      <w:start w:val="1"/>
+      <w:numFmt w:val="bullet"/>
+      <w:lvlText w:val=""/>
+      <w:lvlJc w:val="left"/>
+      <w:pPr>
+        <w:ind w:left="5040" w:hanging="360"/>
+      </w:pPr>
+      <w:rPr>
+        <w:rFonts w:ascii="Symbol" w:hAnsi="Symbol" w:hint="default"/>
+      </w:rPr>
+    </w:lvl>
+    <w:lvl w:ilvl="7" w:tplc="04090003" w:tentative="1">
+      <w:start w:val="1"/>
+      <w:numFmt w:val="bullet"/>
+      <w:lvlText w:val="o"/>
+      <w:lvlJc w:val="left"/>
+      <w:pPr>
+        <w:ind w:left="5760" w:hanging="360"/>
+      </w:pPr>
+      <w:rPr>
+        <w:rFonts w:ascii="Courier New" w:hAnsi="Courier New" w:cs="Courier New" w:hint="default"/>
+      </w:rPr>
+    </w:lvl>
+    <w:lvl w:ilvl="8" w:tplc="04090005" w:tentative="1">
+      <w:start w:val="1"/>
+      <w:numFmt w:val="bullet"/>
+      <w:lvlText w:val=""/>
+      <w:lvlJc w:val="left"/>
+      <w:pPr>
+        <w:ind w:left="6480" w:hanging="360"/>
+      </w:pPr>
+      <w:rPr>
+        <w:rFonts w:ascii="Wingdings" w:hAnsi="Wingdings" w:hint="default"/>
+      </w:rPr>
+    </w:lvl>
+  </w:abstractNum>
+  <w:abstractNum w:abstractNumId="5" w15:restartNumberingAfterBreak="0">
     <w:nsid w:val="34E029D2"/>
     <w:multiLevelType w:val="hybridMultilevel"/>
     <w:tmpl w:val="99142B36"/>
@@ -26049,7 +25945,7 @@
       </w:rPr>
     </w:lvl>
   </w:abstractNum>
-  <w:abstractNum w:abstractNumId="5" w15:restartNumberingAfterBreak="0">
+  <w:abstractNum w:abstractNumId="6" w15:restartNumberingAfterBreak="0">
     <w:nsid w:val="45F1003F"/>
     <w:multiLevelType w:val="multilevel"/>
     <w:tmpl w:val="338604FA"/>
@@ -26144,7 +26040,7 @@
       </w:rPr>
     </w:lvl>
   </w:abstractNum>
-  <w:abstractNum w:abstractNumId="6" w15:restartNumberingAfterBreak="0">
+  <w:abstractNum w:abstractNumId="7" w15:restartNumberingAfterBreak="0">
     <w:nsid w:val="46D36221"/>
     <w:multiLevelType w:val="hybridMultilevel"/>
     <w:tmpl w:val="949CD2C4"/>
@@ -26257,7 +26153,7 @@
       </w:rPr>
     </w:lvl>
   </w:abstractNum>
-  <w:abstractNum w:abstractNumId="7" w15:restartNumberingAfterBreak="0">
+  <w:abstractNum w:abstractNumId="8" w15:restartNumberingAfterBreak="0">
     <w:nsid w:val="579248D2"/>
     <w:multiLevelType w:val="hybridMultilevel"/>
     <w:tmpl w:val="AA5635D2"/>
@@ -26370,7 +26266,7 @@
       </w:rPr>
     </w:lvl>
   </w:abstractNum>
-  <w:abstractNum w:abstractNumId="8" w15:restartNumberingAfterBreak="0">
+  <w:abstractNum w:abstractNumId="9" w15:restartNumberingAfterBreak="0">
     <w:nsid w:val="5A0E1CFF"/>
     <w:multiLevelType w:val="hybridMultilevel"/>
     <w:tmpl w:val="46965B68"/>
@@ -26459,7 +26355,7 @@
       </w:pPr>
     </w:lvl>
   </w:abstractNum>
-  <w:abstractNum w:abstractNumId="9" w15:restartNumberingAfterBreak="0">
+  <w:abstractNum w:abstractNumId="10" w15:restartNumberingAfterBreak="0">
     <w:nsid w:val="5C9E5D69"/>
     <w:multiLevelType w:val="hybridMultilevel"/>
     <w:tmpl w:val="822899F6"/>
@@ -26571,7 +26467,7 @@
       </w:rPr>
     </w:lvl>
   </w:abstractNum>
-  <w:abstractNum w:abstractNumId="10" w15:restartNumberingAfterBreak="0">
+  <w:abstractNum w:abstractNumId="11" w15:restartNumberingAfterBreak="0">
     <w:nsid w:val="60097EC9"/>
     <w:multiLevelType w:val="hybridMultilevel"/>
     <w:tmpl w:val="7F3CA794"/>
@@ -26683,7 +26579,7 @@
       </w:rPr>
     </w:lvl>
   </w:abstractNum>
-  <w:abstractNum w:abstractNumId="11" w15:restartNumberingAfterBreak="0">
+  <w:abstractNum w:abstractNumId="12" w15:restartNumberingAfterBreak="0">
     <w:nsid w:val="61DA25B9"/>
     <w:multiLevelType w:val="multilevel"/>
     <w:tmpl w:val="CBF4D144"/>
@@ -26817,7 +26713,120 @@
       </w:rPr>
     </w:lvl>
   </w:abstractNum>
-  <w:abstractNum w:abstractNumId="12" w15:restartNumberingAfterBreak="0">
+  <w:abstractNum w:abstractNumId="13" w15:restartNumberingAfterBreak="0">
+    <w:nsid w:val="6EBD22B9"/>
+    <w:multiLevelType w:val="hybridMultilevel"/>
+    <w:tmpl w:val="84F66B0C"/>
+    <w:lvl w:ilvl="0" w:tplc="04090001">
+      <w:start w:val="1"/>
+      <w:numFmt w:val="bullet"/>
+      <w:lvlText w:val=""/>
+      <w:lvlJc w:val="left"/>
+      <w:pPr>
+        <w:ind w:left="720" w:hanging="360"/>
+      </w:pPr>
+      <w:rPr>
+        <w:rFonts w:ascii="Symbol" w:hAnsi="Symbol" w:hint="default"/>
+      </w:rPr>
+    </w:lvl>
+    <w:lvl w:ilvl="1" w:tplc="04090003" w:tentative="1">
+      <w:start w:val="1"/>
+      <w:numFmt w:val="bullet"/>
+      <w:lvlText w:val="o"/>
+      <w:lvlJc w:val="left"/>
+      <w:pPr>
+        <w:ind w:left="1440" w:hanging="360"/>
+      </w:pPr>
+      <w:rPr>
+        <w:rFonts w:ascii="Courier New" w:hAnsi="Courier New" w:cs="Courier New" w:hint="default"/>
+      </w:rPr>
+    </w:lvl>
+    <w:lvl w:ilvl="2" w:tplc="04090005" w:tentative="1">
+      <w:start w:val="1"/>
+      <w:numFmt w:val="bullet"/>
+      <w:lvlText w:val=""/>
+      <w:lvlJc w:val="left"/>
+      <w:pPr>
+        <w:ind w:left="2160" w:hanging="360"/>
+      </w:pPr>
+      <w:rPr>
+        <w:rFonts w:ascii="Wingdings" w:hAnsi="Wingdings" w:hint="default"/>
+      </w:rPr>
+    </w:lvl>
+    <w:lvl w:ilvl="3" w:tplc="04090001" w:tentative="1">
+      <w:start w:val="1"/>
+      <w:numFmt w:val="bullet"/>
+      <w:lvlText w:val=""/>
+      <w:lvlJc w:val="left"/>
+      <w:pPr>
+        <w:ind w:left="2880" w:hanging="360"/>
+      </w:pPr>
+      <w:rPr>
+        <w:rFonts w:ascii="Symbol" w:hAnsi="Symbol" w:hint="default"/>
+      </w:rPr>
+    </w:lvl>
+    <w:lvl w:ilvl="4" w:tplc="04090003" w:tentative="1">
+      <w:start w:val="1"/>
+      <w:numFmt w:val="bullet"/>
+      <w:lvlText w:val="o"/>
+      <w:lvlJc w:val="left"/>
+      <w:pPr>
+        <w:ind w:left="3600" w:hanging="360"/>
+      </w:pPr>
+      <w:rPr>
+        <w:rFonts w:ascii="Courier New" w:hAnsi="Courier New" w:cs="Courier New" w:hint="default"/>
+      </w:rPr>
+    </w:lvl>
+    <w:lvl w:ilvl="5" w:tplc="04090005" w:tentative="1">
+      <w:start w:val="1"/>
+      <w:numFmt w:val="bullet"/>
+      <w:lvlText w:val=""/>
+      <w:lvlJc w:val="left"/>
+      <w:pPr>
+        <w:ind w:left="4320" w:hanging="360"/>
+      </w:pPr>
+      <w:rPr>
+        <w:rFonts w:ascii="Wingdings" w:hAnsi="Wingdings" w:hint="default"/>
+      </w:rPr>
+    </w:lvl>
+    <w:lvl w:ilvl="6" w:tplc="04090001" w:tentative="1">
+      <w:start w:val="1"/>
+      <w:numFmt w:val="bullet"/>
+      <w:lvlText w:val=""/>
+      <w:lvlJc w:val="left"/>
+      <w:pPr>
+        <w:ind w:left="5040" w:hanging="360"/>
+      </w:pPr>
+      <w:rPr>
+        <w:rFonts w:ascii="Symbol" w:hAnsi="Symbol" w:hint="default"/>
+      </w:rPr>
+    </w:lvl>
+    <w:lvl w:ilvl="7" w:tplc="04090003" w:tentative="1">
+      <w:start w:val="1"/>
+      <w:numFmt w:val="bullet"/>
+      <w:lvlText w:val="o"/>
+      <w:lvlJc w:val="left"/>
+      <w:pPr>
+        <w:ind w:left="5760" w:hanging="360"/>
+      </w:pPr>
+      <w:rPr>
+        <w:rFonts w:ascii="Courier New" w:hAnsi="Courier New" w:cs="Courier New" w:hint="default"/>
+      </w:rPr>
+    </w:lvl>
+    <w:lvl w:ilvl="8" w:tplc="04090005" w:tentative="1">
+      <w:start w:val="1"/>
+      <w:numFmt w:val="bullet"/>
+      <w:lvlText w:val=""/>
+      <w:lvlJc w:val="left"/>
+      <w:pPr>
+        <w:ind w:left="6480" w:hanging="360"/>
+      </w:pPr>
+      <w:rPr>
+        <w:rFonts w:ascii="Wingdings" w:hAnsi="Wingdings" w:hint="default"/>
+      </w:rPr>
+    </w:lvl>
+  </w:abstractNum>
+  <w:abstractNum w:abstractNumId="14" w15:restartNumberingAfterBreak="0">
     <w:nsid w:val="73B77322"/>
     <w:multiLevelType w:val="hybridMultilevel"/>
     <w:tmpl w:val="3C94803E"/>
@@ -26930,7 +26939,7 @@
       </w:rPr>
     </w:lvl>
   </w:abstractNum>
-  <w:abstractNum w:abstractNumId="13" w15:restartNumberingAfterBreak="0">
+  <w:abstractNum w:abstractNumId="15" w15:restartNumberingAfterBreak="0">
     <w:nsid w:val="78883C25"/>
     <w:multiLevelType w:val="multilevel"/>
     <w:tmpl w:val="D6BA3274"/>
@@ -27064,7 +27073,7 @@
       </w:rPr>
     </w:lvl>
   </w:abstractNum>
-  <w:abstractNum w:abstractNumId="14" w15:restartNumberingAfterBreak="0">
+  <w:abstractNum w:abstractNumId="16" w15:restartNumberingAfterBreak="0">
     <w:nsid w:val="7EC7790A"/>
     <w:multiLevelType w:val="hybridMultilevel"/>
     <w:tmpl w:val="9E00F3FA"/>
@@ -27178,49 +27187,55 @@
     </w:lvl>
   </w:abstractNum>
   <w:num w:numId="1">
-    <w:abstractNumId w:val="5"/>
+    <w:abstractNumId w:val="6"/>
   </w:num>
   <w:num w:numId="2">
-    <w:abstractNumId w:val="11"/>
+    <w:abstractNumId w:val="12"/>
   </w:num>
   <w:num w:numId="3">
-    <w:abstractNumId w:val="13"/>
+    <w:abstractNumId w:val="15"/>
   </w:num>
   <w:num w:numId="4">
     <w:abstractNumId w:val="2"/>
   </w:num>
   <w:num w:numId="5">
-    <w:abstractNumId w:val="8"/>
+    <w:abstractNumId w:val="9"/>
   </w:num>
   <w:num w:numId="6">
-    <w:abstractNumId w:val="7"/>
+    <w:abstractNumId w:val="8"/>
   </w:num>
   <w:num w:numId="7">
     <w:abstractNumId w:val="3"/>
   </w:num>
   <w:num w:numId="8">
-    <w:abstractNumId w:val="6"/>
+    <w:abstractNumId w:val="7"/>
   </w:num>
   <w:num w:numId="9">
     <w:abstractNumId w:val="1"/>
   </w:num>
   <w:num w:numId="10">
-    <w:abstractNumId w:val="10"/>
+    <w:abstractNumId w:val="11"/>
   </w:num>
   <w:num w:numId="11">
-    <w:abstractNumId w:val="9"/>
+    <w:abstractNumId w:val="10"/>
   </w:num>
   <w:num w:numId="12">
     <w:abstractNumId w:val="0"/>
   </w:num>
   <w:num w:numId="13">
-    <w:abstractNumId w:val="4"/>
+    <w:abstractNumId w:val="5"/>
   </w:num>
   <w:num w:numId="14">
+    <w:abstractNumId w:val="16"/>
+  </w:num>
+  <w:num w:numId="15">
     <w:abstractNumId w:val="14"/>
   </w:num>
-  <w:num w:numId="15">
-    <w:abstractNumId w:val="12"/>
+  <w:num w:numId="16">
+    <w:abstractNumId w:val="13"/>
+  </w:num>
+  <w:num w:numId="17">
+    <w:abstractNumId w:val="4"/>
   </w:num>
 </w:numbering>
 </file>
@@ -33714,7 +33729,7 @@
 </file>
 
 <file path=customXml/itemProps1.xml><?xml version="1.0" encoding="utf-8"?>
-<ds:datastoreItem xmlns:ds="http://schemas.openxmlformats.org/officeDocument/2006/customXml" ds:itemID="{1640D331-6B8C-4898-AD8D-811C966CE582}">
+<ds:datastoreItem xmlns:ds="http://schemas.openxmlformats.org/officeDocument/2006/customXml" ds:itemID="{3E318FBE-C6AE-4B1F-A0CE-10239EB85F61}">
   <ds:schemaRefs>
     <ds:schemaRef ds:uri="http://schemas.openxmlformats.org/officeDocument/2006/bibliography"/>
   </ds:schemaRefs>

</xml_diff>